<commit_message>
Release Legend Dynamics under CC BY 4.0: statement in every guide, the website and a LICENSE file
Co-Authored-By: Claude Opus 5.5 <noreply@anthropic.com>
Claude-Session: https://claude.ai/code/session_015SADCFzhKijkC2foUmXrpC
</commit_message>
<xml_diff>
--- a/legend-dynamics/Legend_Dynamics_Core_Rules.docx
+++ b/legend-dynamics/Legend_Dynamics_Core_Rules.docx
@@ -4172,7 +4172,7 @@
       </w:r>
     </w:p>
     <w:bookmarkEnd w:id="82"/>
-    <w:bookmarkStart w:id="83" w:name="quick-reference"/>
+    <w:bookmarkStart w:id="84" w:name="quick-reference"/>
     <w:p>
       <w:pPr>
         <w:pStyle w:val="Heading1"/>
@@ -4352,10 +4352,30 @@
           <w:iCs/>
           <w:i/>
         </w:rPr>
-        <w:t xml:space="preserve">Legend Dynamics RPG system. The core rules and this setting are original works.</w:t>
-      </w:r>
-    </w:p>
-    <w:bookmarkEnd w:id="83"/>
+        <w:t xml:space="preserve">Legend Dynamics RPG system.</w:t>
+      </w:r>
+      <w:r>
+        <w:t xml:space="preserve"> </w:t>
+      </w:r>
+      <w:r>
+        <w:t xml:space="preserve">This RPG is released under the</w:t>
+      </w:r>
+      <w:r>
+        <w:t xml:space="preserve"> </w:t>
+      </w:r>
+      <w:hyperlink r:id="rId83">
+        <w:r>
+          <w:rPr>
+            <w:rStyle w:val="Hyperlink"/>
+          </w:rPr>
+          <w:t xml:space="preserve">Creative Commons Attribution 4.0 International License</w:t>
+        </w:r>
+      </w:hyperlink>
+      <w:r>
+        <w:t xml:space="preserve">. You may share, adapt, and use it for any purpose, including commercially, as long as you give appropriate credit to the author.</w:t>
+      </w:r>
+    </w:p>
+    <w:bookmarkEnd w:id="84"/>
     <w:sectPr/>
   </w:body>
 </w:document>

</xml_diff>

<commit_message>
Credit Don Smallwood as the creator of Legend Dynamics
Co-Authored-By: Claude Opus 5.5 <noreply@anthropic.com>
Claude-Session: https://claude.ai/code/session_015SADCFzhKijkC2foUmXrpC
</commit_message>
<xml_diff>
--- a/legend-dynamics/Legend_Dynamics_Core_Rules.docx
+++ b/legend-dynamics/Legend_Dynamics_Core_Rules.docx
@@ -82,6 +82,20 @@
       </w:r>
       <w:r>
         <w:t xml:space="preserve">system</w:t>
+      </w:r>
+    </w:p>
+    <w:p>
+      <w:pPr>
+        <w:pStyle w:val="Author"/>
+      </w:pPr>
+      <w:r>
+        <w:t xml:space="preserve">Don</w:t>
+      </w:r>
+      <w:r>
+        <w:t xml:space="preserve"> </w:t>
+      </w:r>
+      <w:r>
+        <w:t xml:space="preserve">Smallwood</w:t>
       </w:r>
     </w:p>
     <w:p>
@@ -4352,7 +4366,7 @@
           <w:iCs/>
           <w:i/>
         </w:rPr>
-        <w:t xml:space="preserve">Legend Dynamics RPG system.</w:t>
+        <w:t xml:space="preserve">Legend Dynamics RPG system, created by Don Smallwood.</w:t>
       </w:r>
       <w:r>
         <w:t xml:space="preserve"> </w:t>

</xml_diff>

<commit_message>
Range bands in the core rules for every setting; weapons get effective ranges; ExLAW Leap and Teleport distances by Class
Co-Authored-By: Claude Opus 5.5 <noreply@anthropic.com>
Claude-Session: https://claude.ai/code/session_015SADCFzhKijkC2foUmXrpC
</commit_message>
<xml_diff>
--- a/legend-dynamics/Legend_Dynamics_Core_Rules.docx
+++ b/legend-dynamics/Legend_Dynamics_Core_Rules.docx
@@ -2160,7 +2160,7 @@
     </w:p>
     <w:bookmarkEnd w:id="48"/>
     <w:bookmarkEnd w:id="49"/>
-    <w:bookmarkStart w:id="55" w:name="personal-combat"/>
+    <w:bookmarkStart w:id="56" w:name="personal-combat"/>
     <w:p>
       <w:pPr>
         <w:pStyle w:val="Heading1"/>
@@ -2183,7 +2183,7 @@
         <w:pStyle w:val="FirstParagraph"/>
       </w:pPr>
       <w:r>
-        <w:t xml:space="preserve">Act in descending Agility order. Players choose the order of tied characters; the GM resolves other ties. A round lasts a few seconds. On your turn, move a short distance and take one meaningful action, such as attacking, reloading, helping, or attempting a task.</w:t>
+        <w:t xml:space="preserve">Act in descending Agility order. Players choose the order of tied characters; the GM resolves other ties. A round lasts a few seconds. On your turn, move a short distance (up to 10 yards: the Close band below) and take one meaningful action, such as attacking, reloading, helping, or attempting a task.</w:t>
       </w:r>
     </w:p>
     <w:bookmarkEnd w:id="50"/>
@@ -2213,7 +2213,374 @@
       </w:r>
     </w:p>
     <w:bookmarkEnd w:id="51"/>
-    <w:bookmarkStart w:id="53" w:name="injury"/>
+    <w:bookmarkStart w:id="52" w:name="range"/>
+    <w:p>
+      <w:pPr>
+        <w:pStyle w:val="Heading2"/>
+      </w:pPr>
+      <w:r>
+        <w:t xml:space="preserve">Range</w:t>
+      </w:r>
+    </w:p>
+    <w:p>
+      <w:pPr>
+        <w:pStyle w:val="FirstParagraph"/>
+      </w:pPr>
+      <w:r>
+        <w:t xml:space="preserve">Distances fall into five bands:</w:t>
+      </w:r>
+    </w:p>
+    <w:tbl>
+      <w:tblPr>
+        <w:tblStyle w:val="Table"/>
+        <w:tblW w:type="pct" w:w="5000"/>
+        <w:tblLook w:firstRow="1" w:lastRow="0" w:firstColumn="0" w:lastColumn="0" w:noHBand="0" w:noVBand="0" w:val="0020"/>
+        <w:jc w:val="start"/>
+        <w:tblBorders>
+          <w:top w:val="single" w:sz="4" w:color="B8C2D3"/>
+          <w:left w:val="single" w:sz="4" w:color="B8C2D3"/>
+          <w:bottom w:val="single" w:sz="4" w:color="B8C2D3"/>
+          <w:right w:val="single" w:sz="4" w:color="B8C2D3"/>
+          <w:insideH w:val="single" w:sz="4" w:color="B8C2D3"/>
+          <w:insideV w:val="single" w:sz="4" w:color="B8C2D3"/>
+        </w:tblBorders>
+      </w:tblPr>
+      <w:tblGrid>
+        <w:gridCol w:w="2640"/>
+        <w:gridCol w:w="2640"/>
+        <w:gridCol w:w="2640"/>
+      </w:tblGrid>
+      <w:tr>
+        <w:trPr>
+          <w:tblHeader w:val="true"/>
+        </w:trPr>
+        <w:tc>
+          <w:tcPr>
+            <w:shd w:val="clear" w:fill="E9EEF6"/>
+          </w:tcPr>
+          <w:p>
+            <w:pPr>
+              <w:pStyle w:val="Compact"/>
+              <w:jc w:val="left"/>
+            </w:pPr>
+            <w:r>
+              <w:rPr>
+                <w:b/>
+                <w:sz w:val="19"/>
+              </w:rPr>
+              <w:t xml:space="preserve">Band</w:t>
+            </w:r>
+          </w:p>
+        </w:tc>
+        <w:tc>
+          <w:tcPr>
+            <w:shd w:val="clear" w:fill="E9EEF6"/>
+          </w:tcPr>
+          <w:p>
+            <w:pPr>
+              <w:pStyle w:val="Compact"/>
+              <w:jc w:val="left"/>
+            </w:pPr>
+            <w:r>
+              <w:rPr>
+                <w:b/>
+                <w:sz w:val="19"/>
+              </w:rPr>
+              <w:t xml:space="preserve">Distance</w:t>
+            </w:r>
+          </w:p>
+        </w:tc>
+        <w:tc>
+          <w:tcPr>
+            <w:shd w:val="clear" w:fill="E9EEF6"/>
+          </w:tcPr>
+          <w:p>
+            <w:pPr>
+              <w:pStyle w:val="Compact"/>
+              <w:jc w:val="left"/>
+            </w:pPr>
+            <w:r>
+              <w:rPr>
+                <w:b/>
+                <w:sz w:val="19"/>
+              </w:rPr>
+              <w:t xml:space="preserve">For example</w:t>
+            </w:r>
+          </w:p>
+        </w:tc>
+      </w:tr>
+      <w:tr>
+        <w:tc>
+          <w:tcPr/>
+          <w:p>
+            <w:pPr>
+              <w:pStyle w:val="Compact"/>
+              <w:jc w:val="left"/>
+            </w:pPr>
+            <w:r>
+              <w:rPr>
+                <w:b/>
+                <w:sz w:val="19"/>
+              </w:rPr>
+              <w:t xml:space="preserve">Close</w:t>
+            </w:r>
+          </w:p>
+        </w:tc>
+        <w:tc>
+          <w:tcPr/>
+          <w:p>
+            <w:pPr>
+              <w:pStyle w:val="Compact"/>
+              <w:jc w:val="left"/>
+            </w:pPr>
+            <w:r>
+              <w:rPr>
+                <w:sz w:val="19"/>
+              </w:rPr>
+              <w:t xml:space="preserve">Up to 10 yards</w:t>
+            </w:r>
+          </w:p>
+        </w:tc>
+        <w:tc>
+          <w:tcPr/>
+          <w:p>
+            <w:pPr>
+              <w:pStyle w:val="Compact"/>
+              <w:jc w:val="left"/>
+            </w:pPr>
+            <w:r>
+              <w:rPr>
+                <w:sz w:val="19"/>
+              </w:rPr>
+              <w:t xml:space="preserve">Across a room; one move covers it</w:t>
+            </w:r>
+          </w:p>
+        </w:tc>
+      </w:tr>
+      <w:tr>
+        <w:tc>
+          <w:tcPr/>
+          <w:p>
+            <w:pPr>
+              <w:pStyle w:val="Compact"/>
+              <w:jc w:val="left"/>
+            </w:pPr>
+            <w:r>
+              <w:rPr>
+                <w:b/>
+                <w:sz w:val="19"/>
+              </w:rPr>
+              <w:t xml:space="preserve">Short</w:t>
+            </w:r>
+          </w:p>
+        </w:tc>
+        <w:tc>
+          <w:tcPr/>
+          <w:p>
+            <w:pPr>
+              <w:pStyle w:val="Compact"/>
+              <w:jc w:val="left"/>
+            </w:pPr>
+            <w:r>
+              <w:rPr>
+                <w:sz w:val="19"/>
+              </w:rPr>
+              <w:t xml:space="preserve">Up to 50 yards</w:t>
+            </w:r>
+          </w:p>
+        </w:tc>
+        <w:tc>
+          <w:tcPr/>
+          <w:p>
+            <w:pPr>
+              <w:pStyle w:val="Compact"/>
+              <w:jc w:val="left"/>
+            </w:pPr>
+            <w:r>
+              <w:rPr>
+                <w:sz w:val="19"/>
+              </w:rPr>
+              <w:t xml:space="preserve">Across a street or a courtyard</w:t>
+            </w:r>
+          </w:p>
+        </w:tc>
+      </w:tr>
+      <w:tr>
+        <w:tc>
+          <w:tcPr/>
+          <w:p>
+            <w:pPr>
+              <w:pStyle w:val="Compact"/>
+              <w:jc w:val="left"/>
+            </w:pPr>
+            <w:r>
+              <w:rPr>
+                <w:b/>
+                <w:sz w:val="19"/>
+              </w:rPr>
+              <w:t xml:space="preserve">Medium</w:t>
+            </w:r>
+          </w:p>
+        </w:tc>
+        <w:tc>
+          <w:tcPr/>
+          <w:p>
+            <w:pPr>
+              <w:pStyle w:val="Compact"/>
+              <w:jc w:val="left"/>
+            </w:pPr>
+            <w:r>
+              <w:rPr>
+                <w:sz w:val="19"/>
+              </w:rPr>
+              <w:t xml:space="preserve">Up to 150 yards</w:t>
+            </w:r>
+          </w:p>
+        </w:tc>
+        <w:tc>
+          <w:tcPr/>
+          <w:p>
+            <w:pPr>
+              <w:pStyle w:val="Compact"/>
+              <w:jc w:val="left"/>
+            </w:pPr>
+            <w:r>
+              <w:rPr>
+                <w:sz w:val="19"/>
+              </w:rPr>
+              <w:t xml:space="preserve">A city block, a long field</w:t>
+            </w:r>
+          </w:p>
+        </w:tc>
+      </w:tr>
+      <w:tr>
+        <w:tc>
+          <w:tcPr/>
+          <w:p>
+            <w:pPr>
+              <w:pStyle w:val="Compact"/>
+              <w:jc w:val="left"/>
+            </w:pPr>
+            <w:r>
+              <w:rPr>
+                <w:b/>
+                <w:sz w:val="19"/>
+              </w:rPr>
+              <w:t xml:space="preserve">Long</w:t>
+            </w:r>
+          </w:p>
+        </w:tc>
+        <w:tc>
+          <w:tcPr/>
+          <w:p>
+            <w:pPr>
+              <w:pStyle w:val="Compact"/>
+              <w:jc w:val="left"/>
+            </w:pPr>
+            <w:r>
+              <w:rPr>
+                <w:sz w:val="19"/>
+              </w:rPr>
+              <w:t xml:space="preserve">Up to 500 yards</w:t>
+            </w:r>
+          </w:p>
+        </w:tc>
+        <w:tc>
+          <w:tcPr/>
+          <w:p>
+            <w:pPr>
+              <w:pStyle w:val="Compact"/>
+              <w:jc w:val="left"/>
+            </w:pPr>
+            <w:r>
+              <w:rPr>
+                <w:sz w:val="19"/>
+              </w:rPr>
+              <w:t xml:space="preserve">Across a valley, a park or a harbor</w:t>
+            </w:r>
+          </w:p>
+        </w:tc>
+      </w:tr>
+      <w:tr>
+        <w:tc>
+          <w:tcPr/>
+          <w:p>
+            <w:pPr>
+              <w:pStyle w:val="Compact"/>
+              <w:jc w:val="left"/>
+            </w:pPr>
+            <w:r>
+              <w:rPr>
+                <w:b/>
+                <w:sz w:val="19"/>
+              </w:rPr>
+              <w:t xml:space="preserve">Extreme</w:t>
+            </w:r>
+          </w:p>
+        </w:tc>
+        <w:tc>
+          <w:tcPr/>
+          <w:p>
+            <w:pPr>
+              <w:pStyle w:val="Compact"/>
+              <w:jc w:val="left"/>
+            </w:pPr>
+            <w:r>
+              <w:rPr>
+                <w:sz w:val="19"/>
+              </w:rPr>
+              <w:t xml:space="preserve">Up to a mile, in line of sight</w:t>
+            </w:r>
+          </w:p>
+        </w:tc>
+        <w:tc>
+          <w:tcPr/>
+          <w:p>
+            <w:pPr>
+              <w:pStyle w:val="Compact"/>
+              <w:jc w:val="left"/>
+            </w:pPr>
+            <w:r>
+              <w:rPr>
+                <w:sz w:val="19"/>
+              </w:rPr>
+              <w:t xml:space="preserve">Rooftop to rooftop across a town</w:t>
+            </w:r>
+          </w:p>
+        </w:tc>
+      </w:tr>
+    </w:tbl>
+    <w:p>
+      <w:pPr>
+        <w:pStyle w:val="BodyText"/>
+      </w:pPr>
+      <w:r>
+        <w:t xml:space="preserve">Every ranged weapon has an</w:t>
+      </w:r>
+      <w:r>
+        <w:t xml:space="preserve"> </w:t>
+      </w:r>
+      <w:r>
+        <w:rPr>
+          <w:bCs/>
+          <w:b/>
+        </w:rPr>
+        <w:t xml:space="preserve">effective band</w:t>
+      </w:r>
+      <w:r>
+        <w:t xml:space="preserve">, shown in the weapons table. Attacks within it take no penalty. One band beyond it is −2, two bands beyond is −4, and anything farther is out of range. Weapons in hand and fists reach only someone next to you; move into reach as part of your turn. A thrown weapon’s effective band is Close.</w:t>
+      </w:r>
+    </w:p>
+    <w:p>
+      <w:pPr>
+        <w:pStyle w:val="BodyText"/>
+      </w:pPr>
+      <w:r>
+        <w:t xml:space="preserve">Moving: your move each turn covers the Close band. Give up your action to run and you cover Short instead.</w:t>
+      </w:r>
+    </w:p>
+    <w:bookmarkEnd w:id="52"/>
+    <w:bookmarkStart w:id="54" w:name="injury"/>
     <w:p>
       <w:pPr>
         <w:pStyle w:val="Heading2"/>
@@ -2502,7 +2869,7 @@
         <w:t xml:space="preserve">Injury penalties replace each other rather than stacking. They apply to movement, attacks, Dodge, and other tasks the injury physically hinders.</w:t>
       </w:r>
     </w:p>
-    <w:bookmarkStart w:id="52" w:name="dying-and-death"/>
+    <w:bookmarkStart w:id="53" w:name="dying-and-death"/>
     <w:p>
       <w:pPr>
         <w:pStyle w:val="Heading3"/>
@@ -2614,9 +2981,9 @@
         <w:t xml:space="preserve">Your protection is avoiding the hit: Dodge, cover, and a Legend point, which reduces a hit by one box.</w:t>
       </w:r>
     </w:p>
-    <w:bookmarkEnd w:id="52"/>
     <w:bookmarkEnd w:id="53"/>
-    <w:bookmarkStart w:id="54" w:name="weapons-and-damage"/>
+    <w:bookmarkEnd w:id="54"/>
+    <w:bookmarkStart w:id="55" w:name="weapons-and-damage"/>
     <w:p>
       <w:pPr>
         <w:pStyle w:val="Heading2"/>
@@ -2658,9 +3025,9 @@
         <w:t xml:space="preserve">Your setting pack supplies this (ammo).</w:t>
       </w:r>
     </w:p>
-    <w:bookmarkEnd w:id="54"/>
     <w:bookmarkEnd w:id="55"/>
-    <w:bookmarkStart w:id="60" w:name="medical-care"/>
+    <w:bookmarkEnd w:id="56"/>
+    <w:bookmarkStart w:id="61" w:name="medical-care"/>
     <w:p>
       <w:pPr>
         <w:pStyle w:val="Heading1"/>
@@ -2669,7 +3036,7 @@
         <w:t xml:space="preserve">Medical care</w:t>
       </w:r>
     </w:p>
-    <w:bookmarkStart w:id="56" w:name="diagnosis-and-stabilization"/>
+    <w:bookmarkStart w:id="57" w:name="diagnosis-and-stabilization"/>
     <w:p>
       <w:pPr>
         <w:pStyle w:val="Heading2"/>
@@ -2686,8 +3053,8 @@
         <w:t xml:space="preserve">Roll Medicine when the diagnosis is uncertain or an urgent treatment decision matters. Emergency stabilization takes one action and a successful Medicine roll with a medical kit. It ends Dying and stops deterioration, but removes no boxes.</w:t>
       </w:r>
     </w:p>
-    <w:bookmarkEnd w:id="56"/>
-    <w:bookmarkStart w:id="57" w:name="field-treatment"/>
+    <w:bookmarkEnd w:id="57"/>
+    <w:bookmarkStart w:id="58" w:name="field-treatment"/>
     <w:p>
       <w:pPr>
         <w:pStyle w:val="Heading2"/>
@@ -2704,8 +3071,8 @@
         <w:t xml:space="preserve">With a medical kit and several uninterrupted minutes, successful Medicine removes one injury box; success by 5 or more removes two. Each injury receives one field-treatment attempt; further attempts need changed circumstances.</w:t>
       </w:r>
     </w:p>
-    <w:bookmarkEnd w:id="57"/>
-    <w:bookmarkStart w:id="58" w:name="proper-care"/>
+    <w:bookmarkEnd w:id="58"/>
+    <w:bookmarkStart w:id="59" w:name="proper-care"/>
     <w:p>
       <w:pPr>
         <w:pStyle w:val="Heading2"/>
@@ -2722,8 +3089,8 @@
         <w:t xml:space="preserve">A proper infirmary grants +2 to Medicine. A successful treatment removes two boxes; success by 5 or more removes three. Allow the time the treatment requires.</w:t>
       </w:r>
     </w:p>
-    <w:bookmarkEnd w:id="58"/>
-    <w:bookmarkStart w:id="59" w:name="natural-recovery"/>
+    <w:bookmarkEnd w:id="59"/>
+    <w:bookmarkStart w:id="60" w:name="natural-recovery"/>
     <w:p>
       <w:pPr>
         <w:pStyle w:val="Heading2"/>
@@ -2756,9 +3123,9 @@
         <w:t xml:space="preserve">of rest clears one injury box. Rest means nothing strenuous. At three boxes, rest alone clears nothing: treatment must clear the first box.</w:t>
       </w:r>
     </w:p>
-    <w:bookmarkEnd w:id="59"/>
     <w:bookmarkEnd w:id="60"/>
-    <w:bookmarkStart w:id="64" w:name="legend-points-and-tracks"/>
+    <w:bookmarkEnd w:id="61"/>
+    <w:bookmarkStart w:id="65" w:name="legend-points-and-tracks"/>
     <w:p>
       <w:pPr>
         <w:pStyle w:val="Heading1"/>
@@ -2767,7 +3134,7 @@
         <w:t xml:space="preserve">Legend points and tracks</w:t>
       </w:r>
     </w:p>
-    <w:bookmarkStart w:id="61" w:name="using-legend-points"/>
+    <w:bookmarkStart w:id="62" w:name="using-legend-points"/>
     <w:p>
       <w:pPr>
         <w:pStyle w:val="Heading2"/>
@@ -2952,8 +3319,8 @@
         <w:t xml:space="preserve">Gain one point when one of your complications creates a meaningful problem you accept, including a companion complication. You can decline the proposed complication without penalty.</w:t>
       </w:r>
     </w:p>
-    <w:bookmarkEnd w:id="61"/>
-    <w:bookmarkStart w:id="62" w:name="tracks"/>
+    <w:bookmarkEnd w:id="62"/>
+    <w:bookmarkStart w:id="63" w:name="tracks"/>
     <w:p>
       <w:pPr>
         <w:pStyle w:val="Heading2"/>
@@ -2974,8 +3341,8 @@
         <w:t xml:space="preserve">Your setting pack supplies this (tracks).</w:t>
       </w:r>
     </w:p>
-    <w:bookmarkEnd w:id="62"/>
-    <w:bookmarkStart w:id="63" w:name="advancement"/>
+    <w:bookmarkEnd w:id="63"/>
+    <w:bookmarkStart w:id="64" w:name="advancement"/>
     <w:p>
       <w:pPr>
         <w:pStyle w:val="Heading2"/>
@@ -2992,9 +3359,9 @@
         <w:t xml:space="preserve">After a significant mission, the GM may authorize one relevant skill to advance from Untrained to Trained or from Trained to Specialty, or allow revision of an advantage or complication. Only a Specialist’s starting skill is Expert; a skill raised later tops out at Specialty (+3) unless they broaden (see Step 3).</w:t>
       </w:r>
     </w:p>
-    <w:bookmarkEnd w:id="63"/>
     <w:bookmarkEnd w:id="64"/>
-    <w:bookmarkStart w:id="67" w:name="running-missions"/>
+    <w:bookmarkEnd w:id="65"/>
+    <w:bookmarkStart w:id="68" w:name="running-missions"/>
     <w:p>
       <w:pPr>
         <w:pStyle w:val="Heading1"/>
@@ -3003,7 +3370,7 @@
         <w:t xml:space="preserve">Running missions</w:t>
       </w:r>
     </w:p>
-    <w:bookmarkStart w:id="65" w:name="mission-seeds"/>
+    <w:bookmarkStart w:id="66" w:name="mission-seeds"/>
     <w:p>
       <w:pPr>
         <w:pStyle w:val="Heading2"/>
@@ -3032,8 +3399,8 @@
         <w:t xml:space="preserve">Your setting pack supplies this (seeds).</w:t>
       </w:r>
     </w:p>
-    <w:bookmarkEnd w:id="65"/>
-    <w:bookmarkStart w:id="66" w:name="the-journal"/>
+    <w:bookmarkEnd w:id="66"/>
+    <w:bookmarkStart w:id="67" w:name="the-journal"/>
     <w:p>
       <w:pPr>
         <w:pStyle w:val="Heading2"/>
@@ -3160,9 +3527,9 @@
         <w:t xml:space="preserve">After a significant mission, the GM may authorize one skill step for each character.</w:t>
       </w:r>
     </w:p>
-    <w:bookmarkEnd w:id="66"/>
     <w:bookmarkEnd w:id="67"/>
-    <w:bookmarkStart w:id="68" w:name="ready-made-characters"/>
+    <w:bookmarkEnd w:id="68"/>
+    <w:bookmarkStart w:id="69" w:name="ready-made-characters"/>
     <w:p>
       <w:pPr>
         <w:pStyle w:val="Heading1"/>
@@ -3191,8 +3558,8 @@
         <w:t xml:space="preserve">Your setting pack supplies this (pregens).</w:t>
       </w:r>
     </w:p>
-    <w:bookmarkEnd w:id="68"/>
-    <w:bookmarkStart w:id="69" w:name="advantages"/>
+    <w:bookmarkEnd w:id="69"/>
+    <w:bookmarkStart w:id="70" w:name="advantages"/>
     <w:p>
       <w:pPr>
         <w:pStyle w:val="Heading1"/>
@@ -3221,8 +3588,8 @@
         <w:t xml:space="preserve">Your setting pack supplies this (advantages).</w:t>
       </w:r>
     </w:p>
-    <w:bookmarkEnd w:id="69"/>
-    <w:bookmarkStart w:id="70" w:name="origins"/>
+    <w:bookmarkEnd w:id="70"/>
+    <w:bookmarkStart w:id="71" w:name="origins"/>
     <w:p>
       <w:pPr>
         <w:pStyle w:val="Heading1"/>
@@ -3243,8 +3610,8 @@
         <w:t xml:space="preserve">Your setting pack supplies this (origins).</w:t>
       </w:r>
     </w:p>
-    <w:bookmarkEnd w:id="70"/>
-    <w:bookmarkStart w:id="81" w:name="making-your-own"/>
+    <w:bookmarkEnd w:id="71"/>
+    <w:bookmarkStart w:id="82" w:name="making-your-own"/>
     <w:p>
       <w:pPr>
         <w:pStyle w:val="Heading1"/>
@@ -3277,7 +3644,7 @@
         <w:t xml:space="preserve">option at the end of each list, and its checklist holds a custom choice to the same rules as everything else.</w:t>
       </w:r>
     </w:p>
-    <w:bookmarkStart w:id="71" w:name="a-custom-role"/>
+    <w:bookmarkStart w:id="72" w:name="a-custom-role"/>
     <w:p>
       <w:pPr>
         <w:pStyle w:val="Heading2"/>
@@ -3453,8 +3820,8 @@
         <w:t xml:space="preserve">.</w:t>
       </w:r>
     </w:p>
-    <w:bookmarkEnd w:id="71"/>
-    <w:bookmarkStart w:id="80" w:name="a-custom-origin"/>
+    <w:bookmarkEnd w:id="72"/>
+    <w:bookmarkStart w:id="81" w:name="a-custom-origin"/>
     <w:p>
       <w:pPr>
         <w:pStyle w:val="Heading2"/>
@@ -3471,7 +3838,7 @@
         <w:t xml:space="preserve">Build it with the GM, one step at a time.</w:t>
       </w:r>
     </w:p>
-    <w:bookmarkStart w:id="72" w:name="the-concept"/>
+    <w:bookmarkStart w:id="73" w:name="the-concept"/>
     <w:p>
       <w:pPr>
         <w:pStyle w:val="Heading3"/>
@@ -3488,8 +3855,8 @@
         <w:t xml:space="preserve">Two or three sentences: where they come from, what sets them apart, and how others see them. It should be something the origins in this book don’t already cover.</w:t>
       </w:r>
     </w:p>
-    <w:bookmarkEnd w:id="72"/>
-    <w:bookmarkStart w:id="73" w:name="the-tier"/>
+    <w:bookmarkEnd w:id="73"/>
+    <w:bookmarkStart w:id="74" w:name="the-tier"/>
     <w:p>
       <w:pPr>
         <w:pStyle w:val="Heading3"/>
@@ -3786,8 +4153,8 @@
         <w:t xml:space="preserve">When in doubt, choose the higher tier.</w:t>
       </w:r>
     </w:p>
-    <w:bookmarkEnd w:id="73"/>
-    <w:bookmarkStart w:id="74" w:name="attribute-adjustments"/>
+    <w:bookmarkEnd w:id="74"/>
+    <w:bookmarkStart w:id="75" w:name="attribute-adjustments"/>
     <w:p>
       <w:pPr>
         <w:pStyle w:val="Heading3"/>
@@ -3833,8 +4200,8 @@
         <w:t xml:space="preserve">: a +2 needs a −2 or two −1s. The adjustments move the attribute’s base (+1 starts it at 11) and raise its starting maximum (13 plus the bonus). Most origins change two to four attributes.</w:t>
       </w:r>
     </w:p>
-    <w:bookmarkEnd w:id="74"/>
-    <w:bookmarkStart w:id="75" w:name="core-rules-tier-1-and-up"/>
+    <w:bookmarkEnd w:id="75"/>
+    <w:bookmarkStart w:id="76" w:name="core-rules-tier-1-and-up"/>
     <w:p>
       <w:pPr>
         <w:pStyle w:val="Heading3"/>
@@ -3851,8 +4218,8 @@
         <w:t xml:space="preserve">One to three short rules that always apply: what they can do (see in the dark, resist cold, a free Trained skill) and what it costs (a weakness, a people’s distrust, a hazard they can’t abide). A strength with no drawback is worth more than it looks, so price it a tier higher.</w:t>
       </w:r>
     </w:p>
-    <w:bookmarkEnd w:id="75"/>
-    <w:bookmarkStart w:id="76" w:name="origin-advantages"/>
+    <w:bookmarkEnd w:id="76"/>
+    <w:bookmarkStart w:id="77" w:name="origin-advantages"/>
     <w:p>
       <w:pPr>
         <w:pStyle w:val="Heading3"/>
@@ -3907,8 +4274,8 @@
         <w:t xml:space="preserve">: a problem the trait causes, with a clear trigger and a real consequence, which earns a Legend point when it bites, like any complication. A character takes one advantage, general or origin, so make them distinct choices.</w:t>
       </w:r>
     </w:p>
-    <w:bookmarkEnd w:id="76"/>
-    <w:bookmarkStart w:id="77" w:name="an-alternate-form-optional-tier-2-or-3"/>
+    <w:bookmarkEnd w:id="77"/>
+    <w:bookmarkStart w:id="78" w:name="an-alternate-form-optional-tier-2-or-3"/>
     <w:p>
       <w:pPr>
         <w:pStyle w:val="Heading3"/>
@@ -3941,8 +4308,8 @@
         <w:t xml:space="preserve">apply.</w:t>
       </w:r>
     </w:p>
-    <w:bookmarkEnd w:id="77"/>
-    <w:bookmarkStart w:id="78" w:name="in-the-creator"/>
+    <w:bookmarkEnd w:id="78"/>
+    <w:bookmarkStart w:id="79" w:name="in-the-creator"/>
     <w:p>
       <w:pPr>
         <w:pStyle w:val="Heading3"/>
@@ -4047,8 +4414,8 @@
         <w:t xml:space="preserve">and enter the advantage and its companion complication.</w:t>
       </w:r>
     </w:p>
-    <w:bookmarkEnd w:id="78"/>
-    <w:bookmarkStart w:id="79" w:name="example"/>
+    <w:bookmarkEnd w:id="79"/>
+    <w:bookmarkStart w:id="80" w:name="example"/>
     <w:p>
       <w:pPr>
         <w:pStyle w:val="Heading3"/>
@@ -4153,10 +4520,10 @@
         <w:t xml:space="preserve">: you trust your own people first; when it matters, accept the cost of that loyalty.</w:t>
       </w:r>
     </w:p>
-    <w:bookmarkEnd w:id="79"/>
     <w:bookmarkEnd w:id="80"/>
     <w:bookmarkEnd w:id="81"/>
-    <w:bookmarkStart w:id="82" w:name="complications"/>
+    <w:bookmarkEnd w:id="82"/>
+    <w:bookmarkStart w:id="83" w:name="complications"/>
     <w:p>
       <w:pPr>
         <w:pStyle w:val="Heading1"/>
@@ -4185,8 +4552,8 @@
         <w:t xml:space="preserve">Your setting pack supplies this (complications).</w:t>
       </w:r>
     </w:p>
-    <w:bookmarkEnd w:id="82"/>
-    <w:bookmarkStart w:id="84" w:name="quick-reference"/>
+    <w:bookmarkEnd w:id="83"/>
+    <w:bookmarkStart w:id="85" w:name="quick-reference"/>
     <w:p>
       <w:pPr>
         <w:pStyle w:val="Heading1"/>
@@ -4377,7 +4744,7 @@
       <w:r>
         <w:t xml:space="preserve"> </w:t>
       </w:r>
-      <w:hyperlink r:id="rId83">
+      <w:hyperlink r:id="rId84">
         <w:r>
           <w:rPr>
             <w:rStyle w:val="Hyperlink"/>
@@ -4389,7 +4756,7 @@
         <w:t xml:space="preserve">. You may share, adapt, and use it for any purpose, including commercially, as long as you give appropriate credit to the author.</w:t>
       </w:r>
     </w:p>
-    <w:bookmarkEnd w:id="84"/>
+    <w:bookmarkEnd w:id="85"/>
     <w:sectPr/>
   </w:body>
 </w:document>

</xml_diff>

<commit_message>
Allegiances: law in Trails of Blood & Dust; campaign and custom allegiances
- Trails of Blood & Dust: The U.S. Marshals, A County Sheriff's Office, A
  City Police Department and The Pinkerton National Detective Agency.
- Every creator: the GM view's Campaign allegiances list adds a power met
  in play (name, benefit, burden). It joins the Allegiance list, goes in
  the group file, and Save allegiances to file makes a file players open
  in their own creator. A character keeps a copy of a campaign allegiance,
  so it travels with the character file.
- "Another allegiance": a player writes one with the GM; the checklist asks
  for its name, benefit and burden; the sheet shows it.
- Core guide: a line on GM-added and written allegiances.

Co-Authored-By: Claude Opus 5.5 <noreply@anthropic.com>
Claude-Session: https://claude.ai/code/session_015SADCFzhKijkC2foUmXrpC
</commit_message>
<xml_diff>
--- a/legend-dynamics/Legend_Dynamics_Core_Rules.docx
+++ b/legend-dynamics/Legend_Dynamics_Core_Rules.docx
@@ -1549,6 +1549,46 @@
       </w:pPr>
       <w:r>
         <w:t xml:space="preserve">Anyone can owe allegiance to one of the setting’s powers. It’s a benefit paired with a burden; the burden works like a complication and earns Legend when it causes you a real problem.</w:t>
+      </w:r>
+    </w:p>
+    <w:p>
+      <w:pPr>
+        <w:pStyle w:val="BodyText"/>
+      </w:pPr>
+      <w:r>
+        <w:t xml:space="preserve">The GM can add others met in play (the creator’s GM view has a</w:t>
+      </w:r>
+      <w:r>
+        <w:t xml:space="preserve"> </w:t>
+      </w:r>
+      <w:r>
+        <w:rPr>
+          <w:bCs/>
+          <w:b/>
+        </w:rPr>
+        <w:t xml:space="preserve">Campaign allegiances</w:t>
+      </w:r>
+      <w:r>
+        <w:t xml:space="preserve"> </w:t>
+      </w:r>
+      <w:r>
+        <w:t xml:space="preserve">list), and a player can write one with the GM: choose</w:t>
+      </w:r>
+      <w:r>
+        <w:t xml:space="preserve"> </w:t>
+      </w:r>
+      <w:r>
+        <w:rPr>
+          <w:iCs/>
+          <w:i/>
+        </w:rPr>
+        <w:t xml:space="preserve">Another allegiance</w:t>
+      </w:r>
+      <w:r>
+        <w:t xml:space="preserve"> </w:t>
+      </w:r>
+      <w:r>
+        <w:t xml:space="preserve">and give it a name, a benefit and a burden.</w:t>
       </w:r>
     </w:p>
     <w:p>

</xml_diff>

<commit_message>
Advancement points in the core rules and every creator
Characters earn 1 point after a significant job and 2 more at a milestone,
then spend them: a skill step (1 or 2), a revision (1), a new Edge (3), or
+1 to an attribute (4, once each). Magic and powers use the costs their
chapters give. The creator keeps the ledger, the journal awards points,
and older files start balanced.

Co-Authored-By: Claude Opus 5.5 <noreply@anthropic.com>
Claude-Session: https://claude.ai/code/session_015SADCFzhKijkC2foUmXrpC
</commit_message>
<xml_diff>
--- a/legend-dynamics/Legend_Dynamics_Core_Rules.docx
+++ b/legend-dynamics/Legend_Dynamics_Core_Rules.docx
@@ -4363,20 +4363,832 @@
         <w:pStyle w:val="FirstParagraph"/>
       </w:pPr>
       <w:r>
-        <w:t xml:space="preserve">After a significant mission, a magical character can take one of these</w:t>
-      </w:r>
-      <w:r>
-        <w:t xml:space="preserve"> </w:t>
-      </w:r>
-      <w:r>
-        <w:rPr>
-          <w:bCs/>
-          <w:b/>
-        </w:rPr>
-        <w:t xml:space="preserve">instead of a skill step</w:t>
-      </w:r>
-      <w:r>
-        <w:t xml:space="preserve">, with the GM’s approval and a reason from the story. Each setting says which it uses.</w:t>
+        <w:t xml:space="preserve">A magical character can spend advancement points (see</w:t>
+      </w:r>
+      <w:r>
+        <w:t xml:space="preserve"> </w:t>
+      </w:r>
+      <w:r>
+        <w:rPr>
+          <w:iCs/>
+          <w:i/>
+        </w:rPr>
+        <w:t xml:space="preserve">Advancement</w:t>
+      </w:r>
+      <w:r>
+        <w:t xml:space="preserve">) on these, with the GM’s approval and a reason from the story. Each setting says which it uses.</w:t>
+      </w:r>
+    </w:p>
+    <w:tbl>
+      <w:tblPr>
+        <w:tblStyle w:val="Table"/>
+        <w:tblW w:type="pct" w:w="5000"/>
+        <w:tblLook w:firstRow="1" w:lastRow="0" w:firstColumn="0" w:lastColumn="0" w:noHBand="0" w:noVBand="0" w:val="0020"/>
+        <w:jc w:val="start"/>
+        <w:tblBorders>
+          <w:top w:val="single" w:sz="4" w:color="B8C2D3"/>
+          <w:left w:val="single" w:sz="4" w:color="B8C2D3"/>
+          <w:bottom w:val="single" w:sz="4" w:color="B8C2D3"/>
+          <w:right w:val="single" w:sz="4" w:color="B8C2D3"/>
+          <w:insideH w:val="single" w:sz="4" w:color="B8C2D3"/>
+          <w:insideV w:val="single" w:sz="4" w:color="B8C2D3"/>
+        </w:tblBorders>
+      </w:tblPr>
+      <w:tblGrid>
+        <w:gridCol w:w="1980"/>
+        <w:gridCol w:w="1980"/>
+        <w:gridCol w:w="1980"/>
+        <w:gridCol w:w="1980"/>
+      </w:tblGrid>
+      <w:tr>
+        <w:trPr>
+          <w:tblHeader w:val="true"/>
+        </w:trPr>
+        <w:tc>
+          <w:tcPr>
+            <w:shd w:val="clear" w:fill="E9EEF6"/>
+          </w:tcPr>
+          <w:p>
+            <w:pPr>
+              <w:pStyle w:val="Compact"/>
+              <w:jc w:val="left"/>
+            </w:pPr>
+            <w:r>
+              <w:rPr>
+                <w:b/>
+                <w:sz w:val="19"/>
+              </w:rPr>
+              <w:t xml:space="preserve">Option</w:t>
+            </w:r>
+          </w:p>
+        </w:tc>
+        <w:tc>
+          <w:tcPr>
+            <w:shd w:val="clear" w:fill="E9EEF6"/>
+          </w:tcPr>
+          <w:p>
+            <w:pPr>
+              <w:pStyle w:val="Compact"/>
+              <w:jc w:val="left"/>
+            </w:pPr>
+            <w:r>
+              <w:rPr>
+                <w:b/>
+                <w:sz w:val="19"/>
+              </w:rPr>
+              <w:t xml:space="preserve">Effect</w:t>
+            </w:r>
+          </w:p>
+        </w:tc>
+        <w:tc>
+          <w:tcPr>
+            <w:shd w:val="clear" w:fill="E9EEF6"/>
+          </w:tcPr>
+          <w:p>
+            <w:pPr>
+              <w:pStyle w:val="Compact"/>
+              <w:jc w:val="left"/>
+            </w:pPr>
+            <w:r>
+              <w:rPr>
+                <w:b/>
+                <w:sz w:val="19"/>
+              </w:rPr>
+              <w:t xml:space="preserve">Cost</w:t>
+            </w:r>
+          </w:p>
+        </w:tc>
+        <w:tc>
+          <w:tcPr>
+            <w:shd w:val="clear" w:fill="E9EEF6"/>
+          </w:tcPr>
+          <w:p>
+            <w:pPr>
+              <w:pStyle w:val="Compact"/>
+              <w:jc w:val="left"/>
+            </w:pPr>
+            <w:r>
+              <w:rPr>
+                <w:b/>
+                <w:sz w:val="19"/>
+              </w:rPr>
+              <w:t xml:space="preserve">Limit</w:t>
+            </w:r>
+          </w:p>
+        </w:tc>
+      </w:tr>
+      <w:tr>
+        <w:tc>
+          <w:tcPr/>
+          <w:p>
+            <w:pPr>
+              <w:pStyle w:val="Compact"/>
+              <w:jc w:val="left"/>
+            </w:pPr>
+            <w:r>
+              <w:rPr>
+                <w:b/>
+                <w:sz w:val="19"/>
+              </w:rPr>
+              <w:t xml:space="preserve">New burst</w:t>
+            </w:r>
+          </w:p>
+        </w:tc>
+        <w:tc>
+          <w:tcPr/>
+          <w:p>
+            <w:pPr>
+              <w:pStyle w:val="Compact"/>
+              <w:jc w:val="left"/>
+            </w:pPr>
+            <w:r>
+              <w:rPr>
+                <w:sz w:val="19"/>
+              </w:rPr>
+              <w:t xml:space="preserve">Learn one burst beyond your limit</w:t>
+            </w:r>
+          </w:p>
+        </w:tc>
+        <w:tc>
+          <w:tcPr/>
+          <w:p>
+            <w:pPr>
+              <w:pStyle w:val="Compact"/>
+              <w:jc w:val="left"/>
+            </w:pPr>
+            <w:r>
+              <w:rPr>
+                <w:sz w:val="19"/>
+              </w:rPr>
+              <w:t xml:space="preserve">1</w:t>
+            </w:r>
+          </w:p>
+        </w:tc>
+        <w:tc>
+          <w:tcPr/>
+          <w:p>
+            <w:pPr>
+              <w:pStyle w:val="Compact"/>
+              <w:jc w:val="left"/>
+            </w:pPr>
+            <w:r>
+              <w:rPr>
+                <w:sz w:val="19"/>
+              </w:rPr>
+              <w:t xml:space="preserve">Up to 2 extra</w:t>
+            </w:r>
+          </w:p>
+        </w:tc>
+      </w:tr>
+      <w:tr>
+        <w:tc>
+          <w:tcPr/>
+          <w:p>
+            <w:pPr>
+              <w:pStyle w:val="Compact"/>
+              <w:jc w:val="left"/>
+            </w:pPr>
+            <w:r>
+              <w:rPr>
+                <w:b/>
+                <w:sz w:val="19"/>
+              </w:rPr>
+              <w:t xml:space="preserve">Deeper step</w:t>
+            </w:r>
+          </w:p>
+        </w:tc>
+        <w:tc>
+          <w:tcPr/>
+          <w:p>
+            <w:pPr>
+              <w:pStyle w:val="Compact"/>
+              <w:jc w:val="left"/>
+            </w:pPr>
+            <w:r>
+              <w:rPr>
+                <w:sz w:val="19"/>
+              </w:rPr>
+              <w:t xml:space="preserve">One burst you know works one step deeper: one more Boost</w:t>
+            </w:r>
+          </w:p>
+        </w:tc>
+        <w:tc>
+          <w:tcPr/>
+          <w:p>
+            <w:pPr>
+              <w:pStyle w:val="Compact"/>
+              <w:jc w:val="left"/>
+            </w:pPr>
+            <w:r>
+              <w:rPr>
+                <w:sz w:val="19"/>
+              </w:rPr>
+              <w:t xml:space="preserve">2</w:t>
+            </w:r>
+          </w:p>
+        </w:tc>
+        <w:tc>
+          <w:tcPr/>
+          <w:p>
+            <w:pPr>
+              <w:pStyle w:val="Compact"/>
+              <w:jc w:val="left"/>
+            </w:pPr>
+            <w:r>
+              <w:rPr>
+                <w:sz w:val="19"/>
+              </w:rPr>
+              <w:t xml:space="preserve">Each burst once</w:t>
+            </w:r>
+          </w:p>
+        </w:tc>
+      </w:tr>
+      <w:tr>
+        <w:tc>
+          <w:tcPr/>
+          <w:p>
+            <w:pPr>
+              <w:pStyle w:val="Compact"/>
+              <w:jc w:val="left"/>
+            </w:pPr>
+            <w:r>
+              <w:rPr>
+                <w:b/>
+                <w:sz w:val="19"/>
+              </w:rPr>
+              <w:t xml:space="preserve">Another charm</w:t>
+            </w:r>
+          </w:p>
+        </w:tc>
+        <w:tc>
+          <w:tcPr/>
+          <w:p>
+            <w:pPr>
+              <w:pStyle w:val="Compact"/>
+              <w:jc w:val="left"/>
+            </w:pPr>
+            <w:r>
+              <w:rPr>
+                <w:sz w:val="19"/>
+              </w:rPr>
+              <w:t xml:space="preserve">Carry one more ready charm</w:t>
+            </w:r>
+          </w:p>
+        </w:tc>
+        <w:tc>
+          <w:tcPr/>
+          <w:p>
+            <w:pPr>
+              <w:pStyle w:val="Compact"/>
+              <w:jc w:val="left"/>
+            </w:pPr>
+            <w:r>
+              <w:rPr>
+                <w:sz w:val="19"/>
+              </w:rPr>
+              <w:t xml:space="preserve">1</w:t>
+            </w:r>
+          </w:p>
+        </w:tc>
+        <w:tc>
+          <w:tcPr/>
+          <w:p>
+            <w:pPr>
+              <w:pStyle w:val="Compact"/>
+              <w:jc w:val="left"/>
+            </w:pPr>
+            <w:r>
+              <w:rPr>
+                <w:sz w:val="19"/>
+              </w:rPr>
+              <w:t xml:space="preserve">Up to 2 extra</w:t>
+            </w:r>
+          </w:p>
+        </w:tc>
+      </w:tr>
+      <w:tr>
+        <w:tc>
+          <w:tcPr/>
+          <w:p>
+            <w:pPr>
+              <w:pStyle w:val="Compact"/>
+              <w:jc w:val="left"/>
+            </w:pPr>
+            <w:r>
+              <w:rPr>
+                <w:b/>
+                <w:sz w:val="19"/>
+              </w:rPr>
+              <w:t xml:space="preserve">By heart</w:t>
+            </w:r>
+          </w:p>
+        </w:tc>
+        <w:tc>
+          <w:tcPr/>
+          <w:p>
+            <w:pPr>
+              <w:pStyle w:val="Compact"/>
+              <w:jc w:val="left"/>
+            </w:pPr>
+            <w:r>
+              <w:rPr>
+                <w:sz w:val="19"/>
+              </w:rPr>
+              <w:t xml:space="preserve">One kind of working takes one fewer segment (minimum 1)</w:t>
+            </w:r>
+          </w:p>
+        </w:tc>
+        <w:tc>
+          <w:tcPr/>
+          <w:p>
+            <w:pPr>
+              <w:pStyle w:val="Compact"/>
+              <w:jc w:val="left"/>
+            </w:pPr>
+            <w:r>
+              <w:rPr>
+                <w:sz w:val="19"/>
+              </w:rPr>
+              <w:t xml:space="preserve">1</w:t>
+            </w:r>
+          </w:p>
+        </w:tc>
+        <w:tc>
+          <w:tcPr/>
+          <w:p>
+            <w:pPr>
+              <w:pStyle w:val="Compact"/>
+              <w:jc w:val="left"/>
+            </w:pPr>
+            <w:r>
+              <w:rPr>
+                <w:sz w:val="19"/>
+              </w:rPr>
+              <w:t xml:space="preserve">Each kind once</w:t>
+            </w:r>
+          </w:p>
+        </w:tc>
+      </w:tr>
+      <w:tr>
+        <w:tc>
+          <w:tcPr/>
+          <w:p>
+            <w:pPr>
+              <w:pStyle w:val="Compact"/>
+              <w:jc w:val="left"/>
+            </w:pPr>
+            <w:r>
+              <w:rPr>
+                <w:b/>
+                <w:sz w:val="19"/>
+              </w:rPr>
+              <w:t xml:space="preserve">Quicker hand</w:t>
+            </w:r>
+          </w:p>
+        </w:tc>
+        <w:tc>
+          <w:tcPr/>
+          <w:p>
+            <w:pPr>
+              <w:pStyle w:val="Compact"/>
+              <w:jc w:val="left"/>
+            </w:pPr>
+            <w:r>
+              <w:rPr>
+                <w:sz w:val="19"/>
+              </w:rPr>
+              <w:t xml:space="preserve">One working you know goes one pace faster: an hour becomes ten minutes, ten minutes one action</w:t>
+            </w:r>
+          </w:p>
+        </w:tc>
+        <w:tc>
+          <w:tcPr/>
+          <w:p>
+            <w:pPr>
+              <w:pStyle w:val="Compact"/>
+              <w:jc w:val="left"/>
+            </w:pPr>
+            <w:r>
+              <w:rPr>
+                <w:sz w:val="19"/>
+              </w:rPr>
+              <w:t xml:space="preserve">1</w:t>
+            </w:r>
+          </w:p>
+        </w:tc>
+        <w:tc>
+          <w:tcPr/>
+          <w:p>
+            <w:pPr>
+              <w:pStyle w:val="Compact"/>
+              <w:jc w:val="left"/>
+            </w:pPr>
+            <w:r>
+              <w:rPr>
+                <w:sz w:val="19"/>
+              </w:rPr>
+              <w:t xml:space="preserve">Each working once</w:t>
+            </w:r>
+          </w:p>
+        </w:tc>
+      </w:tr>
+      <w:tr>
+        <w:tc>
+          <w:tcPr/>
+          <w:p>
+            <w:pPr>
+              <w:pStyle w:val="Compact"/>
+              <w:jc w:val="left"/>
+            </w:pPr>
+            <w:r>
+              <w:rPr>
+                <w:b/>
+                <w:sz w:val="19"/>
+              </w:rPr>
+              <w:t xml:space="preserve">Mastery</w:t>
+            </w:r>
+          </w:p>
+        </w:tc>
+        <w:tc>
+          <w:tcPr/>
+          <w:p>
+            <w:pPr>
+              <w:pStyle w:val="Compact"/>
+              <w:jc w:val="left"/>
+            </w:pPr>
+            <w:r>
+              <w:rPr>
+                <w:sz w:val="19"/>
+              </w:rPr>
+              <w:t xml:space="preserve">Your magic skill becomes Expert (+5)</w:t>
+            </w:r>
+          </w:p>
+        </w:tc>
+        <w:tc>
+          <w:tcPr/>
+          <w:p>
+            <w:pPr>
+              <w:pStyle w:val="Compact"/>
+              <w:jc w:val="left"/>
+            </w:pPr>
+            <w:r>
+              <w:rPr>
+                <w:sz w:val="19"/>
+              </w:rPr>
+              <w:t xml:space="preserve">4</w:t>
+            </w:r>
+          </w:p>
+        </w:tc>
+        <w:tc>
+          <w:tcPr/>
+          <w:p>
+            <w:pPr>
+              <w:pStyle w:val="Compact"/>
+              <w:jc w:val="left"/>
+            </w:pPr>
+            <w:r>
+              <w:rPr>
+                <w:sz w:val="19"/>
+              </w:rPr>
+              <w:t xml:space="preserve">Once, at the end of a long campaign</w:t>
+            </w:r>
+          </w:p>
+        </w:tc>
+      </w:tr>
+    </w:tbl>
+    <w:bookmarkEnd w:id="65"/>
+    <w:bookmarkEnd w:id="66"/>
+    <w:bookmarkStart w:id="70" w:name="legend-points-and-tracks"/>
+    <w:p>
+      <w:pPr>
+        <w:pStyle w:val="Heading1"/>
+      </w:pPr>
+      <w:r>
+        <w:t xml:space="preserve">Legend points and tracks</w:t>
+      </w:r>
+    </w:p>
+    <w:bookmarkStart w:id="67" w:name="using-legend-points"/>
+    <w:p>
+      <w:pPr>
+        <w:pStyle w:val="Heading2"/>
+      </w:pPr>
+      <w:r>
+        <w:t xml:space="preserve">Using Legend points</w:t>
+      </w:r>
+    </w:p>
+    <w:p>
+      <w:pPr>
+        <w:pStyle w:val="FirstParagraph"/>
+      </w:pPr>
+      <w:r>
+        <w:t xml:space="preserve">Begin each session with two Legend points (three with Extra Legend); unused points do not carry over. Spend no more than one point on a single roll or injury event.</w:t>
+      </w:r>
+    </w:p>
+    <w:tbl>
+      <w:tblPr>
+        <w:tblStyle w:val="Table"/>
+        <w:tblW w:type="pct" w:w="5000"/>
+        <w:tblLook w:firstRow="1" w:lastRow="0" w:firstColumn="0" w:lastColumn="0" w:noHBand="0" w:noVBand="0" w:val="0020"/>
+        <w:jc w:val="start"/>
+        <w:tblBorders>
+          <w:top w:val="single" w:sz="4" w:color="B8C2D3"/>
+          <w:left w:val="single" w:sz="4" w:color="B8C2D3"/>
+          <w:bottom w:val="single" w:sz="4" w:color="B8C2D3"/>
+          <w:right w:val="single" w:sz="4" w:color="B8C2D3"/>
+          <w:insideH w:val="single" w:sz="4" w:color="B8C2D3"/>
+          <w:insideV w:val="single" w:sz="4" w:color="B8C2D3"/>
+        </w:tblBorders>
+      </w:tblPr>
+      <w:tblGrid>
+        <w:gridCol w:w="3960"/>
+        <w:gridCol w:w="3960"/>
+      </w:tblGrid>
+      <w:tr>
+        <w:trPr>
+          <w:tblHeader w:val="true"/>
+        </w:trPr>
+        <w:tc>
+          <w:tcPr>
+            <w:shd w:val="clear" w:fill="E9EEF6"/>
+          </w:tcPr>
+          <w:p>
+            <w:pPr>
+              <w:pStyle w:val="Compact"/>
+              <w:jc w:val="left"/>
+            </w:pPr>
+            <w:r>
+              <w:rPr>
+                <w:b/>
+                <w:sz w:val="19"/>
+              </w:rPr>
+              <w:t xml:space="preserve">Spend one point to</w:t>
+            </w:r>
+          </w:p>
+        </w:tc>
+        <w:tc>
+          <w:tcPr>
+            <w:shd w:val="clear" w:fill="E9EEF6"/>
+          </w:tcPr>
+          <w:p>
+            <w:pPr>
+              <w:pStyle w:val="Compact"/>
+              <w:jc w:val="left"/>
+            </w:pPr>
+            <w:r>
+              <w:rPr>
+                <w:b/>
+                <w:sz w:val="19"/>
+              </w:rPr>
+              <w:t xml:space="preserve">Timing and limits</w:t>
+            </w:r>
+          </w:p>
+        </w:tc>
+      </w:tr>
+      <w:tr>
+        <w:tc>
+          <w:tcPr/>
+          <w:p>
+            <w:pPr>
+              <w:pStyle w:val="Compact"/>
+              <w:jc w:val="left"/>
+            </w:pPr>
+            <w:r>
+              <w:rPr>
+                <w:b/>
+                <w:sz w:val="19"/>
+              </w:rPr>
+              <w:t xml:space="preserve">Reroll your own roll</w:t>
+            </w:r>
+          </w:p>
+        </w:tc>
+        <w:tc>
+          <w:tcPr/>
+          <w:p>
+            <w:pPr>
+              <w:pStyle w:val="Compact"/>
+              <w:jc w:val="left"/>
+            </w:pPr>
+            <w:r>
+              <w:rPr>
+                <w:sz w:val="19"/>
+              </w:rPr>
+              <w:t xml:space="preserve">Declare after seeing the result but before its consequences. Keep the second result, even if worse.</w:t>
+            </w:r>
+          </w:p>
+        </w:tc>
+      </w:tr>
+      <w:tr>
+        <w:tc>
+          <w:tcPr/>
+          <w:p>
+            <w:pPr>
+              <w:pStyle w:val="Compact"/>
+              <w:jc w:val="left"/>
+            </w:pPr>
+            <w:r>
+              <w:rPr>
+                <w:b/>
+                <w:sz w:val="19"/>
+              </w:rPr>
+              <w:t xml:space="preserve">Reduce an injury by one box</w:t>
+            </w:r>
+          </w:p>
+        </w:tc>
+        <w:tc>
+          <w:tcPr/>
+          <w:p>
+            <w:pPr>
+              <w:pStyle w:val="Compact"/>
+              <w:jc w:val="left"/>
+            </w:pPr>
+            <w:r>
+              <w:rPr>
+                <w:sz w:val="19"/>
+              </w:rPr>
+              <w:t xml:space="preserve">Declare when a hit would mark boxes, before applying them. Does not prevent certain death.</w:t>
+            </w:r>
+          </w:p>
+        </w:tc>
+      </w:tr>
+      <w:tr>
+        <w:tc>
+          <w:tcPr/>
+          <w:p>
+            <w:pPr>
+              <w:pStyle w:val="Compact"/>
+              <w:jc w:val="left"/>
+            </w:pPr>
+            <w:r>
+              <w:rPr>
+                <w:b/>
+                <w:sz w:val="19"/>
+              </w:rPr>
+              <w:t xml:space="preserve">Establish a small preparation</w:t>
+            </w:r>
+          </w:p>
+        </w:tc>
+        <w:tc>
+          <w:tcPr/>
+          <w:p>
+            <w:pPr>
+              <w:pStyle w:val="Compact"/>
+              <w:jc w:val="left"/>
+            </w:pPr>
+            <w:r>
+              <w:rPr>
+                <w:sz w:val="19"/>
+              </w:rPr>
+              <w:t xml:space="preserve">Propose a plausible detail, such as having packed something useful. GM approval is required.</w:t>
+            </w:r>
+          </w:p>
+        </w:tc>
+      </w:tr>
+    </w:tbl>
+    <w:p>
+      <w:pPr>
+        <w:pStyle w:val="BodyText"/>
+      </w:pPr>
+      <w:r>
+        <w:t xml:space="preserve">Gain one point when one of your complications creates a meaningful problem you accept, including a companion complication. You can decline the proposed complication without penalty.</w:t>
+      </w:r>
+    </w:p>
+    <w:bookmarkEnd w:id="67"/>
+    <w:bookmarkStart w:id="68" w:name="tracks"/>
+    <w:p>
+      <w:pPr>
+        <w:pStyle w:val="Heading2"/>
+      </w:pPr>
+      <w:r>
+        <w:t xml:space="preserve">Tracks</w:t>
+      </w:r>
+    </w:p>
+    <w:p>
+      <w:pPr>
+        <w:pStyle w:val="FirstParagraph"/>
+      </w:pPr>
+      <w:r>
+        <w:rPr>
+          <w:iCs/>
+          <w:i/>
+        </w:rPr>
+        <w:t xml:space="preserve">Your setting pack supplies this (tracks).</w:t>
+      </w:r>
+    </w:p>
+    <w:bookmarkEnd w:id="68"/>
+    <w:bookmarkStart w:id="69" w:name="advancement"/>
+    <w:p>
+      <w:pPr>
+        <w:pStyle w:val="Heading2"/>
+      </w:pPr>
+      <w:r>
+        <w:t xml:space="preserve">Advancement</w:t>
+      </w:r>
+    </w:p>
+    <w:p>
+      <w:pPr>
+        <w:pStyle w:val="FirstParagraph"/>
+      </w:pPr>
+      <w:r>
+        <w:t xml:space="preserve">Characters grow by earning</w:t>
+      </w:r>
+      <w:r>
+        <w:t xml:space="preserve"> </w:t>
+      </w:r>
+      <w:r>
+        <w:rPr>
+          <w:bCs/>
+          <w:b/>
+        </w:rPr>
+        <w:t xml:space="preserve">advancement points</w:t>
+      </w:r>
+      <w:r>
+        <w:t xml:space="preserve"> </w:t>
+      </w:r>
+      <w:r>
+        <w:t xml:space="preserve">and spending them.</w:t>
+      </w:r>
+    </w:p>
+    <w:p>
+      <w:pPr>
+        <w:numPr>
+          <w:ilvl w:val="0"/>
+          <w:numId w:val="1008"/>
+        </w:numPr>
+        <w:pStyle w:val="Compact"/>
+      </w:pPr>
+      <w:r>
+        <w:rPr>
+          <w:bCs/>
+          <w:b/>
+        </w:rPr>
+        <w:t xml:space="preserve">Earning.</w:t>
+      </w:r>
+      <w:r>
+        <w:t xml:space="preserve"> </w:t>
+      </w:r>
+      <w:r>
+        <w:t xml:space="preserve">After a significant mission, the GM awards each character</w:t>
+      </w:r>
+      <w:r>
+        <w:t xml:space="preserve"> </w:t>
+      </w:r>
+      <w:r>
+        <w:rPr>
+          <w:bCs/>
+          <w:b/>
+        </w:rPr>
+        <w:t xml:space="preserve">1 point</w:t>
+      </w:r>
+      <w:r>
+        <w:t xml:space="preserve">. At a</w:t>
+      </w:r>
+      <w:r>
+        <w:t xml:space="preserve"> </w:t>
+      </w:r>
+      <w:r>
+        <w:rPr>
+          <w:bCs/>
+          <w:b/>
+        </w:rPr>
+        <w:t xml:space="preserve">milestone</w:t>
+      </w:r>
+      <w:r>
+        <w:t xml:space="preserve">, the end of a story arc, everyone earns</w:t>
+      </w:r>
+      <w:r>
+        <w:t xml:space="preserve"> </w:t>
+      </w:r>
+      <w:r>
+        <w:rPr>
+          <w:bCs/>
+          <w:b/>
+        </w:rPr>
+        <w:t xml:space="preserve">2 more</w:t>
+      </w:r>
+      <w:r>
+        <w:t xml:space="preserve">.</w:t>
+      </w:r>
+    </w:p>
+    <w:p>
+      <w:pPr>
+        <w:numPr>
+          <w:ilvl w:val="0"/>
+          <w:numId w:val="1008"/>
+        </w:numPr>
+        <w:pStyle w:val="Compact"/>
+      </w:pPr>
+      <w:r>
+        <w:rPr>
+          <w:bCs/>
+          <w:b/>
+        </w:rPr>
+        <w:t xml:space="preserve">Spending.</w:t>
+      </w:r>
+      <w:r>
+        <w:t xml:space="preserve"> </w:t>
+      </w:r>
+      <w:r>
+        <w:t xml:space="preserve">Spend points when you earn them, or bank them for something bigger. Each purchase needs the GM’s approval and a reason from the story: training with someone, something you lived through, a debt paid.</w:t>
       </w:r>
     </w:p>
     <w:tbl>
@@ -4417,7 +5229,7 @@
                 <w:b/>
                 <w:sz w:val="19"/>
               </w:rPr>
-              <w:t xml:space="preserve">Option</w:t>
+              <w:t xml:space="preserve">Purchase</w:t>
             </w:r>
           </w:p>
         </w:tc>
@@ -4435,7 +5247,7 @@
                 <w:b/>
                 <w:sz w:val="19"/>
               </w:rPr>
-              <w:t xml:space="preserve">Effect</w:t>
+              <w:t xml:space="preserve">Cost</w:t>
             </w:r>
           </w:p>
         </w:tc>
@@ -4471,37 +5283,37 @@
                 <w:b/>
                 <w:sz w:val="19"/>
               </w:rPr>
-              <w:t xml:space="preserve">New burst</w:t>
-            </w:r>
-          </w:p>
-        </w:tc>
-        <w:tc>
-          <w:tcPr/>
-          <w:p>
-            <w:pPr>
-              <w:pStyle w:val="Compact"/>
-              <w:jc w:val="left"/>
-            </w:pPr>
-            <w:r>
-              <w:rPr>
-                <w:sz w:val="19"/>
-              </w:rPr>
-              <w:t xml:space="preserve">Learn one burst beyond your limit</w:t>
-            </w:r>
-          </w:p>
-        </w:tc>
-        <w:tc>
-          <w:tcPr/>
-          <w:p>
-            <w:pPr>
-              <w:pStyle w:val="Compact"/>
-              <w:jc w:val="left"/>
-            </w:pPr>
-            <w:r>
-              <w:rPr>
-                <w:sz w:val="19"/>
-              </w:rPr>
-              <w:t xml:space="preserve">Up to 2 extra</w:t>
+              <w:t xml:space="preserve">A skill from Untrained to Trained</w:t>
+            </w:r>
+          </w:p>
+        </w:tc>
+        <w:tc>
+          <w:tcPr/>
+          <w:p>
+            <w:pPr>
+              <w:pStyle w:val="Compact"/>
+              <w:jc w:val="left"/>
+            </w:pPr>
+            <w:r>
+              <w:rPr>
+                <w:sz w:val="19"/>
+              </w:rPr>
+              <w:t xml:space="preserve">1</w:t>
+            </w:r>
+          </w:p>
+        </w:tc>
+        <w:tc>
+          <w:tcPr/>
+          <w:p>
+            <w:pPr>
+              <w:pStyle w:val="Compact"/>
+              <w:jc w:val="left"/>
+            </w:pPr>
+            <w:r>
+              <w:rPr>
+                <w:sz w:val="19"/>
+              </w:rPr>
+              <w:t xml:space="preserve">—</w:t>
             </w:r>
           </w:p>
         </w:tc>
@@ -4519,37 +5331,37 @@
                 <w:b/>
                 <w:sz w:val="19"/>
               </w:rPr>
-              <w:t xml:space="preserve">Deeper step</w:t>
-            </w:r>
-          </w:p>
-        </w:tc>
-        <w:tc>
-          <w:tcPr/>
-          <w:p>
-            <w:pPr>
-              <w:pStyle w:val="Compact"/>
-              <w:jc w:val="left"/>
-            </w:pPr>
-            <w:r>
-              <w:rPr>
-                <w:sz w:val="19"/>
-              </w:rPr>
-              <w:t xml:space="preserve">One burst you know works one step deeper: one more Boost</w:t>
-            </w:r>
-          </w:p>
-        </w:tc>
-        <w:tc>
-          <w:tcPr/>
-          <w:p>
-            <w:pPr>
-              <w:pStyle w:val="Compact"/>
-              <w:jc w:val="left"/>
-            </w:pPr>
-            <w:r>
-              <w:rPr>
-                <w:sz w:val="19"/>
-              </w:rPr>
-              <w:t xml:space="preserve">Each burst once</w:t>
+              <w:t xml:space="preserve">A skill from Trained to Specialty</w:t>
+            </w:r>
+          </w:p>
+        </w:tc>
+        <w:tc>
+          <w:tcPr/>
+          <w:p>
+            <w:pPr>
+              <w:pStyle w:val="Compact"/>
+              <w:jc w:val="left"/>
+            </w:pPr>
+            <w:r>
+              <w:rPr>
+                <w:sz w:val="19"/>
+              </w:rPr>
+              <w:t xml:space="preserve">2</w:t>
+            </w:r>
+          </w:p>
+        </w:tc>
+        <w:tc>
+          <w:tcPr/>
+          <w:p>
+            <w:pPr>
+              <w:pStyle w:val="Compact"/>
+              <w:jc w:val="left"/>
+            </w:pPr>
+            <w:r>
+              <w:rPr>
+                <w:sz w:val="19"/>
+              </w:rPr>
+              <w:t xml:space="preserve">Specialty (+3) is the ceiling: only a Specialist’s starting skill is Expert, unless they broaden (see Step 3)</w:t>
             </w:r>
           </w:p>
         </w:tc>
@@ -4567,37 +5379,37 @@
                 <w:b/>
                 <w:sz w:val="19"/>
               </w:rPr>
-              <w:t xml:space="preserve">Another charm</w:t>
-            </w:r>
-          </w:p>
-        </w:tc>
-        <w:tc>
-          <w:tcPr/>
-          <w:p>
-            <w:pPr>
-              <w:pStyle w:val="Compact"/>
-              <w:jc w:val="left"/>
-            </w:pPr>
-            <w:r>
-              <w:rPr>
-                <w:sz w:val="19"/>
-              </w:rPr>
-              <w:t xml:space="preserve">Carry one more ready charm</w:t>
-            </w:r>
-          </w:p>
-        </w:tc>
-        <w:tc>
-          <w:tcPr/>
-          <w:p>
-            <w:pPr>
-              <w:pStyle w:val="Compact"/>
-              <w:jc w:val="left"/>
-            </w:pPr>
-            <w:r>
-              <w:rPr>
-                <w:sz w:val="19"/>
-              </w:rPr>
-              <w:t xml:space="preserve">Up to 2 extra</w:t>
+              <w:t xml:space="preserve">Revise an advantage or complication</w:t>
+            </w:r>
+          </w:p>
+        </w:tc>
+        <w:tc>
+          <w:tcPr/>
+          <w:p>
+            <w:pPr>
+              <w:pStyle w:val="Compact"/>
+              <w:jc w:val="left"/>
+            </w:pPr>
+            <w:r>
+              <w:rPr>
+                <w:sz w:val="19"/>
+              </w:rPr>
+              <w:t xml:space="preserve">1</w:t>
+            </w:r>
+          </w:p>
+        </w:tc>
+        <w:tc>
+          <w:tcPr/>
+          <w:p>
+            <w:pPr>
+              <w:pStyle w:val="Compact"/>
+              <w:jc w:val="left"/>
+            </w:pPr>
+            <w:r>
+              <w:rPr>
+                <w:sz w:val="19"/>
+              </w:rPr>
+              <w:t xml:space="preserve">—</w:t>
             </w:r>
           </w:p>
         </w:tc>
@@ -4615,37 +5427,37 @@
                 <w:b/>
                 <w:sz w:val="19"/>
               </w:rPr>
-              <w:t xml:space="preserve">By heart</w:t>
-            </w:r>
-          </w:p>
-        </w:tc>
-        <w:tc>
-          <w:tcPr/>
-          <w:p>
-            <w:pPr>
-              <w:pStyle w:val="Compact"/>
-              <w:jc w:val="left"/>
-            </w:pPr>
-            <w:r>
-              <w:rPr>
-                <w:sz w:val="19"/>
-              </w:rPr>
-              <w:t xml:space="preserve">One kind of working takes one fewer segment (minimum 1)</w:t>
-            </w:r>
-          </w:p>
-        </w:tc>
-        <w:tc>
-          <w:tcPr/>
-          <w:p>
-            <w:pPr>
-              <w:pStyle w:val="Compact"/>
-              <w:jc w:val="left"/>
-            </w:pPr>
-            <w:r>
-              <w:rPr>
-                <w:sz w:val="19"/>
-              </w:rPr>
-              <w:t xml:space="preserve">Each kind once</w:t>
+              <w:t xml:space="preserve">A new Edge</w:t>
+            </w:r>
+          </w:p>
+        </w:tc>
+        <w:tc>
+          <w:tcPr/>
+          <w:p>
+            <w:pPr>
+              <w:pStyle w:val="Compact"/>
+              <w:jc w:val="left"/>
+            </w:pPr>
+            <w:r>
+              <w:rPr>
+                <w:sz w:val="19"/>
+              </w:rPr>
+              <w:t xml:space="preserve">3</w:t>
+            </w:r>
+          </w:p>
+        </w:tc>
+        <w:tc>
+          <w:tcPr/>
+          <w:p>
+            <w:pPr>
+              <w:pStyle w:val="Compact"/>
+              <w:jc w:val="left"/>
+            </w:pPr>
+            <w:r>
+              <w:rPr>
+                <w:sz w:val="19"/>
+              </w:rPr>
+              <w:t xml:space="preserve">Any Edge except the attribute and Trained-skill Edges, within its own limit</w:t>
             </w:r>
           </w:p>
         </w:tc>
@@ -4663,324 +5475,48 @@
                 <w:b/>
                 <w:sz w:val="19"/>
               </w:rPr>
-              <w:t xml:space="preserve">Quicker hand</w:t>
-            </w:r>
-          </w:p>
-        </w:tc>
-        <w:tc>
-          <w:tcPr/>
-          <w:p>
-            <w:pPr>
-              <w:pStyle w:val="Compact"/>
-              <w:jc w:val="left"/>
-            </w:pPr>
-            <w:r>
-              <w:rPr>
-                <w:sz w:val="19"/>
-              </w:rPr>
-              <w:t xml:space="preserve">One working you know goes one pace faster: an hour becomes ten minutes, ten minutes one action</w:t>
-            </w:r>
-          </w:p>
-        </w:tc>
-        <w:tc>
-          <w:tcPr/>
-          <w:p>
-            <w:pPr>
-              <w:pStyle w:val="Compact"/>
-              <w:jc w:val="left"/>
-            </w:pPr>
-            <w:r>
-              <w:rPr>
-                <w:sz w:val="19"/>
-              </w:rPr>
-              <w:t xml:space="preserve">Each working once</w:t>
-            </w:r>
-          </w:p>
-        </w:tc>
-      </w:tr>
-      <w:tr>
-        <w:tc>
-          <w:tcPr/>
-          <w:p>
-            <w:pPr>
-              <w:pStyle w:val="Compact"/>
-              <w:jc w:val="left"/>
-            </w:pPr>
-            <w:r>
-              <w:rPr>
-                <w:b/>
-                <w:sz w:val="19"/>
-              </w:rPr>
-              <w:t xml:space="preserve">Mastery</w:t>
-            </w:r>
-          </w:p>
-        </w:tc>
-        <w:tc>
-          <w:tcPr/>
-          <w:p>
-            <w:pPr>
-              <w:pStyle w:val="Compact"/>
-              <w:jc w:val="left"/>
-            </w:pPr>
-            <w:r>
-              <w:rPr>
-                <w:sz w:val="19"/>
-              </w:rPr>
-              <w:t xml:space="preserve">Your magic skill becomes Expert (+5)</w:t>
-            </w:r>
-          </w:p>
-        </w:tc>
-        <w:tc>
-          <w:tcPr/>
-          <w:p>
-            <w:pPr>
-              <w:pStyle w:val="Compact"/>
-              <w:jc w:val="left"/>
-            </w:pPr>
-            <w:r>
-              <w:rPr>
-                <w:sz w:val="19"/>
-              </w:rPr>
-              <w:t xml:space="preserve">Once, at the end of a long campaign</w:t>
+              <w:t xml:space="preserve">+1 to an attribute</w:t>
+            </w:r>
+          </w:p>
+        </w:tc>
+        <w:tc>
+          <w:tcPr/>
+          <w:p>
+            <w:pPr>
+              <w:pStyle w:val="Compact"/>
+              <w:jc w:val="left"/>
+            </w:pPr>
+            <w:r>
+              <w:rPr>
+                <w:sz w:val="19"/>
+              </w:rPr>
+              <w:t xml:space="preserve">4</w:t>
+            </w:r>
+          </w:p>
+        </w:tc>
+        <w:tc>
+          <w:tcPr/>
+          <w:p>
+            <w:pPr>
+              <w:pStyle w:val="Compact"/>
+              <w:jc w:val="left"/>
+            </w:pPr>
+            <w:r>
+              <w:rPr>
+                <w:sz w:val="19"/>
+              </w:rPr>
+              <w:t xml:space="preserve">Once per attribute; no higher than one above the starting maximum (14, plus any origin bonus)</w:t>
             </w:r>
           </w:p>
         </w:tc>
       </w:tr>
     </w:tbl>
-    <w:bookmarkEnd w:id="65"/>
-    <w:bookmarkEnd w:id="66"/>
-    <w:bookmarkStart w:id="70" w:name="legend-points-and-tracks"/>
-    <w:p>
-      <w:pPr>
-        <w:pStyle w:val="Heading1"/>
-      </w:pPr>
-      <w:r>
-        <w:t xml:space="preserve">Legend points and tracks</w:t>
-      </w:r>
-    </w:p>
-    <w:bookmarkStart w:id="67" w:name="using-legend-points"/>
-    <w:p>
-      <w:pPr>
-        <w:pStyle w:val="Heading2"/>
-      </w:pPr>
-      <w:r>
-        <w:t xml:space="preserve">Using Legend points</w:t>
-      </w:r>
-    </w:p>
-    <w:p>
-      <w:pPr>
-        <w:pStyle w:val="FirstParagraph"/>
-      </w:pPr>
-      <w:r>
-        <w:t xml:space="preserve">Begin each session with two Legend points (three with Extra Legend); unused points do not carry over. Spend no more than one point on a single roll or injury event.</w:t>
-      </w:r>
-    </w:p>
-    <w:tbl>
-      <w:tblPr>
-        <w:tblStyle w:val="Table"/>
-        <w:tblW w:type="pct" w:w="5000"/>
-        <w:tblLook w:firstRow="1" w:lastRow="0" w:firstColumn="0" w:lastColumn="0" w:noHBand="0" w:noVBand="0" w:val="0020"/>
-        <w:jc w:val="start"/>
-        <w:tblBorders>
-          <w:top w:val="single" w:sz="4" w:color="B8C2D3"/>
-          <w:left w:val="single" w:sz="4" w:color="B8C2D3"/>
-          <w:bottom w:val="single" w:sz="4" w:color="B8C2D3"/>
-          <w:right w:val="single" w:sz="4" w:color="B8C2D3"/>
-          <w:insideH w:val="single" w:sz="4" w:color="B8C2D3"/>
-          <w:insideV w:val="single" w:sz="4" w:color="B8C2D3"/>
-        </w:tblBorders>
-      </w:tblPr>
-      <w:tblGrid>
-        <w:gridCol w:w="3960"/>
-        <w:gridCol w:w="3960"/>
-      </w:tblGrid>
-      <w:tr>
-        <w:trPr>
-          <w:tblHeader w:val="true"/>
-        </w:trPr>
-        <w:tc>
-          <w:tcPr>
-            <w:shd w:val="clear" w:fill="E9EEF6"/>
-          </w:tcPr>
-          <w:p>
-            <w:pPr>
-              <w:pStyle w:val="Compact"/>
-              <w:jc w:val="left"/>
-            </w:pPr>
-            <w:r>
-              <w:rPr>
-                <w:b/>
-                <w:sz w:val="19"/>
-              </w:rPr>
-              <w:t xml:space="preserve">Spend one point to</w:t>
-            </w:r>
-          </w:p>
-        </w:tc>
-        <w:tc>
-          <w:tcPr>
-            <w:shd w:val="clear" w:fill="E9EEF6"/>
-          </w:tcPr>
-          <w:p>
-            <w:pPr>
-              <w:pStyle w:val="Compact"/>
-              <w:jc w:val="left"/>
-            </w:pPr>
-            <w:r>
-              <w:rPr>
-                <w:b/>
-                <w:sz w:val="19"/>
-              </w:rPr>
-              <w:t xml:space="preserve">Timing and limits</w:t>
-            </w:r>
-          </w:p>
-        </w:tc>
-      </w:tr>
-      <w:tr>
-        <w:tc>
-          <w:tcPr/>
-          <w:p>
-            <w:pPr>
-              <w:pStyle w:val="Compact"/>
-              <w:jc w:val="left"/>
-            </w:pPr>
-            <w:r>
-              <w:rPr>
-                <w:b/>
-                <w:sz w:val="19"/>
-              </w:rPr>
-              <w:t xml:space="preserve">Reroll your own roll</w:t>
-            </w:r>
-          </w:p>
-        </w:tc>
-        <w:tc>
-          <w:tcPr/>
-          <w:p>
-            <w:pPr>
-              <w:pStyle w:val="Compact"/>
-              <w:jc w:val="left"/>
-            </w:pPr>
-            <w:r>
-              <w:rPr>
-                <w:sz w:val="19"/>
-              </w:rPr>
-              <w:t xml:space="preserve">Declare after seeing the result but before its consequences. Keep the second result, even if worse.</w:t>
-            </w:r>
-          </w:p>
-        </w:tc>
-      </w:tr>
-      <w:tr>
-        <w:tc>
-          <w:tcPr/>
-          <w:p>
-            <w:pPr>
-              <w:pStyle w:val="Compact"/>
-              <w:jc w:val="left"/>
-            </w:pPr>
-            <w:r>
-              <w:rPr>
-                <w:b/>
-                <w:sz w:val="19"/>
-              </w:rPr>
-              <w:t xml:space="preserve">Reduce an injury by one box</w:t>
-            </w:r>
-          </w:p>
-        </w:tc>
-        <w:tc>
-          <w:tcPr/>
-          <w:p>
-            <w:pPr>
-              <w:pStyle w:val="Compact"/>
-              <w:jc w:val="left"/>
-            </w:pPr>
-            <w:r>
-              <w:rPr>
-                <w:sz w:val="19"/>
-              </w:rPr>
-              <w:t xml:space="preserve">Declare when a hit would mark boxes, before applying them. Does not prevent certain death.</w:t>
-            </w:r>
-          </w:p>
-        </w:tc>
-      </w:tr>
-      <w:tr>
-        <w:tc>
-          <w:tcPr/>
-          <w:p>
-            <w:pPr>
-              <w:pStyle w:val="Compact"/>
-              <w:jc w:val="left"/>
-            </w:pPr>
-            <w:r>
-              <w:rPr>
-                <w:b/>
-                <w:sz w:val="19"/>
-              </w:rPr>
-              <w:t xml:space="preserve">Establish a small preparation</w:t>
-            </w:r>
-          </w:p>
-        </w:tc>
-        <w:tc>
-          <w:tcPr/>
-          <w:p>
-            <w:pPr>
-              <w:pStyle w:val="Compact"/>
-              <w:jc w:val="left"/>
-            </w:pPr>
-            <w:r>
-              <w:rPr>
-                <w:sz w:val="19"/>
-              </w:rPr>
-              <w:t xml:space="preserve">Propose a plausible detail, such as having packed something useful. GM approval is required.</w:t>
-            </w:r>
-          </w:p>
-        </w:tc>
-      </w:tr>
-    </w:tbl>
     <w:p>
       <w:pPr>
         <w:pStyle w:val="BodyText"/>
       </w:pPr>
       <w:r>
-        <w:t xml:space="preserve">Gain one point when one of your complications creates a meaningful problem you accept, including a companion complication. You can decline the proposed complication without penalty.</w:t>
-      </w:r>
-    </w:p>
-    <w:bookmarkEnd w:id="67"/>
-    <w:bookmarkStart w:id="68" w:name="tracks"/>
-    <w:p>
-      <w:pPr>
-        <w:pStyle w:val="Heading2"/>
-      </w:pPr>
-      <w:r>
-        <w:t xml:space="preserve">Tracks</w:t>
-      </w:r>
-    </w:p>
-    <w:p>
-      <w:pPr>
-        <w:pStyle w:val="FirstParagraph"/>
-      </w:pPr>
-      <w:r>
-        <w:rPr>
-          <w:iCs/>
-          <w:i/>
-        </w:rPr>
-        <w:t xml:space="preserve">Your setting pack supplies this (tracks).</w:t>
-      </w:r>
-    </w:p>
-    <w:bookmarkEnd w:id="68"/>
-    <w:bookmarkStart w:id="69" w:name="advancement"/>
-    <w:p>
-      <w:pPr>
-        <w:pStyle w:val="Heading2"/>
-      </w:pPr>
-      <w:r>
-        <w:t xml:space="preserve">Advancement</w:t>
-      </w:r>
-    </w:p>
-    <w:p>
-      <w:pPr>
-        <w:pStyle w:val="FirstParagraph"/>
-      </w:pPr>
-      <w:r>
-        <w:t xml:space="preserve">After a significant mission, the GM may authorize one relevant skill to advance from Untrained to Trained or from Trained to Specialty, or allow revision of an advantage or complication. Only a Specialist’s starting skill is Expert; a skill raised later tops out at Specialty (+3) unless they broaden (see Step 3).</w:t>
+        <w:t xml:space="preserve">Magic and powers grow the same way, at the costs their chapters give.</w:t>
       </w:r>
     </w:p>
     <w:bookmarkEnd w:id="69"/>
@@ -5039,250 +5575,6 @@
       </w:pPr>
       <w:r>
         <w:t xml:space="preserve">End each mission with a short entry, written together:</w:t>
-      </w:r>
-    </w:p>
-    <w:p>
-      <w:pPr>
-        <w:numPr>
-          <w:ilvl w:val="0"/>
-          <w:numId w:val="1008"/>
-        </w:numPr>
-        <w:pStyle w:val="Compact"/>
-      </w:pPr>
-      <w:r>
-        <w:rPr>
-          <w:bCs/>
-          <w:b/>
-        </w:rPr>
-        <w:t xml:space="preserve">The mission.</w:t>
-      </w:r>
-      <w:r>
-        <w:t xml:space="preserve"> </w:t>
-      </w:r>
-      <w:r>
-        <w:t xml:space="preserve">What happened, and did we succeed: fully, partly, or not at all?</w:t>
-      </w:r>
-    </w:p>
-    <w:p>
-      <w:pPr>
-        <w:numPr>
-          <w:ilvl w:val="0"/>
-          <w:numId w:val="1008"/>
-        </w:numPr>
-        <w:pStyle w:val="Compact"/>
-      </w:pPr>
-      <w:r>
-        <w:rPr>
-          <w:bCs/>
-          <w:b/>
-        </w:rPr>
-        <w:t xml:space="preserve">Who stood out?</w:t>
-      </w:r>
-      <w:r>
-        <w:t xml:space="preserve"> </w:t>
-      </w:r>
-      <w:r>
-        <w:t xml:space="preserve">A moment worth remembering.</w:t>
-      </w:r>
-    </w:p>
-    <w:p>
-      <w:pPr>
-        <w:numPr>
-          <w:ilvl w:val="0"/>
-          <w:numId w:val="1008"/>
-        </w:numPr>
-        <w:pStyle w:val="Compact"/>
-      </w:pPr>
-      <w:r>
-        <w:rPr>
-          <w:bCs/>
-          <w:b/>
-        </w:rPr>
-        <w:t xml:space="preserve">Complications.</w:t>
-      </w:r>
-      <w:r>
-        <w:t xml:space="preserve"> </w:t>
-      </w:r>
-      <w:r>
-        <w:t xml:space="preserve">Which ones came into play, and what did they cost?</w:t>
-      </w:r>
-    </w:p>
-    <w:p>
-      <w:pPr>
-        <w:numPr>
-          <w:ilvl w:val="0"/>
-          <w:numId w:val="1008"/>
-        </w:numPr>
-        <w:pStyle w:val="Compact"/>
-      </w:pPr>
-      <w:r>
-        <w:rPr>
-          <w:bCs/>
-          <w:b/>
-        </w:rPr>
-        <w:t xml:space="preserve">What changed?</w:t>
-      </w:r>
-      <w:r>
-        <w:t xml:space="preserve"> </w:t>
-      </w:r>
-      <w:r>
-        <w:t xml:space="preserve">New allies or enemies, damage, open threads for next time.</w:t>
-      </w:r>
-    </w:p>
-    <w:p>
-      <w:pPr>
-        <w:numPr>
-          <w:ilvl w:val="0"/>
-          <w:numId w:val="1008"/>
-        </w:numPr>
-        <w:pStyle w:val="Compact"/>
-      </w:pPr>
-      <w:r>
-        <w:rPr>
-          <w:bCs/>
-          <w:b/>
-        </w:rPr>
-        <w:t xml:space="preserve">Advancement.</w:t>
-      </w:r>
-      <w:r>
-        <w:t xml:space="preserve"> </w:t>
-      </w:r>
-      <w:r>
-        <w:t xml:space="preserve">After a significant mission, the GM may authorize one skill step for each character.</w:t>
-      </w:r>
-    </w:p>
-    <w:bookmarkEnd w:id="72"/>
-    <w:bookmarkEnd w:id="73"/>
-    <w:bookmarkStart w:id="74" w:name="ready-made-characters"/>
-    <w:p>
-      <w:pPr>
-        <w:pStyle w:val="Heading1"/>
-      </w:pPr>
-      <w:r>
-        <w:t xml:space="preserve">Ready-made characters</w:t>
-      </w:r>
-    </w:p>
-    <w:p>
-      <w:pPr>
-        <w:pStyle w:val="FirstParagraph"/>
-      </w:pPr>
-      <w:r>
-        <w:t xml:space="preserve">Characters ready to play, for one-shots, new players, or a group in a hurry. Each follows the creation rules exactly, and their connections tie them together. In the creator, choose one from the ready-made list to open it and make it your own.</w:t>
-      </w:r>
-    </w:p>
-    <w:p>
-      <w:pPr>
-        <w:pStyle w:val="BodyText"/>
-      </w:pPr>
-      <w:r>
-        <w:rPr>
-          <w:iCs/>
-          <w:i/>
-        </w:rPr>
-        <w:t xml:space="preserve">Your setting pack supplies this (pregens).</w:t>
-      </w:r>
-    </w:p>
-    <w:bookmarkEnd w:id="74"/>
-    <w:bookmarkStart w:id="75" w:name="advantages"/>
-    <w:p>
-      <w:pPr>
-        <w:pStyle w:val="Heading1"/>
-      </w:pPr>
-      <w:r>
-        <w:t xml:space="preserve">Advantages</w:t>
-      </w:r>
-    </w:p>
-    <w:p>
-      <w:pPr>
-        <w:pStyle w:val="FirstParagraph"/>
-      </w:pPr>
-      <w:r>
-        <w:t xml:space="preserve">Choose one advantage at character creation: a general advantage from this chapter, or an origin advantage from the next. Each grants +2 only in the listed circumstances. An advantage does not grant training, authorize an impossible action, or replace essential gear. Use only one advantage bonus per roll.</w:t>
-      </w:r>
-    </w:p>
-    <w:p>
-      <w:pPr>
-        <w:pStyle w:val="BodyText"/>
-      </w:pPr>
-      <w:r>
-        <w:rPr>
-          <w:iCs/>
-          <w:i/>
-        </w:rPr>
-        <w:t xml:space="preserve">Your setting pack supplies this (advantages).</w:t>
-      </w:r>
-    </w:p>
-    <w:bookmarkEnd w:id="75"/>
-    <w:bookmarkStart w:id="76" w:name="origins"/>
-    <w:p>
-      <w:pPr>
-        <w:pStyle w:val="Heading1"/>
-      </w:pPr>
-      <w:r>
-        <w:t xml:space="preserve">Origins</w:t>
-      </w:r>
-    </w:p>
-    <w:p>
-      <w:pPr>
-        <w:pStyle w:val="FirstParagraph"/>
-      </w:pPr>
-      <w:r>
-        <w:rPr>
-          <w:iCs/>
-          <w:i/>
-        </w:rPr>
-        <w:t xml:space="preserve">Your setting pack supplies this (origins).</w:t>
-      </w:r>
-    </w:p>
-    <w:bookmarkEnd w:id="76"/>
-    <w:bookmarkStart w:id="87" w:name="making-your-own"/>
-    <w:p>
-      <w:pPr>
-        <w:pStyle w:val="Heading1"/>
-      </w:pPr>
-      <w:r>
-        <w:t xml:space="preserve">Making your own</w:t>
-      </w:r>
-    </w:p>
-    <w:p>
-      <w:pPr>
-        <w:pStyle w:val="FirstParagraph"/>
-      </w:pPr>
-      <w:r>
-        <w:t xml:space="preserve">The roles and origins in this book are a starting point, not a limit. With the GM’s agreement, any player can create their own role or origin. The creator has a</w:t>
-      </w:r>
-      <w:r>
-        <w:t xml:space="preserve"> </w:t>
-      </w:r>
-      <w:r>
-        <w:rPr>
-          <w:bCs/>
-          <w:b/>
-        </w:rPr>
-        <w:t xml:space="preserve">Custom</w:t>
-      </w:r>
-      <w:r>
-        <w:t xml:space="preserve"> </w:t>
-      </w:r>
-      <w:r>
-        <w:t xml:space="preserve">option at the end of each list, and its checklist holds a custom choice to the same rules as everything else.</w:t>
-      </w:r>
-    </w:p>
-    <w:bookmarkStart w:id="77" w:name="a-custom-role"/>
-    <w:p>
-      <w:pPr>
-        <w:pStyle w:val="Heading2"/>
-      </w:pPr>
-      <w:r>
-        <w:t xml:space="preserve">A custom role</w:t>
-      </w:r>
-    </w:p>
-    <w:p>
-      <w:pPr>
-        <w:pStyle w:val="FirstParagraph"/>
-      </w:pPr>
-      <w:r>
-        <w:t xml:space="preserve">A role is a concept, not a package of powers: it gives no bonus of its own. A custom one only needs a clear place in the group.</w:t>
       </w:r>
     </w:p>
     <w:p>
@@ -5298,37 +5590,13 @@
           <w:bCs/>
           <w:b/>
         </w:rPr>
-        <w:t xml:space="preserve">Name it and describe it.</w:t>
-      </w:r>
-      <w:r>
-        <w:t xml:space="preserve"> </w:t>
-      </w:r>
-      <w:r>
-        <w:t xml:space="preserve">One sentence for what your character does that no one else does, in the style of the roles above:</w:t>
-      </w:r>
-      <w:r>
-        <w:t xml:space="preserve"> </w:t>
-      </w:r>
-      <w:r>
-        <w:rPr>
-          <w:iCs/>
-          <w:i/>
-        </w:rPr>
-        <w:t xml:space="preserve">“</w:t>
-      </w:r>
-      <w:r>
-        <w:rPr>
-          <w:iCs/>
-          <w:i/>
-        </w:rPr>
-        <w:t xml:space="preserve">Smuggler: knows every back door, bribe and hidden hold.</w:t>
-      </w:r>
-      <w:r>
-        <w:rPr>
-          <w:iCs/>
-          <w:i/>
-        </w:rPr>
-        <w:t xml:space="preserve">”</w:t>
+        <w:t xml:space="preserve">The mission.</w:t>
+      </w:r>
+      <w:r>
+        <w:t xml:space="preserve"> </w:t>
+      </w:r>
+      <w:r>
+        <w:t xml:space="preserve">What happened, and did we succeed: fully, partly, or not at all?</w:t>
       </w:r>
     </w:p>
     <w:p>
@@ -5344,13 +5612,13 @@
           <w:bCs/>
           <w:b/>
         </w:rPr>
-        <w:t xml:space="preserve">Choose a group.</w:t>
-      </w:r>
-      <w:r>
-        <w:t xml:space="preserve"> </w:t>
-      </w:r>
-      <w:r>
-        <w:t xml:space="preserve">Pick the one it belongs with: one of your setting’s groups. The group only sets your sheet’s colors and emblem.</w:t>
+        <w:t xml:space="preserve">Who stood out?</w:t>
+      </w:r>
+      <w:r>
+        <w:t xml:space="preserve"> </w:t>
+      </w:r>
+      <w:r>
+        <w:t xml:space="preserve">A moment worth remembering.</w:t>
       </w:r>
     </w:p>
     <w:p>
@@ -5366,13 +5634,13 @@
           <w:bCs/>
           <w:b/>
         </w:rPr>
-        <w:t xml:space="preserve">Pick four core skills.</w:t>
-      </w:r>
-      <w:r>
-        <w:t xml:space="preserve"> </w:t>
-      </w:r>
-      <w:r>
-        <w:t xml:space="preserve">The skills it can’t do without. Mark them Trained yourself in step 3 (the built-in roles do this for you); they count toward your normal Trained skills.</w:t>
+        <w:t xml:space="preserve">Complications.</w:t>
+      </w:r>
+      <w:r>
+        <w:t xml:space="preserve"> </w:t>
+      </w:r>
+      <w:r>
+        <w:t xml:space="preserve">Which ones came into play, and what did they cost?</w:t>
       </w:r>
     </w:p>
     <w:p>
@@ -5380,6 +5648,274 @@
         <w:numPr>
           <w:ilvl w:val="0"/>
           <w:numId w:val="1009"/>
+        </w:numPr>
+        <w:pStyle w:val="Compact"/>
+      </w:pPr>
+      <w:r>
+        <w:rPr>
+          <w:bCs/>
+          <w:b/>
+        </w:rPr>
+        <w:t xml:space="preserve">What changed?</w:t>
+      </w:r>
+      <w:r>
+        <w:t xml:space="preserve"> </w:t>
+      </w:r>
+      <w:r>
+        <w:t xml:space="preserve">New allies or enemies, damage, open threads for next time.</w:t>
+      </w:r>
+    </w:p>
+    <w:p>
+      <w:pPr>
+        <w:numPr>
+          <w:ilvl w:val="0"/>
+          <w:numId w:val="1009"/>
+        </w:numPr>
+        <w:pStyle w:val="Compact"/>
+      </w:pPr>
+      <w:r>
+        <w:rPr>
+          <w:bCs/>
+          <w:b/>
+        </w:rPr>
+        <w:t xml:space="preserve">Advancement.</w:t>
+      </w:r>
+      <w:r>
+        <w:t xml:space="preserve"> </w:t>
+      </w:r>
+      <w:r>
+        <w:t xml:space="preserve">After a significant mission, each character earns 1 advancement point; at a milestone, 2 more.</w:t>
+      </w:r>
+    </w:p>
+    <w:bookmarkEnd w:id="72"/>
+    <w:bookmarkEnd w:id="73"/>
+    <w:bookmarkStart w:id="74" w:name="ready-made-characters"/>
+    <w:p>
+      <w:pPr>
+        <w:pStyle w:val="Heading1"/>
+      </w:pPr>
+      <w:r>
+        <w:t xml:space="preserve">Ready-made characters</w:t>
+      </w:r>
+    </w:p>
+    <w:p>
+      <w:pPr>
+        <w:pStyle w:val="FirstParagraph"/>
+      </w:pPr>
+      <w:r>
+        <w:t xml:space="preserve">Characters ready to play, for one-shots, new players, or a group in a hurry. Each follows the creation rules exactly, and their connections tie them together. In the creator, choose one from the ready-made list to open it and make it your own.</w:t>
+      </w:r>
+    </w:p>
+    <w:p>
+      <w:pPr>
+        <w:pStyle w:val="BodyText"/>
+      </w:pPr>
+      <w:r>
+        <w:rPr>
+          <w:iCs/>
+          <w:i/>
+        </w:rPr>
+        <w:t xml:space="preserve">Your setting pack supplies this (pregens).</w:t>
+      </w:r>
+    </w:p>
+    <w:bookmarkEnd w:id="74"/>
+    <w:bookmarkStart w:id="75" w:name="advantages"/>
+    <w:p>
+      <w:pPr>
+        <w:pStyle w:val="Heading1"/>
+      </w:pPr>
+      <w:r>
+        <w:t xml:space="preserve">Advantages</w:t>
+      </w:r>
+    </w:p>
+    <w:p>
+      <w:pPr>
+        <w:pStyle w:val="FirstParagraph"/>
+      </w:pPr>
+      <w:r>
+        <w:t xml:space="preserve">Choose one advantage at character creation: a general advantage from this chapter, or an origin advantage from the next. Each grants +2 only in the listed circumstances. An advantage does not grant training, authorize an impossible action, or replace essential gear. Use only one advantage bonus per roll.</w:t>
+      </w:r>
+    </w:p>
+    <w:p>
+      <w:pPr>
+        <w:pStyle w:val="BodyText"/>
+      </w:pPr>
+      <w:r>
+        <w:rPr>
+          <w:iCs/>
+          <w:i/>
+        </w:rPr>
+        <w:t xml:space="preserve">Your setting pack supplies this (advantages).</w:t>
+      </w:r>
+    </w:p>
+    <w:bookmarkEnd w:id="75"/>
+    <w:bookmarkStart w:id="76" w:name="origins"/>
+    <w:p>
+      <w:pPr>
+        <w:pStyle w:val="Heading1"/>
+      </w:pPr>
+      <w:r>
+        <w:t xml:space="preserve">Origins</w:t>
+      </w:r>
+    </w:p>
+    <w:p>
+      <w:pPr>
+        <w:pStyle w:val="FirstParagraph"/>
+      </w:pPr>
+      <w:r>
+        <w:rPr>
+          <w:iCs/>
+          <w:i/>
+        </w:rPr>
+        <w:t xml:space="preserve">Your setting pack supplies this (origins).</w:t>
+      </w:r>
+    </w:p>
+    <w:bookmarkEnd w:id="76"/>
+    <w:bookmarkStart w:id="87" w:name="making-your-own"/>
+    <w:p>
+      <w:pPr>
+        <w:pStyle w:val="Heading1"/>
+      </w:pPr>
+      <w:r>
+        <w:t xml:space="preserve">Making your own</w:t>
+      </w:r>
+    </w:p>
+    <w:p>
+      <w:pPr>
+        <w:pStyle w:val="FirstParagraph"/>
+      </w:pPr>
+      <w:r>
+        <w:t xml:space="preserve">The roles and origins in this book are a starting point, not a limit. With the GM’s agreement, any player can create their own role or origin. The creator has a</w:t>
+      </w:r>
+      <w:r>
+        <w:t xml:space="preserve"> </w:t>
+      </w:r>
+      <w:r>
+        <w:rPr>
+          <w:bCs/>
+          <w:b/>
+        </w:rPr>
+        <w:t xml:space="preserve">Custom</w:t>
+      </w:r>
+      <w:r>
+        <w:t xml:space="preserve"> </w:t>
+      </w:r>
+      <w:r>
+        <w:t xml:space="preserve">option at the end of each list, and its checklist holds a custom choice to the same rules as everything else.</w:t>
+      </w:r>
+    </w:p>
+    <w:bookmarkStart w:id="77" w:name="a-custom-role"/>
+    <w:p>
+      <w:pPr>
+        <w:pStyle w:val="Heading2"/>
+      </w:pPr>
+      <w:r>
+        <w:t xml:space="preserve">A custom role</w:t>
+      </w:r>
+    </w:p>
+    <w:p>
+      <w:pPr>
+        <w:pStyle w:val="FirstParagraph"/>
+      </w:pPr>
+      <w:r>
+        <w:t xml:space="preserve">A role is a concept, not a package of powers: it gives no bonus of its own. A custom one only needs a clear place in the group.</w:t>
+      </w:r>
+    </w:p>
+    <w:p>
+      <w:pPr>
+        <w:numPr>
+          <w:ilvl w:val="0"/>
+          <w:numId w:val="1010"/>
+        </w:numPr>
+        <w:pStyle w:val="Compact"/>
+      </w:pPr>
+      <w:r>
+        <w:rPr>
+          <w:bCs/>
+          <w:b/>
+        </w:rPr>
+        <w:t xml:space="preserve">Name it and describe it.</w:t>
+      </w:r>
+      <w:r>
+        <w:t xml:space="preserve"> </w:t>
+      </w:r>
+      <w:r>
+        <w:t xml:space="preserve">One sentence for what your character does that no one else does, in the style of the roles above:</w:t>
+      </w:r>
+      <w:r>
+        <w:t xml:space="preserve"> </w:t>
+      </w:r>
+      <w:r>
+        <w:rPr>
+          <w:iCs/>
+          <w:i/>
+        </w:rPr>
+        <w:t xml:space="preserve">“</w:t>
+      </w:r>
+      <w:r>
+        <w:rPr>
+          <w:iCs/>
+          <w:i/>
+        </w:rPr>
+        <w:t xml:space="preserve">Smuggler: knows every back door, bribe and hidden hold.</w:t>
+      </w:r>
+      <w:r>
+        <w:rPr>
+          <w:iCs/>
+          <w:i/>
+        </w:rPr>
+        <w:t xml:space="preserve">”</w:t>
+      </w:r>
+    </w:p>
+    <w:p>
+      <w:pPr>
+        <w:numPr>
+          <w:ilvl w:val="0"/>
+          <w:numId w:val="1010"/>
+        </w:numPr>
+        <w:pStyle w:val="Compact"/>
+      </w:pPr>
+      <w:r>
+        <w:rPr>
+          <w:bCs/>
+          <w:b/>
+        </w:rPr>
+        <w:t xml:space="preserve">Choose a group.</w:t>
+      </w:r>
+      <w:r>
+        <w:t xml:space="preserve"> </w:t>
+      </w:r>
+      <w:r>
+        <w:t xml:space="preserve">Pick the one it belongs with: one of your setting’s groups. The group only sets your sheet’s colors and emblem.</w:t>
+      </w:r>
+    </w:p>
+    <w:p>
+      <w:pPr>
+        <w:numPr>
+          <w:ilvl w:val="0"/>
+          <w:numId w:val="1010"/>
+        </w:numPr>
+        <w:pStyle w:val="Compact"/>
+      </w:pPr>
+      <w:r>
+        <w:rPr>
+          <w:bCs/>
+          <w:b/>
+        </w:rPr>
+        <w:t xml:space="preserve">Pick four core skills.</w:t>
+      </w:r>
+      <w:r>
+        <w:t xml:space="preserve"> </w:t>
+      </w:r>
+      <w:r>
+        <w:t xml:space="preserve">The skills it can’t do without. Mark them Trained yourself in step 3 (the built-in roles do this for you); they count toward your normal Trained skills.</w:t>
+      </w:r>
+    </w:p>
+    <w:p>
+      <w:pPr>
+        <w:numPr>
+          <w:ilvl w:val="0"/>
+          <w:numId w:val="1010"/>
         </w:numPr>
         <w:pStyle w:val="Compact"/>
       </w:pPr>
@@ -5946,7 +6482,7 @@
       <w:pPr>
         <w:numPr>
           <w:ilvl w:val="0"/>
-          <w:numId w:val="1010"/>
+          <w:numId w:val="1011"/>
         </w:numPr>
         <w:pStyle w:val="Compact"/>
       </w:pPr>
@@ -5974,7 +6510,7 @@
       <w:pPr>
         <w:numPr>
           <w:ilvl w:val="0"/>
-          <w:numId w:val="1010"/>
+          <w:numId w:val="1011"/>
         </w:numPr>
         <w:pStyle w:val="Compact"/>
       </w:pPr>
@@ -5986,7 +6522,7 @@
       <w:pPr>
         <w:numPr>
           <w:ilvl w:val="0"/>
-          <w:numId w:val="1010"/>
+          <w:numId w:val="1011"/>
         </w:numPr>
         <w:pStyle w:val="Compact"/>
       </w:pPr>
@@ -6014,7 +6550,7 @@
       <w:pPr>
         <w:numPr>
           <w:ilvl w:val="0"/>
-          <w:numId w:val="1010"/>
+          <w:numId w:val="1011"/>
         </w:numPr>
         <w:pStyle w:val="Compact"/>
       </w:pPr>
@@ -6700,34 +7236,7 @@
     </w:lvlOverride>
   </w:num>
   <w:num w:numId="1008">
-    <w:abstractNumId w:val="99411"/>
-    <w:lvlOverride w:ilvl="0">
-      <w:startOverride w:val="1"/>
-    </w:lvlOverride>
-    <w:lvlOverride w:ilvl="1">
-      <w:startOverride w:val="1"/>
-    </w:lvlOverride>
-    <w:lvlOverride w:ilvl="2">
-      <w:startOverride w:val="1"/>
-    </w:lvlOverride>
-    <w:lvlOverride w:ilvl="3">
-      <w:startOverride w:val="1"/>
-    </w:lvlOverride>
-    <w:lvlOverride w:ilvl="4">
-      <w:startOverride w:val="1"/>
-    </w:lvlOverride>
-    <w:lvlOverride w:ilvl="5">
-      <w:startOverride w:val="1"/>
-    </w:lvlOverride>
-    <w:lvlOverride w:ilvl="6">
-      <w:startOverride w:val="1"/>
-    </w:lvlOverride>
-    <w:lvlOverride w:ilvl="7">
-      <w:startOverride w:val="1"/>
-    </w:lvlOverride>
-    <w:lvlOverride w:ilvl="8">
-      <w:startOverride w:val="1"/>
-    </w:lvlOverride>
+    <w:abstractNumId w:val="991"/>
   </w:num>
   <w:num w:numId="1009">
     <w:abstractNumId w:val="99411"/>
@@ -6760,6 +7269,36 @@
     </w:lvlOverride>
   </w:num>
   <w:num w:numId="1010">
+    <w:abstractNumId w:val="99411"/>
+    <w:lvlOverride w:ilvl="0">
+      <w:startOverride w:val="1"/>
+    </w:lvlOverride>
+    <w:lvlOverride w:ilvl="1">
+      <w:startOverride w:val="1"/>
+    </w:lvlOverride>
+    <w:lvlOverride w:ilvl="2">
+      <w:startOverride w:val="1"/>
+    </w:lvlOverride>
+    <w:lvlOverride w:ilvl="3">
+      <w:startOverride w:val="1"/>
+    </w:lvlOverride>
+    <w:lvlOverride w:ilvl="4">
+      <w:startOverride w:val="1"/>
+    </w:lvlOverride>
+    <w:lvlOverride w:ilvl="5">
+      <w:startOverride w:val="1"/>
+    </w:lvlOverride>
+    <w:lvlOverride w:ilvl="6">
+      <w:startOverride w:val="1"/>
+    </w:lvlOverride>
+    <w:lvlOverride w:ilvl="7">
+      <w:startOverride w:val="1"/>
+    </w:lvlOverride>
+    <w:lvlOverride w:ilvl="8">
+      <w:startOverride w:val="1"/>
+    </w:lvlOverride>
+  </w:num>
+  <w:num w:numId="1011">
     <w:abstractNumId w:val="99411"/>
     <w:lvlOverride w:ilvl="0">
       <w:startOverride w:val="1"/>

</xml_diff>

<commit_message>
Telling hits, called shots and the Hard to put down Edge
An attack that succeeds by 5+ or on a natural 3-4, and isn't defended, lets
the attacker pick one effect (disarm, knock down, pin, rattle, break gear,
open them up, precise); no extra boxes. A called shot names the effect at
-2 (small target -4) and gets it on any hit. Telling hits go both ways; a
character shrugs one off with Hard to put down (once per fight) or a point.
The roller offers called shots and flags telling hits.

Co-Authored-By: Claude Opus 5.5 <noreply@anthropic.com>
Claude-Session: https://claude.ai/code/session_015SADCFzhKijkC2foUmXrpC
</commit_message>
<xml_diff>
--- a/legend-dynamics/Legend_Dynamics_Core_Rules.docx
+++ b/legend-dynamics/Legend_Dynamics_Core_Rules.docx
@@ -1111,6 +1111,74 @@
           </w:p>
         </w:tc>
       </w:tr>
+      <w:tr>
+        <w:tc>
+          <w:tcPr/>
+          <w:p>
+            <w:pPr>
+              <w:pStyle w:val="Compact"/>
+              <w:jc w:val="left"/>
+            </w:pPr>
+            <w:r>
+              <w:rPr>
+                <w:b/>
+                <w:sz w:val="19"/>
+              </w:rPr>
+              <w:t xml:space="preserve">Hard to put down</w:t>
+            </w:r>
+          </w:p>
+        </w:tc>
+        <w:tc>
+          <w:tcPr/>
+          <w:p>
+            <w:pPr>
+              <w:pStyle w:val="Compact"/>
+              <w:jc w:val="left"/>
+            </w:pPr>
+            <w:r>
+              <w:rPr>
+                <w:sz w:val="19"/>
+              </w:rPr>
+              <w:t xml:space="preserve">Once per fight, shrug off a telling hit’s effect: you still take its boxes (see</w:t>
+            </w:r>
+            <w:r>
+              <w:rPr>
+                <w:sz w:val="19"/>
+              </w:rPr>
+              <w:t xml:space="preserve"> </w:t>
+            </w:r>
+            <w:r>
+              <w:rPr>
+                <w:iCs/>
+                <w:i/>
+                <w:sz w:val="19"/>
+              </w:rPr>
+              <w:t xml:space="preserve">Telling hits</w:t>
+            </w:r>
+            <w:r>
+              <w:rPr>
+                <w:sz w:val="19"/>
+              </w:rPr>
+              <w:t xml:space="preserve">)</w:t>
+            </w:r>
+          </w:p>
+        </w:tc>
+        <w:tc>
+          <w:tcPr/>
+          <w:p>
+            <w:pPr>
+              <w:pStyle w:val="Compact"/>
+              <w:jc w:val="left"/>
+            </w:pPr>
+            <w:r>
+              <w:rPr>
+                <w:sz w:val="19"/>
+              </w:rPr>
+              <w:t xml:space="preserve">1</w:t>
+            </w:r>
+          </w:p>
+        </w:tc>
+      </w:tr>
     </w:tbl>
     <w:bookmarkEnd w:id="26"/>
     <w:bookmarkStart w:id="27" w:name="spending-points"/>
@@ -2248,7 +2316,7 @@
     </w:p>
     <w:bookmarkEnd w:id="48"/>
     <w:bookmarkEnd w:id="49"/>
-    <w:bookmarkStart w:id="56" w:name="personal-combat"/>
+    <w:bookmarkStart w:id="57" w:name="personal-combat"/>
     <w:p>
       <w:pPr>
         <w:pStyle w:val="Heading1"/>
@@ -2458,11 +2526,484 @@
         <w:pStyle w:val="FirstParagraph"/>
       </w:pPr>
       <w:r>
-        <w:t xml:space="preserve">Solid cover blocks a shot. Partial cover imposes −2 on the attack. Weapon effects apply after a hit survives any defense. Success margin does not increase damage.</w:t>
+        <w:t xml:space="preserve">Solid cover blocks a shot. Partial cover imposes −2 on the attack. Weapon effects apply after a hit survives any defense. Success margin does not increase damage: a great hit decides</w:t>
+      </w:r>
+      <w:r>
+        <w:t xml:space="preserve"> </w:t>
+      </w:r>
+      <w:r>
+        <w:rPr>
+          <w:iCs/>
+          <w:i/>
+        </w:rPr>
+        <w:t xml:space="preserve">what</w:t>
+      </w:r>
+      <w:r>
+        <w:t xml:space="preserve"> </w:t>
+      </w:r>
+      <w:r>
+        <w:t xml:space="preserve">happens instead.</w:t>
       </w:r>
     </w:p>
     <w:bookmarkEnd w:id="51"/>
-    <w:bookmarkStart w:id="52" w:name="range"/>
+    <w:bookmarkStart w:id="52" w:name="telling-hits"/>
+    <w:p>
+      <w:pPr>
+        <w:pStyle w:val="Heading2"/>
+      </w:pPr>
+      <w:r>
+        <w:t xml:space="preserve">Telling hits</w:t>
+      </w:r>
+    </w:p>
+    <w:p>
+      <w:pPr>
+        <w:pStyle w:val="FirstParagraph"/>
+      </w:pPr>
+      <w:r>
+        <w:t xml:space="preserve">A really good shot, or a blow that lands exactly where it was meant to, lets the attacker say what it does.</w:t>
+      </w:r>
+    </w:p>
+    <w:p>
+      <w:pPr>
+        <w:numPr>
+          <w:ilvl w:val="0"/>
+          <w:numId w:val="1006"/>
+        </w:numPr>
+        <w:pStyle w:val="Compact"/>
+      </w:pPr>
+      <w:r>
+        <w:rPr>
+          <w:bCs/>
+          <w:b/>
+        </w:rPr>
+        <w:t xml:space="preserve">A telling hit</w:t>
+      </w:r>
+      <w:r>
+        <w:t xml:space="preserve"> </w:t>
+      </w:r>
+      <w:r>
+        <w:t xml:space="preserve">is an attack that succeeds by</w:t>
+      </w:r>
+      <w:r>
+        <w:t xml:space="preserve"> </w:t>
+      </w:r>
+      <w:r>
+        <w:rPr>
+          <w:bCs/>
+          <w:b/>
+        </w:rPr>
+        <w:t xml:space="preserve">5 or more</w:t>
+      </w:r>
+      <w:r>
+        <w:t xml:space="preserve">, or on a natural 3 or 4, and isn’t stopped by a defense. The attacker picks</w:t>
+      </w:r>
+      <w:r>
+        <w:t xml:space="preserve"> </w:t>
+      </w:r>
+      <w:r>
+        <w:rPr>
+          <w:bCs/>
+          <w:b/>
+        </w:rPr>
+        <w:t xml:space="preserve">one effect</w:t>
+      </w:r>
+      <w:r>
+        <w:t xml:space="preserve"> </w:t>
+      </w:r>
+      <w:r>
+        <w:t xml:space="preserve">below and describes it. The weapon still marks its usual boxes.</w:t>
+      </w:r>
+    </w:p>
+    <w:p>
+      <w:pPr>
+        <w:numPr>
+          <w:ilvl w:val="0"/>
+          <w:numId w:val="1006"/>
+        </w:numPr>
+        <w:pStyle w:val="Compact"/>
+      </w:pPr>
+      <w:r>
+        <w:rPr>
+          <w:bCs/>
+          <w:b/>
+        </w:rPr>
+        <w:t xml:space="preserve">A called shot.</w:t>
+      </w:r>
+      <w:r>
+        <w:t xml:space="preserve"> </w:t>
+      </w:r>
+      <w:r>
+        <w:t xml:space="preserve">Before rolling, name the effect you want and take −2 on the attack, or −4 for a small target (a hand, an eye, a rope, a lock). If the attack hits at all, the effect happens, whatever the margin. An advantage that rewards aiming cuts this penalty by 1.</w:t>
+      </w:r>
+    </w:p>
+    <w:p>
+      <w:pPr>
+        <w:numPr>
+          <w:ilvl w:val="0"/>
+          <w:numId w:val="1006"/>
+        </w:numPr>
+        <w:pStyle w:val="Compact"/>
+      </w:pPr>
+      <w:r>
+        <w:rPr>
+          <w:bCs/>
+          <w:b/>
+        </w:rPr>
+        <w:t xml:space="preserve">Both ways.</w:t>
+      </w:r>
+      <w:r>
+        <w:t xml:space="preserve"> </w:t>
+      </w:r>
+      <w:r>
+        <w:t xml:space="preserve">Opponents land telling hits on characters too.</w:t>
+      </w:r>
+    </w:p>
+    <w:tbl>
+      <w:tblPr>
+        <w:tblStyle w:val="Table"/>
+        <w:tblW w:type="pct" w:w="5000"/>
+        <w:tblLook w:firstRow="1" w:lastRow="0" w:firstColumn="0" w:lastColumn="0" w:noHBand="0" w:noVBand="0" w:val="0020"/>
+        <w:jc w:val="start"/>
+        <w:tblBorders>
+          <w:top w:val="single" w:sz="4" w:color="B8C2D3"/>
+          <w:left w:val="single" w:sz="4" w:color="B8C2D3"/>
+          <w:bottom w:val="single" w:sz="4" w:color="B8C2D3"/>
+          <w:right w:val="single" w:sz="4" w:color="B8C2D3"/>
+          <w:insideH w:val="single" w:sz="4" w:color="B8C2D3"/>
+          <w:insideV w:val="single" w:sz="4" w:color="B8C2D3"/>
+        </w:tblBorders>
+      </w:tblPr>
+      <w:tblGrid>
+        <w:gridCol w:w="3960"/>
+        <w:gridCol w:w="3960"/>
+      </w:tblGrid>
+      <w:tr>
+        <w:trPr>
+          <w:tblHeader w:val="true"/>
+        </w:trPr>
+        <w:tc>
+          <w:tcPr>
+            <w:shd w:val="clear" w:fill="E9EEF6"/>
+          </w:tcPr>
+          <w:p>
+            <w:pPr>
+              <w:pStyle w:val="Compact"/>
+              <w:jc w:val="left"/>
+            </w:pPr>
+            <w:r>
+              <w:rPr>
+                <w:b/>
+                <w:sz w:val="19"/>
+              </w:rPr>
+              <w:t xml:space="preserve">Effect</w:t>
+            </w:r>
+          </w:p>
+        </w:tc>
+        <w:tc>
+          <w:tcPr>
+            <w:shd w:val="clear" w:fill="E9EEF6"/>
+          </w:tcPr>
+          <w:p>
+            <w:pPr>
+              <w:pStyle w:val="Compact"/>
+              <w:jc w:val="left"/>
+            </w:pPr>
+            <w:r>
+              <w:rPr>
+                <w:b/>
+                <w:sz w:val="19"/>
+              </w:rPr>
+              <w:t xml:space="preserve">What happens</w:t>
+            </w:r>
+          </w:p>
+        </w:tc>
+      </w:tr>
+      <w:tr>
+        <w:tc>
+          <w:tcPr/>
+          <w:p>
+            <w:pPr>
+              <w:pStyle w:val="Compact"/>
+              <w:jc w:val="left"/>
+            </w:pPr>
+            <w:r>
+              <w:rPr>
+                <w:b/>
+                <w:sz w:val="19"/>
+              </w:rPr>
+              <w:t xml:space="preserve">Disarm</w:t>
+            </w:r>
+          </w:p>
+        </w:tc>
+        <w:tc>
+          <w:tcPr/>
+          <w:p>
+            <w:pPr>
+              <w:pStyle w:val="Compact"/>
+              <w:jc w:val="left"/>
+            </w:pPr>
+            <w:r>
+              <w:rPr>
+                <w:sz w:val="19"/>
+              </w:rPr>
+              <w:t xml:space="preserve">The weapon or held item drops, or flies a few yards away</w:t>
+            </w:r>
+          </w:p>
+        </w:tc>
+      </w:tr>
+      <w:tr>
+        <w:tc>
+          <w:tcPr/>
+          <w:p>
+            <w:pPr>
+              <w:pStyle w:val="Compact"/>
+              <w:jc w:val="left"/>
+            </w:pPr>
+            <w:r>
+              <w:rPr>
+                <w:b/>
+                <w:sz w:val="19"/>
+              </w:rPr>
+              <w:t xml:space="preserve">Knock down</w:t>
+            </w:r>
+          </w:p>
+        </w:tc>
+        <w:tc>
+          <w:tcPr/>
+          <w:p>
+            <w:pPr>
+              <w:pStyle w:val="Compact"/>
+              <w:jc w:val="left"/>
+            </w:pPr>
+            <w:r>
+              <w:rPr>
+                <w:sz w:val="19"/>
+              </w:rPr>
+              <w:t xml:space="preserve">The target falls prone, or is driven back a few steps</w:t>
+            </w:r>
+          </w:p>
+        </w:tc>
+      </w:tr>
+      <w:tr>
+        <w:tc>
+          <w:tcPr/>
+          <w:p>
+            <w:pPr>
+              <w:pStyle w:val="Compact"/>
+              <w:jc w:val="left"/>
+            </w:pPr>
+            <w:r>
+              <w:rPr>
+                <w:b/>
+                <w:sz w:val="19"/>
+              </w:rPr>
+              <w:t xml:space="preserve">Pin</w:t>
+            </w:r>
+          </w:p>
+        </w:tc>
+        <w:tc>
+          <w:tcPr/>
+          <w:p>
+            <w:pPr>
+              <w:pStyle w:val="Compact"/>
+              <w:jc w:val="left"/>
+            </w:pPr>
+            <w:r>
+              <w:rPr>
+                <w:sz w:val="19"/>
+              </w:rPr>
+              <w:t xml:space="preserve">The target is held, tangled or pinned down: their next action goes to getting free</w:t>
+            </w:r>
+          </w:p>
+        </w:tc>
+      </w:tr>
+      <w:tr>
+        <w:tc>
+          <w:tcPr/>
+          <w:p>
+            <w:pPr>
+              <w:pStyle w:val="Compact"/>
+              <w:jc w:val="left"/>
+            </w:pPr>
+            <w:r>
+              <w:rPr>
+                <w:b/>
+                <w:sz w:val="19"/>
+              </w:rPr>
+              <w:t xml:space="preserve">Rattle</w:t>
+            </w:r>
+          </w:p>
+        </w:tc>
+        <w:tc>
+          <w:tcPr/>
+          <w:p>
+            <w:pPr>
+              <w:pStyle w:val="Compact"/>
+              <w:jc w:val="left"/>
+            </w:pPr>
+            <w:r>
+              <w:rPr>
+                <w:sz w:val="19"/>
+              </w:rPr>
+              <w:t xml:space="preserve">−2 to the target’s next roll</w:t>
+            </w:r>
+          </w:p>
+        </w:tc>
+      </w:tr>
+      <w:tr>
+        <w:tc>
+          <w:tcPr/>
+          <w:p>
+            <w:pPr>
+              <w:pStyle w:val="Compact"/>
+              <w:jc w:val="left"/>
+            </w:pPr>
+            <w:r>
+              <w:rPr>
+                <w:b/>
+                <w:sz w:val="19"/>
+              </w:rPr>
+              <w:t xml:space="preserve">Break gear</w:t>
+            </w:r>
+          </w:p>
+        </w:tc>
+        <w:tc>
+          <w:tcPr/>
+          <w:p>
+            <w:pPr>
+              <w:pStyle w:val="Compact"/>
+              <w:jc w:val="left"/>
+            </w:pPr>
+            <w:r>
+              <w:rPr>
+                <w:sz w:val="19"/>
+              </w:rPr>
+              <w:t xml:space="preserve">A shield, weapon or tool breaks; armor loses 1 protection until it’s repaired</w:t>
+            </w:r>
+          </w:p>
+        </w:tc>
+      </w:tr>
+      <w:tr>
+        <w:tc>
+          <w:tcPr/>
+          <w:p>
+            <w:pPr>
+              <w:pStyle w:val="Compact"/>
+              <w:jc w:val="left"/>
+            </w:pPr>
+            <w:r>
+              <w:rPr>
+                <w:b/>
+                <w:sz w:val="19"/>
+              </w:rPr>
+              <w:t xml:space="preserve">Open them up</w:t>
+            </w:r>
+          </w:p>
+        </w:tc>
+        <w:tc>
+          <w:tcPr/>
+          <w:p>
+            <w:pPr>
+              <w:pStyle w:val="Compact"/>
+              <w:jc w:val="left"/>
+            </w:pPr>
+            <w:r>
+              <w:rPr>
+                <w:sz w:val="19"/>
+              </w:rPr>
+              <w:t xml:space="preserve">The next attack on this target this round gets +2</w:t>
+            </w:r>
+          </w:p>
+        </w:tc>
+      </w:tr>
+      <w:tr>
+        <w:tc>
+          <w:tcPr/>
+          <w:p>
+            <w:pPr>
+              <w:pStyle w:val="Compact"/>
+              <w:jc w:val="left"/>
+            </w:pPr>
+            <w:r>
+              <w:rPr>
+                <w:b/>
+                <w:sz w:val="19"/>
+              </w:rPr>
+              <w:t xml:space="preserve">Precise</w:t>
+            </w:r>
+          </w:p>
+        </w:tc>
+        <w:tc>
+          <w:tcPr/>
+          <w:p>
+            <w:pPr>
+              <w:pStyle w:val="Compact"/>
+              <w:jc w:val="left"/>
+            </w:pPr>
+            <w:r>
+              <w:rPr>
+                <w:sz w:val="19"/>
+              </w:rPr>
+              <w:t xml:space="preserve">You hit exactly what you aimed at: the lantern, the rope, the tire, the hand on the trigger</w:t>
+            </w:r>
+          </w:p>
+        </w:tc>
+      </w:tr>
+    </w:tbl>
+    <w:p>
+      <w:pPr>
+        <w:pStyle w:val="BodyText"/>
+      </w:pPr>
+      <w:r>
+        <w:rPr>
+          <w:bCs/>
+          <w:b/>
+        </w:rPr>
+        <w:t xml:space="preserve">Limits.</w:t>
+      </w:r>
+      <w:r>
+        <w:t xml:space="preserve"> </w:t>
+      </w:r>
+      <w:r>
+        <w:t xml:space="preserve">A telling hit never adds boxes and never gets past a defense. The effect has to make sense: nobody disarms a bear or knocks down a train, and the GM can rule an effect out. Opponents who drop from one hit are already down, so a telling hit against them sets up what comes next, like sending one crashing into another.</w:t>
+      </w:r>
+    </w:p>
+    <w:p>
+      <w:pPr>
+        <w:pStyle w:val="BodyText"/>
+      </w:pPr>
+      <w:r>
+        <w:rPr>
+          <w:bCs/>
+          <w:b/>
+        </w:rPr>
+        <w:t xml:space="preserve">Staying alive.</w:t>
+      </w:r>
+      <w:r>
+        <w:t xml:space="preserve"> </w:t>
+      </w:r>
+      <w:r>
+        <w:t xml:space="preserve">A character on the receiving end can shrug off a telling hit’s effect with</w:t>
+      </w:r>
+      <w:r>
+        <w:t xml:space="preserve"> </w:t>
+      </w:r>
+      <w:r>
+        <w:rPr>
+          <w:bCs/>
+          <w:b/>
+        </w:rPr>
+        <w:t xml:space="preserve">Hard to put down</w:t>
+      </w:r>
+      <w:r>
+        <w:t xml:space="preserve"> </w:t>
+      </w:r>
+      <w:r>
+        <w:t xml:space="preserve">(once per fight) or by spending a Legend point. Either way, they still take the boxes.</w:t>
+      </w:r>
+    </w:p>
+    <w:bookmarkEnd w:id="52"/>
+    <w:bookmarkStart w:id="53" w:name="range"/>
     <w:p>
       <w:pPr>
         <w:pStyle w:val="Heading2"/>
@@ -2828,8 +3369,8 @@
         <w:t xml:space="preserve">Moving: your move each turn covers the Close band. Give up your action to run and you cover Short instead.</w:t>
       </w:r>
     </w:p>
-    <w:bookmarkEnd w:id="52"/>
-    <w:bookmarkStart w:id="54" w:name="injury"/>
+    <w:bookmarkEnd w:id="53"/>
+    <w:bookmarkStart w:id="55" w:name="injury"/>
     <w:p>
       <w:pPr>
         <w:pStyle w:val="Heading2"/>
@@ -3118,7 +3659,7 @@
         <w:t xml:space="preserve">Injury penalties replace each other rather than stacking. They apply to movement, attacks, Dodge, and other tasks the injury physically hinders.</w:t>
       </w:r>
     </w:p>
-    <w:bookmarkStart w:id="53" w:name="dying-and-death"/>
+    <w:bookmarkStart w:id="54" w:name="dying-and-death"/>
     <w:p>
       <w:pPr>
         <w:pStyle w:val="Heading3"/>
@@ -3131,7 +3672,7 @@
       <w:pPr>
         <w:numPr>
           <w:ilvl w:val="0"/>
-          <w:numId w:val="1006"/>
+          <w:numId w:val="1007"/>
         </w:numPr>
         <w:pStyle w:val="Compact"/>
       </w:pPr>
@@ -3182,7 +3723,7 @@
       <w:pPr>
         <w:numPr>
           <w:ilvl w:val="0"/>
-          <w:numId w:val="1006"/>
+          <w:numId w:val="1007"/>
         </w:numPr>
         <w:pStyle w:val="Compact"/>
       </w:pPr>
@@ -3204,7 +3745,7 @@
       <w:pPr>
         <w:numPr>
           <w:ilvl w:val="0"/>
-          <w:numId w:val="1006"/>
+          <w:numId w:val="1007"/>
         </w:numPr>
         <w:pStyle w:val="Compact"/>
       </w:pPr>
@@ -3230,9 +3771,9 @@
         <w:t xml:space="preserve">Your protection is avoiding the hit: a defense (Dodge, Parry or Block), cover, and a Legend point, which reduces a hit by one box.</w:t>
       </w:r>
     </w:p>
-    <w:bookmarkEnd w:id="53"/>
     <w:bookmarkEnd w:id="54"/>
-    <w:bookmarkStart w:id="55" w:name="weapons-and-damage"/>
+    <w:bookmarkEnd w:id="55"/>
+    <w:bookmarkStart w:id="56" w:name="weapons-and-damage"/>
     <w:p>
       <w:pPr>
         <w:pStyle w:val="Heading2"/>
@@ -3274,9 +3815,9 @@
         <w:t xml:space="preserve">Your setting pack supplies this (ammo).</w:t>
       </w:r>
     </w:p>
-    <w:bookmarkEnd w:id="55"/>
     <w:bookmarkEnd w:id="56"/>
-    <w:bookmarkStart w:id="61" w:name="medical-care"/>
+    <w:bookmarkEnd w:id="57"/>
+    <w:bookmarkStart w:id="62" w:name="medical-care"/>
     <w:p>
       <w:pPr>
         <w:pStyle w:val="Heading1"/>
@@ -3285,7 +3826,7 @@
         <w:t xml:space="preserve">Medical care</w:t>
       </w:r>
     </w:p>
-    <w:bookmarkStart w:id="57" w:name="diagnosis-and-stabilization"/>
+    <w:bookmarkStart w:id="58" w:name="diagnosis-and-stabilization"/>
     <w:p>
       <w:pPr>
         <w:pStyle w:val="Heading2"/>
@@ -3302,8 +3843,8 @@
         <w:t xml:space="preserve">Roll Medicine when the diagnosis is uncertain or an urgent treatment decision matters. Emergency stabilization takes one action and a successful Medicine roll with a medical kit. It ends Dying and stops deterioration, but removes no boxes.</w:t>
       </w:r>
     </w:p>
-    <w:bookmarkEnd w:id="57"/>
-    <w:bookmarkStart w:id="58" w:name="field-treatment"/>
+    <w:bookmarkEnd w:id="58"/>
+    <w:bookmarkStart w:id="59" w:name="field-treatment"/>
     <w:p>
       <w:pPr>
         <w:pStyle w:val="Heading2"/>
@@ -3320,8 +3861,8 @@
         <w:t xml:space="preserve">With a medical kit and several uninterrupted minutes, successful Medicine removes one injury box; success by 5 or more removes two. Each injury receives one field-treatment attempt; further attempts need changed circumstances.</w:t>
       </w:r>
     </w:p>
-    <w:bookmarkEnd w:id="58"/>
-    <w:bookmarkStart w:id="59" w:name="proper-care"/>
+    <w:bookmarkEnd w:id="59"/>
+    <w:bookmarkStart w:id="60" w:name="proper-care"/>
     <w:p>
       <w:pPr>
         <w:pStyle w:val="Heading2"/>
@@ -3338,8 +3879,8 @@
         <w:t xml:space="preserve">A proper infirmary grants +2 to Medicine. A successful treatment removes two boxes; success by 5 or more removes three. Allow the time the treatment requires.</w:t>
       </w:r>
     </w:p>
-    <w:bookmarkEnd w:id="59"/>
-    <w:bookmarkStart w:id="60" w:name="natural-recovery"/>
+    <w:bookmarkEnd w:id="60"/>
+    <w:bookmarkStart w:id="61" w:name="natural-recovery"/>
     <w:p>
       <w:pPr>
         <w:pStyle w:val="Heading2"/>
@@ -3372,9 +3913,9 @@
         <w:t xml:space="preserve">of rest clears one injury box. Rest means nothing strenuous. At three boxes, rest alone clears nothing: treatment must clear the first box.</w:t>
       </w:r>
     </w:p>
-    <w:bookmarkEnd w:id="60"/>
     <w:bookmarkEnd w:id="61"/>
-    <w:bookmarkStart w:id="66" w:name="magic"/>
+    <w:bookmarkEnd w:id="62"/>
+    <w:bookmarkStart w:id="67" w:name="magic"/>
     <w:p>
       <w:pPr>
         <w:pStyle w:val="Heading1"/>
@@ -3618,7 +4159,7 @@
         </w:tc>
       </w:tr>
     </w:tbl>
-    <w:bookmarkStart w:id="62" w:name="bursts"/>
+    <w:bookmarkStart w:id="63" w:name="bursts"/>
     <w:p>
       <w:pPr>
         <w:pStyle w:val="Heading2"/>
@@ -3999,8 +4540,8 @@
         <w:t xml:space="preserve">A failed burst marks a box of your setting’s price track; a natural 18 marks two, or something answers that shouldn’t.</w:t>
       </w:r>
     </w:p>
-    <w:bookmarkEnd w:id="62"/>
-    <w:bookmarkStart w:id="63" w:name="workings"/>
+    <w:bookmarkEnd w:id="63"/>
+    <w:bookmarkStart w:id="64" w:name="workings"/>
     <w:p>
       <w:pPr>
         <w:pStyle w:val="Heading2"/>
@@ -4013,7 +4554,7 @@
       <w:pPr>
         <w:numPr>
           <w:ilvl w:val="0"/>
-          <w:numId w:val="1007"/>
+          <w:numId w:val="1008"/>
         </w:numPr>
         <w:pStyle w:val="Compact"/>
       </w:pPr>
@@ -4035,7 +4576,7 @@
       <w:pPr>
         <w:numPr>
           <w:ilvl w:val="0"/>
-          <w:numId w:val="1007"/>
+          <w:numId w:val="1008"/>
         </w:numPr>
         <w:pStyle w:val="Compact"/>
       </w:pPr>
@@ -4057,7 +4598,7 @@
       <w:pPr>
         <w:numPr>
           <w:ilvl w:val="0"/>
-          <w:numId w:val="1007"/>
+          <w:numId w:val="1008"/>
         </w:numPr>
         <w:pStyle w:val="Compact"/>
       </w:pPr>
@@ -4317,8 +4858,8 @@
         <w:t xml:space="preserve">The right materials, hour or place remove one segment.</w:t>
       </w:r>
     </w:p>
-    <w:bookmarkEnd w:id="63"/>
-    <w:bookmarkStart w:id="64" w:name="charms"/>
+    <w:bookmarkEnd w:id="64"/>
+    <w:bookmarkStart w:id="65" w:name="charms"/>
     <w:p>
       <w:pPr>
         <w:pStyle w:val="Heading2"/>
@@ -4348,8 +4889,8 @@
         <w:t xml:space="preserve">. Preparation is how slow magic wins a fast fight.</w:t>
       </w:r>
     </w:p>
-    <w:bookmarkEnd w:id="64"/>
-    <w:bookmarkStart w:id="65" w:name="magic-advancement"/>
+    <w:bookmarkEnd w:id="65"/>
+    <w:bookmarkStart w:id="66" w:name="magic-advancement"/>
     <w:p>
       <w:pPr>
         <w:pStyle w:val="Heading2"/>
@@ -4856,9 +5397,9 @@
         </w:tc>
       </w:tr>
     </w:tbl>
-    <w:bookmarkEnd w:id="65"/>
     <w:bookmarkEnd w:id="66"/>
-    <w:bookmarkStart w:id="70" w:name="legend-points-and-tracks"/>
+    <w:bookmarkEnd w:id="67"/>
+    <w:bookmarkStart w:id="71" w:name="legend-points-and-tracks"/>
     <w:p>
       <w:pPr>
         <w:pStyle w:val="Heading1"/>
@@ -4867,7 +5408,7 @@
         <w:t xml:space="preserve">Legend points and tracks</w:t>
       </w:r>
     </w:p>
-    <w:bookmarkStart w:id="67" w:name="using-legend-points"/>
+    <w:bookmarkStart w:id="68" w:name="using-legend-points"/>
     <w:p>
       <w:pPr>
         <w:pStyle w:val="Heading2"/>
@@ -5023,6 +5564,39 @@
                 <w:b/>
                 <w:sz w:val="19"/>
               </w:rPr>
+              <w:t xml:space="preserve">Shrug off a telling hit</w:t>
+            </w:r>
+          </w:p>
+        </w:tc>
+        <w:tc>
+          <w:tcPr/>
+          <w:p>
+            <w:pPr>
+              <w:pStyle w:val="Compact"/>
+              <w:jc w:val="left"/>
+            </w:pPr>
+            <w:r>
+              <w:rPr>
+                <w:sz w:val="19"/>
+              </w:rPr>
+              <w:t xml:space="preserve">Cancel the effect an attacker picked against you; you still take the boxes.</w:t>
+            </w:r>
+          </w:p>
+        </w:tc>
+      </w:tr>
+      <w:tr>
+        <w:tc>
+          <w:tcPr/>
+          <w:p>
+            <w:pPr>
+              <w:pStyle w:val="Compact"/>
+              <w:jc w:val="left"/>
+            </w:pPr>
+            <w:r>
+              <w:rPr>
+                <w:b/>
+                <w:sz w:val="19"/>
+              </w:rPr>
               <w:t xml:space="preserve">Establish a small preparation</w:t>
             </w:r>
           </w:p>
@@ -5052,8 +5626,8 @@
         <w:t xml:space="preserve">Gain one point when one of your complications creates a meaningful problem you accept, including a companion complication. You can decline the proposed complication without penalty.</w:t>
       </w:r>
     </w:p>
-    <w:bookmarkEnd w:id="67"/>
-    <w:bookmarkStart w:id="68" w:name="tracks"/>
+    <w:bookmarkEnd w:id="68"/>
+    <w:bookmarkStart w:id="69" w:name="tracks"/>
     <w:p>
       <w:pPr>
         <w:pStyle w:val="Heading2"/>
@@ -5074,8 +5648,8 @@
         <w:t xml:space="preserve">Your setting pack supplies this (tracks).</w:t>
       </w:r>
     </w:p>
-    <w:bookmarkEnd w:id="68"/>
-    <w:bookmarkStart w:id="69" w:name="advancement"/>
+    <w:bookmarkEnd w:id="69"/>
+    <w:bookmarkStart w:id="70" w:name="advancement"/>
     <w:p>
       <w:pPr>
         <w:pStyle w:val="Heading2"/>
@@ -5112,7 +5686,7 @@
       <w:pPr>
         <w:numPr>
           <w:ilvl w:val="0"/>
-          <w:numId w:val="1008"/>
+          <w:numId w:val="1009"/>
         </w:numPr>
         <w:pStyle w:val="Compact"/>
       </w:pPr>
@@ -5173,7 +5747,7 @@
       <w:pPr>
         <w:numPr>
           <w:ilvl w:val="0"/>
-          <w:numId w:val="1008"/>
+          <w:numId w:val="1009"/>
         </w:numPr>
         <w:pStyle w:val="Compact"/>
       </w:pPr>
@@ -5519,9 +6093,9 @@
         <w:t xml:space="preserve">Magic and powers grow the same way, at the costs their chapters give.</w:t>
       </w:r>
     </w:p>
-    <w:bookmarkEnd w:id="69"/>
     <w:bookmarkEnd w:id="70"/>
-    <w:bookmarkStart w:id="73" w:name="running-missions"/>
+    <w:bookmarkEnd w:id="71"/>
+    <w:bookmarkStart w:id="74" w:name="running-missions"/>
     <w:p>
       <w:pPr>
         <w:pStyle w:val="Heading1"/>
@@ -5530,7 +6104,7 @@
         <w:t xml:space="preserve">Running missions</w:t>
       </w:r>
     </w:p>
-    <w:bookmarkStart w:id="71" w:name="mission-seeds"/>
+    <w:bookmarkStart w:id="72" w:name="mission-seeds"/>
     <w:p>
       <w:pPr>
         <w:pStyle w:val="Heading2"/>
@@ -5559,8 +6133,8 @@
         <w:t xml:space="preserve">Your setting pack supplies this (seeds).</w:t>
       </w:r>
     </w:p>
-    <w:bookmarkEnd w:id="71"/>
-    <w:bookmarkStart w:id="72" w:name="the-journal"/>
+    <w:bookmarkEnd w:id="72"/>
+    <w:bookmarkStart w:id="73" w:name="the-journal"/>
     <w:p>
       <w:pPr>
         <w:pStyle w:val="Heading2"/>
@@ -5575,250 +6149,6 @@
       </w:pPr>
       <w:r>
         <w:t xml:space="preserve">End each mission with a short entry, written together:</w:t>
-      </w:r>
-    </w:p>
-    <w:p>
-      <w:pPr>
-        <w:numPr>
-          <w:ilvl w:val="0"/>
-          <w:numId w:val="1009"/>
-        </w:numPr>
-        <w:pStyle w:val="Compact"/>
-      </w:pPr>
-      <w:r>
-        <w:rPr>
-          <w:bCs/>
-          <w:b/>
-        </w:rPr>
-        <w:t xml:space="preserve">The mission.</w:t>
-      </w:r>
-      <w:r>
-        <w:t xml:space="preserve"> </w:t>
-      </w:r>
-      <w:r>
-        <w:t xml:space="preserve">What happened, and did we succeed: fully, partly, or not at all?</w:t>
-      </w:r>
-    </w:p>
-    <w:p>
-      <w:pPr>
-        <w:numPr>
-          <w:ilvl w:val="0"/>
-          <w:numId w:val="1009"/>
-        </w:numPr>
-        <w:pStyle w:val="Compact"/>
-      </w:pPr>
-      <w:r>
-        <w:rPr>
-          <w:bCs/>
-          <w:b/>
-        </w:rPr>
-        <w:t xml:space="preserve">Who stood out?</w:t>
-      </w:r>
-      <w:r>
-        <w:t xml:space="preserve"> </w:t>
-      </w:r>
-      <w:r>
-        <w:t xml:space="preserve">A moment worth remembering.</w:t>
-      </w:r>
-    </w:p>
-    <w:p>
-      <w:pPr>
-        <w:numPr>
-          <w:ilvl w:val="0"/>
-          <w:numId w:val="1009"/>
-        </w:numPr>
-        <w:pStyle w:val="Compact"/>
-      </w:pPr>
-      <w:r>
-        <w:rPr>
-          <w:bCs/>
-          <w:b/>
-        </w:rPr>
-        <w:t xml:space="preserve">Complications.</w:t>
-      </w:r>
-      <w:r>
-        <w:t xml:space="preserve"> </w:t>
-      </w:r>
-      <w:r>
-        <w:t xml:space="preserve">Which ones came into play, and what did they cost?</w:t>
-      </w:r>
-    </w:p>
-    <w:p>
-      <w:pPr>
-        <w:numPr>
-          <w:ilvl w:val="0"/>
-          <w:numId w:val="1009"/>
-        </w:numPr>
-        <w:pStyle w:val="Compact"/>
-      </w:pPr>
-      <w:r>
-        <w:rPr>
-          <w:bCs/>
-          <w:b/>
-        </w:rPr>
-        <w:t xml:space="preserve">What changed?</w:t>
-      </w:r>
-      <w:r>
-        <w:t xml:space="preserve"> </w:t>
-      </w:r>
-      <w:r>
-        <w:t xml:space="preserve">New allies or enemies, damage, open threads for next time.</w:t>
-      </w:r>
-    </w:p>
-    <w:p>
-      <w:pPr>
-        <w:numPr>
-          <w:ilvl w:val="0"/>
-          <w:numId w:val="1009"/>
-        </w:numPr>
-        <w:pStyle w:val="Compact"/>
-      </w:pPr>
-      <w:r>
-        <w:rPr>
-          <w:bCs/>
-          <w:b/>
-        </w:rPr>
-        <w:t xml:space="preserve">Advancement.</w:t>
-      </w:r>
-      <w:r>
-        <w:t xml:space="preserve"> </w:t>
-      </w:r>
-      <w:r>
-        <w:t xml:space="preserve">After a significant mission, each character earns 1 advancement point; at a milestone, 2 more.</w:t>
-      </w:r>
-    </w:p>
-    <w:bookmarkEnd w:id="72"/>
-    <w:bookmarkEnd w:id="73"/>
-    <w:bookmarkStart w:id="74" w:name="ready-made-characters"/>
-    <w:p>
-      <w:pPr>
-        <w:pStyle w:val="Heading1"/>
-      </w:pPr>
-      <w:r>
-        <w:t xml:space="preserve">Ready-made characters</w:t>
-      </w:r>
-    </w:p>
-    <w:p>
-      <w:pPr>
-        <w:pStyle w:val="FirstParagraph"/>
-      </w:pPr>
-      <w:r>
-        <w:t xml:space="preserve">Characters ready to play, for one-shots, new players, or a group in a hurry. Each follows the creation rules exactly, and their connections tie them together. In the creator, choose one from the ready-made list to open it and make it your own.</w:t>
-      </w:r>
-    </w:p>
-    <w:p>
-      <w:pPr>
-        <w:pStyle w:val="BodyText"/>
-      </w:pPr>
-      <w:r>
-        <w:rPr>
-          <w:iCs/>
-          <w:i/>
-        </w:rPr>
-        <w:t xml:space="preserve">Your setting pack supplies this (pregens).</w:t>
-      </w:r>
-    </w:p>
-    <w:bookmarkEnd w:id="74"/>
-    <w:bookmarkStart w:id="75" w:name="advantages"/>
-    <w:p>
-      <w:pPr>
-        <w:pStyle w:val="Heading1"/>
-      </w:pPr>
-      <w:r>
-        <w:t xml:space="preserve">Advantages</w:t>
-      </w:r>
-    </w:p>
-    <w:p>
-      <w:pPr>
-        <w:pStyle w:val="FirstParagraph"/>
-      </w:pPr>
-      <w:r>
-        <w:t xml:space="preserve">Choose one advantage at character creation: a general advantage from this chapter, or an origin advantage from the next. Each grants +2 only in the listed circumstances. An advantage does not grant training, authorize an impossible action, or replace essential gear. Use only one advantage bonus per roll.</w:t>
-      </w:r>
-    </w:p>
-    <w:p>
-      <w:pPr>
-        <w:pStyle w:val="BodyText"/>
-      </w:pPr>
-      <w:r>
-        <w:rPr>
-          <w:iCs/>
-          <w:i/>
-        </w:rPr>
-        <w:t xml:space="preserve">Your setting pack supplies this (advantages).</w:t>
-      </w:r>
-    </w:p>
-    <w:bookmarkEnd w:id="75"/>
-    <w:bookmarkStart w:id="76" w:name="origins"/>
-    <w:p>
-      <w:pPr>
-        <w:pStyle w:val="Heading1"/>
-      </w:pPr>
-      <w:r>
-        <w:t xml:space="preserve">Origins</w:t>
-      </w:r>
-    </w:p>
-    <w:p>
-      <w:pPr>
-        <w:pStyle w:val="FirstParagraph"/>
-      </w:pPr>
-      <w:r>
-        <w:rPr>
-          <w:iCs/>
-          <w:i/>
-        </w:rPr>
-        <w:t xml:space="preserve">Your setting pack supplies this (origins).</w:t>
-      </w:r>
-    </w:p>
-    <w:bookmarkEnd w:id="76"/>
-    <w:bookmarkStart w:id="87" w:name="making-your-own"/>
-    <w:p>
-      <w:pPr>
-        <w:pStyle w:val="Heading1"/>
-      </w:pPr>
-      <w:r>
-        <w:t xml:space="preserve">Making your own</w:t>
-      </w:r>
-    </w:p>
-    <w:p>
-      <w:pPr>
-        <w:pStyle w:val="FirstParagraph"/>
-      </w:pPr>
-      <w:r>
-        <w:t xml:space="preserve">The roles and origins in this book are a starting point, not a limit. With the GM’s agreement, any player can create their own role or origin. The creator has a</w:t>
-      </w:r>
-      <w:r>
-        <w:t xml:space="preserve"> </w:t>
-      </w:r>
-      <w:r>
-        <w:rPr>
-          <w:bCs/>
-          <w:b/>
-        </w:rPr>
-        <w:t xml:space="preserve">Custom</w:t>
-      </w:r>
-      <w:r>
-        <w:t xml:space="preserve"> </w:t>
-      </w:r>
-      <w:r>
-        <w:t xml:space="preserve">option at the end of each list, and its checklist holds a custom choice to the same rules as everything else.</w:t>
-      </w:r>
-    </w:p>
-    <w:bookmarkStart w:id="77" w:name="a-custom-role"/>
-    <w:p>
-      <w:pPr>
-        <w:pStyle w:val="Heading2"/>
-      </w:pPr>
-      <w:r>
-        <w:t xml:space="preserve">A custom role</w:t>
-      </w:r>
-    </w:p>
-    <w:p>
-      <w:pPr>
-        <w:pStyle w:val="FirstParagraph"/>
-      </w:pPr>
-      <w:r>
-        <w:t xml:space="preserve">A role is a concept, not a package of powers: it gives no bonus of its own. A custom one only needs a clear place in the group.</w:t>
       </w:r>
     </w:p>
     <w:p>
@@ -5834,37 +6164,13 @@
           <w:bCs/>
           <w:b/>
         </w:rPr>
-        <w:t xml:space="preserve">Name it and describe it.</w:t>
-      </w:r>
-      <w:r>
-        <w:t xml:space="preserve"> </w:t>
-      </w:r>
-      <w:r>
-        <w:t xml:space="preserve">One sentence for what your character does that no one else does, in the style of the roles above:</w:t>
-      </w:r>
-      <w:r>
-        <w:t xml:space="preserve"> </w:t>
-      </w:r>
-      <w:r>
-        <w:rPr>
-          <w:iCs/>
-          <w:i/>
-        </w:rPr>
-        <w:t xml:space="preserve">“</w:t>
-      </w:r>
-      <w:r>
-        <w:rPr>
-          <w:iCs/>
-          <w:i/>
-        </w:rPr>
-        <w:t xml:space="preserve">Smuggler: knows every back door, bribe and hidden hold.</w:t>
-      </w:r>
-      <w:r>
-        <w:rPr>
-          <w:iCs/>
-          <w:i/>
-        </w:rPr>
-        <w:t xml:space="preserve">”</w:t>
+        <w:t xml:space="preserve">The mission.</w:t>
+      </w:r>
+      <w:r>
+        <w:t xml:space="preserve"> </w:t>
+      </w:r>
+      <w:r>
+        <w:t xml:space="preserve">What happened, and did we succeed: fully, partly, or not at all?</w:t>
       </w:r>
     </w:p>
     <w:p>
@@ -5880,13 +6186,13 @@
           <w:bCs/>
           <w:b/>
         </w:rPr>
-        <w:t xml:space="preserve">Choose a group.</w:t>
-      </w:r>
-      <w:r>
-        <w:t xml:space="preserve"> </w:t>
-      </w:r>
-      <w:r>
-        <w:t xml:space="preserve">Pick the one it belongs with: one of your setting’s groups. The group only sets your sheet’s colors and emblem.</w:t>
+        <w:t xml:space="preserve">Who stood out?</w:t>
+      </w:r>
+      <w:r>
+        <w:t xml:space="preserve"> </w:t>
+      </w:r>
+      <w:r>
+        <w:t xml:space="preserve">A moment worth remembering.</w:t>
       </w:r>
     </w:p>
     <w:p>
@@ -5902,13 +6208,13 @@
           <w:bCs/>
           <w:b/>
         </w:rPr>
-        <w:t xml:space="preserve">Pick four core skills.</w:t>
-      </w:r>
-      <w:r>
-        <w:t xml:space="preserve"> </w:t>
-      </w:r>
-      <w:r>
-        <w:t xml:space="preserve">The skills it can’t do without. Mark them Trained yourself in step 3 (the built-in roles do this for you); they count toward your normal Trained skills.</w:t>
+        <w:t xml:space="preserve">Complications.</w:t>
+      </w:r>
+      <w:r>
+        <w:t xml:space="preserve"> </w:t>
+      </w:r>
+      <w:r>
+        <w:t xml:space="preserve">Which ones came into play, and what did they cost?</w:t>
       </w:r>
     </w:p>
     <w:p>
@@ -5924,13 +6230,46 @@
           <w:bCs/>
           <w:b/>
         </w:rPr>
-        <w:t xml:space="preserve">Check it with the GM.</w:t>
-      </w:r>
-      <w:r>
-        <w:t xml:space="preserve"> </w:t>
-      </w:r>
-      <w:r>
-        <w:t xml:space="preserve">It should fit the setting and overlap the existing roles as little as possible.</w:t>
+        <w:t xml:space="preserve">What changed?</w:t>
+      </w:r>
+      <w:r>
+        <w:t xml:space="preserve"> </w:t>
+      </w:r>
+      <w:r>
+        <w:t xml:space="preserve">New allies or enemies, damage, open threads for next time.</w:t>
+      </w:r>
+    </w:p>
+    <w:p>
+      <w:pPr>
+        <w:numPr>
+          <w:ilvl w:val="0"/>
+          <w:numId w:val="1010"/>
+        </w:numPr>
+        <w:pStyle w:val="Compact"/>
+      </w:pPr>
+      <w:r>
+        <w:rPr>
+          <w:bCs/>
+          <w:b/>
+        </w:rPr>
+        <w:t xml:space="preserve">Advancement.</w:t>
+      </w:r>
+      <w:r>
+        <w:t xml:space="preserve"> </w:t>
+      </w:r>
+      <w:r>
+        <w:t xml:space="preserve">After a significant mission, each character earns 1 advancement point; at a milestone, 2 more.</w:t>
+      </w:r>
+    </w:p>
+    <w:bookmarkEnd w:id="73"/>
+    <w:bookmarkEnd w:id="74"/>
+    <w:bookmarkStart w:id="75" w:name="ready-made-characters"/>
+    <w:p>
+      <w:pPr>
+        <w:pStyle w:val="Heading1"/>
+      </w:pPr>
+      <w:r>
+        <w:t xml:space="preserve">Ready-made characters</w:t>
       </w:r>
     </w:p>
     <w:p>
@@ -5938,50 +6277,285 @@
         <w:pStyle w:val="FirstParagraph"/>
       </w:pPr>
       <w:r>
-        <w:rPr>
-          <w:bCs/>
-          <w:b/>
-        </w:rPr>
-        <w:t xml:space="preserve">In the creator:</w:t>
-      </w:r>
-      <w:r>
-        <w:t xml:space="preserve"> </w:t>
-      </w:r>
-      <w:r>
-        <w:t xml:space="preserve">in step 1, choose</w:t>
-      </w:r>
-      <w:r>
-        <w:t xml:space="preserve"> </w:t>
-      </w:r>
-      <w:r>
-        <w:rPr>
-          <w:bCs/>
-          <w:b/>
-        </w:rPr>
-        <w:t xml:space="preserve">Custom role…</w:t>
-      </w:r>
-      <w:r>
-        <w:t xml:space="preserve"> </w:t>
-      </w:r>
-      <w:r>
-        <w:t xml:space="preserve">at the end of the Role list, then enter its name and group. Write the description in</w:t>
-      </w:r>
-      <w:r>
-        <w:t xml:space="preserve"> </w:t>
-      </w:r>
+        <w:t xml:space="preserve">Characters ready to play, for one-shots, new players, or a group in a hurry. Each follows the creation rules exactly, and their connections tie them together. In the creator, choose one from the ready-made list to open it and make it your own.</w:t>
+      </w:r>
+    </w:p>
+    <w:p>
+      <w:pPr>
+        <w:pStyle w:val="BodyText"/>
+      </w:pPr>
       <w:r>
         <w:rPr>
           <w:iCs/>
           <w:i/>
         </w:rPr>
+        <w:t xml:space="preserve">Your setting pack supplies this (pregens).</w:t>
+      </w:r>
+    </w:p>
+    <w:bookmarkEnd w:id="75"/>
+    <w:bookmarkStart w:id="76" w:name="advantages"/>
+    <w:p>
+      <w:pPr>
+        <w:pStyle w:val="Heading1"/>
+      </w:pPr>
+      <w:r>
+        <w:t xml:space="preserve">Advantages</w:t>
+      </w:r>
+    </w:p>
+    <w:p>
+      <w:pPr>
+        <w:pStyle w:val="FirstParagraph"/>
+      </w:pPr>
+      <w:r>
+        <w:t xml:space="preserve">Choose one advantage at character creation: a general advantage from this chapter, or an origin advantage from the next. Each grants +2 only in the listed circumstances. An advantage does not grant training, authorize an impossible action, or replace essential gear. Use only one advantage bonus per roll.</w:t>
+      </w:r>
+    </w:p>
+    <w:p>
+      <w:pPr>
+        <w:pStyle w:val="BodyText"/>
+      </w:pPr>
+      <w:r>
+        <w:rPr>
+          <w:iCs/>
+          <w:i/>
+        </w:rPr>
+        <w:t xml:space="preserve">Your setting pack supplies this (advantages).</w:t>
+      </w:r>
+    </w:p>
+    <w:bookmarkEnd w:id="76"/>
+    <w:bookmarkStart w:id="77" w:name="origins"/>
+    <w:p>
+      <w:pPr>
+        <w:pStyle w:val="Heading1"/>
+      </w:pPr>
+      <w:r>
+        <w:t xml:space="preserve">Origins</w:t>
+      </w:r>
+    </w:p>
+    <w:p>
+      <w:pPr>
+        <w:pStyle w:val="FirstParagraph"/>
+      </w:pPr>
+      <w:r>
+        <w:rPr>
+          <w:iCs/>
+          <w:i/>
+        </w:rPr>
+        <w:t xml:space="preserve">Your setting pack supplies this (origins).</w:t>
+      </w:r>
+    </w:p>
+    <w:bookmarkEnd w:id="77"/>
+    <w:bookmarkStart w:id="88" w:name="making-your-own"/>
+    <w:p>
+      <w:pPr>
+        <w:pStyle w:val="Heading1"/>
+      </w:pPr>
+      <w:r>
+        <w:t xml:space="preserve">Making your own</w:t>
+      </w:r>
+    </w:p>
+    <w:p>
+      <w:pPr>
+        <w:pStyle w:val="FirstParagraph"/>
+      </w:pPr>
+      <w:r>
+        <w:t xml:space="preserve">The roles and origins in this book are a starting point, not a limit. With the GM’s agreement, any player can create their own role or origin. The creator has a</w:t>
+      </w:r>
+      <w:r>
+        <w:t xml:space="preserve"> </w:t>
+      </w:r>
+      <w:r>
+        <w:rPr>
+          <w:bCs/>
+          <w:b/>
+        </w:rPr>
+        <w:t xml:space="preserve">Custom</w:t>
+      </w:r>
+      <w:r>
+        <w:t xml:space="preserve"> </w:t>
+      </w:r>
+      <w:r>
+        <w:t xml:space="preserve">option at the end of each list, and its checklist holds a custom choice to the same rules as everything else.</w:t>
+      </w:r>
+    </w:p>
+    <w:bookmarkStart w:id="78" w:name="a-custom-role"/>
+    <w:p>
+      <w:pPr>
+        <w:pStyle w:val="Heading2"/>
+      </w:pPr>
+      <w:r>
+        <w:t xml:space="preserve">A custom role</w:t>
+      </w:r>
+    </w:p>
+    <w:p>
+      <w:pPr>
+        <w:pStyle w:val="FirstParagraph"/>
+      </w:pPr>
+      <w:r>
+        <w:t xml:space="preserve">A role is a concept, not a package of powers: it gives no bonus of its own. A custom one only needs a clear place in the group.</w:t>
+      </w:r>
+    </w:p>
+    <w:p>
+      <w:pPr>
+        <w:numPr>
+          <w:ilvl w:val="0"/>
+          <w:numId w:val="1011"/>
+        </w:numPr>
+        <w:pStyle w:val="Compact"/>
+      </w:pPr>
+      <w:r>
+        <w:rPr>
+          <w:bCs/>
+          <w:b/>
+        </w:rPr>
+        <w:t xml:space="preserve">Name it and describe it.</w:t>
+      </w:r>
+      <w:r>
+        <w:t xml:space="preserve"> </w:t>
+      </w:r>
+      <w:r>
+        <w:t xml:space="preserve">One sentence for what your character does that no one else does, in the style of the roles above:</w:t>
+      </w:r>
+      <w:r>
+        <w:t xml:space="preserve"> </w:t>
+      </w:r>
+      <w:r>
+        <w:rPr>
+          <w:iCs/>
+          <w:i/>
+        </w:rPr>
+        <w:t xml:space="preserve">“</w:t>
+      </w:r>
+      <w:r>
+        <w:rPr>
+          <w:iCs/>
+          <w:i/>
+        </w:rPr>
+        <w:t xml:space="preserve">Smuggler: knows every back door, bribe and hidden hold.</w:t>
+      </w:r>
+      <w:r>
+        <w:rPr>
+          <w:iCs/>
+          <w:i/>
+        </w:rPr>
+        <w:t xml:space="preserve">”</w:t>
+      </w:r>
+    </w:p>
+    <w:p>
+      <w:pPr>
+        <w:numPr>
+          <w:ilvl w:val="0"/>
+          <w:numId w:val="1011"/>
+        </w:numPr>
+        <w:pStyle w:val="Compact"/>
+      </w:pPr>
+      <w:r>
+        <w:rPr>
+          <w:bCs/>
+          <w:b/>
+        </w:rPr>
+        <w:t xml:space="preserve">Choose a group.</w:t>
+      </w:r>
+      <w:r>
+        <w:t xml:space="preserve"> </w:t>
+      </w:r>
+      <w:r>
+        <w:t xml:space="preserve">Pick the one it belongs with: one of your setting’s groups. The group only sets your sheet’s colors and emblem.</w:t>
+      </w:r>
+    </w:p>
+    <w:p>
+      <w:pPr>
+        <w:numPr>
+          <w:ilvl w:val="0"/>
+          <w:numId w:val="1011"/>
+        </w:numPr>
+        <w:pStyle w:val="Compact"/>
+      </w:pPr>
+      <w:r>
+        <w:rPr>
+          <w:bCs/>
+          <w:b/>
+        </w:rPr>
+        <w:t xml:space="preserve">Pick four core skills.</w:t>
+      </w:r>
+      <w:r>
+        <w:t xml:space="preserve"> </w:t>
+      </w:r>
+      <w:r>
+        <w:t xml:space="preserve">The skills it can’t do without. Mark them Trained yourself in step 3 (the built-in roles do this for you); they count toward your normal Trained skills.</w:t>
+      </w:r>
+    </w:p>
+    <w:p>
+      <w:pPr>
+        <w:numPr>
+          <w:ilvl w:val="0"/>
+          <w:numId w:val="1011"/>
+        </w:numPr>
+        <w:pStyle w:val="Compact"/>
+      </w:pPr>
+      <w:r>
+        <w:rPr>
+          <w:bCs/>
+          <w:b/>
+        </w:rPr>
+        <w:t xml:space="preserve">Check it with the GM.</w:t>
+      </w:r>
+      <w:r>
+        <w:t xml:space="preserve"> </w:t>
+      </w:r>
+      <w:r>
+        <w:t xml:space="preserve">It should fit the setting and overlap the existing roles as little as possible.</w:t>
+      </w:r>
+    </w:p>
+    <w:p>
+      <w:pPr>
+        <w:pStyle w:val="FirstParagraph"/>
+      </w:pPr>
+      <w:r>
+        <w:rPr>
+          <w:bCs/>
+          <w:b/>
+        </w:rPr>
+        <w:t xml:space="preserve">In the creator:</w:t>
+      </w:r>
+      <w:r>
+        <w:t xml:space="preserve"> </w:t>
+      </w:r>
+      <w:r>
+        <w:t xml:space="preserve">in step 1, choose</w:t>
+      </w:r>
+      <w:r>
+        <w:t xml:space="preserve"> </w:t>
+      </w:r>
+      <w:r>
+        <w:rPr>
+          <w:bCs/>
+          <w:b/>
+        </w:rPr>
+        <w:t xml:space="preserve">Custom role…</w:t>
+      </w:r>
+      <w:r>
+        <w:t xml:space="preserve"> </w:t>
+      </w:r>
+      <w:r>
+        <w:t xml:space="preserve">at the end of the Role list, then enter its name and group. Write the description in</w:t>
+      </w:r>
+      <w:r>
+        <w:t xml:space="preserve"> </w:t>
+      </w:r>
+      <w:r>
+        <w:rPr>
+          <w:iCs/>
+          <w:i/>
+        </w:rPr>
         <w:t xml:space="preserve">What you bring</w:t>
       </w:r>
       <w:r>
         <w:t xml:space="preserve">.</w:t>
       </w:r>
     </w:p>
-    <w:bookmarkEnd w:id="77"/>
-    <w:bookmarkStart w:id="86" w:name="a-custom-origin"/>
+    <w:bookmarkEnd w:id="78"/>
+    <w:bookmarkStart w:id="87" w:name="a-custom-origin"/>
     <w:p>
       <w:pPr>
         <w:pStyle w:val="Heading2"/>
@@ -5998,7 +6572,7 @@
         <w:t xml:space="preserve">Build it with the GM, one step at a time.</w:t>
       </w:r>
     </w:p>
-    <w:bookmarkStart w:id="78" w:name="the-concept"/>
+    <w:bookmarkStart w:id="79" w:name="the-concept"/>
     <w:p>
       <w:pPr>
         <w:pStyle w:val="Heading3"/>
@@ -6015,8 +6589,8 @@
         <w:t xml:space="preserve">Two or three sentences: where they come from, what sets them apart, and how others see them. It should be something the origins in this book don’t already cover.</w:t>
       </w:r>
     </w:p>
-    <w:bookmarkEnd w:id="78"/>
-    <w:bookmarkStart w:id="79" w:name="the-tier"/>
+    <w:bookmarkEnd w:id="79"/>
+    <w:bookmarkStart w:id="80" w:name="the-tier"/>
     <w:p>
       <w:pPr>
         <w:pStyle w:val="Heading3"/>
@@ -6313,8 +6887,8 @@
         <w:t xml:space="preserve">When in doubt, choose the higher tier.</w:t>
       </w:r>
     </w:p>
-    <w:bookmarkEnd w:id="79"/>
-    <w:bookmarkStart w:id="80" w:name="attribute-adjustments"/>
+    <w:bookmarkEnd w:id="80"/>
+    <w:bookmarkStart w:id="81" w:name="attribute-adjustments"/>
     <w:p>
       <w:pPr>
         <w:pStyle w:val="Heading3"/>
@@ -6360,8 +6934,8 @@
         <w:t xml:space="preserve">: a +2 needs a −2 or two −1s. The adjustments move the attribute’s base (+1 starts it at 11) and raise its starting maximum (13 plus the bonus). Most origins change two to four attributes.</w:t>
       </w:r>
     </w:p>
-    <w:bookmarkEnd w:id="80"/>
-    <w:bookmarkStart w:id="81" w:name="core-rules-tier-1-and-up"/>
+    <w:bookmarkEnd w:id="81"/>
+    <w:bookmarkStart w:id="82" w:name="core-rules-tier-1-and-up"/>
     <w:p>
       <w:pPr>
         <w:pStyle w:val="Heading3"/>
@@ -6378,8 +6952,8 @@
         <w:t xml:space="preserve">One to three short rules that always apply: what they can do (see in the dark, resist cold, a free Trained skill) and what it costs (a weakness, a people’s distrust, a hazard they can’t abide). A strength with no drawback is worth more than it looks, so price it a tier higher.</w:t>
       </w:r>
     </w:p>
-    <w:bookmarkEnd w:id="81"/>
-    <w:bookmarkStart w:id="82" w:name="origin-advantages"/>
+    <w:bookmarkEnd w:id="82"/>
+    <w:bookmarkStart w:id="83" w:name="origin-advantages"/>
     <w:p>
       <w:pPr>
         <w:pStyle w:val="Heading3"/>
@@ -6434,8 +7008,8 @@
         <w:t xml:space="preserve">: a problem the trait causes, with a clear trigger and a real consequence, which earns a Legend point when it bites, like any complication. A character takes one advantage, general or origin, so make them distinct choices.</w:t>
       </w:r>
     </w:p>
-    <w:bookmarkEnd w:id="82"/>
-    <w:bookmarkStart w:id="83" w:name="an-alternate-form-optional-tier-2-or-3"/>
+    <w:bookmarkEnd w:id="83"/>
+    <w:bookmarkStart w:id="84" w:name="an-alternate-form-optional-tier-2-or-3"/>
     <w:p>
       <w:pPr>
         <w:pStyle w:val="Heading3"/>
@@ -6468,8 +7042,8 @@
         <w:t xml:space="preserve">apply.</w:t>
       </w:r>
     </w:p>
-    <w:bookmarkEnd w:id="83"/>
-    <w:bookmarkStart w:id="84" w:name="in-the-creator"/>
+    <w:bookmarkEnd w:id="84"/>
+    <w:bookmarkStart w:id="85" w:name="in-the-creator"/>
     <w:p>
       <w:pPr>
         <w:pStyle w:val="Heading3"/>
@@ -6482,7 +7056,7 @@
       <w:pPr>
         <w:numPr>
           <w:ilvl w:val="0"/>
-          <w:numId w:val="1011"/>
+          <w:numId w:val="1012"/>
         </w:numPr>
         <w:pStyle w:val="Compact"/>
       </w:pPr>
@@ -6510,7 +7084,7 @@
       <w:pPr>
         <w:numPr>
           <w:ilvl w:val="0"/>
-          <w:numId w:val="1011"/>
+          <w:numId w:val="1012"/>
         </w:numPr>
         <w:pStyle w:val="Compact"/>
       </w:pPr>
@@ -6522,7 +7096,7 @@
       <w:pPr>
         <w:numPr>
           <w:ilvl w:val="0"/>
-          <w:numId w:val="1011"/>
+          <w:numId w:val="1012"/>
         </w:numPr>
         <w:pStyle w:val="Compact"/>
       </w:pPr>
@@ -6550,7 +7124,7 @@
       <w:pPr>
         <w:numPr>
           <w:ilvl w:val="0"/>
-          <w:numId w:val="1011"/>
+          <w:numId w:val="1012"/>
         </w:numPr>
         <w:pStyle w:val="Compact"/>
       </w:pPr>
@@ -6574,8 +7148,8 @@
         <w:t xml:space="preserve">and enter the advantage and its companion complication.</w:t>
       </w:r>
     </w:p>
-    <w:bookmarkEnd w:id="84"/>
-    <w:bookmarkStart w:id="85" w:name="example"/>
+    <w:bookmarkEnd w:id="85"/>
+    <w:bookmarkStart w:id="86" w:name="example"/>
     <w:p>
       <w:pPr>
         <w:pStyle w:val="Heading3"/>
@@ -6680,10 +7254,10 @@
         <w:t xml:space="preserve">: you trust your own people first; when it matters, accept the cost of that loyalty.</w:t>
       </w:r>
     </w:p>
-    <w:bookmarkEnd w:id="85"/>
     <w:bookmarkEnd w:id="86"/>
     <w:bookmarkEnd w:id="87"/>
-    <w:bookmarkStart w:id="88" w:name="complications"/>
+    <w:bookmarkEnd w:id="88"/>
+    <w:bookmarkStart w:id="89" w:name="complications"/>
     <w:p>
       <w:pPr>
         <w:pStyle w:val="Heading1"/>
@@ -6712,8 +7286,8 @@
         <w:t xml:space="preserve">Your setting pack supplies this (complications).</w:t>
       </w:r>
     </w:p>
-    <w:bookmarkEnd w:id="88"/>
-    <w:bookmarkStart w:id="90" w:name="quick-reference"/>
+    <w:bookmarkEnd w:id="89"/>
+    <w:bookmarkStart w:id="91" w:name="quick-reference"/>
     <w:p>
       <w:pPr>
         <w:pStyle w:val="Heading1"/>
@@ -6845,7 +7419,7 @@
         <w:t xml:space="preserve"> </w:t>
       </w:r>
       <w:r>
-        <w:t xml:space="preserve">move plus one action. Hit → one defense a round (Dodge, Parry or Block; −1 to −3 against a clean hit) → weapon effect. Dodge = Agility −2 plus Athletics training (+0, +1, +2). Parry −3, Block −2 plus the shield. Aim: +1. A 2-box weapon that brings you to three boxes leaves you Dying; at three boxes, another 2-box hit kills.</w:t>
+        <w:t xml:space="preserve">move plus one action. Hit → one defense a round (Dodge, Parry or Block; −1 to −3 against a clean hit) → weapon effect. Dodge = Agility −2 plus Athletics training (+0, +1, +2). Parry −3, Block −2 plus the shield. Aim: +1. Telling hit (by 5+ or natural 3–4): the attacker picks an effect; called shot −2 (small target −4). A 2-box weapon that brings you to three boxes leaves you Dying; at three boxes, another 2-box hit kills.</w:t>
       </w:r>
     </w:p>
     <w:p>
@@ -6881,7 +7455,7 @@
         <w:t xml:space="preserve"> </w:t>
       </w:r>
       <w:r>
-        <w:t xml:space="preserve">start each session with two. Reroll, reduce an injury by one box, or establish a small preparation. Earn one from an accepted complication.</w:t>
+        <w:t xml:space="preserve">start each session with two. Reroll, reduce an injury by one box, shrug off a telling hit, or establish a small preparation. Earn one from an accepted complication.</w:t>
       </w:r>
     </w:p>
     <w:p>
@@ -6904,7 +7478,7 @@
       <w:r>
         <w:t xml:space="preserve"> </w:t>
       </w:r>
-      <w:hyperlink r:id="rId89">
+      <w:hyperlink r:id="rId90">
         <w:r>
           <w:rPr>
             <w:rStyle w:val="Hyperlink"/>
@@ -6916,7 +7490,7 @@
         <w:t xml:space="preserve">. You may share, adapt, and use it for any purpose, including commercially, as long as you give appropriate credit to the author.</w:t>
       </w:r>
     </w:p>
-    <w:bookmarkEnd w:id="90"/>
+    <w:bookmarkEnd w:id="91"/>
     <w:sectPr/>
   </w:body>
 </w:document>
@@ -7206,6 +7780,9 @@
     <w:abstractNumId w:val="991"/>
   </w:num>
   <w:num w:numId="1007">
+    <w:abstractNumId w:val="991"/>
+  </w:num>
+  <w:num w:numId="1008">
     <w:abstractNumId w:val="99411"/>
     <w:lvlOverride w:ilvl="0">
       <w:startOverride w:val="1"/>
@@ -7235,38 +7812,8 @@
       <w:startOverride w:val="1"/>
     </w:lvlOverride>
   </w:num>
-  <w:num w:numId="1008">
+  <w:num w:numId="1009">
     <w:abstractNumId w:val="991"/>
-  </w:num>
-  <w:num w:numId="1009">
-    <w:abstractNumId w:val="99411"/>
-    <w:lvlOverride w:ilvl="0">
-      <w:startOverride w:val="1"/>
-    </w:lvlOverride>
-    <w:lvlOverride w:ilvl="1">
-      <w:startOverride w:val="1"/>
-    </w:lvlOverride>
-    <w:lvlOverride w:ilvl="2">
-      <w:startOverride w:val="1"/>
-    </w:lvlOverride>
-    <w:lvlOverride w:ilvl="3">
-      <w:startOverride w:val="1"/>
-    </w:lvlOverride>
-    <w:lvlOverride w:ilvl="4">
-      <w:startOverride w:val="1"/>
-    </w:lvlOverride>
-    <w:lvlOverride w:ilvl="5">
-      <w:startOverride w:val="1"/>
-    </w:lvlOverride>
-    <w:lvlOverride w:ilvl="6">
-      <w:startOverride w:val="1"/>
-    </w:lvlOverride>
-    <w:lvlOverride w:ilvl="7">
-      <w:startOverride w:val="1"/>
-    </w:lvlOverride>
-    <w:lvlOverride w:ilvl="8">
-      <w:startOverride w:val="1"/>
-    </w:lvlOverride>
   </w:num>
   <w:num w:numId="1010">
     <w:abstractNumId w:val="99411"/>
@@ -7299,6 +7846,36 @@
     </w:lvlOverride>
   </w:num>
   <w:num w:numId="1011">
+    <w:abstractNumId w:val="99411"/>
+    <w:lvlOverride w:ilvl="0">
+      <w:startOverride w:val="1"/>
+    </w:lvlOverride>
+    <w:lvlOverride w:ilvl="1">
+      <w:startOverride w:val="1"/>
+    </w:lvlOverride>
+    <w:lvlOverride w:ilvl="2">
+      <w:startOverride w:val="1"/>
+    </w:lvlOverride>
+    <w:lvlOverride w:ilvl="3">
+      <w:startOverride w:val="1"/>
+    </w:lvlOverride>
+    <w:lvlOverride w:ilvl="4">
+      <w:startOverride w:val="1"/>
+    </w:lvlOverride>
+    <w:lvlOverride w:ilvl="5">
+      <w:startOverride w:val="1"/>
+    </w:lvlOverride>
+    <w:lvlOverride w:ilvl="6">
+      <w:startOverride w:val="1"/>
+    </w:lvlOverride>
+    <w:lvlOverride w:ilvl="7">
+      <w:startOverride w:val="1"/>
+    </w:lvlOverride>
+    <w:lvlOverride w:ilvl="8">
+      <w:startOverride w:val="1"/>
+    </w:lvlOverride>
+  </w:num>
+  <w:num w:numId="1012">
     <w:abstractNumId w:val="99411"/>
     <w:lvlOverride w:ilvl="0">
       <w:startOverride w:val="1"/>

</xml_diff>

<commit_message>
Recovery: rest takes longer the worse you're hurt
Clearing one box takes a full day at 1 box, at least three days at 2, and a
week at 3, and at 3 only once someone has stabilized or treated the
character. Replaces the per-setting rest interval (restText). The Dhampir's
fast healing now clears a box a day at any level.

Co-Authored-By: Claude Opus 5.5 <noreply@anthropic.com>
Claude-Session: https://claude.ai/code/session_015SADCFzhKijkC2foUmXrpC
</commit_message>
<xml_diff>
--- a/legend-dynamics/Legend_Dynamics_Core_Rules.docx
+++ b/legend-dynamics/Legend_Dynamics_Core_Rules.docx
@@ -3894,23 +3894,175 @@
         <w:pStyle w:val="FirstParagraph"/>
       </w:pPr>
       <w:r>
-        <w:t xml:space="preserve">Each</w:t>
-      </w:r>
-      <w:r>
-        <w:t xml:space="preserve"> </w:t>
-      </w:r>
-      <w:r>
-        <w:rPr>
-          <w:bCs/>
-          <w:b/>
-        </w:rPr>
-        <w:t xml:space="preserve">full day</w:t>
-      </w:r>
-      <w:r>
-        <w:t xml:space="preserve"> </w:t>
-      </w:r>
-      <w:r>
-        <w:t xml:space="preserve">of rest clears one injury box. Rest means nothing strenuous. At three boxes, rest alone clears nothing: treatment must clear the first box.</w:t>
+        <w:t xml:space="preserve">Rest clears injury one box at a time, and the worse you’re hurt, the longer each box takes. Rest means nothing strenuous: no fighting, no hard travel, no long days of work.</w:t>
+      </w:r>
+    </w:p>
+    <w:tbl>
+      <w:tblPr>
+        <w:tblStyle w:val="Table"/>
+        <w:tblW w:type="auto" w:w="0"/>
+        <w:tblLook w:firstRow="1" w:lastRow="0" w:firstColumn="0" w:lastColumn="0" w:noHBand="0" w:noVBand="0" w:val="0020"/>
+        <w:jc w:val="start"/>
+        <w:tblBorders>
+          <w:top w:val="single" w:sz="4" w:color="B8C2D3"/>
+          <w:left w:val="single" w:sz="4" w:color="B8C2D3"/>
+          <w:bottom w:val="single" w:sz="4" w:color="B8C2D3"/>
+          <w:right w:val="single" w:sz="4" w:color="B8C2D3"/>
+          <w:insideH w:val="single" w:sz="4" w:color="B8C2D3"/>
+          <w:insideV w:val="single" w:sz="4" w:color="B8C2D3"/>
+        </w:tblBorders>
+      </w:tblPr>
+      <w:tblGrid>
+        <w:gridCol w:w="3960"/>
+        <w:gridCol w:w="3960"/>
+      </w:tblGrid>
+      <w:tr>
+        <w:trPr>
+          <w:tblHeader w:val="true"/>
+        </w:trPr>
+        <w:tc>
+          <w:tcPr>
+            <w:shd w:val="clear" w:fill="E9EEF6"/>
+          </w:tcPr>
+          <w:p>
+            <w:pPr>
+              <w:pStyle w:val="Compact"/>
+              <w:jc w:val="left"/>
+            </w:pPr>
+            <w:r>
+              <w:rPr>
+                <w:b/>
+                <w:sz w:val="19"/>
+              </w:rPr>
+              <w:t xml:space="preserve">Boxes marked</w:t>
+            </w:r>
+          </w:p>
+        </w:tc>
+        <w:tc>
+          <w:tcPr>
+            <w:shd w:val="clear" w:fill="E9EEF6"/>
+          </w:tcPr>
+          <w:p>
+            <w:pPr>
+              <w:pStyle w:val="Compact"/>
+              <w:jc w:val="left"/>
+            </w:pPr>
+            <w:r>
+              <w:rPr>
+                <w:b/>
+                <w:sz w:val="19"/>
+              </w:rPr>
+              <w:t xml:space="preserve">Rest to clear one box</w:t>
+            </w:r>
+          </w:p>
+        </w:tc>
+      </w:tr>
+      <w:tr>
+        <w:tc>
+          <w:tcPr/>
+          <w:p>
+            <w:pPr>
+              <w:pStyle w:val="Compact"/>
+              <w:jc w:val="left"/>
+            </w:pPr>
+            <w:r>
+              <w:rPr>
+                <w:b/>
+                <w:sz w:val="19"/>
+              </w:rPr>
+              <w:t xml:space="preserve">1</w:t>
+            </w:r>
+          </w:p>
+        </w:tc>
+        <w:tc>
+          <w:tcPr/>
+          <w:p>
+            <w:pPr>
+              <w:pStyle w:val="Compact"/>
+              <w:jc w:val="left"/>
+            </w:pPr>
+            <w:r>
+              <w:rPr>
+                <w:sz w:val="19"/>
+              </w:rPr>
+              <w:t xml:space="preserve">A full day</w:t>
+            </w:r>
+          </w:p>
+        </w:tc>
+      </w:tr>
+      <w:tr>
+        <w:tc>
+          <w:tcPr/>
+          <w:p>
+            <w:pPr>
+              <w:pStyle w:val="Compact"/>
+              <w:jc w:val="left"/>
+            </w:pPr>
+            <w:r>
+              <w:rPr>
+                <w:b/>
+                <w:sz w:val="19"/>
+              </w:rPr>
+              <w:t xml:space="preserve">2</w:t>
+            </w:r>
+          </w:p>
+        </w:tc>
+        <w:tc>
+          <w:tcPr/>
+          <w:p>
+            <w:pPr>
+              <w:pStyle w:val="Compact"/>
+              <w:jc w:val="left"/>
+            </w:pPr>
+            <w:r>
+              <w:rPr>
+                <w:sz w:val="19"/>
+              </w:rPr>
+              <w:t xml:space="preserve">At least three days</w:t>
+            </w:r>
+          </w:p>
+        </w:tc>
+      </w:tr>
+      <w:tr>
+        <w:tc>
+          <w:tcPr/>
+          <w:p>
+            <w:pPr>
+              <w:pStyle w:val="Compact"/>
+              <w:jc w:val="left"/>
+            </w:pPr>
+            <w:r>
+              <w:rPr>
+                <w:b/>
+                <w:sz w:val="19"/>
+              </w:rPr>
+              <w:t xml:space="preserve">3</w:t>
+            </w:r>
+          </w:p>
+        </w:tc>
+        <w:tc>
+          <w:tcPr/>
+          <w:p>
+            <w:pPr>
+              <w:pStyle w:val="Compact"/>
+              <w:jc w:val="left"/>
+            </w:pPr>
+            <w:r>
+              <w:rPr>
+                <w:sz w:val="19"/>
+              </w:rPr>
+              <w:t xml:space="preserve">A week, and only in someone’s care</w:t>
+            </w:r>
+          </w:p>
+        </w:tc>
+      </w:tr>
+    </w:tbl>
+    <w:p>
+      <w:pPr>
+        <w:pStyle w:val="BodyText"/>
+      </w:pPr>
+      <w:r>
+        <w:t xml:space="preserve">At three boxes, rest alone does nothing until someone has stabilized or treated you; after that, a week of rest in their care clears the first box. A successful treatment is faster. The times add up: from three boxes, rest alone takes about a week and a half to heal completely (a week, then three days, then a day).</w:t>
       </w:r>
     </w:p>
     <w:bookmarkEnd w:id="61"/>
@@ -7437,7 +7589,7 @@
         <w:t xml:space="preserve"> </w:t>
       </w:r>
       <w:r>
-        <w:t xml:space="preserve">stabilize in one action. Field care clears 1 box (2 on margin 5+). Proper care gives +2 and clears 2 (3 on margin 5+). Rest: one box per full day, not from three.</w:t>
+        <w:t xml:space="preserve">stabilize in one action. Field care clears 1 box (2 on margin 5+). Proper care gives +2 and clears 2 (3 on margin 5+). Rest clears a box in a day at 1 box, three days at 2, a week at 3 (in someone’s care).</w:t>
       </w:r>
     </w:p>
     <w:p>

</xml_diff>

<commit_message>
Battle map instructions: on the map and in the rules
A "How to use the map" section on the map card, written for each setting
(its point name, its units, its ship), and a Battle map section in the core
rules' Personal combat chapter, with a generated paragraph for settings
that have a ship fight.

Co-Authored-By: Claude Opus 5.5 <noreply@anthropic.com>
Claude-Session: https://claude.ai/code/session_015SADCFzhKijkC2foUmXrpC
</commit_message>
<xml_diff>
--- a/legend-dynamics/Legend_Dynamics_Core_Rules.docx
+++ b/legend-dynamics/Legend_Dynamics_Core_Rules.docx
@@ -2316,7 +2316,7 @@
     </w:p>
     <w:bookmarkEnd w:id="48"/>
     <w:bookmarkEnd w:id="49"/>
-    <w:bookmarkStart w:id="57" w:name="personal-combat"/>
+    <w:bookmarkStart w:id="58" w:name="personal-combat"/>
     <w:p>
       <w:pPr>
         <w:pStyle w:val="Heading1"/>
@@ -3816,8 +3816,179 @@
       </w:r>
     </w:p>
     <w:bookmarkEnd w:id="56"/>
+    <w:bookmarkStart w:id="57" w:name="the-battle-map"/>
+    <w:p>
+      <w:pPr>
+        <w:pStyle w:val="Heading2"/>
+      </w:pPr>
+      <w:r>
+        <w:t xml:space="preserve">The battle map</w:t>
+      </w:r>
+    </w:p>
+    <w:p>
+      <w:pPr>
+        <w:pStyle w:val="FirstParagraph"/>
+      </w:pPr>
+      <w:r>
+        <w:t xml:space="preserve">The GM view of the character creator has a</w:t>
+      </w:r>
+      <w:r>
+        <w:t xml:space="preserve"> </w:t>
+      </w:r>
+      <w:r>
+        <w:rPr>
+          <w:bCs/>
+          <w:b/>
+        </w:rPr>
+        <w:t xml:space="preserve">battle map</w:t>
+      </w:r>
+      <w:r>
+        <w:t xml:space="preserve"> </w:t>
+      </w:r>
+      <w:r>
+        <w:t xml:space="preserve">for fights where it helps to see who is where. It is a tool, not a rule: everything on it follows the rules in this chapter, and a fight without it works the same way. Open</w:t>
+      </w:r>
+      <w:r>
+        <w:t xml:space="preserve"> </w:t>
+      </w:r>
+      <w:r>
+        <w:rPr>
+          <w:bCs/>
+          <w:b/>
+        </w:rPr>
+        <w:t xml:space="preserve">How to use the map</w:t>
+      </w:r>
+      <w:r>
+        <w:t xml:space="preserve"> </w:t>
+      </w:r>
+      <w:r>
+        <w:t xml:space="preserve">on the map itself for the buttons, step by step.</w:t>
+      </w:r>
+    </w:p>
+    <w:p>
+      <w:pPr>
+        <w:pStyle w:val="BodyText"/>
+      </w:pPr>
+      <w:r>
+        <w:rPr>
+          <w:bCs/>
+          <w:b/>
+        </w:rPr>
+        <w:t xml:space="preserve">Two kinds of map.</w:t>
+      </w:r>
+    </w:p>
+    <w:p>
+      <w:pPr>
+        <w:numPr>
+          <w:ilvl w:val="0"/>
+          <w:numId w:val="1008"/>
+        </w:numPr>
+        <w:pStyle w:val="Compact"/>
+      </w:pPr>
+      <w:r>
+        <w:rPr>
+          <w:bCs/>
+          <w:b/>
+        </w:rPr>
+        <w:t xml:space="preserve">A hex map</w:t>
+      </w:r>
+      <w:r>
+        <w:t xml:space="preserve"> </w:t>
+      </w:r>
+      <w:r>
+        <w:t xml:space="preserve">for fights where position matters: cover, doorways, who can reach whom. The GM chooses what one hex is: 1 yard for a brawl in a room, 5 or 10 yards for a street, 50 for open ground. Dragging a token or measuring shows the distance and its</w:t>
+      </w:r>
+      <w:r>
+        <w:t xml:space="preserve"> </w:t>
+      </w:r>
+      <w:r>
+        <w:rPr>
+          <w:bCs/>
+          <w:b/>
+        </w:rPr>
+        <w:t xml:space="preserve">range band</w:t>
+      </w:r>
+      <w:r>
+        <w:t xml:space="preserve">, so the GM can read the penalty from the Range table above.</w:t>
+      </w:r>
+    </w:p>
+    <w:p>
+      <w:pPr>
+        <w:numPr>
+          <w:ilvl w:val="0"/>
+          <w:numId w:val="1008"/>
+        </w:numPr>
+        <w:pStyle w:val="Compact"/>
+      </w:pPr>
+      <w:r>
+        <w:rPr>
+          <w:bCs/>
+          <w:b/>
+        </w:rPr>
+        <w:t xml:space="preserve">A range track</w:t>
+      </w:r>
+      <w:r>
+        <w:t xml:space="preserve"> </w:t>
+      </w:r>
+      <w:r>
+        <w:t xml:space="preserve">for fights where only distance matters: a chase, a running fight across open country. It has a lane for the party and one for each range band. Moving a token into the next lane moves it one band in or out.</w:t>
+      </w:r>
+    </w:p>
+    <w:p>
+      <w:pPr>
+        <w:pStyle w:val="FirstParagraph"/>
+      </w:pPr>
+      <w:r>
+        <w:rPr>
+          <w:bCs/>
+          <w:b/>
+        </w:rPr>
+        <w:t xml:space="preserve">Tokens.</w:t>
+      </w:r>
+      <w:r>
+        <w:t xml:space="preserve"> </w:t>
+      </w:r>
+      <w:r>
+        <w:t xml:space="preserve">The GM places the party with one button. Their tokens stay linked to the characters in the GM view: marking Injury, Dying, the stunned condition or a Legend point on a token marks it on the character, and the other way round. Opponents come from the setting’s threats with their boxes filled in. Their pips fill as they are hurt, and a token whose boxes are all marked is taken out.</w:t>
+      </w:r>
+    </w:p>
+    <w:p>
+      <w:pPr>
+        <w:pStyle w:val="BodyText"/>
+      </w:pPr>
+      <w:r>
+        <w:rPr>
+          <w:bCs/>
+          <w:b/>
+        </w:rPr>
+        <w:t xml:space="preserve">Keeping a map.</w:t>
+      </w:r>
+      <w:r>
+        <w:t xml:space="preserve"> </w:t>
+      </w:r>
+      <w:r>
+        <w:t xml:space="preserve">The map stays in the GM’s browser.</w:t>
+      </w:r>
+      <w:r>
+        <w:t xml:space="preserve"> </w:t>
+      </w:r>
+      <w:r>
+        <w:rPr>
+          <w:bCs/>
+          <w:b/>
+        </w:rPr>
+        <w:t xml:space="preserve">Save map to file</w:t>
+      </w:r>
+      <w:r>
+        <w:t xml:space="preserve"> </w:t>
+      </w:r>
+      <w:r>
+        <w:t xml:space="preserve">keeps both maps, their pictures and tokens in one file, to prepare a fight ahead of time or share it with another GM.</w:t>
+      </w:r>
+    </w:p>
     <w:bookmarkEnd w:id="57"/>
-    <w:bookmarkStart w:id="62" w:name="medical-care"/>
+    <w:bookmarkEnd w:id="58"/>
+    <w:bookmarkStart w:id="63" w:name="medical-care"/>
     <w:p>
       <w:pPr>
         <w:pStyle w:val="Heading1"/>
@@ -3826,7 +3997,7 @@
         <w:t xml:space="preserve">Medical care</w:t>
       </w:r>
     </w:p>
-    <w:bookmarkStart w:id="58" w:name="diagnosis-and-stabilization"/>
+    <w:bookmarkStart w:id="59" w:name="diagnosis-and-stabilization"/>
     <w:p>
       <w:pPr>
         <w:pStyle w:val="Heading2"/>
@@ -3843,8 +4014,8 @@
         <w:t xml:space="preserve">Roll Medicine when the diagnosis is uncertain or an urgent treatment decision matters. Emergency stabilization takes one action and a successful Medicine roll with a medical kit. It ends Dying and stops deterioration, but removes no boxes.</w:t>
       </w:r>
     </w:p>
-    <w:bookmarkEnd w:id="58"/>
-    <w:bookmarkStart w:id="59" w:name="field-treatment"/>
+    <w:bookmarkEnd w:id="59"/>
+    <w:bookmarkStart w:id="60" w:name="field-treatment"/>
     <w:p>
       <w:pPr>
         <w:pStyle w:val="Heading2"/>
@@ -3861,8 +4032,8 @@
         <w:t xml:space="preserve">With a medical kit and several uninterrupted minutes, successful Medicine removes one injury box; success by 5 or more removes two. Each injury receives one field-treatment attempt; further attempts need changed circumstances.</w:t>
       </w:r>
     </w:p>
-    <w:bookmarkEnd w:id="59"/>
-    <w:bookmarkStart w:id="60" w:name="proper-care"/>
+    <w:bookmarkEnd w:id="60"/>
+    <w:bookmarkStart w:id="61" w:name="proper-care"/>
     <w:p>
       <w:pPr>
         <w:pStyle w:val="Heading2"/>
@@ -3879,8 +4050,8 @@
         <w:t xml:space="preserve">A proper infirmary grants +2 to Medicine. A successful treatment removes two boxes; success by 5 or more removes three. Allow the time the treatment requires.</w:t>
       </w:r>
     </w:p>
-    <w:bookmarkEnd w:id="60"/>
-    <w:bookmarkStart w:id="61" w:name="natural-recovery"/>
+    <w:bookmarkEnd w:id="61"/>
+    <w:bookmarkStart w:id="62" w:name="natural-recovery"/>
     <w:p>
       <w:pPr>
         <w:pStyle w:val="Heading2"/>
@@ -4065,9 +4236,9 @@
         <w:t xml:space="preserve">At three boxes, rest alone does nothing until someone has stabilized or treated you; after that, a week of rest in their care clears the first box. A successful treatment is faster. The times add up: from three boxes, rest alone takes about a week and a half to heal completely (a week, then three days, then a day).</w:t>
       </w:r>
     </w:p>
-    <w:bookmarkEnd w:id="61"/>
     <w:bookmarkEnd w:id="62"/>
-    <w:bookmarkStart w:id="67" w:name="magic"/>
+    <w:bookmarkEnd w:id="63"/>
+    <w:bookmarkStart w:id="68" w:name="magic"/>
     <w:p>
       <w:pPr>
         <w:pStyle w:val="Heading1"/>
@@ -4311,7 +4482,7 @@
         </w:tc>
       </w:tr>
     </w:tbl>
-    <w:bookmarkStart w:id="63" w:name="bursts"/>
+    <w:bookmarkStart w:id="64" w:name="bursts"/>
     <w:p>
       <w:pPr>
         <w:pStyle w:val="Heading2"/>
@@ -4692,8 +4863,8 @@
         <w:t xml:space="preserve">A failed burst marks a box of your setting’s price track; a natural 18 marks two, or something answers that shouldn’t.</w:t>
       </w:r>
     </w:p>
-    <w:bookmarkEnd w:id="63"/>
-    <w:bookmarkStart w:id="64" w:name="workings"/>
+    <w:bookmarkEnd w:id="64"/>
+    <w:bookmarkStart w:id="65" w:name="workings"/>
     <w:p>
       <w:pPr>
         <w:pStyle w:val="Heading2"/>
@@ -4706,7 +4877,7 @@
       <w:pPr>
         <w:numPr>
           <w:ilvl w:val="0"/>
-          <w:numId w:val="1008"/>
+          <w:numId w:val="1009"/>
         </w:numPr>
         <w:pStyle w:val="Compact"/>
       </w:pPr>
@@ -4728,7 +4899,7 @@
       <w:pPr>
         <w:numPr>
           <w:ilvl w:val="0"/>
-          <w:numId w:val="1008"/>
+          <w:numId w:val="1009"/>
         </w:numPr>
         <w:pStyle w:val="Compact"/>
       </w:pPr>
@@ -4750,7 +4921,7 @@
       <w:pPr>
         <w:numPr>
           <w:ilvl w:val="0"/>
-          <w:numId w:val="1008"/>
+          <w:numId w:val="1009"/>
         </w:numPr>
         <w:pStyle w:val="Compact"/>
       </w:pPr>
@@ -5010,8 +5181,8 @@
         <w:t xml:space="preserve">The right materials, hour or place remove one segment.</w:t>
       </w:r>
     </w:p>
-    <w:bookmarkEnd w:id="64"/>
-    <w:bookmarkStart w:id="65" w:name="charms"/>
+    <w:bookmarkEnd w:id="65"/>
+    <w:bookmarkStart w:id="66" w:name="charms"/>
     <w:p>
       <w:pPr>
         <w:pStyle w:val="Heading2"/>
@@ -5041,8 +5212,8 @@
         <w:t xml:space="preserve">. Preparation is how slow magic wins a fast fight.</w:t>
       </w:r>
     </w:p>
-    <w:bookmarkEnd w:id="65"/>
-    <w:bookmarkStart w:id="66" w:name="magic-advancement"/>
+    <w:bookmarkEnd w:id="66"/>
+    <w:bookmarkStart w:id="67" w:name="magic-advancement"/>
     <w:p>
       <w:pPr>
         <w:pStyle w:val="Heading2"/>
@@ -5549,9 +5720,9 @@
         </w:tc>
       </w:tr>
     </w:tbl>
-    <w:bookmarkEnd w:id="66"/>
     <w:bookmarkEnd w:id="67"/>
-    <w:bookmarkStart w:id="71" w:name="legend-points-and-tracks"/>
+    <w:bookmarkEnd w:id="68"/>
+    <w:bookmarkStart w:id="72" w:name="legend-points-and-tracks"/>
     <w:p>
       <w:pPr>
         <w:pStyle w:val="Heading1"/>
@@ -5560,7 +5731,7 @@
         <w:t xml:space="preserve">Legend points and tracks</w:t>
       </w:r>
     </w:p>
-    <w:bookmarkStart w:id="68" w:name="using-legend-points"/>
+    <w:bookmarkStart w:id="69" w:name="using-legend-points"/>
     <w:p>
       <w:pPr>
         <w:pStyle w:val="Heading2"/>
@@ -5778,8 +5949,8 @@
         <w:t xml:space="preserve">Gain one point when one of your complications creates a meaningful problem you accept, including a companion complication. You can decline the proposed complication without penalty.</w:t>
       </w:r>
     </w:p>
-    <w:bookmarkEnd w:id="68"/>
-    <w:bookmarkStart w:id="69" w:name="tracks"/>
+    <w:bookmarkEnd w:id="69"/>
+    <w:bookmarkStart w:id="70" w:name="tracks"/>
     <w:p>
       <w:pPr>
         <w:pStyle w:val="Heading2"/>
@@ -5800,8 +5971,8 @@
         <w:t xml:space="preserve">Your setting pack supplies this (tracks).</w:t>
       </w:r>
     </w:p>
-    <w:bookmarkEnd w:id="69"/>
-    <w:bookmarkStart w:id="70" w:name="advancement"/>
+    <w:bookmarkEnd w:id="70"/>
+    <w:bookmarkStart w:id="71" w:name="advancement"/>
     <w:p>
       <w:pPr>
         <w:pStyle w:val="Heading2"/>
@@ -5838,7 +6009,7 @@
       <w:pPr>
         <w:numPr>
           <w:ilvl w:val="0"/>
-          <w:numId w:val="1009"/>
+          <w:numId w:val="1010"/>
         </w:numPr>
         <w:pStyle w:val="Compact"/>
       </w:pPr>
@@ -5899,7 +6070,7 @@
       <w:pPr>
         <w:numPr>
           <w:ilvl w:val="0"/>
-          <w:numId w:val="1009"/>
+          <w:numId w:val="1010"/>
         </w:numPr>
         <w:pStyle w:val="Compact"/>
       </w:pPr>
@@ -6245,9 +6416,9 @@
         <w:t xml:space="preserve">Magic and powers grow the same way, at the costs their chapters give.</w:t>
       </w:r>
     </w:p>
-    <w:bookmarkEnd w:id="70"/>
     <w:bookmarkEnd w:id="71"/>
-    <w:bookmarkStart w:id="74" w:name="running-missions"/>
+    <w:bookmarkEnd w:id="72"/>
+    <w:bookmarkStart w:id="75" w:name="running-missions"/>
     <w:p>
       <w:pPr>
         <w:pStyle w:val="Heading1"/>
@@ -6256,7 +6427,7 @@
         <w:t xml:space="preserve">Running missions</w:t>
       </w:r>
     </w:p>
-    <w:bookmarkStart w:id="72" w:name="mission-seeds"/>
+    <w:bookmarkStart w:id="73" w:name="mission-seeds"/>
     <w:p>
       <w:pPr>
         <w:pStyle w:val="Heading2"/>
@@ -6285,8 +6456,8 @@
         <w:t xml:space="preserve">Your setting pack supplies this (seeds).</w:t>
       </w:r>
     </w:p>
-    <w:bookmarkEnd w:id="72"/>
-    <w:bookmarkStart w:id="73" w:name="the-journal"/>
+    <w:bookmarkEnd w:id="73"/>
+    <w:bookmarkStart w:id="74" w:name="the-journal"/>
     <w:p>
       <w:pPr>
         <w:pStyle w:val="Heading2"/>
@@ -6301,250 +6472,6 @@
       </w:pPr>
       <w:r>
         <w:t xml:space="preserve">End each mission with a short entry, written together:</w:t>
-      </w:r>
-    </w:p>
-    <w:p>
-      <w:pPr>
-        <w:numPr>
-          <w:ilvl w:val="0"/>
-          <w:numId w:val="1010"/>
-        </w:numPr>
-        <w:pStyle w:val="Compact"/>
-      </w:pPr>
-      <w:r>
-        <w:rPr>
-          <w:bCs/>
-          <w:b/>
-        </w:rPr>
-        <w:t xml:space="preserve">The mission.</w:t>
-      </w:r>
-      <w:r>
-        <w:t xml:space="preserve"> </w:t>
-      </w:r>
-      <w:r>
-        <w:t xml:space="preserve">What happened, and did we succeed: fully, partly, or not at all?</w:t>
-      </w:r>
-    </w:p>
-    <w:p>
-      <w:pPr>
-        <w:numPr>
-          <w:ilvl w:val="0"/>
-          <w:numId w:val="1010"/>
-        </w:numPr>
-        <w:pStyle w:val="Compact"/>
-      </w:pPr>
-      <w:r>
-        <w:rPr>
-          <w:bCs/>
-          <w:b/>
-        </w:rPr>
-        <w:t xml:space="preserve">Who stood out?</w:t>
-      </w:r>
-      <w:r>
-        <w:t xml:space="preserve"> </w:t>
-      </w:r>
-      <w:r>
-        <w:t xml:space="preserve">A moment worth remembering.</w:t>
-      </w:r>
-    </w:p>
-    <w:p>
-      <w:pPr>
-        <w:numPr>
-          <w:ilvl w:val="0"/>
-          <w:numId w:val="1010"/>
-        </w:numPr>
-        <w:pStyle w:val="Compact"/>
-      </w:pPr>
-      <w:r>
-        <w:rPr>
-          <w:bCs/>
-          <w:b/>
-        </w:rPr>
-        <w:t xml:space="preserve">Complications.</w:t>
-      </w:r>
-      <w:r>
-        <w:t xml:space="preserve"> </w:t>
-      </w:r>
-      <w:r>
-        <w:t xml:space="preserve">Which ones came into play, and what did they cost?</w:t>
-      </w:r>
-    </w:p>
-    <w:p>
-      <w:pPr>
-        <w:numPr>
-          <w:ilvl w:val="0"/>
-          <w:numId w:val="1010"/>
-        </w:numPr>
-        <w:pStyle w:val="Compact"/>
-      </w:pPr>
-      <w:r>
-        <w:rPr>
-          <w:bCs/>
-          <w:b/>
-        </w:rPr>
-        <w:t xml:space="preserve">What changed?</w:t>
-      </w:r>
-      <w:r>
-        <w:t xml:space="preserve"> </w:t>
-      </w:r>
-      <w:r>
-        <w:t xml:space="preserve">New allies or enemies, damage, open threads for next time.</w:t>
-      </w:r>
-    </w:p>
-    <w:p>
-      <w:pPr>
-        <w:numPr>
-          <w:ilvl w:val="0"/>
-          <w:numId w:val="1010"/>
-        </w:numPr>
-        <w:pStyle w:val="Compact"/>
-      </w:pPr>
-      <w:r>
-        <w:rPr>
-          <w:bCs/>
-          <w:b/>
-        </w:rPr>
-        <w:t xml:space="preserve">Advancement.</w:t>
-      </w:r>
-      <w:r>
-        <w:t xml:space="preserve"> </w:t>
-      </w:r>
-      <w:r>
-        <w:t xml:space="preserve">After a significant mission, each character earns 1 advancement point; at a milestone, 2 more.</w:t>
-      </w:r>
-    </w:p>
-    <w:bookmarkEnd w:id="73"/>
-    <w:bookmarkEnd w:id="74"/>
-    <w:bookmarkStart w:id="75" w:name="ready-made-characters"/>
-    <w:p>
-      <w:pPr>
-        <w:pStyle w:val="Heading1"/>
-      </w:pPr>
-      <w:r>
-        <w:t xml:space="preserve">Ready-made characters</w:t>
-      </w:r>
-    </w:p>
-    <w:p>
-      <w:pPr>
-        <w:pStyle w:val="FirstParagraph"/>
-      </w:pPr>
-      <w:r>
-        <w:t xml:space="preserve">Characters ready to play, for one-shots, new players, or a group in a hurry. Each follows the creation rules exactly, and their connections tie them together. In the creator, choose one from the ready-made list to open it and make it your own.</w:t>
-      </w:r>
-    </w:p>
-    <w:p>
-      <w:pPr>
-        <w:pStyle w:val="BodyText"/>
-      </w:pPr>
-      <w:r>
-        <w:rPr>
-          <w:iCs/>
-          <w:i/>
-        </w:rPr>
-        <w:t xml:space="preserve">Your setting pack supplies this (pregens).</w:t>
-      </w:r>
-    </w:p>
-    <w:bookmarkEnd w:id="75"/>
-    <w:bookmarkStart w:id="76" w:name="advantages"/>
-    <w:p>
-      <w:pPr>
-        <w:pStyle w:val="Heading1"/>
-      </w:pPr>
-      <w:r>
-        <w:t xml:space="preserve">Advantages</w:t>
-      </w:r>
-    </w:p>
-    <w:p>
-      <w:pPr>
-        <w:pStyle w:val="FirstParagraph"/>
-      </w:pPr>
-      <w:r>
-        <w:t xml:space="preserve">Choose one advantage at character creation: a general advantage from this chapter, or an origin advantage from the next. Each grants +2 only in the listed circumstances. An advantage does not grant training, authorize an impossible action, or replace essential gear. Use only one advantage bonus per roll.</w:t>
-      </w:r>
-    </w:p>
-    <w:p>
-      <w:pPr>
-        <w:pStyle w:val="BodyText"/>
-      </w:pPr>
-      <w:r>
-        <w:rPr>
-          <w:iCs/>
-          <w:i/>
-        </w:rPr>
-        <w:t xml:space="preserve">Your setting pack supplies this (advantages).</w:t>
-      </w:r>
-    </w:p>
-    <w:bookmarkEnd w:id="76"/>
-    <w:bookmarkStart w:id="77" w:name="origins"/>
-    <w:p>
-      <w:pPr>
-        <w:pStyle w:val="Heading1"/>
-      </w:pPr>
-      <w:r>
-        <w:t xml:space="preserve">Origins</w:t>
-      </w:r>
-    </w:p>
-    <w:p>
-      <w:pPr>
-        <w:pStyle w:val="FirstParagraph"/>
-      </w:pPr>
-      <w:r>
-        <w:rPr>
-          <w:iCs/>
-          <w:i/>
-        </w:rPr>
-        <w:t xml:space="preserve">Your setting pack supplies this (origins).</w:t>
-      </w:r>
-    </w:p>
-    <w:bookmarkEnd w:id="77"/>
-    <w:bookmarkStart w:id="88" w:name="making-your-own"/>
-    <w:p>
-      <w:pPr>
-        <w:pStyle w:val="Heading1"/>
-      </w:pPr>
-      <w:r>
-        <w:t xml:space="preserve">Making your own</w:t>
-      </w:r>
-    </w:p>
-    <w:p>
-      <w:pPr>
-        <w:pStyle w:val="FirstParagraph"/>
-      </w:pPr>
-      <w:r>
-        <w:t xml:space="preserve">The roles and origins in this book are a starting point, not a limit. With the GM’s agreement, any player can create their own role or origin. The creator has a</w:t>
-      </w:r>
-      <w:r>
-        <w:t xml:space="preserve"> </w:t>
-      </w:r>
-      <w:r>
-        <w:rPr>
-          <w:bCs/>
-          <w:b/>
-        </w:rPr>
-        <w:t xml:space="preserve">Custom</w:t>
-      </w:r>
-      <w:r>
-        <w:t xml:space="preserve"> </w:t>
-      </w:r>
-      <w:r>
-        <w:t xml:space="preserve">option at the end of each list, and its checklist holds a custom choice to the same rules as everything else.</w:t>
-      </w:r>
-    </w:p>
-    <w:bookmarkStart w:id="78" w:name="a-custom-role"/>
-    <w:p>
-      <w:pPr>
-        <w:pStyle w:val="Heading2"/>
-      </w:pPr>
-      <w:r>
-        <w:t xml:space="preserve">A custom role</w:t>
-      </w:r>
-    </w:p>
-    <w:p>
-      <w:pPr>
-        <w:pStyle w:val="FirstParagraph"/>
-      </w:pPr>
-      <w:r>
-        <w:t xml:space="preserve">A role is a concept, not a package of powers: it gives no bonus of its own. A custom one only needs a clear place in the group.</w:t>
       </w:r>
     </w:p>
     <w:p>
@@ -6560,37 +6487,13 @@
           <w:bCs/>
           <w:b/>
         </w:rPr>
-        <w:t xml:space="preserve">Name it and describe it.</w:t>
-      </w:r>
-      <w:r>
-        <w:t xml:space="preserve"> </w:t>
-      </w:r>
-      <w:r>
-        <w:t xml:space="preserve">One sentence for what your character does that no one else does, in the style of the roles above:</w:t>
-      </w:r>
-      <w:r>
-        <w:t xml:space="preserve"> </w:t>
-      </w:r>
-      <w:r>
-        <w:rPr>
-          <w:iCs/>
-          <w:i/>
-        </w:rPr>
-        <w:t xml:space="preserve">“</w:t>
-      </w:r>
-      <w:r>
-        <w:rPr>
-          <w:iCs/>
-          <w:i/>
-        </w:rPr>
-        <w:t xml:space="preserve">Smuggler: knows every back door, bribe and hidden hold.</w:t>
-      </w:r>
-      <w:r>
-        <w:rPr>
-          <w:iCs/>
-          <w:i/>
-        </w:rPr>
-        <w:t xml:space="preserve">”</w:t>
+        <w:t xml:space="preserve">The mission.</w:t>
+      </w:r>
+      <w:r>
+        <w:t xml:space="preserve"> </w:t>
+      </w:r>
+      <w:r>
+        <w:t xml:space="preserve">What happened, and did we succeed: fully, partly, or not at all?</w:t>
       </w:r>
     </w:p>
     <w:p>
@@ -6606,13 +6509,13 @@
           <w:bCs/>
           <w:b/>
         </w:rPr>
-        <w:t xml:space="preserve">Choose a group.</w:t>
-      </w:r>
-      <w:r>
-        <w:t xml:space="preserve"> </w:t>
-      </w:r>
-      <w:r>
-        <w:t xml:space="preserve">Pick the one it belongs with: one of your setting’s groups. The group only sets your sheet’s colors and emblem.</w:t>
+        <w:t xml:space="preserve">Who stood out?</w:t>
+      </w:r>
+      <w:r>
+        <w:t xml:space="preserve"> </w:t>
+      </w:r>
+      <w:r>
+        <w:t xml:space="preserve">A moment worth remembering.</w:t>
       </w:r>
     </w:p>
     <w:p>
@@ -6628,13 +6531,13 @@
           <w:bCs/>
           <w:b/>
         </w:rPr>
-        <w:t xml:space="preserve">Pick four core skills.</w:t>
-      </w:r>
-      <w:r>
-        <w:t xml:space="preserve"> </w:t>
-      </w:r>
-      <w:r>
-        <w:t xml:space="preserve">The skills it can’t do without. Mark them Trained yourself in step 3 (the built-in roles do this for you); they count toward your normal Trained skills.</w:t>
+        <w:t xml:space="preserve">Complications.</w:t>
+      </w:r>
+      <w:r>
+        <w:t xml:space="preserve"> </w:t>
+      </w:r>
+      <w:r>
+        <w:t xml:space="preserve">Which ones came into play, and what did they cost?</w:t>
       </w:r>
     </w:p>
     <w:p>
@@ -6650,13 +6553,46 @@
           <w:bCs/>
           <w:b/>
         </w:rPr>
-        <w:t xml:space="preserve">Check it with the GM.</w:t>
-      </w:r>
-      <w:r>
-        <w:t xml:space="preserve"> </w:t>
-      </w:r>
-      <w:r>
-        <w:t xml:space="preserve">It should fit the setting and overlap the existing roles as little as possible.</w:t>
+        <w:t xml:space="preserve">What changed?</w:t>
+      </w:r>
+      <w:r>
+        <w:t xml:space="preserve"> </w:t>
+      </w:r>
+      <w:r>
+        <w:t xml:space="preserve">New allies or enemies, damage, open threads for next time.</w:t>
+      </w:r>
+    </w:p>
+    <w:p>
+      <w:pPr>
+        <w:numPr>
+          <w:ilvl w:val="0"/>
+          <w:numId w:val="1011"/>
+        </w:numPr>
+        <w:pStyle w:val="Compact"/>
+      </w:pPr>
+      <w:r>
+        <w:rPr>
+          <w:bCs/>
+          <w:b/>
+        </w:rPr>
+        <w:t xml:space="preserve">Advancement.</w:t>
+      </w:r>
+      <w:r>
+        <w:t xml:space="preserve"> </w:t>
+      </w:r>
+      <w:r>
+        <w:t xml:space="preserve">After a significant mission, each character earns 1 advancement point; at a milestone, 2 more.</w:t>
+      </w:r>
+    </w:p>
+    <w:bookmarkEnd w:id="74"/>
+    <w:bookmarkEnd w:id="75"/>
+    <w:bookmarkStart w:id="76" w:name="ready-made-characters"/>
+    <w:p>
+      <w:pPr>
+        <w:pStyle w:val="Heading1"/>
+      </w:pPr>
+      <w:r>
+        <w:t xml:space="preserve">Ready-made characters</w:t>
       </w:r>
     </w:p>
     <w:p>
@@ -6664,50 +6600,285 @@
         <w:pStyle w:val="FirstParagraph"/>
       </w:pPr>
       <w:r>
-        <w:rPr>
-          <w:bCs/>
-          <w:b/>
-        </w:rPr>
-        <w:t xml:space="preserve">In the creator:</w:t>
-      </w:r>
-      <w:r>
-        <w:t xml:space="preserve"> </w:t>
-      </w:r>
-      <w:r>
-        <w:t xml:space="preserve">in step 1, choose</w:t>
-      </w:r>
-      <w:r>
-        <w:t xml:space="preserve"> </w:t>
-      </w:r>
-      <w:r>
-        <w:rPr>
-          <w:bCs/>
-          <w:b/>
-        </w:rPr>
-        <w:t xml:space="preserve">Custom role…</w:t>
-      </w:r>
-      <w:r>
-        <w:t xml:space="preserve"> </w:t>
-      </w:r>
-      <w:r>
-        <w:t xml:space="preserve">at the end of the Role list, then enter its name and group. Write the description in</w:t>
-      </w:r>
-      <w:r>
-        <w:t xml:space="preserve"> </w:t>
-      </w:r>
+        <w:t xml:space="preserve">Characters ready to play, for one-shots, new players, or a group in a hurry. Each follows the creation rules exactly, and their connections tie them together. In the creator, choose one from the ready-made list to open it and make it your own.</w:t>
+      </w:r>
+    </w:p>
+    <w:p>
+      <w:pPr>
+        <w:pStyle w:val="BodyText"/>
+      </w:pPr>
       <w:r>
         <w:rPr>
           <w:iCs/>
           <w:i/>
         </w:rPr>
+        <w:t xml:space="preserve">Your setting pack supplies this (pregens).</w:t>
+      </w:r>
+    </w:p>
+    <w:bookmarkEnd w:id="76"/>
+    <w:bookmarkStart w:id="77" w:name="advantages"/>
+    <w:p>
+      <w:pPr>
+        <w:pStyle w:val="Heading1"/>
+      </w:pPr>
+      <w:r>
+        <w:t xml:space="preserve">Advantages</w:t>
+      </w:r>
+    </w:p>
+    <w:p>
+      <w:pPr>
+        <w:pStyle w:val="FirstParagraph"/>
+      </w:pPr>
+      <w:r>
+        <w:t xml:space="preserve">Choose one advantage at character creation: a general advantage from this chapter, or an origin advantage from the next. Each grants +2 only in the listed circumstances. An advantage does not grant training, authorize an impossible action, or replace essential gear. Use only one advantage bonus per roll.</w:t>
+      </w:r>
+    </w:p>
+    <w:p>
+      <w:pPr>
+        <w:pStyle w:val="BodyText"/>
+      </w:pPr>
+      <w:r>
+        <w:rPr>
+          <w:iCs/>
+          <w:i/>
+        </w:rPr>
+        <w:t xml:space="preserve">Your setting pack supplies this (advantages).</w:t>
+      </w:r>
+    </w:p>
+    <w:bookmarkEnd w:id="77"/>
+    <w:bookmarkStart w:id="78" w:name="origins"/>
+    <w:p>
+      <w:pPr>
+        <w:pStyle w:val="Heading1"/>
+      </w:pPr>
+      <w:r>
+        <w:t xml:space="preserve">Origins</w:t>
+      </w:r>
+    </w:p>
+    <w:p>
+      <w:pPr>
+        <w:pStyle w:val="FirstParagraph"/>
+      </w:pPr>
+      <w:r>
+        <w:rPr>
+          <w:iCs/>
+          <w:i/>
+        </w:rPr>
+        <w:t xml:space="preserve">Your setting pack supplies this (origins).</w:t>
+      </w:r>
+    </w:p>
+    <w:bookmarkEnd w:id="78"/>
+    <w:bookmarkStart w:id="89" w:name="making-your-own"/>
+    <w:p>
+      <w:pPr>
+        <w:pStyle w:val="Heading1"/>
+      </w:pPr>
+      <w:r>
+        <w:t xml:space="preserve">Making your own</w:t>
+      </w:r>
+    </w:p>
+    <w:p>
+      <w:pPr>
+        <w:pStyle w:val="FirstParagraph"/>
+      </w:pPr>
+      <w:r>
+        <w:t xml:space="preserve">The roles and origins in this book are a starting point, not a limit. With the GM’s agreement, any player can create their own role or origin. The creator has a</w:t>
+      </w:r>
+      <w:r>
+        <w:t xml:space="preserve"> </w:t>
+      </w:r>
+      <w:r>
+        <w:rPr>
+          <w:bCs/>
+          <w:b/>
+        </w:rPr>
+        <w:t xml:space="preserve">Custom</w:t>
+      </w:r>
+      <w:r>
+        <w:t xml:space="preserve"> </w:t>
+      </w:r>
+      <w:r>
+        <w:t xml:space="preserve">option at the end of each list, and its checklist holds a custom choice to the same rules as everything else.</w:t>
+      </w:r>
+    </w:p>
+    <w:bookmarkStart w:id="79" w:name="a-custom-role"/>
+    <w:p>
+      <w:pPr>
+        <w:pStyle w:val="Heading2"/>
+      </w:pPr>
+      <w:r>
+        <w:t xml:space="preserve">A custom role</w:t>
+      </w:r>
+    </w:p>
+    <w:p>
+      <w:pPr>
+        <w:pStyle w:val="FirstParagraph"/>
+      </w:pPr>
+      <w:r>
+        <w:t xml:space="preserve">A role is a concept, not a package of powers: it gives no bonus of its own. A custom one only needs a clear place in the group.</w:t>
+      </w:r>
+    </w:p>
+    <w:p>
+      <w:pPr>
+        <w:numPr>
+          <w:ilvl w:val="0"/>
+          <w:numId w:val="1012"/>
+        </w:numPr>
+        <w:pStyle w:val="Compact"/>
+      </w:pPr>
+      <w:r>
+        <w:rPr>
+          <w:bCs/>
+          <w:b/>
+        </w:rPr>
+        <w:t xml:space="preserve">Name it and describe it.</w:t>
+      </w:r>
+      <w:r>
+        <w:t xml:space="preserve"> </w:t>
+      </w:r>
+      <w:r>
+        <w:t xml:space="preserve">One sentence for what your character does that no one else does, in the style of the roles above:</w:t>
+      </w:r>
+      <w:r>
+        <w:t xml:space="preserve"> </w:t>
+      </w:r>
+      <w:r>
+        <w:rPr>
+          <w:iCs/>
+          <w:i/>
+        </w:rPr>
+        <w:t xml:space="preserve">“</w:t>
+      </w:r>
+      <w:r>
+        <w:rPr>
+          <w:iCs/>
+          <w:i/>
+        </w:rPr>
+        <w:t xml:space="preserve">Smuggler: knows every back door, bribe and hidden hold.</w:t>
+      </w:r>
+      <w:r>
+        <w:rPr>
+          <w:iCs/>
+          <w:i/>
+        </w:rPr>
+        <w:t xml:space="preserve">”</w:t>
+      </w:r>
+    </w:p>
+    <w:p>
+      <w:pPr>
+        <w:numPr>
+          <w:ilvl w:val="0"/>
+          <w:numId w:val="1012"/>
+        </w:numPr>
+        <w:pStyle w:val="Compact"/>
+      </w:pPr>
+      <w:r>
+        <w:rPr>
+          <w:bCs/>
+          <w:b/>
+        </w:rPr>
+        <w:t xml:space="preserve">Choose a group.</w:t>
+      </w:r>
+      <w:r>
+        <w:t xml:space="preserve"> </w:t>
+      </w:r>
+      <w:r>
+        <w:t xml:space="preserve">Pick the one it belongs with: one of your setting’s groups. The group only sets your sheet’s colors and emblem.</w:t>
+      </w:r>
+    </w:p>
+    <w:p>
+      <w:pPr>
+        <w:numPr>
+          <w:ilvl w:val="0"/>
+          <w:numId w:val="1012"/>
+        </w:numPr>
+        <w:pStyle w:val="Compact"/>
+      </w:pPr>
+      <w:r>
+        <w:rPr>
+          <w:bCs/>
+          <w:b/>
+        </w:rPr>
+        <w:t xml:space="preserve">Pick four core skills.</w:t>
+      </w:r>
+      <w:r>
+        <w:t xml:space="preserve"> </w:t>
+      </w:r>
+      <w:r>
+        <w:t xml:space="preserve">The skills it can’t do without. Mark them Trained yourself in step 3 (the built-in roles do this for you); they count toward your normal Trained skills.</w:t>
+      </w:r>
+    </w:p>
+    <w:p>
+      <w:pPr>
+        <w:numPr>
+          <w:ilvl w:val="0"/>
+          <w:numId w:val="1012"/>
+        </w:numPr>
+        <w:pStyle w:val="Compact"/>
+      </w:pPr>
+      <w:r>
+        <w:rPr>
+          <w:bCs/>
+          <w:b/>
+        </w:rPr>
+        <w:t xml:space="preserve">Check it with the GM.</w:t>
+      </w:r>
+      <w:r>
+        <w:t xml:space="preserve"> </w:t>
+      </w:r>
+      <w:r>
+        <w:t xml:space="preserve">It should fit the setting and overlap the existing roles as little as possible.</w:t>
+      </w:r>
+    </w:p>
+    <w:p>
+      <w:pPr>
+        <w:pStyle w:val="FirstParagraph"/>
+      </w:pPr>
+      <w:r>
+        <w:rPr>
+          <w:bCs/>
+          <w:b/>
+        </w:rPr>
+        <w:t xml:space="preserve">In the creator:</w:t>
+      </w:r>
+      <w:r>
+        <w:t xml:space="preserve"> </w:t>
+      </w:r>
+      <w:r>
+        <w:t xml:space="preserve">in step 1, choose</w:t>
+      </w:r>
+      <w:r>
+        <w:t xml:space="preserve"> </w:t>
+      </w:r>
+      <w:r>
+        <w:rPr>
+          <w:bCs/>
+          <w:b/>
+        </w:rPr>
+        <w:t xml:space="preserve">Custom role…</w:t>
+      </w:r>
+      <w:r>
+        <w:t xml:space="preserve"> </w:t>
+      </w:r>
+      <w:r>
+        <w:t xml:space="preserve">at the end of the Role list, then enter its name and group. Write the description in</w:t>
+      </w:r>
+      <w:r>
+        <w:t xml:space="preserve"> </w:t>
+      </w:r>
+      <w:r>
+        <w:rPr>
+          <w:iCs/>
+          <w:i/>
+        </w:rPr>
         <w:t xml:space="preserve">What you bring</w:t>
       </w:r>
       <w:r>
         <w:t xml:space="preserve">.</w:t>
       </w:r>
     </w:p>
-    <w:bookmarkEnd w:id="78"/>
-    <w:bookmarkStart w:id="87" w:name="a-custom-origin"/>
+    <w:bookmarkEnd w:id="79"/>
+    <w:bookmarkStart w:id="88" w:name="a-custom-origin"/>
     <w:p>
       <w:pPr>
         <w:pStyle w:val="Heading2"/>
@@ -6724,7 +6895,7 @@
         <w:t xml:space="preserve">Build it with the GM, one step at a time.</w:t>
       </w:r>
     </w:p>
-    <w:bookmarkStart w:id="79" w:name="the-concept"/>
+    <w:bookmarkStart w:id="80" w:name="the-concept"/>
     <w:p>
       <w:pPr>
         <w:pStyle w:val="Heading3"/>
@@ -6741,8 +6912,8 @@
         <w:t xml:space="preserve">Two or three sentences: where they come from, what sets them apart, and how others see them. It should be something the origins in this book don’t already cover.</w:t>
       </w:r>
     </w:p>
-    <w:bookmarkEnd w:id="79"/>
-    <w:bookmarkStart w:id="80" w:name="the-tier"/>
+    <w:bookmarkEnd w:id="80"/>
+    <w:bookmarkStart w:id="81" w:name="the-tier"/>
     <w:p>
       <w:pPr>
         <w:pStyle w:val="Heading3"/>
@@ -7039,8 +7210,8 @@
         <w:t xml:space="preserve">When in doubt, choose the higher tier.</w:t>
       </w:r>
     </w:p>
-    <w:bookmarkEnd w:id="80"/>
-    <w:bookmarkStart w:id="81" w:name="attribute-adjustments"/>
+    <w:bookmarkEnd w:id="81"/>
+    <w:bookmarkStart w:id="82" w:name="attribute-adjustments"/>
     <w:p>
       <w:pPr>
         <w:pStyle w:val="Heading3"/>
@@ -7086,8 +7257,8 @@
         <w:t xml:space="preserve">: a +2 needs a −2 or two −1s. The adjustments move the attribute’s base (+1 starts it at 11) and raise its starting maximum (13 plus the bonus). Most origins change two to four attributes.</w:t>
       </w:r>
     </w:p>
-    <w:bookmarkEnd w:id="81"/>
-    <w:bookmarkStart w:id="82" w:name="core-rules-tier-1-and-up"/>
+    <w:bookmarkEnd w:id="82"/>
+    <w:bookmarkStart w:id="83" w:name="core-rules-tier-1-and-up"/>
     <w:p>
       <w:pPr>
         <w:pStyle w:val="Heading3"/>
@@ -7104,8 +7275,8 @@
         <w:t xml:space="preserve">One to three short rules that always apply: what they can do (see in the dark, resist cold, a free Trained skill) and what it costs (a weakness, a people’s distrust, a hazard they can’t abide). A strength with no drawback is worth more than it looks, so price it a tier higher.</w:t>
       </w:r>
     </w:p>
-    <w:bookmarkEnd w:id="82"/>
-    <w:bookmarkStart w:id="83" w:name="origin-advantages"/>
+    <w:bookmarkEnd w:id="83"/>
+    <w:bookmarkStart w:id="84" w:name="origin-advantages"/>
     <w:p>
       <w:pPr>
         <w:pStyle w:val="Heading3"/>
@@ -7160,8 +7331,8 @@
         <w:t xml:space="preserve">: a problem the trait causes, with a clear trigger and a real consequence, which earns a Legend point when it bites, like any complication. A character takes one advantage, general or origin, so make them distinct choices.</w:t>
       </w:r>
     </w:p>
-    <w:bookmarkEnd w:id="83"/>
-    <w:bookmarkStart w:id="84" w:name="an-alternate-form-optional-tier-2-or-3"/>
+    <w:bookmarkEnd w:id="84"/>
+    <w:bookmarkStart w:id="85" w:name="an-alternate-form-optional-tier-2-or-3"/>
     <w:p>
       <w:pPr>
         <w:pStyle w:val="Heading3"/>
@@ -7194,8 +7365,8 @@
         <w:t xml:space="preserve">apply.</w:t>
       </w:r>
     </w:p>
-    <w:bookmarkEnd w:id="84"/>
-    <w:bookmarkStart w:id="85" w:name="in-the-creator"/>
+    <w:bookmarkEnd w:id="85"/>
+    <w:bookmarkStart w:id="86" w:name="in-the-creator"/>
     <w:p>
       <w:pPr>
         <w:pStyle w:val="Heading3"/>
@@ -7208,7 +7379,7 @@
       <w:pPr>
         <w:numPr>
           <w:ilvl w:val="0"/>
-          <w:numId w:val="1012"/>
+          <w:numId w:val="1013"/>
         </w:numPr>
         <w:pStyle w:val="Compact"/>
       </w:pPr>
@@ -7236,7 +7407,7 @@
       <w:pPr>
         <w:numPr>
           <w:ilvl w:val="0"/>
-          <w:numId w:val="1012"/>
+          <w:numId w:val="1013"/>
         </w:numPr>
         <w:pStyle w:val="Compact"/>
       </w:pPr>
@@ -7248,7 +7419,7 @@
       <w:pPr>
         <w:numPr>
           <w:ilvl w:val="0"/>
-          <w:numId w:val="1012"/>
+          <w:numId w:val="1013"/>
         </w:numPr>
         <w:pStyle w:val="Compact"/>
       </w:pPr>
@@ -7276,7 +7447,7 @@
       <w:pPr>
         <w:numPr>
           <w:ilvl w:val="0"/>
-          <w:numId w:val="1012"/>
+          <w:numId w:val="1013"/>
         </w:numPr>
         <w:pStyle w:val="Compact"/>
       </w:pPr>
@@ -7300,8 +7471,8 @@
         <w:t xml:space="preserve">and enter the advantage and its companion complication.</w:t>
       </w:r>
     </w:p>
-    <w:bookmarkEnd w:id="85"/>
-    <w:bookmarkStart w:id="86" w:name="example"/>
+    <w:bookmarkEnd w:id="86"/>
+    <w:bookmarkStart w:id="87" w:name="example"/>
     <w:p>
       <w:pPr>
         <w:pStyle w:val="Heading3"/>
@@ -7406,10 +7577,10 @@
         <w:t xml:space="preserve">: you trust your own people first; when it matters, accept the cost of that loyalty.</w:t>
       </w:r>
     </w:p>
-    <w:bookmarkEnd w:id="86"/>
     <w:bookmarkEnd w:id="87"/>
     <w:bookmarkEnd w:id="88"/>
-    <w:bookmarkStart w:id="89" w:name="complications"/>
+    <w:bookmarkEnd w:id="89"/>
+    <w:bookmarkStart w:id="90" w:name="complications"/>
     <w:p>
       <w:pPr>
         <w:pStyle w:val="Heading1"/>
@@ -7438,8 +7609,8 @@
         <w:t xml:space="preserve">Your setting pack supplies this (complications).</w:t>
       </w:r>
     </w:p>
-    <w:bookmarkEnd w:id="89"/>
-    <w:bookmarkStart w:id="91" w:name="quick-reference"/>
+    <w:bookmarkEnd w:id="90"/>
+    <w:bookmarkStart w:id="92" w:name="quick-reference"/>
     <w:p>
       <w:pPr>
         <w:pStyle w:val="Heading1"/>
@@ -7630,7 +7801,7 @@
       <w:r>
         <w:t xml:space="preserve"> </w:t>
       </w:r>
-      <w:hyperlink r:id="rId90">
+      <w:hyperlink r:id="rId91">
         <w:r>
           <w:rPr>
             <w:rStyle w:val="Hyperlink"/>
@@ -7642,7 +7813,7 @@
         <w:t xml:space="preserve">. You may share, adapt, and use it for any purpose, including commercially, as long as you give appropriate credit to the author.</w:t>
       </w:r>
     </w:p>
-    <w:bookmarkEnd w:id="91"/>
+    <w:bookmarkEnd w:id="92"/>
     <w:sectPr/>
   </w:body>
 </w:document>
@@ -7935,6 +8106,9 @@
     <w:abstractNumId w:val="991"/>
   </w:num>
   <w:num w:numId="1008">
+    <w:abstractNumId w:val="991"/>
+  </w:num>
+  <w:num w:numId="1009">
     <w:abstractNumId w:val="99411"/>
     <w:lvlOverride w:ilvl="0">
       <w:startOverride w:val="1"/>
@@ -7964,38 +8138,8 @@
       <w:startOverride w:val="1"/>
     </w:lvlOverride>
   </w:num>
-  <w:num w:numId="1009">
+  <w:num w:numId="1010">
     <w:abstractNumId w:val="991"/>
-  </w:num>
-  <w:num w:numId="1010">
-    <w:abstractNumId w:val="99411"/>
-    <w:lvlOverride w:ilvl="0">
-      <w:startOverride w:val="1"/>
-    </w:lvlOverride>
-    <w:lvlOverride w:ilvl="1">
-      <w:startOverride w:val="1"/>
-    </w:lvlOverride>
-    <w:lvlOverride w:ilvl="2">
-      <w:startOverride w:val="1"/>
-    </w:lvlOverride>
-    <w:lvlOverride w:ilvl="3">
-      <w:startOverride w:val="1"/>
-    </w:lvlOverride>
-    <w:lvlOverride w:ilvl="4">
-      <w:startOverride w:val="1"/>
-    </w:lvlOverride>
-    <w:lvlOverride w:ilvl="5">
-      <w:startOverride w:val="1"/>
-    </w:lvlOverride>
-    <w:lvlOverride w:ilvl="6">
-      <w:startOverride w:val="1"/>
-    </w:lvlOverride>
-    <w:lvlOverride w:ilvl="7">
-      <w:startOverride w:val="1"/>
-    </w:lvlOverride>
-    <w:lvlOverride w:ilvl="8">
-      <w:startOverride w:val="1"/>
-    </w:lvlOverride>
   </w:num>
   <w:num w:numId="1011">
     <w:abstractNumId w:val="99411"/>
@@ -8028,6 +8172,36 @@
     </w:lvlOverride>
   </w:num>
   <w:num w:numId="1012">
+    <w:abstractNumId w:val="99411"/>
+    <w:lvlOverride w:ilvl="0">
+      <w:startOverride w:val="1"/>
+    </w:lvlOverride>
+    <w:lvlOverride w:ilvl="1">
+      <w:startOverride w:val="1"/>
+    </w:lvlOverride>
+    <w:lvlOverride w:ilvl="2">
+      <w:startOverride w:val="1"/>
+    </w:lvlOverride>
+    <w:lvlOverride w:ilvl="3">
+      <w:startOverride w:val="1"/>
+    </w:lvlOverride>
+    <w:lvlOverride w:ilvl="4">
+      <w:startOverride w:val="1"/>
+    </w:lvlOverride>
+    <w:lvlOverride w:ilvl="5">
+      <w:startOverride w:val="1"/>
+    </w:lvlOverride>
+    <w:lvlOverride w:ilvl="6">
+      <w:startOverride w:val="1"/>
+    </w:lvlOverride>
+    <w:lvlOverride w:ilvl="7">
+      <w:startOverride w:val="1"/>
+    </w:lvlOverride>
+    <w:lvlOverride w:ilvl="8">
+      <w:startOverride w:val="1"/>
+    </w:lvlOverride>
+  </w:num>
+  <w:num w:numId="1013">
     <w:abstractNumId w:val="99411"/>
     <w:lvlOverride w:ilvl="0">
       <w:startOverride w:val="1"/>

</xml_diff>

<commit_message>
Encounter panel for Pelion; guide sections for the panel; stun hits aren't telling
Pelion's GM view gets the Encounter panel (phasers on stun or kill, disruptors,
Gorn and creature attacks, Additional Defense and Hard to put down as traits).
build-guide.py inlines the panel for any game with ENCOUNTER markers. The core
rules and Pelion's guide gain a short section on the panel.

Co-Authored-By: Claude Opus 5.5 <noreply@anthropic.com>
Claude-Session: https://claude.ai/code/session_015SADCFzhKijkC2foUmXrpC
</commit_message>
<xml_diff>
--- a/legend-dynamics/Legend_Dynamics_Core_Rules.docx
+++ b/legend-dynamics/Legend_Dynamics_Core_Rules.docx
@@ -2316,7 +2316,7 @@
     </w:p>
     <w:bookmarkEnd w:id="48"/>
     <w:bookmarkEnd w:id="49"/>
-    <w:bookmarkStart w:id="58" w:name="personal-combat"/>
+    <w:bookmarkStart w:id="59" w:name="personal-combat"/>
     <w:p>
       <w:pPr>
         <w:pStyle w:val="Heading1"/>
@@ -3987,8 +3987,42 @@
       </w:r>
     </w:p>
     <w:bookmarkEnd w:id="57"/>
+    <w:bookmarkStart w:id="58" w:name="the-encounter-panel"/>
+    <w:p>
+      <w:pPr>
+        <w:pStyle w:val="Heading2"/>
+      </w:pPr>
+      <w:r>
+        <w:t xml:space="preserve">The Encounter panel</w:t>
+      </w:r>
+    </w:p>
+    <w:p>
+      <w:pPr>
+        <w:pStyle w:val="FirstParagraph"/>
+      </w:pPr>
+      <w:r>
+        <w:t xml:space="preserve">The GM view also has an</w:t>
+      </w:r>
+      <w:r>
+        <w:t xml:space="preserve"> </w:t>
+      </w:r>
+      <w:r>
+        <w:rPr>
+          <w:bCs/>
+          <w:b/>
+        </w:rPr>
+        <w:t xml:space="preserve">Encounter</w:t>
+      </w:r>
+      <w:r>
+        <w:t xml:space="preserve"> </w:t>
+      </w:r>
+      <w:r>
+        <w:t xml:space="preserve">panel that runs a fight by these rules and shows every roll. Add characters from the GM view and opponents from the Threats table (or make one up on the spot), then start: it keeps the turn order by Agility, and for each attack works out the range, the defense (Dodge, Parry or Block, one a round), the boxes marked and any telling hit, offering a Legend point choices at the moment they apply. Hits land on the character cards and the battle map, and with gritty combat on, grievous wounds are rolled and kept. The panel keeps a log and a summary of the fight, which can be saved to a file. It’s a helper, not a rule: the GM can rule any result differently, and the log says so.</w:t>
+      </w:r>
+    </w:p>
     <w:bookmarkEnd w:id="58"/>
-    <w:bookmarkStart w:id="63" w:name="medical-care"/>
+    <w:bookmarkEnd w:id="59"/>
+    <w:bookmarkStart w:id="64" w:name="medical-care"/>
     <w:p>
       <w:pPr>
         <w:pStyle w:val="Heading1"/>
@@ -3997,7 +4031,7 @@
         <w:t xml:space="preserve">Medical care</w:t>
       </w:r>
     </w:p>
-    <w:bookmarkStart w:id="59" w:name="diagnosis-and-stabilization"/>
+    <w:bookmarkStart w:id="60" w:name="diagnosis-and-stabilization"/>
     <w:p>
       <w:pPr>
         <w:pStyle w:val="Heading2"/>
@@ -4014,8 +4048,8 @@
         <w:t xml:space="preserve">Roll Medicine when the diagnosis is uncertain or an urgent treatment decision matters. Emergency stabilization takes one action and a successful Medicine roll with a medical kit. It ends Dying and stops deterioration, but removes no boxes.</w:t>
       </w:r>
     </w:p>
-    <w:bookmarkEnd w:id="59"/>
-    <w:bookmarkStart w:id="60" w:name="field-treatment"/>
+    <w:bookmarkEnd w:id="60"/>
+    <w:bookmarkStart w:id="61" w:name="field-treatment"/>
     <w:p>
       <w:pPr>
         <w:pStyle w:val="Heading2"/>
@@ -4032,8 +4066,8 @@
         <w:t xml:space="preserve">With a medical kit and several uninterrupted minutes, successful Medicine removes one injury box; success by 5 or more removes two. Each injury receives one field-treatment attempt; further attempts need changed circumstances.</w:t>
       </w:r>
     </w:p>
-    <w:bookmarkEnd w:id="60"/>
-    <w:bookmarkStart w:id="61" w:name="proper-care"/>
+    <w:bookmarkEnd w:id="61"/>
+    <w:bookmarkStart w:id="62" w:name="proper-care"/>
     <w:p>
       <w:pPr>
         <w:pStyle w:val="Heading2"/>
@@ -4050,8 +4084,8 @@
         <w:t xml:space="preserve">A proper infirmary grants +2 to Medicine. A successful treatment removes two boxes; success by 5 or more removes three. Allow the time the treatment requires.</w:t>
       </w:r>
     </w:p>
-    <w:bookmarkEnd w:id="61"/>
-    <w:bookmarkStart w:id="62" w:name="natural-recovery"/>
+    <w:bookmarkEnd w:id="62"/>
+    <w:bookmarkStart w:id="63" w:name="natural-recovery"/>
     <w:p>
       <w:pPr>
         <w:pStyle w:val="Heading2"/>
@@ -4236,9 +4270,9 @@
         <w:t xml:space="preserve">At three boxes, rest alone does nothing until someone has stabilized or treated you; after that, a week of rest in their care clears the first box. A successful treatment is faster. The times add up: from three boxes, rest alone takes about a week and a half to heal completely (a week, then three days, then a day).</w:t>
       </w:r>
     </w:p>
-    <w:bookmarkEnd w:id="62"/>
     <w:bookmarkEnd w:id="63"/>
-    <w:bookmarkStart w:id="68" w:name="magic"/>
+    <w:bookmarkEnd w:id="64"/>
+    <w:bookmarkStart w:id="69" w:name="magic"/>
     <w:p>
       <w:pPr>
         <w:pStyle w:val="Heading1"/>
@@ -4482,7 +4516,7 @@
         </w:tc>
       </w:tr>
     </w:tbl>
-    <w:bookmarkStart w:id="64" w:name="bursts"/>
+    <w:bookmarkStart w:id="65" w:name="bursts"/>
     <w:p>
       <w:pPr>
         <w:pStyle w:val="Heading2"/>
@@ -4863,8 +4897,8 @@
         <w:t xml:space="preserve">A failed burst marks a box of your setting’s price track; a natural 18 marks two, or something answers that shouldn’t.</w:t>
       </w:r>
     </w:p>
-    <w:bookmarkEnd w:id="64"/>
-    <w:bookmarkStart w:id="65" w:name="workings"/>
+    <w:bookmarkEnd w:id="65"/>
+    <w:bookmarkStart w:id="66" w:name="workings"/>
     <w:p>
       <w:pPr>
         <w:pStyle w:val="Heading2"/>
@@ -5181,8 +5215,8 @@
         <w:t xml:space="preserve">The right materials, hour or place remove one segment.</w:t>
       </w:r>
     </w:p>
-    <w:bookmarkEnd w:id="65"/>
-    <w:bookmarkStart w:id="66" w:name="charms"/>
+    <w:bookmarkEnd w:id="66"/>
+    <w:bookmarkStart w:id="67" w:name="charms"/>
     <w:p>
       <w:pPr>
         <w:pStyle w:val="Heading2"/>
@@ -5212,8 +5246,8 @@
         <w:t xml:space="preserve">. Preparation is how slow magic wins a fast fight.</w:t>
       </w:r>
     </w:p>
-    <w:bookmarkEnd w:id="66"/>
-    <w:bookmarkStart w:id="67" w:name="magic-advancement"/>
+    <w:bookmarkEnd w:id="67"/>
+    <w:bookmarkStart w:id="68" w:name="magic-advancement"/>
     <w:p>
       <w:pPr>
         <w:pStyle w:val="Heading2"/>
@@ -5720,9 +5754,9 @@
         </w:tc>
       </w:tr>
     </w:tbl>
-    <w:bookmarkEnd w:id="67"/>
     <w:bookmarkEnd w:id="68"/>
-    <w:bookmarkStart w:id="72" w:name="legend-points-and-tracks"/>
+    <w:bookmarkEnd w:id="69"/>
+    <w:bookmarkStart w:id="73" w:name="legend-points-and-tracks"/>
     <w:p>
       <w:pPr>
         <w:pStyle w:val="Heading1"/>
@@ -5731,7 +5765,7 @@
         <w:t xml:space="preserve">Legend points and tracks</w:t>
       </w:r>
     </w:p>
-    <w:bookmarkStart w:id="69" w:name="using-legend-points"/>
+    <w:bookmarkStart w:id="70" w:name="using-legend-points"/>
     <w:p>
       <w:pPr>
         <w:pStyle w:val="Heading2"/>
@@ -5949,8 +5983,8 @@
         <w:t xml:space="preserve">Gain one point when one of your complications creates a meaningful problem you accept, including a companion complication. You can decline the proposed complication without penalty.</w:t>
       </w:r>
     </w:p>
-    <w:bookmarkEnd w:id="69"/>
-    <w:bookmarkStart w:id="70" w:name="tracks"/>
+    <w:bookmarkEnd w:id="70"/>
+    <w:bookmarkStart w:id="71" w:name="tracks"/>
     <w:p>
       <w:pPr>
         <w:pStyle w:val="Heading2"/>
@@ -5971,8 +6005,8 @@
         <w:t xml:space="preserve">Your setting pack supplies this (tracks).</w:t>
       </w:r>
     </w:p>
-    <w:bookmarkEnd w:id="70"/>
-    <w:bookmarkStart w:id="71" w:name="advancement"/>
+    <w:bookmarkEnd w:id="71"/>
+    <w:bookmarkStart w:id="72" w:name="advancement"/>
     <w:p>
       <w:pPr>
         <w:pStyle w:val="Heading2"/>
@@ -6416,9 +6450,9 @@
         <w:t xml:space="preserve">Magic and powers grow the same way, at the costs their chapters give.</w:t>
       </w:r>
     </w:p>
-    <w:bookmarkEnd w:id="71"/>
     <w:bookmarkEnd w:id="72"/>
-    <w:bookmarkStart w:id="75" w:name="running-missions"/>
+    <w:bookmarkEnd w:id="73"/>
+    <w:bookmarkStart w:id="76" w:name="running-missions"/>
     <w:p>
       <w:pPr>
         <w:pStyle w:val="Heading1"/>
@@ -6427,7 +6461,7 @@
         <w:t xml:space="preserve">Running missions</w:t>
       </w:r>
     </w:p>
-    <w:bookmarkStart w:id="73" w:name="mission-seeds"/>
+    <w:bookmarkStart w:id="74" w:name="mission-seeds"/>
     <w:p>
       <w:pPr>
         <w:pStyle w:val="Heading2"/>
@@ -6456,8 +6490,8 @@
         <w:t xml:space="preserve">Your setting pack supplies this (seeds).</w:t>
       </w:r>
     </w:p>
-    <w:bookmarkEnd w:id="73"/>
-    <w:bookmarkStart w:id="74" w:name="the-journal"/>
+    <w:bookmarkEnd w:id="74"/>
+    <w:bookmarkStart w:id="75" w:name="the-journal"/>
     <w:p>
       <w:pPr>
         <w:pStyle w:val="Heading2"/>
@@ -6584,9 +6618,9 @@
         <w:t xml:space="preserve">After a significant mission, each character earns 1 advancement point; at a milestone, 2 more.</w:t>
       </w:r>
     </w:p>
-    <w:bookmarkEnd w:id="74"/>
     <w:bookmarkEnd w:id="75"/>
-    <w:bookmarkStart w:id="76" w:name="ready-made-characters"/>
+    <w:bookmarkEnd w:id="76"/>
+    <w:bookmarkStart w:id="77" w:name="ready-made-characters"/>
     <w:p>
       <w:pPr>
         <w:pStyle w:val="Heading1"/>
@@ -6615,8 +6649,8 @@
         <w:t xml:space="preserve">Your setting pack supplies this (pregens).</w:t>
       </w:r>
     </w:p>
-    <w:bookmarkEnd w:id="76"/>
-    <w:bookmarkStart w:id="77" w:name="advantages"/>
+    <w:bookmarkEnd w:id="77"/>
+    <w:bookmarkStart w:id="78" w:name="advantages"/>
     <w:p>
       <w:pPr>
         <w:pStyle w:val="Heading1"/>
@@ -6645,8 +6679,8 @@
         <w:t xml:space="preserve">Your setting pack supplies this (advantages).</w:t>
       </w:r>
     </w:p>
-    <w:bookmarkEnd w:id="77"/>
-    <w:bookmarkStart w:id="78" w:name="origins"/>
+    <w:bookmarkEnd w:id="78"/>
+    <w:bookmarkStart w:id="79" w:name="origins"/>
     <w:p>
       <w:pPr>
         <w:pStyle w:val="Heading1"/>
@@ -6667,8 +6701,8 @@
         <w:t xml:space="preserve">Your setting pack supplies this (origins).</w:t>
       </w:r>
     </w:p>
-    <w:bookmarkEnd w:id="78"/>
-    <w:bookmarkStart w:id="89" w:name="making-your-own"/>
+    <w:bookmarkEnd w:id="79"/>
+    <w:bookmarkStart w:id="90" w:name="making-your-own"/>
     <w:p>
       <w:pPr>
         <w:pStyle w:val="Heading1"/>
@@ -6701,7 +6735,7 @@
         <w:t xml:space="preserve">option at the end of each list, and its checklist holds a custom choice to the same rules as everything else.</w:t>
       </w:r>
     </w:p>
-    <w:bookmarkStart w:id="79" w:name="a-custom-role"/>
+    <w:bookmarkStart w:id="80" w:name="a-custom-role"/>
     <w:p>
       <w:pPr>
         <w:pStyle w:val="Heading2"/>
@@ -6877,8 +6911,8 @@
         <w:t xml:space="preserve">.</w:t>
       </w:r>
     </w:p>
-    <w:bookmarkEnd w:id="79"/>
-    <w:bookmarkStart w:id="88" w:name="a-custom-origin"/>
+    <w:bookmarkEnd w:id="80"/>
+    <w:bookmarkStart w:id="89" w:name="a-custom-origin"/>
     <w:p>
       <w:pPr>
         <w:pStyle w:val="Heading2"/>
@@ -6895,7 +6929,7 @@
         <w:t xml:space="preserve">Build it with the GM, one step at a time.</w:t>
       </w:r>
     </w:p>
-    <w:bookmarkStart w:id="80" w:name="the-concept"/>
+    <w:bookmarkStart w:id="81" w:name="the-concept"/>
     <w:p>
       <w:pPr>
         <w:pStyle w:val="Heading3"/>
@@ -6912,8 +6946,8 @@
         <w:t xml:space="preserve">Two or three sentences: where they come from, what sets them apart, and how others see them. It should be something the origins in this book don’t already cover.</w:t>
       </w:r>
     </w:p>
-    <w:bookmarkEnd w:id="80"/>
-    <w:bookmarkStart w:id="81" w:name="the-tier"/>
+    <w:bookmarkEnd w:id="81"/>
+    <w:bookmarkStart w:id="82" w:name="the-tier"/>
     <w:p>
       <w:pPr>
         <w:pStyle w:val="Heading3"/>
@@ -7210,8 +7244,8 @@
         <w:t xml:space="preserve">When in doubt, choose the higher tier.</w:t>
       </w:r>
     </w:p>
-    <w:bookmarkEnd w:id="81"/>
-    <w:bookmarkStart w:id="82" w:name="attribute-adjustments"/>
+    <w:bookmarkEnd w:id="82"/>
+    <w:bookmarkStart w:id="83" w:name="attribute-adjustments"/>
     <w:p>
       <w:pPr>
         <w:pStyle w:val="Heading3"/>
@@ -7257,8 +7291,8 @@
         <w:t xml:space="preserve">: a +2 needs a −2 or two −1s. The adjustments move the attribute’s base (+1 starts it at 11) and raise its starting maximum (13 plus the bonus). Most origins change two to four attributes.</w:t>
       </w:r>
     </w:p>
-    <w:bookmarkEnd w:id="82"/>
-    <w:bookmarkStart w:id="83" w:name="core-rules-tier-1-and-up"/>
+    <w:bookmarkEnd w:id="83"/>
+    <w:bookmarkStart w:id="84" w:name="core-rules-tier-1-and-up"/>
     <w:p>
       <w:pPr>
         <w:pStyle w:val="Heading3"/>
@@ -7275,8 +7309,8 @@
         <w:t xml:space="preserve">One to three short rules that always apply: what they can do (see in the dark, resist cold, a free Trained skill) and what it costs (a weakness, a people’s distrust, a hazard they can’t abide). A strength with no drawback is worth more than it looks, so price it a tier higher.</w:t>
       </w:r>
     </w:p>
-    <w:bookmarkEnd w:id="83"/>
-    <w:bookmarkStart w:id="84" w:name="origin-advantages"/>
+    <w:bookmarkEnd w:id="84"/>
+    <w:bookmarkStart w:id="85" w:name="origin-advantages"/>
     <w:p>
       <w:pPr>
         <w:pStyle w:val="Heading3"/>
@@ -7331,8 +7365,8 @@
         <w:t xml:space="preserve">: a problem the trait causes, with a clear trigger and a real consequence, which earns a Legend point when it bites, like any complication. A character takes one advantage, general or origin, so make them distinct choices.</w:t>
       </w:r>
     </w:p>
-    <w:bookmarkEnd w:id="84"/>
-    <w:bookmarkStart w:id="85" w:name="an-alternate-form-optional-tier-2-or-3"/>
+    <w:bookmarkEnd w:id="85"/>
+    <w:bookmarkStart w:id="86" w:name="an-alternate-form-optional-tier-2-or-3"/>
     <w:p>
       <w:pPr>
         <w:pStyle w:val="Heading3"/>
@@ -7365,8 +7399,8 @@
         <w:t xml:space="preserve">apply.</w:t>
       </w:r>
     </w:p>
-    <w:bookmarkEnd w:id="85"/>
-    <w:bookmarkStart w:id="86" w:name="in-the-creator"/>
+    <w:bookmarkEnd w:id="86"/>
+    <w:bookmarkStart w:id="87" w:name="in-the-creator"/>
     <w:p>
       <w:pPr>
         <w:pStyle w:val="Heading3"/>
@@ -7471,8 +7505,8 @@
         <w:t xml:space="preserve">and enter the advantage and its companion complication.</w:t>
       </w:r>
     </w:p>
-    <w:bookmarkEnd w:id="86"/>
-    <w:bookmarkStart w:id="87" w:name="example"/>
+    <w:bookmarkEnd w:id="87"/>
+    <w:bookmarkStart w:id="88" w:name="example"/>
     <w:p>
       <w:pPr>
         <w:pStyle w:val="Heading3"/>
@@ -7577,10 +7611,10 @@
         <w:t xml:space="preserve">: you trust your own people first; when it matters, accept the cost of that loyalty.</w:t>
       </w:r>
     </w:p>
-    <w:bookmarkEnd w:id="87"/>
     <w:bookmarkEnd w:id="88"/>
     <w:bookmarkEnd w:id="89"/>
-    <w:bookmarkStart w:id="90" w:name="complications"/>
+    <w:bookmarkEnd w:id="90"/>
+    <w:bookmarkStart w:id="91" w:name="complications"/>
     <w:p>
       <w:pPr>
         <w:pStyle w:val="Heading1"/>
@@ -7609,8 +7643,8 @@
         <w:t xml:space="preserve">Your setting pack supplies this (complications).</w:t>
       </w:r>
     </w:p>
-    <w:bookmarkEnd w:id="90"/>
-    <w:bookmarkStart w:id="92" w:name="quick-reference"/>
+    <w:bookmarkEnd w:id="91"/>
+    <w:bookmarkStart w:id="93" w:name="quick-reference"/>
     <w:p>
       <w:pPr>
         <w:pStyle w:val="Heading1"/>
@@ -7801,7 +7835,7 @@
       <w:r>
         <w:t xml:space="preserve"> </w:t>
       </w:r>
-      <w:hyperlink r:id="rId91">
+      <w:hyperlink r:id="rId92">
         <w:r>
           <w:rPr>
             <w:rStyle w:val="Hyperlink"/>
@@ -7813,7 +7847,7 @@
         <w:t xml:space="preserve">. You may share, adapt, and use it for any purpose, including commercially, as long as you give appropriate credit to the author.</w:t>
       </w:r>
     </w:p>
-    <w:bookmarkEnd w:id="92"/>
+    <w:bookmarkEnd w:id="93"/>
     <w:sectPr/>
   </w:body>
 </w:document>

</xml_diff>

<commit_message>
Range bands: tighter distances and a 20-yard run (held for playtest)
Short 25 yd, Medium 100, Long 300, Extreme 1,000 (was 50, 150, 500, a
mile); Close stays 10. Running now covers 20 yards, not a whole Short band.
Weapon bands, penalties and the band count are unchanged. Updates the core
rules, quick reference, battle-map measuring, the default range track and
the stagecoach chase. Not to be merged until the balance playtest is done.

Co-Authored-By: Claude Opus 5.5 <noreply@anthropic.com>
Claude-Session: https://claude.ai/code/session_015SADCFzhKijkC2foUmXrpC
</commit_message>
<xml_diff>
--- a/legend-dynamics/Legend_Dynamics_Core_Rules.docx
+++ b/legend-dynamics/Legend_Dynamics_Core_Rules.docx
@@ -4142,7 +4142,7 @@
               <w:rPr>
                 <w:sz w:val="19"/>
               </w:rPr>
-              <w:t xml:space="preserve">Up to 50 yards</w:t>
+              <w:t xml:space="preserve">Up to 25 yards</w:t>
             </w:r>
           </w:p>
         </w:tc>
@@ -4190,7 +4190,7 @@
               <w:rPr>
                 <w:sz w:val="19"/>
               </w:rPr>
-              <w:t xml:space="preserve">Up to 150 yards</w:t>
+              <w:t xml:space="preserve">Up to 100 yards</w:t>
             </w:r>
           </w:p>
         </w:tc>
@@ -4238,22 +4238,22 @@
               <w:rPr>
                 <w:sz w:val="19"/>
               </w:rPr>
-              <w:t xml:space="preserve">Up to 500 yards</w:t>
-            </w:r>
-          </w:p>
-        </w:tc>
-        <w:tc>
-          <w:tcPr/>
-          <w:p>
-            <w:pPr>
-              <w:pStyle w:val="Compact"/>
-              <w:jc w:val="left"/>
-            </w:pPr>
-            <w:r>
-              <w:rPr>
-                <w:sz w:val="19"/>
-              </w:rPr>
-              <w:t xml:space="preserve">Across a valley, a park or a harbor</w:t>
+              <w:t xml:space="preserve">Up to 300 yards</w:t>
+            </w:r>
+          </w:p>
+        </w:tc>
+        <w:tc>
+          <w:tcPr/>
+          <w:p>
+            <w:pPr>
+              <w:pStyle w:val="Compact"/>
+              <w:jc w:val="left"/>
+            </w:pPr>
+            <w:r>
+              <w:rPr>
+                <w:sz w:val="19"/>
+              </w:rPr>
+              <w:t xml:space="preserve">Across a park, a harbor or a small valley</w:t>
             </w:r>
           </w:p>
         </w:tc>
@@ -4286,7 +4286,7 @@
               <w:rPr>
                 <w:sz w:val="19"/>
               </w:rPr>
-              <w:t xml:space="preserve">Up to a mile, in line of sight</w:t>
+              <w:t xml:space="preserve">Up to 1,000 yards, in line of sight</w:t>
             </w:r>
           </w:p>
         </w:tc>
@@ -4333,7 +4333,7 @@
         <w:pStyle w:val="BodyText"/>
       </w:pPr>
       <w:r>
-        <w:t xml:space="preserve">Moving: your move each turn covers the Close band. Give up your action to run and you cover Short instead.</w:t>
+        <w:t xml:space="preserve">Moving: your move each turn covers the Close band. Give up your action to run and you cover twice that, 20 yards.</w:t>
       </w:r>
     </w:p>
     <w:bookmarkEnd w:id="58"/>

</xml_diff>

<commit_message>
Move, weapon reach, and telling-hit effects by weapon (held for playtest)
- Move: 5 yards, +1 per 2 points of Agility + Body above 20, plus the
  Athletics bonus (as for Dodge) and an origin speed adjustment (+1/-1,
  none set yet; a custom origin chooses one). Run is twice Move; threats
  move 8 yards. Shown on the sheet, the HUD, GM cards and the battle map,
  per form for shapechangers.
- Reach: every weapon in hand has 1, 2 or 3 yards, in its weapons-table
  row; the battle map's measure names the reach up close.
- Telling hits: Pin needs a weapon in hand, fists or a grapple; knock down
  needs one of those or a shot that marks 2+ boxes (taser and stunner add
  it); bare hands don't break gear. The encounter panel offers only the
  weapon's effects for a telling hit or a called shot, and the roller's
  note lists those for the skill.

Co-Authored-By: Claude Opus 5.5 <noreply@anthropic.com>
Claude-Session: https://claude.ai/code/session_015SADCFzhKijkC2foUmXrpC
</commit_message>
<xml_diff>
--- a/legend-dynamics/Legend_Dynamics_Core_Rules.docx
+++ b/legend-dynamics/Legend_Dynamics_Core_Rules.docx
@@ -1727,7 +1727,20 @@
         <w:pStyle w:val="FirstParagraph"/>
       </w:pPr>
       <w:r>
-        <w:t xml:space="preserve">Your Dodge is Agility −2, plus your Athletics training bonus: +0 if Untrained, +1 if Trained, or +2 if a Specialty or Expert. Begin uninjured, with two Legend points (three with Extra Legend) and your gear. Name your friend, or your fine weapon or tool and the one narrow use it improves, if you took those Edges. Describe one connection to another player’s character.</w:t>
+        <w:t xml:space="preserve">Your Dodge is Agility −2, plus your Athletics training bonus: +0 if Untrained, +1 if Trained, or +2 if a Specialty or Expert. Your Move is 5 yards, +1 for every 2 points of Agility + Body above 20, plus the same Athletics bonus and any origin speed adjustment (see</w:t>
+      </w:r>
+      <w:r>
+        <w:t xml:space="preserve"> </w:t>
+      </w:r>
+      <w:r>
+        <w:rPr>
+          <w:iCs/>
+          <w:i/>
+        </w:rPr>
+        <w:t xml:space="preserve">Move and reach</w:t>
+      </w:r>
+      <w:r>
+        <w:t xml:space="preserve">). Begin uninjured, with two Legend points (three with Extra Legend) and your gear. Name your friend, or your fine weapon or tool and the one narrow use it improves, if you took those Edges. Describe one connection to another player’s character.</w:t>
       </w:r>
     </w:p>
     <w:bookmarkStart w:id="34" w:name="top-10-connections-to-another-character"/>
@@ -3261,7 +3274,7 @@
     </w:p>
     <w:bookmarkEnd w:id="53"/>
     <w:bookmarkEnd w:id="54"/>
-    <w:bookmarkStart w:id="64" w:name="personal-combat"/>
+    <w:bookmarkStart w:id="65" w:name="personal-combat"/>
     <w:p>
       <w:pPr>
         <w:pStyle w:val="Heading1"/>
@@ -3284,7 +3297,23 @@
         <w:pStyle w:val="FirstParagraph"/>
       </w:pPr>
       <w:r>
-        <w:t xml:space="preserve">Act in descending Agility order. Players choose the order of tied characters; the GM resolves other ties. A round lasts a few seconds. On your turn, move a short distance (up to 10 yards: the Close band below) and take one meaningful action, such as attacking, reloading, helping, or attempting a task.</w:t>
+        <w:t xml:space="preserve">Act in descending Agility order. Players choose the order of tied characters; the GM resolves other ties. A round lasts a few seconds. On your turn, move up to your</w:t>
+      </w:r>
+      <w:r>
+        <w:t xml:space="preserve"> </w:t>
+      </w:r>
+      <w:r>
+        <w:rPr>
+          <w:bCs/>
+          <w:b/>
+        </w:rPr>
+        <w:t xml:space="preserve">Move</w:t>
+      </w:r>
+      <w:r>
+        <w:t xml:space="preserve"> </w:t>
+      </w:r>
+      <w:r>
+        <w:t xml:space="preserve">(below) and take one meaningful action, such as attacking, reloading, helping, or attempting a task.</w:t>
       </w:r>
     </w:p>
     <w:bookmarkEnd w:id="55"/>
@@ -3584,7 +3613,7 @@
         <w:t xml:space="preserve"> </w:t>
       </w:r>
       <w:r>
-        <w:t xml:space="preserve">Before rolling, name the effect you want and take −2 on the attack, or −4 for a small target (a hand, an eye, a rope, a lock). If the attack hits at all, the effect happens, whatever the margin. An advantage that rewards aiming cuts this penalty by 1.</w:t>
+        <w:t xml:space="preserve">Before rolling, name an effect your weapon can deliver and take −2 on the attack, or −4 for a small target (a hand, an eye, a rope, a lock). If the attack hits at all, the effect happens, whatever the margin. An advantage that rewards aiming cuts this penalty by 1.</w:t>
       </w:r>
     </w:p>
     <w:p>
@@ -3607,384 +3636,6 @@
       </w:r>
       <w:r>
         <w:t xml:space="preserve">Opponents land telling hits on characters too.</w:t>
-      </w:r>
-    </w:p>
-    <w:tbl>
-      <w:tblPr>
-        <w:tblStyle w:val="Table"/>
-        <w:tblW w:type="pct" w:w="5000"/>
-        <w:tblLook w:firstRow="1" w:lastRow="0" w:firstColumn="0" w:lastColumn="0" w:noHBand="0" w:noVBand="0" w:val="0020"/>
-        <w:jc w:val="start"/>
-        <w:tblBorders>
-          <w:top w:val="single" w:sz="4" w:color="B8C2D3"/>
-          <w:left w:val="single" w:sz="4" w:color="B8C2D3"/>
-          <w:bottom w:val="single" w:sz="4" w:color="B8C2D3"/>
-          <w:right w:val="single" w:sz="4" w:color="B8C2D3"/>
-          <w:insideH w:val="single" w:sz="4" w:color="B8C2D3"/>
-          <w:insideV w:val="single" w:sz="4" w:color="B8C2D3"/>
-        </w:tblBorders>
-      </w:tblPr>
-      <w:tblGrid>
-        <w:gridCol w:w="3960"/>
-        <w:gridCol w:w="3960"/>
-      </w:tblGrid>
-      <w:tr>
-        <w:trPr>
-          <w:tblHeader w:val="true"/>
-        </w:trPr>
-        <w:tc>
-          <w:tcPr>
-            <w:shd w:val="clear" w:fill="E9EEF6"/>
-          </w:tcPr>
-          <w:p>
-            <w:pPr>
-              <w:pStyle w:val="Compact"/>
-              <w:jc w:val="left"/>
-            </w:pPr>
-            <w:r>
-              <w:rPr>
-                <w:b/>
-                <w:sz w:val="19"/>
-              </w:rPr>
-              <w:t xml:space="preserve">Effect</w:t>
-            </w:r>
-          </w:p>
-        </w:tc>
-        <w:tc>
-          <w:tcPr>
-            <w:shd w:val="clear" w:fill="E9EEF6"/>
-          </w:tcPr>
-          <w:p>
-            <w:pPr>
-              <w:pStyle w:val="Compact"/>
-              <w:jc w:val="left"/>
-            </w:pPr>
-            <w:r>
-              <w:rPr>
-                <w:b/>
-                <w:sz w:val="19"/>
-              </w:rPr>
-              <w:t xml:space="preserve">What happens</w:t>
-            </w:r>
-          </w:p>
-        </w:tc>
-      </w:tr>
-      <w:tr>
-        <w:tc>
-          <w:tcPr/>
-          <w:p>
-            <w:pPr>
-              <w:pStyle w:val="Compact"/>
-              <w:jc w:val="left"/>
-            </w:pPr>
-            <w:r>
-              <w:rPr>
-                <w:b/>
-                <w:sz w:val="19"/>
-              </w:rPr>
-              <w:t xml:space="preserve">Disarm</w:t>
-            </w:r>
-          </w:p>
-        </w:tc>
-        <w:tc>
-          <w:tcPr/>
-          <w:p>
-            <w:pPr>
-              <w:pStyle w:val="Compact"/>
-              <w:jc w:val="left"/>
-            </w:pPr>
-            <w:r>
-              <w:rPr>
-                <w:sz w:val="19"/>
-              </w:rPr>
-              <w:t xml:space="preserve">The weapon or held item drops, or flies a few yards away</w:t>
-            </w:r>
-          </w:p>
-        </w:tc>
-      </w:tr>
-      <w:tr>
-        <w:tc>
-          <w:tcPr/>
-          <w:p>
-            <w:pPr>
-              <w:pStyle w:val="Compact"/>
-              <w:jc w:val="left"/>
-            </w:pPr>
-            <w:r>
-              <w:rPr>
-                <w:b/>
-                <w:sz w:val="19"/>
-              </w:rPr>
-              <w:t xml:space="preserve">Knock down</w:t>
-            </w:r>
-          </w:p>
-        </w:tc>
-        <w:tc>
-          <w:tcPr/>
-          <w:p>
-            <w:pPr>
-              <w:pStyle w:val="Compact"/>
-              <w:jc w:val="left"/>
-            </w:pPr>
-            <w:r>
-              <w:rPr>
-                <w:sz w:val="19"/>
-              </w:rPr>
-              <w:t xml:space="preserve">The target falls prone, or is driven back a few steps. Standing up uses the target’s move on their next turn; they still take their action</w:t>
-            </w:r>
-          </w:p>
-        </w:tc>
-      </w:tr>
-      <w:tr>
-        <w:tc>
-          <w:tcPr/>
-          <w:p>
-            <w:pPr>
-              <w:pStyle w:val="Compact"/>
-              <w:jc w:val="left"/>
-            </w:pPr>
-            <w:r>
-              <w:rPr>
-                <w:b/>
-                <w:sz w:val="19"/>
-              </w:rPr>
-              <w:t xml:space="preserve">Pin</w:t>
-            </w:r>
-          </w:p>
-        </w:tc>
-        <w:tc>
-          <w:tcPr/>
-          <w:p>
-            <w:pPr>
-              <w:pStyle w:val="Compact"/>
-              <w:jc w:val="left"/>
-            </w:pPr>
-            <w:r>
-              <w:rPr>
-                <w:sz w:val="19"/>
-              </w:rPr>
-              <w:t xml:space="preserve">The target is held, tangled or pinned down. Their next action goes to getting free, and then they are free: no roll needed. Keeping them pinned takes another successful attack</w:t>
-            </w:r>
-          </w:p>
-        </w:tc>
-      </w:tr>
-      <w:tr>
-        <w:tc>
-          <w:tcPr/>
-          <w:p>
-            <w:pPr>
-              <w:pStyle w:val="Compact"/>
-              <w:jc w:val="left"/>
-            </w:pPr>
-            <w:r>
-              <w:rPr>
-                <w:b/>
-                <w:sz w:val="19"/>
-              </w:rPr>
-              <w:t xml:space="preserve">Rattle</w:t>
-            </w:r>
-          </w:p>
-        </w:tc>
-        <w:tc>
-          <w:tcPr/>
-          <w:p>
-            <w:pPr>
-              <w:pStyle w:val="Compact"/>
-              <w:jc w:val="left"/>
-            </w:pPr>
-            <w:r>
-              <w:rPr>
-                <w:sz w:val="19"/>
-              </w:rPr>
-              <w:t xml:space="preserve">−2 to the target’s next roll</w:t>
-            </w:r>
-          </w:p>
-        </w:tc>
-      </w:tr>
-      <w:tr>
-        <w:tc>
-          <w:tcPr/>
-          <w:p>
-            <w:pPr>
-              <w:pStyle w:val="Compact"/>
-              <w:jc w:val="left"/>
-            </w:pPr>
-            <w:r>
-              <w:rPr>
-                <w:b/>
-                <w:sz w:val="19"/>
-              </w:rPr>
-              <w:t xml:space="preserve">Break gear</w:t>
-            </w:r>
-          </w:p>
-        </w:tc>
-        <w:tc>
-          <w:tcPr/>
-          <w:p>
-            <w:pPr>
-              <w:pStyle w:val="Compact"/>
-              <w:jc w:val="left"/>
-            </w:pPr>
-            <w:r>
-              <w:rPr>
-                <w:sz w:val="19"/>
-              </w:rPr>
-              <w:t xml:space="preserve">A weapon, shield or tool is knocked out of use (jammed, bent, unstrung, cracked) until its owner spends an action putting it right. It’s destroyed for good only if it was already vulnerable (a rotten haft, an improvised shield) or the attacker has a weakness to exploit. Armor loses 1 protection until it’s repaired</w:t>
-            </w:r>
-          </w:p>
-        </w:tc>
-      </w:tr>
-      <w:tr>
-        <w:tc>
-          <w:tcPr/>
-          <w:p>
-            <w:pPr>
-              <w:pStyle w:val="Compact"/>
-              <w:jc w:val="left"/>
-            </w:pPr>
-            <w:r>
-              <w:rPr>
-                <w:b/>
-                <w:sz w:val="19"/>
-              </w:rPr>
-              <w:t xml:space="preserve">Open them up</w:t>
-            </w:r>
-          </w:p>
-        </w:tc>
-        <w:tc>
-          <w:tcPr/>
-          <w:p>
-            <w:pPr>
-              <w:pStyle w:val="Compact"/>
-              <w:jc w:val="left"/>
-            </w:pPr>
-            <w:r>
-              <w:rPr>
-                <w:sz w:val="19"/>
-              </w:rPr>
-              <w:t xml:space="preserve">The next attack on this target this round gets +2</w:t>
-            </w:r>
-          </w:p>
-        </w:tc>
-      </w:tr>
-      <w:tr>
-        <w:tc>
-          <w:tcPr/>
-          <w:p>
-            <w:pPr>
-              <w:pStyle w:val="Compact"/>
-              <w:jc w:val="left"/>
-            </w:pPr>
-            <w:r>
-              <w:rPr>
-                <w:b/>
-                <w:sz w:val="19"/>
-              </w:rPr>
-              <w:t xml:space="preserve">Precise</w:t>
-            </w:r>
-          </w:p>
-        </w:tc>
-        <w:tc>
-          <w:tcPr/>
-          <w:p>
-            <w:pPr>
-              <w:pStyle w:val="Compact"/>
-              <w:jc w:val="left"/>
-            </w:pPr>
-            <w:r>
-              <w:rPr>
-                <w:sz w:val="19"/>
-              </w:rPr>
-              <w:t xml:space="preserve">You hit exactly what you aimed at: the lantern, the rope, the tire, the hand on the trigger. It changes the situation, never the rules: no extra boxes, no getting past a defense, no instant death</w:t>
-            </w:r>
-          </w:p>
-        </w:tc>
-      </w:tr>
-    </w:tbl>
-    <w:p>
-      <w:pPr>
-        <w:pStyle w:val="BodyText"/>
-      </w:pPr>
-      <w:r>
-        <w:rPr>
-          <w:bCs/>
-          <w:b/>
-        </w:rPr>
-        <w:t xml:space="preserve">Limits.</w:t>
-      </w:r>
-      <w:r>
-        <w:t xml:space="preserve"> </w:t>
-      </w:r>
-      <w:r>
-        <w:t xml:space="preserve">A telling hit never adds boxes and never gets past a defense. It never kills outright, disables a character for good, or destroys exceptional equipment: those come only from injury, from the</w:t>
-      </w:r>
-      <w:r>
-        <w:t xml:space="preserve"> </w:t>
-      </w:r>
-      <w:r>
-        <w:rPr>
-          <w:iCs/>
-          <w:i/>
-        </w:rPr>
-        <w:t xml:space="preserve">Dying and death</w:t>
-      </w:r>
-      <w:r>
-        <w:t xml:space="preserve"> </w:t>
-      </w:r>
-      <w:r>
-        <w:t xml:space="preserve">rules, or from an established weakness. The effect has to make sense: nobody disarms a bear or knocks down a train, and the GM can rule an effect out. Opponents who drop from one hit are already down, so a telling hit against them sets up what comes next, like sending one crashing into another.</w:t>
-      </w:r>
-    </w:p>
-    <w:p>
-      <w:pPr>
-        <w:pStyle w:val="BodyText"/>
-      </w:pPr>
-      <w:r>
-        <w:rPr>
-          <w:bCs/>
-          <w:b/>
-        </w:rPr>
-        <w:t xml:space="preserve">Staying alive.</w:t>
-      </w:r>
-      <w:r>
-        <w:t xml:space="preserve"> </w:t>
-      </w:r>
-      <w:r>
-        <w:t xml:space="preserve">A character on the receiving end can shrug off a telling hit’s effect with</w:t>
-      </w:r>
-      <w:r>
-        <w:t xml:space="preserve"> </w:t>
-      </w:r>
-      <w:r>
-        <w:rPr>
-          <w:bCs/>
-          <w:b/>
-        </w:rPr>
-        <w:t xml:space="preserve">Hard to put down</w:t>
-      </w:r>
-      <w:r>
-        <w:t xml:space="preserve"> </w:t>
-      </w:r>
-      <w:r>
-        <w:t xml:space="preserve">(once per fight) or by spending a Legend point. Either way, they still take the boxes.</w:t>
-      </w:r>
-    </w:p>
-    <w:bookmarkEnd w:id="57"/>
-    <w:bookmarkStart w:id="58" w:name="range"/>
-    <w:p>
-      <w:pPr>
-        <w:pStyle w:val="Heading2"/>
-      </w:pPr>
-      <w:r>
-        <w:t xml:space="preserve">Range</w:t>
-      </w:r>
-    </w:p>
-    <w:p>
-      <w:pPr>
-        <w:pStyle w:val="FirstParagraph"/>
-      </w:pPr>
-      <w:r>
-        <w:t xml:space="preserve">Distances fall into five bands:</w:t>
       </w:r>
     </w:p>
     <w:tbl>
@@ -4025,7 +3676,7 @@
                 <w:b/>
                 <w:sz w:val="19"/>
               </w:rPr>
-              <w:t xml:space="preserve">Band</w:t>
+              <w:t xml:space="preserve">Effect</w:t>
             </w:r>
           </w:p>
         </w:tc>
@@ -4043,7 +3694,7 @@
                 <w:b/>
                 <w:sz w:val="19"/>
               </w:rPr>
-              <w:t xml:space="preserve">Distance</w:t>
+              <w:t xml:space="preserve">With</w:t>
             </w:r>
           </w:p>
         </w:tc>
@@ -4061,7 +3712,7 @@
                 <w:b/>
                 <w:sz w:val="19"/>
               </w:rPr>
-              <w:t xml:space="preserve">For example</w:t>
+              <w:t xml:space="preserve">What happens</w:t>
             </w:r>
           </w:p>
         </w:tc>
@@ -4079,37 +3730,37 @@
                 <w:b/>
                 <w:sz w:val="19"/>
               </w:rPr>
-              <w:t xml:space="preserve">Close</w:t>
-            </w:r>
-          </w:p>
-        </w:tc>
-        <w:tc>
-          <w:tcPr/>
-          <w:p>
-            <w:pPr>
-              <w:pStyle w:val="Compact"/>
-              <w:jc w:val="left"/>
-            </w:pPr>
-            <w:r>
-              <w:rPr>
-                <w:sz w:val="19"/>
-              </w:rPr>
-              <w:t xml:space="preserve">Up to 10 yards</w:t>
-            </w:r>
-          </w:p>
-        </w:tc>
-        <w:tc>
-          <w:tcPr/>
-          <w:p>
-            <w:pPr>
-              <w:pStyle w:val="Compact"/>
-              <w:jc w:val="left"/>
-            </w:pPr>
-            <w:r>
-              <w:rPr>
-                <w:sz w:val="19"/>
-              </w:rPr>
-              <w:t xml:space="preserve">Across a room; one move covers it</w:t>
+              <w:t xml:space="preserve">Disarm</w:t>
+            </w:r>
+          </w:p>
+        </w:tc>
+        <w:tc>
+          <w:tcPr/>
+          <w:p>
+            <w:pPr>
+              <w:pStyle w:val="Compact"/>
+              <w:jc w:val="left"/>
+            </w:pPr>
+            <w:r>
+              <w:rPr>
+                <w:sz w:val="19"/>
+              </w:rPr>
+              <w:t xml:space="preserve">Any attack</w:t>
+            </w:r>
+          </w:p>
+        </w:tc>
+        <w:tc>
+          <w:tcPr/>
+          <w:p>
+            <w:pPr>
+              <w:pStyle w:val="Compact"/>
+              <w:jc w:val="left"/>
+            </w:pPr>
+            <w:r>
+              <w:rPr>
+                <w:sz w:val="19"/>
+              </w:rPr>
+              <w:t xml:space="preserve">The weapon or held item drops, or flies a few yards away</w:t>
             </w:r>
           </w:p>
         </w:tc>
@@ -4127,37 +3778,37 @@
                 <w:b/>
                 <w:sz w:val="19"/>
               </w:rPr>
-              <w:t xml:space="preserve">Short</w:t>
-            </w:r>
-          </w:p>
-        </w:tc>
-        <w:tc>
-          <w:tcPr/>
-          <w:p>
-            <w:pPr>
-              <w:pStyle w:val="Compact"/>
-              <w:jc w:val="left"/>
-            </w:pPr>
-            <w:r>
-              <w:rPr>
-                <w:sz w:val="19"/>
-              </w:rPr>
-              <w:t xml:space="preserve">Up to 25 yards</w:t>
-            </w:r>
-          </w:p>
-        </w:tc>
-        <w:tc>
-          <w:tcPr/>
-          <w:p>
-            <w:pPr>
-              <w:pStyle w:val="Compact"/>
-              <w:jc w:val="left"/>
-            </w:pPr>
-            <w:r>
-              <w:rPr>
-                <w:sz w:val="19"/>
-              </w:rPr>
-              <w:t xml:space="preserve">Across a street or a courtyard</w:t>
+              <w:t xml:space="preserve">Knock down</w:t>
+            </w:r>
+          </w:p>
+        </w:tc>
+        <w:tc>
+          <w:tcPr/>
+          <w:p>
+            <w:pPr>
+              <w:pStyle w:val="Compact"/>
+              <w:jc w:val="left"/>
+            </w:pPr>
+            <w:r>
+              <w:rPr>
+                <w:sz w:val="19"/>
+              </w:rPr>
+              <w:t xml:space="preserve">A weapon in hand or fists, or a shot or missile that marks 2 or more boxes</w:t>
+            </w:r>
+          </w:p>
+        </w:tc>
+        <w:tc>
+          <w:tcPr/>
+          <w:p>
+            <w:pPr>
+              <w:pStyle w:val="Compact"/>
+              <w:jc w:val="left"/>
+            </w:pPr>
+            <w:r>
+              <w:rPr>
+                <w:sz w:val="19"/>
+              </w:rPr>
+              <w:t xml:space="preserve">The target falls prone, or is driven back a few steps. Standing up uses the target’s move on their next turn; they still take their action</w:t>
             </w:r>
           </w:p>
         </w:tc>
@@ -4175,37 +3826,37 @@
                 <w:b/>
                 <w:sz w:val="19"/>
               </w:rPr>
-              <w:t xml:space="preserve">Medium</w:t>
-            </w:r>
-          </w:p>
-        </w:tc>
-        <w:tc>
-          <w:tcPr/>
-          <w:p>
-            <w:pPr>
-              <w:pStyle w:val="Compact"/>
-              <w:jc w:val="left"/>
-            </w:pPr>
-            <w:r>
-              <w:rPr>
-                <w:sz w:val="19"/>
-              </w:rPr>
-              <w:t xml:space="preserve">Up to 100 yards</w:t>
-            </w:r>
-          </w:p>
-        </w:tc>
-        <w:tc>
-          <w:tcPr/>
-          <w:p>
-            <w:pPr>
-              <w:pStyle w:val="Compact"/>
-              <w:jc w:val="left"/>
-            </w:pPr>
-            <w:r>
-              <w:rPr>
-                <w:sz w:val="19"/>
-              </w:rPr>
-              <w:t xml:space="preserve">A city block, a long field</w:t>
+              <w:t xml:space="preserve">Pin</w:t>
+            </w:r>
+          </w:p>
+        </w:tc>
+        <w:tc>
+          <w:tcPr/>
+          <w:p>
+            <w:pPr>
+              <w:pStyle w:val="Compact"/>
+              <w:jc w:val="left"/>
+            </w:pPr>
+            <w:r>
+              <w:rPr>
+                <w:sz w:val="19"/>
+              </w:rPr>
+              <w:t xml:space="preserve">A weapon in hand, fists or a grapple</w:t>
+            </w:r>
+          </w:p>
+        </w:tc>
+        <w:tc>
+          <w:tcPr/>
+          <w:p>
+            <w:pPr>
+              <w:pStyle w:val="Compact"/>
+              <w:jc w:val="left"/>
+            </w:pPr>
+            <w:r>
+              <w:rPr>
+                <w:sz w:val="19"/>
+              </w:rPr>
+              <w:t xml:space="preserve">The target is grabbed, held, or pinned against a wall or the ground. Their next action goes to getting free, and then they are free: no roll needed. Keeping them pinned takes another successful attack</w:t>
             </w:r>
           </w:p>
         </w:tc>
@@ -4223,37 +3874,37 @@
                 <w:b/>
                 <w:sz w:val="19"/>
               </w:rPr>
-              <w:t xml:space="preserve">Long</w:t>
-            </w:r>
-          </w:p>
-        </w:tc>
-        <w:tc>
-          <w:tcPr/>
-          <w:p>
-            <w:pPr>
-              <w:pStyle w:val="Compact"/>
-              <w:jc w:val="left"/>
-            </w:pPr>
-            <w:r>
-              <w:rPr>
-                <w:sz w:val="19"/>
-              </w:rPr>
-              <w:t xml:space="preserve">Up to 300 yards</w:t>
-            </w:r>
-          </w:p>
-        </w:tc>
-        <w:tc>
-          <w:tcPr/>
-          <w:p>
-            <w:pPr>
-              <w:pStyle w:val="Compact"/>
-              <w:jc w:val="left"/>
-            </w:pPr>
-            <w:r>
-              <w:rPr>
-                <w:sz w:val="19"/>
-              </w:rPr>
-              <w:t xml:space="preserve">Across a park, a harbor or a small valley</w:t>
+              <w:t xml:space="preserve">Rattle</w:t>
+            </w:r>
+          </w:p>
+        </w:tc>
+        <w:tc>
+          <w:tcPr/>
+          <w:p>
+            <w:pPr>
+              <w:pStyle w:val="Compact"/>
+              <w:jc w:val="left"/>
+            </w:pPr>
+            <w:r>
+              <w:rPr>
+                <w:sz w:val="19"/>
+              </w:rPr>
+              <w:t xml:space="preserve">Any attack</w:t>
+            </w:r>
+          </w:p>
+        </w:tc>
+        <w:tc>
+          <w:tcPr/>
+          <w:p>
+            <w:pPr>
+              <w:pStyle w:val="Compact"/>
+              <w:jc w:val="left"/>
+            </w:pPr>
+            <w:r>
+              <w:rPr>
+                <w:sz w:val="19"/>
+              </w:rPr>
+              <w:t xml:space="preserve">−2 to the target’s next roll</w:t>
             </w:r>
           </w:p>
         </w:tc>
@@ -4271,37 +3922,133 @@
                 <w:b/>
                 <w:sz w:val="19"/>
               </w:rPr>
-              <w:t xml:space="preserve">Extreme</w:t>
-            </w:r>
-          </w:p>
-        </w:tc>
-        <w:tc>
-          <w:tcPr/>
-          <w:p>
-            <w:pPr>
-              <w:pStyle w:val="Compact"/>
-              <w:jc w:val="left"/>
-            </w:pPr>
-            <w:r>
-              <w:rPr>
-                <w:sz w:val="19"/>
-              </w:rPr>
-              <w:t xml:space="preserve">Up to 1,000 yards, in line of sight</w:t>
-            </w:r>
-          </w:p>
-        </w:tc>
-        <w:tc>
-          <w:tcPr/>
-          <w:p>
-            <w:pPr>
-              <w:pStyle w:val="Compact"/>
-              <w:jc w:val="left"/>
-            </w:pPr>
-            <w:r>
-              <w:rPr>
-                <w:sz w:val="19"/>
-              </w:rPr>
-              <w:t xml:space="preserve">Rooftop to rooftop across a town</w:t>
+              <w:t xml:space="preserve">Break gear</w:t>
+            </w:r>
+          </w:p>
+        </w:tc>
+        <w:tc>
+          <w:tcPr/>
+          <w:p>
+            <w:pPr>
+              <w:pStyle w:val="Compact"/>
+              <w:jc w:val="left"/>
+            </w:pPr>
+            <w:r>
+              <w:rPr>
+                <w:sz w:val="19"/>
+              </w:rPr>
+              <w:t xml:space="preserve">Any attack but bare hands and natural weapons</w:t>
+            </w:r>
+          </w:p>
+        </w:tc>
+        <w:tc>
+          <w:tcPr/>
+          <w:p>
+            <w:pPr>
+              <w:pStyle w:val="Compact"/>
+              <w:jc w:val="left"/>
+            </w:pPr>
+            <w:r>
+              <w:rPr>
+                <w:sz w:val="19"/>
+              </w:rPr>
+              <w:t xml:space="preserve">A weapon, shield or tool is knocked out of use (jammed, bent, unstrung, cracked) until its owner spends an action putting it right. It’s destroyed for good only if it was already vulnerable (a rotten haft, an improvised shield) or the attacker has a weakness to exploit. Armor loses 1 protection until it’s repaired</w:t>
+            </w:r>
+          </w:p>
+        </w:tc>
+      </w:tr>
+      <w:tr>
+        <w:tc>
+          <w:tcPr/>
+          <w:p>
+            <w:pPr>
+              <w:pStyle w:val="Compact"/>
+              <w:jc w:val="left"/>
+            </w:pPr>
+            <w:r>
+              <w:rPr>
+                <w:b/>
+                <w:sz w:val="19"/>
+              </w:rPr>
+              <w:t xml:space="preserve">Open them up</w:t>
+            </w:r>
+          </w:p>
+        </w:tc>
+        <w:tc>
+          <w:tcPr/>
+          <w:p>
+            <w:pPr>
+              <w:pStyle w:val="Compact"/>
+              <w:jc w:val="left"/>
+            </w:pPr>
+            <w:r>
+              <w:rPr>
+                <w:sz w:val="19"/>
+              </w:rPr>
+              <w:t xml:space="preserve">Any attack</w:t>
+            </w:r>
+          </w:p>
+        </w:tc>
+        <w:tc>
+          <w:tcPr/>
+          <w:p>
+            <w:pPr>
+              <w:pStyle w:val="Compact"/>
+              <w:jc w:val="left"/>
+            </w:pPr>
+            <w:r>
+              <w:rPr>
+                <w:sz w:val="19"/>
+              </w:rPr>
+              <w:t xml:space="preserve">The next attack on this target this round gets +2</w:t>
+            </w:r>
+          </w:p>
+        </w:tc>
+      </w:tr>
+      <w:tr>
+        <w:tc>
+          <w:tcPr/>
+          <w:p>
+            <w:pPr>
+              <w:pStyle w:val="Compact"/>
+              <w:jc w:val="left"/>
+            </w:pPr>
+            <w:r>
+              <w:rPr>
+                <w:b/>
+                <w:sz w:val="19"/>
+              </w:rPr>
+              <w:t xml:space="preserve">Precise</w:t>
+            </w:r>
+          </w:p>
+        </w:tc>
+        <w:tc>
+          <w:tcPr/>
+          <w:p>
+            <w:pPr>
+              <w:pStyle w:val="Compact"/>
+              <w:jc w:val="left"/>
+            </w:pPr>
+            <w:r>
+              <w:rPr>
+                <w:sz w:val="19"/>
+              </w:rPr>
+              <w:t xml:space="preserve">Any attack</w:t>
+            </w:r>
+          </w:p>
+        </w:tc>
+        <w:tc>
+          <w:tcPr/>
+          <w:p>
+            <w:pPr>
+              <w:pStyle w:val="Compact"/>
+              <w:jc w:val="left"/>
+            </w:pPr>
+            <w:r>
+              <w:rPr>
+                <w:sz w:val="19"/>
+              </w:rPr>
+              <w:t xml:space="preserve">You hit exactly what you aimed at: the lantern, the rope, the tire, the hand on the trigger. It changes the situation, never the rules: no extra boxes, no getting past a defense, no instant death</w:t>
             </w:r>
           </w:p>
         </w:tc>
@@ -4312,6 +4059,428 @@
         <w:pStyle w:val="BodyText"/>
       </w:pPr>
       <w:r>
+        <w:rPr>
+          <w:bCs/>
+          <w:b/>
+        </w:rPr>
+        <w:t xml:space="preserve">Limits.</w:t>
+      </w:r>
+      <w:r>
+        <w:t xml:space="preserve"> </w:t>
+      </w:r>
+      <w:r>
+        <w:t xml:space="preserve">A telling hit never adds boxes and never gets past a defense. It never kills outright, disables a character for good, or destroys exceptional equipment: those come only from injury, from the</w:t>
+      </w:r>
+      <w:r>
+        <w:t xml:space="preserve"> </w:t>
+      </w:r>
+      <w:r>
+        <w:rPr>
+          <w:iCs/>
+          <w:i/>
+        </w:rPr>
+        <w:t xml:space="preserve">Dying and death</w:t>
+      </w:r>
+      <w:r>
+        <w:t xml:space="preserve"> </w:t>
+      </w:r>
+      <w:r>
+        <w:t xml:space="preserve">rules, or from an established weakness. Only the effects a weapon can deliver are open to it (the</w:t>
+      </w:r>
+      <w:r>
+        <w:t xml:space="preserve"> </w:t>
+      </w:r>
+      <w:r>
+        <w:rPr>
+          <w:iCs/>
+          <w:i/>
+        </w:rPr>
+        <w:t xml:space="preserve">With</w:t>
+      </w:r>
+      <w:r>
+        <w:t xml:space="preserve"> </w:t>
+      </w:r>
+      <w:r>
+        <w:t xml:space="preserve">column; a weapon’s entry may add one, as a taser knocks down). Keeping someone’s head down with gunfire isn’t a pin: that’s cover and a threat. The effect still has to make sense: nobody disarms a bear or knocks down a train, and the GM can rule an effect out. Opponents who drop from one hit are already down, so a telling hit against them sets up what comes next, like sending one crashing into another.</w:t>
+      </w:r>
+    </w:p>
+    <w:p>
+      <w:pPr>
+        <w:pStyle w:val="BodyText"/>
+      </w:pPr>
+      <w:r>
+        <w:rPr>
+          <w:bCs/>
+          <w:b/>
+        </w:rPr>
+        <w:t xml:space="preserve">Staying alive.</w:t>
+      </w:r>
+      <w:r>
+        <w:t xml:space="preserve"> </w:t>
+      </w:r>
+      <w:r>
+        <w:t xml:space="preserve">A character on the receiving end can shrug off a telling hit’s effect with</w:t>
+      </w:r>
+      <w:r>
+        <w:t xml:space="preserve"> </w:t>
+      </w:r>
+      <w:r>
+        <w:rPr>
+          <w:bCs/>
+          <w:b/>
+        </w:rPr>
+        <w:t xml:space="preserve">Hard to put down</w:t>
+      </w:r>
+      <w:r>
+        <w:t xml:space="preserve"> </w:t>
+      </w:r>
+      <w:r>
+        <w:t xml:space="preserve">(once per fight) or by spending a Legend point. Either way, they still take the boxes.</w:t>
+      </w:r>
+    </w:p>
+    <w:bookmarkEnd w:id="57"/>
+    <w:bookmarkStart w:id="58" w:name="range"/>
+    <w:p>
+      <w:pPr>
+        <w:pStyle w:val="Heading2"/>
+      </w:pPr>
+      <w:r>
+        <w:t xml:space="preserve">Range</w:t>
+      </w:r>
+    </w:p>
+    <w:p>
+      <w:pPr>
+        <w:pStyle w:val="FirstParagraph"/>
+      </w:pPr>
+      <w:r>
+        <w:t xml:space="preserve">Distances fall into five bands:</w:t>
+      </w:r>
+    </w:p>
+    <w:tbl>
+      <w:tblPr>
+        <w:tblStyle w:val="Table"/>
+        <w:tblW w:type="pct" w:w="5000"/>
+        <w:tblLook w:firstRow="1" w:lastRow="0" w:firstColumn="0" w:lastColumn="0" w:noHBand="0" w:noVBand="0" w:val="0020"/>
+        <w:jc w:val="start"/>
+        <w:tblBorders>
+          <w:top w:val="single" w:sz="4" w:color="B8C2D3"/>
+          <w:left w:val="single" w:sz="4" w:color="B8C2D3"/>
+          <w:bottom w:val="single" w:sz="4" w:color="B8C2D3"/>
+          <w:right w:val="single" w:sz="4" w:color="B8C2D3"/>
+          <w:insideH w:val="single" w:sz="4" w:color="B8C2D3"/>
+          <w:insideV w:val="single" w:sz="4" w:color="B8C2D3"/>
+        </w:tblBorders>
+      </w:tblPr>
+      <w:tblGrid>
+        <w:gridCol w:w="2640"/>
+        <w:gridCol w:w="2640"/>
+        <w:gridCol w:w="2640"/>
+      </w:tblGrid>
+      <w:tr>
+        <w:trPr>
+          <w:tblHeader w:val="true"/>
+        </w:trPr>
+        <w:tc>
+          <w:tcPr>
+            <w:shd w:val="clear" w:fill="E9EEF6"/>
+          </w:tcPr>
+          <w:p>
+            <w:pPr>
+              <w:pStyle w:val="Compact"/>
+              <w:jc w:val="left"/>
+            </w:pPr>
+            <w:r>
+              <w:rPr>
+                <w:b/>
+                <w:sz w:val="19"/>
+              </w:rPr>
+              <w:t xml:space="preserve">Band</w:t>
+            </w:r>
+          </w:p>
+        </w:tc>
+        <w:tc>
+          <w:tcPr>
+            <w:shd w:val="clear" w:fill="E9EEF6"/>
+          </w:tcPr>
+          <w:p>
+            <w:pPr>
+              <w:pStyle w:val="Compact"/>
+              <w:jc w:val="left"/>
+            </w:pPr>
+            <w:r>
+              <w:rPr>
+                <w:b/>
+                <w:sz w:val="19"/>
+              </w:rPr>
+              <w:t xml:space="preserve">Distance</w:t>
+            </w:r>
+          </w:p>
+        </w:tc>
+        <w:tc>
+          <w:tcPr>
+            <w:shd w:val="clear" w:fill="E9EEF6"/>
+          </w:tcPr>
+          <w:p>
+            <w:pPr>
+              <w:pStyle w:val="Compact"/>
+              <w:jc w:val="left"/>
+            </w:pPr>
+            <w:r>
+              <w:rPr>
+                <w:b/>
+                <w:sz w:val="19"/>
+              </w:rPr>
+              <w:t xml:space="preserve">For example</w:t>
+            </w:r>
+          </w:p>
+        </w:tc>
+      </w:tr>
+      <w:tr>
+        <w:tc>
+          <w:tcPr/>
+          <w:p>
+            <w:pPr>
+              <w:pStyle w:val="Compact"/>
+              <w:jc w:val="left"/>
+            </w:pPr>
+            <w:r>
+              <w:rPr>
+                <w:b/>
+                <w:sz w:val="19"/>
+              </w:rPr>
+              <w:t xml:space="preserve">Close</w:t>
+            </w:r>
+          </w:p>
+        </w:tc>
+        <w:tc>
+          <w:tcPr/>
+          <w:p>
+            <w:pPr>
+              <w:pStyle w:val="Compact"/>
+              <w:jc w:val="left"/>
+            </w:pPr>
+            <w:r>
+              <w:rPr>
+                <w:sz w:val="19"/>
+              </w:rPr>
+              <w:t xml:space="preserve">Up to 10 yards</w:t>
+            </w:r>
+          </w:p>
+        </w:tc>
+        <w:tc>
+          <w:tcPr/>
+          <w:p>
+            <w:pPr>
+              <w:pStyle w:val="Compact"/>
+              <w:jc w:val="left"/>
+            </w:pPr>
+            <w:r>
+              <w:rPr>
+                <w:sz w:val="19"/>
+              </w:rPr>
+              <w:t xml:space="preserve">Across a room; one move covers it</w:t>
+            </w:r>
+          </w:p>
+        </w:tc>
+      </w:tr>
+      <w:tr>
+        <w:tc>
+          <w:tcPr/>
+          <w:p>
+            <w:pPr>
+              <w:pStyle w:val="Compact"/>
+              <w:jc w:val="left"/>
+            </w:pPr>
+            <w:r>
+              <w:rPr>
+                <w:b/>
+                <w:sz w:val="19"/>
+              </w:rPr>
+              <w:t xml:space="preserve">Short</w:t>
+            </w:r>
+          </w:p>
+        </w:tc>
+        <w:tc>
+          <w:tcPr/>
+          <w:p>
+            <w:pPr>
+              <w:pStyle w:val="Compact"/>
+              <w:jc w:val="left"/>
+            </w:pPr>
+            <w:r>
+              <w:rPr>
+                <w:sz w:val="19"/>
+              </w:rPr>
+              <w:t xml:space="preserve">Up to 25 yards</w:t>
+            </w:r>
+          </w:p>
+        </w:tc>
+        <w:tc>
+          <w:tcPr/>
+          <w:p>
+            <w:pPr>
+              <w:pStyle w:val="Compact"/>
+              <w:jc w:val="left"/>
+            </w:pPr>
+            <w:r>
+              <w:rPr>
+                <w:sz w:val="19"/>
+              </w:rPr>
+              <w:t xml:space="preserve">Across a street or a courtyard</w:t>
+            </w:r>
+          </w:p>
+        </w:tc>
+      </w:tr>
+      <w:tr>
+        <w:tc>
+          <w:tcPr/>
+          <w:p>
+            <w:pPr>
+              <w:pStyle w:val="Compact"/>
+              <w:jc w:val="left"/>
+            </w:pPr>
+            <w:r>
+              <w:rPr>
+                <w:b/>
+                <w:sz w:val="19"/>
+              </w:rPr>
+              <w:t xml:space="preserve">Medium</w:t>
+            </w:r>
+          </w:p>
+        </w:tc>
+        <w:tc>
+          <w:tcPr/>
+          <w:p>
+            <w:pPr>
+              <w:pStyle w:val="Compact"/>
+              <w:jc w:val="left"/>
+            </w:pPr>
+            <w:r>
+              <w:rPr>
+                <w:sz w:val="19"/>
+              </w:rPr>
+              <w:t xml:space="preserve">Up to 100 yards</w:t>
+            </w:r>
+          </w:p>
+        </w:tc>
+        <w:tc>
+          <w:tcPr/>
+          <w:p>
+            <w:pPr>
+              <w:pStyle w:val="Compact"/>
+              <w:jc w:val="left"/>
+            </w:pPr>
+            <w:r>
+              <w:rPr>
+                <w:sz w:val="19"/>
+              </w:rPr>
+              <w:t xml:space="preserve">A city block, a long field</w:t>
+            </w:r>
+          </w:p>
+        </w:tc>
+      </w:tr>
+      <w:tr>
+        <w:tc>
+          <w:tcPr/>
+          <w:p>
+            <w:pPr>
+              <w:pStyle w:val="Compact"/>
+              <w:jc w:val="left"/>
+            </w:pPr>
+            <w:r>
+              <w:rPr>
+                <w:b/>
+                <w:sz w:val="19"/>
+              </w:rPr>
+              <w:t xml:space="preserve">Long</w:t>
+            </w:r>
+          </w:p>
+        </w:tc>
+        <w:tc>
+          <w:tcPr/>
+          <w:p>
+            <w:pPr>
+              <w:pStyle w:val="Compact"/>
+              <w:jc w:val="left"/>
+            </w:pPr>
+            <w:r>
+              <w:rPr>
+                <w:sz w:val="19"/>
+              </w:rPr>
+              <w:t xml:space="preserve">Up to 300 yards</w:t>
+            </w:r>
+          </w:p>
+        </w:tc>
+        <w:tc>
+          <w:tcPr/>
+          <w:p>
+            <w:pPr>
+              <w:pStyle w:val="Compact"/>
+              <w:jc w:val="left"/>
+            </w:pPr>
+            <w:r>
+              <w:rPr>
+                <w:sz w:val="19"/>
+              </w:rPr>
+              <w:t xml:space="preserve">Across a park, a harbor or a small valley</w:t>
+            </w:r>
+          </w:p>
+        </w:tc>
+      </w:tr>
+      <w:tr>
+        <w:tc>
+          <w:tcPr/>
+          <w:p>
+            <w:pPr>
+              <w:pStyle w:val="Compact"/>
+              <w:jc w:val="left"/>
+            </w:pPr>
+            <w:r>
+              <w:rPr>
+                <w:b/>
+                <w:sz w:val="19"/>
+              </w:rPr>
+              <w:t xml:space="preserve">Extreme</w:t>
+            </w:r>
+          </w:p>
+        </w:tc>
+        <w:tc>
+          <w:tcPr/>
+          <w:p>
+            <w:pPr>
+              <w:pStyle w:val="Compact"/>
+              <w:jc w:val="left"/>
+            </w:pPr>
+            <w:r>
+              <w:rPr>
+                <w:sz w:val="19"/>
+              </w:rPr>
+              <w:t xml:space="preserve">Up to 1,000 yards, in line of sight</w:t>
+            </w:r>
+          </w:p>
+        </w:tc>
+        <w:tc>
+          <w:tcPr/>
+          <w:p>
+            <w:pPr>
+              <w:pStyle w:val="Compact"/>
+              <w:jc w:val="left"/>
+            </w:pPr>
+            <w:r>
+              <w:rPr>
+                <w:sz w:val="19"/>
+              </w:rPr>
+              <w:t xml:space="preserve">Rooftop to rooftop across a town</w:t>
+            </w:r>
+          </w:p>
+        </w:tc>
+      </w:tr>
+    </w:tbl>
+    <w:p>
+      <w:pPr>
+        <w:pStyle w:val="BodyText"/>
+      </w:pPr>
+      <w:r>
         <w:t xml:space="preserve">Every ranged weapon has an</w:t>
       </w:r>
       <w:r>
@@ -4325,19 +4494,537 @@
         <w:t xml:space="preserve">effective band</w:t>
       </w:r>
       <w:r>
-        <w:t xml:space="preserve">, shown in the weapons table. Attacks within it take no penalty. One band beyond it is −2, two bands beyond is −4, and anything farther is out of range. Weapons in hand and fists reach only someone next to you; move into reach as part of your turn. A thrown weapon’s effective band is Close.</w:t>
-      </w:r>
-    </w:p>
+        <w:t xml:space="preserve">, shown in the weapons table. Attacks within it take no penalty. One band beyond it is −2, two bands beyond is −4, and anything farther is out of range. A thrown weapon’s effective band is Close.</w:t>
+      </w:r>
+    </w:p>
+    <w:bookmarkEnd w:id="58"/>
+    <w:bookmarkStart w:id="59" w:name="move-and-reach"/>
+    <w:p>
+      <w:pPr>
+        <w:pStyle w:val="Heading2"/>
+      </w:pPr>
+      <w:r>
+        <w:t xml:space="preserve">Move and reach</w:t>
+      </w:r>
+    </w:p>
+    <w:p>
+      <w:pPr>
+        <w:pStyle w:val="FirstParagraph"/>
+      </w:pPr>
+      <w:r>
+        <w:rPr>
+          <w:bCs/>
+          <w:b/>
+        </w:rPr>
+        <w:t xml:space="preserve">Move</w:t>
+      </w:r>
+      <w:r>
+        <w:t xml:space="preserve"> </w:t>
+      </w:r>
+      <w:r>
+        <w:t xml:space="preserve">is how far you go in a turn:</w:t>
+      </w:r>
+      <w:r>
+        <w:t xml:space="preserve"> </w:t>
+      </w:r>
+      <w:r>
+        <w:rPr>
+          <w:bCs/>
+          <w:b/>
+        </w:rPr>
+        <w:t xml:space="preserve">5 yards, +1 for every 2 points of Agility + Body above 20</w:t>
+      </w:r>
+      <w:r>
+        <w:t xml:space="preserve"> </w:t>
+      </w:r>
+      <w:r>
+        <w:t xml:space="preserve">(rounded down; nothing is taken off below 20),</w:t>
+      </w:r>
+      <w:r>
+        <w:t xml:space="preserve"> </w:t>
+      </w:r>
+      <w:r>
+        <w:rPr>
+          <w:bCs/>
+          <w:b/>
+        </w:rPr>
+        <w:t xml:space="preserve">+1 for Trained Athletics or +2 for Athletics as a Specialty or Expert</w:t>
+      </w:r>
+      <w:r>
+        <w:t xml:space="preserve">, plus your origin’s speed adjustment, if it has one. Most characters move 6 to 9 yards. Give up your action to</w:t>
+      </w:r>
+      <w:r>
+        <w:t xml:space="preserve"> </w:t>
+      </w:r>
+      <w:r>
+        <w:rPr>
+          <w:bCs/>
+          <w:b/>
+        </w:rPr>
+        <w:t xml:space="preserve">run</w:t>
+      </w:r>
+      <w:r>
+        <w:t xml:space="preserve"> </w:t>
+      </w:r>
+      <w:r>
+        <w:t xml:space="preserve">and you cover twice your Move. Threats move 8 yards unless their entry says otherwise.</w:t>
+      </w:r>
+    </w:p>
+    <w:tbl>
+      <w:tblPr>
+        <w:tblStyle w:val="Table"/>
+        <w:tblW w:type="auto" w:w="0"/>
+        <w:tblLook w:firstRow="1" w:lastRow="0" w:firstColumn="0" w:lastColumn="0" w:noHBand="0" w:noVBand="0" w:val="0020"/>
+        <w:jc w:val="start"/>
+        <w:tblBorders>
+          <w:top w:val="single" w:sz="4" w:color="B8C2D3"/>
+          <w:left w:val="single" w:sz="4" w:color="B8C2D3"/>
+          <w:bottom w:val="single" w:sz="4" w:color="B8C2D3"/>
+          <w:right w:val="single" w:sz="4" w:color="B8C2D3"/>
+          <w:insideH w:val="single" w:sz="4" w:color="B8C2D3"/>
+          <w:insideV w:val="single" w:sz="4" w:color="B8C2D3"/>
+        </w:tblBorders>
+      </w:tblPr>
+      <w:tblGrid>
+        <w:gridCol w:w="1131"/>
+        <w:gridCol w:w="1131"/>
+        <w:gridCol w:w="1131"/>
+        <w:gridCol w:w="1131"/>
+        <w:gridCol w:w="1131"/>
+        <w:gridCol w:w="1131"/>
+        <w:gridCol w:w="1131"/>
+      </w:tblGrid>
+      <w:tr>
+        <w:trPr>
+          <w:tblHeader w:val="true"/>
+        </w:trPr>
+        <w:tc>
+          <w:tcPr>
+            <w:shd w:val="clear" w:fill="E9EEF6"/>
+          </w:tcPr>
+          <w:p>
+            <w:pPr>
+              <w:pStyle w:val="Compact"/>
+              <w:jc w:val="left"/>
+            </w:pPr>
+            <w:r>
+              <w:rPr>
+                <w:b/>
+                <w:sz w:val="19"/>
+              </w:rPr>
+              <w:t xml:space="preserve">Agility + Body</w:t>
+            </w:r>
+          </w:p>
+        </w:tc>
+        <w:tc>
+          <w:tcPr>
+            <w:shd w:val="clear" w:fill="E9EEF6"/>
+          </w:tcPr>
+          <w:p>
+            <w:pPr>
+              <w:pStyle w:val="Compact"/>
+              <w:jc w:val="left"/>
+            </w:pPr>
+            <w:r>
+              <w:rPr>
+                <w:b/>
+                <w:sz w:val="19"/>
+              </w:rPr>
+              <w:t xml:space="preserve">20 or less</w:t>
+            </w:r>
+          </w:p>
+        </w:tc>
+        <w:tc>
+          <w:tcPr>
+            <w:shd w:val="clear" w:fill="E9EEF6"/>
+          </w:tcPr>
+          <w:p>
+            <w:pPr>
+              <w:pStyle w:val="Compact"/>
+              <w:jc w:val="left"/>
+            </w:pPr>
+            <w:r>
+              <w:rPr>
+                <w:b/>
+                <w:sz w:val="19"/>
+              </w:rPr>
+              <w:t xml:space="preserve">21–22</w:t>
+            </w:r>
+          </w:p>
+        </w:tc>
+        <w:tc>
+          <w:tcPr>
+            <w:shd w:val="clear" w:fill="E9EEF6"/>
+          </w:tcPr>
+          <w:p>
+            <w:pPr>
+              <w:pStyle w:val="Compact"/>
+              <w:jc w:val="left"/>
+            </w:pPr>
+            <w:r>
+              <w:rPr>
+                <w:b/>
+                <w:sz w:val="19"/>
+              </w:rPr>
+              <w:t xml:space="preserve">23–24</w:t>
+            </w:r>
+          </w:p>
+        </w:tc>
+        <w:tc>
+          <w:tcPr>
+            <w:shd w:val="clear" w:fill="E9EEF6"/>
+          </w:tcPr>
+          <w:p>
+            <w:pPr>
+              <w:pStyle w:val="Compact"/>
+              <w:jc w:val="left"/>
+            </w:pPr>
+            <w:r>
+              <w:rPr>
+                <w:b/>
+                <w:sz w:val="19"/>
+              </w:rPr>
+              <w:t xml:space="preserve">25–26</w:t>
+            </w:r>
+          </w:p>
+        </w:tc>
+        <w:tc>
+          <w:tcPr>
+            <w:shd w:val="clear" w:fill="E9EEF6"/>
+          </w:tcPr>
+          <w:p>
+            <w:pPr>
+              <w:pStyle w:val="Compact"/>
+              <w:jc w:val="left"/>
+            </w:pPr>
+            <w:r>
+              <w:rPr>
+                <w:b/>
+                <w:sz w:val="19"/>
+              </w:rPr>
+              <w:t xml:space="preserve">27–28</w:t>
+            </w:r>
+          </w:p>
+        </w:tc>
+        <w:tc>
+          <w:tcPr>
+            <w:shd w:val="clear" w:fill="E9EEF6"/>
+          </w:tcPr>
+          <w:p>
+            <w:pPr>
+              <w:pStyle w:val="Compact"/>
+              <w:jc w:val="left"/>
+            </w:pPr>
+            <w:r>
+              <w:rPr>
+                <w:b/>
+                <w:sz w:val="19"/>
+              </w:rPr>
+              <w:t xml:space="preserve">29–30</w:t>
+            </w:r>
+          </w:p>
+        </w:tc>
+      </w:tr>
+      <w:tr>
+        <w:tc>
+          <w:tcPr/>
+          <w:p>
+            <w:pPr>
+              <w:pStyle w:val="Compact"/>
+              <w:jc w:val="left"/>
+            </w:pPr>
+            <w:r>
+              <w:rPr>
+                <w:b/>
+                <w:sz w:val="19"/>
+              </w:rPr>
+              <w:t xml:space="preserve">Move before Athletics</w:t>
+            </w:r>
+          </w:p>
+        </w:tc>
+        <w:tc>
+          <w:tcPr/>
+          <w:p>
+            <w:pPr>
+              <w:pStyle w:val="Compact"/>
+              <w:jc w:val="left"/>
+            </w:pPr>
+            <w:r>
+              <w:rPr>
+                <w:sz w:val="19"/>
+              </w:rPr>
+              <w:t xml:space="preserve">5</w:t>
+            </w:r>
+          </w:p>
+        </w:tc>
+        <w:tc>
+          <w:tcPr/>
+          <w:p>
+            <w:pPr>
+              <w:pStyle w:val="Compact"/>
+              <w:jc w:val="left"/>
+            </w:pPr>
+            <w:r>
+              <w:rPr>
+                <w:sz w:val="19"/>
+              </w:rPr>
+              <w:t xml:space="preserve">6</w:t>
+            </w:r>
+          </w:p>
+        </w:tc>
+        <w:tc>
+          <w:tcPr/>
+          <w:p>
+            <w:pPr>
+              <w:pStyle w:val="Compact"/>
+              <w:jc w:val="left"/>
+            </w:pPr>
+            <w:r>
+              <w:rPr>
+                <w:sz w:val="19"/>
+              </w:rPr>
+              <w:t xml:space="preserve">7</w:t>
+            </w:r>
+          </w:p>
+        </w:tc>
+        <w:tc>
+          <w:tcPr/>
+          <w:p>
+            <w:pPr>
+              <w:pStyle w:val="Compact"/>
+              <w:jc w:val="left"/>
+            </w:pPr>
+            <w:r>
+              <w:rPr>
+                <w:sz w:val="19"/>
+              </w:rPr>
+              <w:t xml:space="preserve">8</w:t>
+            </w:r>
+          </w:p>
+        </w:tc>
+        <w:tc>
+          <w:tcPr/>
+          <w:p>
+            <w:pPr>
+              <w:pStyle w:val="Compact"/>
+              <w:jc w:val="left"/>
+            </w:pPr>
+            <w:r>
+              <w:rPr>
+                <w:sz w:val="19"/>
+              </w:rPr>
+              <w:t xml:space="preserve">9</w:t>
+            </w:r>
+          </w:p>
+        </w:tc>
+        <w:tc>
+          <w:tcPr/>
+          <w:p>
+            <w:pPr>
+              <w:pStyle w:val="Compact"/>
+              <w:jc w:val="left"/>
+            </w:pPr>
+            <w:r>
+              <w:rPr>
+                <w:sz w:val="19"/>
+              </w:rPr>
+              <w:t xml:space="preserve">10</w:t>
+            </w:r>
+          </w:p>
+        </w:tc>
+      </w:tr>
+    </w:tbl>
     <w:p>
       <w:pPr>
         <w:pStyle w:val="BodyText"/>
       </w:pPr>
       <w:r>
-        <w:t xml:space="preserve">Moving: your move each turn covers the Close band. Give up your action to run and you cover twice that, 20 yards.</w:t>
-      </w:r>
-    </w:p>
-    <w:bookmarkEnd w:id="58"/>
-    <w:bookmarkStart w:id="60" w:name="injury"/>
+        <w:t xml:space="preserve">A weapon in hand strikes anyone within its</w:t>
+      </w:r>
+      <w:r>
+        <w:t xml:space="preserve"> </w:t>
+      </w:r>
+      <w:r>
+        <w:rPr>
+          <w:bCs/>
+          <w:b/>
+        </w:rPr>
+        <w:t xml:space="preserve">reach</w:t>
+      </w:r>
+      <w:r>
+        <w:t xml:space="preserve">, shown in the weapons table. Move into reach as part of your turn and attack in the same turn.</w:t>
+      </w:r>
+    </w:p>
+    <w:tbl>
+      <w:tblPr>
+        <w:tblStyle w:val="Table"/>
+        <w:tblW w:type="pct" w:w="5000"/>
+        <w:tblLook w:firstRow="1" w:lastRow="0" w:firstColumn="0" w:lastColumn="0" w:noHBand="0" w:noVBand="0" w:val="0020"/>
+        <w:jc w:val="start"/>
+        <w:tblBorders>
+          <w:top w:val="single" w:sz="4" w:color="B8C2D3"/>
+          <w:left w:val="single" w:sz="4" w:color="B8C2D3"/>
+          <w:bottom w:val="single" w:sz="4" w:color="B8C2D3"/>
+          <w:right w:val="single" w:sz="4" w:color="B8C2D3"/>
+          <w:insideH w:val="single" w:sz="4" w:color="B8C2D3"/>
+          <w:insideV w:val="single" w:sz="4" w:color="B8C2D3"/>
+        </w:tblBorders>
+      </w:tblPr>
+      <w:tblGrid>
+        <w:gridCol w:w="3960"/>
+        <w:gridCol w:w="3960"/>
+      </w:tblGrid>
+      <w:tr>
+        <w:trPr>
+          <w:tblHeader w:val="true"/>
+        </w:trPr>
+        <w:tc>
+          <w:tcPr>
+            <w:shd w:val="clear" w:fill="E9EEF6"/>
+          </w:tcPr>
+          <w:p>
+            <w:pPr>
+              <w:pStyle w:val="Compact"/>
+              <w:jc w:val="left"/>
+            </w:pPr>
+            <w:r>
+              <w:rPr>
+                <w:b/>
+                <w:sz w:val="19"/>
+              </w:rPr>
+              <w:t xml:space="preserve">Reach</w:t>
+            </w:r>
+          </w:p>
+        </w:tc>
+        <w:tc>
+          <w:tcPr>
+            <w:shd w:val="clear" w:fill="E9EEF6"/>
+          </w:tcPr>
+          <w:p>
+            <w:pPr>
+              <w:pStyle w:val="Compact"/>
+              <w:jc w:val="left"/>
+            </w:pPr>
+            <w:r>
+              <w:rPr>
+                <w:b/>
+                <w:sz w:val="19"/>
+              </w:rPr>
+              <w:t xml:space="preserve">Weapons</w:t>
+            </w:r>
+          </w:p>
+        </w:tc>
+      </w:tr>
+      <w:tr>
+        <w:tc>
+          <w:tcPr/>
+          <w:p>
+            <w:pPr>
+              <w:pStyle w:val="Compact"/>
+              <w:jc w:val="left"/>
+            </w:pPr>
+            <w:r>
+              <w:rPr>
+                <w:b/>
+                <w:sz w:val="19"/>
+              </w:rPr>
+              <w:t xml:space="preserve">1 yard</w:t>
+            </w:r>
+          </w:p>
+        </w:tc>
+        <w:tc>
+          <w:tcPr/>
+          <w:p>
+            <w:pPr>
+              <w:pStyle w:val="Compact"/>
+              <w:jc w:val="left"/>
+            </w:pPr>
+            <w:r>
+              <w:rPr>
+                <w:sz w:val="19"/>
+              </w:rPr>
+              <w:t xml:space="preserve">Fists, kicks and grappling; knives, daggers and hatchets; clubs, bottles and batons; claws and fangs</w:t>
+            </w:r>
+          </w:p>
+        </w:tc>
+      </w:tr>
+      <w:tr>
+        <w:tc>
+          <w:tcPr/>
+          <w:p>
+            <w:pPr>
+              <w:pStyle w:val="Compact"/>
+              <w:jc w:val="left"/>
+            </w:pPr>
+            <w:r>
+              <w:rPr>
+                <w:b/>
+                <w:sz w:val="19"/>
+              </w:rPr>
+              <w:t xml:space="preserve">2 yards</w:t>
+            </w:r>
+          </w:p>
+        </w:tc>
+        <w:tc>
+          <w:tcPr/>
+          <w:p>
+            <w:pPr>
+              <w:pStyle w:val="Compact"/>
+              <w:jc w:val="left"/>
+            </w:pPr>
+            <w:r>
+              <w:rPr>
+                <w:sz w:val="19"/>
+              </w:rPr>
+              <w:t xml:space="preserve">Swords, sabers, axes and maces; a rifle butt or a bayonet held short</w:t>
+            </w:r>
+          </w:p>
+        </w:tc>
+      </w:tr>
+      <w:tr>
+        <w:tc>
+          <w:tcPr/>
+          <w:p>
+            <w:pPr>
+              <w:pStyle w:val="Compact"/>
+              <w:jc w:val="left"/>
+            </w:pPr>
+            <w:r>
+              <w:rPr>
+                <w:b/>
+                <w:sz w:val="19"/>
+              </w:rPr>
+              <w:t xml:space="preserve">3 yards</w:t>
+            </w:r>
+          </w:p>
+        </w:tc>
+        <w:tc>
+          <w:tcPr/>
+          <w:p>
+            <w:pPr>
+              <w:pStyle w:val="Compact"/>
+              <w:jc w:val="left"/>
+            </w:pPr>
+            <w:r>
+              <w:rPr>
+                <w:sz w:val="19"/>
+              </w:rPr>
+              <w:t xml:space="preserve">Spears and polearms</w:t>
+            </w:r>
+          </w:p>
+        </w:tc>
+      </w:tr>
+    </w:tbl>
+    <w:p>
+      <w:pPr>
+        <w:pStyle w:val="BodyText"/>
+      </w:pPr>
+      <w:r>
+        <w:t xml:space="preserve">A weapon in hand can’t reach past 3 yards; anything farther is a ranged attack.</w:t>
+      </w:r>
+    </w:p>
+    <w:bookmarkEnd w:id="59"/>
+    <w:bookmarkStart w:id="61" w:name="injury"/>
     <w:p>
       <w:pPr>
         <w:pStyle w:val="Heading2"/>
@@ -4626,7 +5313,7 @@
         <w:t xml:space="preserve">Injury penalties replace each other rather than stacking. They apply to movement, attacks, Dodge, and other tasks the injury physically hinders.</w:t>
       </w:r>
     </w:p>
-    <w:bookmarkStart w:id="59" w:name="dying-and-death"/>
+    <w:bookmarkStart w:id="60" w:name="dying-and-death"/>
     <w:p>
       <w:pPr>
         <w:pStyle w:val="Heading3"/>
@@ -4738,9 +5425,9 @@
         <w:t xml:space="preserve">Your protection is avoiding the hit: a defense (Dodge, Parry or Block), cover, and a Legend point, which reduces a hit by one box.</w:t>
       </w:r>
     </w:p>
-    <w:bookmarkEnd w:id="59"/>
     <w:bookmarkEnd w:id="60"/>
-    <w:bookmarkStart w:id="61" w:name="weapons-and-damage"/>
+    <w:bookmarkEnd w:id="61"/>
+    <w:bookmarkStart w:id="62" w:name="weapons-and-damage"/>
     <w:p>
       <w:pPr>
         <w:pStyle w:val="Heading2"/>
@@ -4782,8 +5469,8 @@
         <w:t xml:space="preserve">Your setting pack supplies this (ammo).</w:t>
       </w:r>
     </w:p>
-    <w:bookmarkEnd w:id="61"/>
-    <w:bookmarkStart w:id="62" w:name="the-battle-map"/>
+    <w:bookmarkEnd w:id="62"/>
+    <w:bookmarkStart w:id="63" w:name="the-battle-map"/>
     <w:p>
       <w:pPr>
         <w:pStyle w:val="Heading2"/>
@@ -4953,8 +5640,8 @@
         <w:t xml:space="preserve">keeps both maps, their pictures and tokens in one file, to prepare a fight ahead of time or share it with another GM.</w:t>
       </w:r>
     </w:p>
-    <w:bookmarkEnd w:id="62"/>
-    <w:bookmarkStart w:id="63" w:name="the-encounter-panel"/>
+    <w:bookmarkEnd w:id="63"/>
+    <w:bookmarkStart w:id="64" w:name="the-encounter-panel"/>
     <w:p>
       <w:pPr>
         <w:pStyle w:val="Heading2"/>
@@ -4987,9 +5674,9 @@
         <w:t xml:space="preserve">panel that runs a fight by these rules and shows every roll. Add characters from the GM view and opponents from the Threats table (or make one up on the spot), then start: it keeps the turn order by Agility, and for each attack works out the range, the defense (Dodge, Parry or Block, one a round, and a second at −2 with Additional Defense), the boxes marked and any telling hit, offering a Legend point choices at the moment they apply. Hits land on the character cards and the battle map, and with gritty combat on, grievous wounds are rolled and kept. The panel keeps a log and a summary of the fight, which can be saved to a file. It’s a helper, not a rule: the GM can rule any result differently, and the log says so.</w:t>
       </w:r>
     </w:p>
-    <w:bookmarkEnd w:id="63"/>
     <w:bookmarkEnd w:id="64"/>
-    <w:bookmarkStart w:id="70" w:name="medical-care"/>
+    <w:bookmarkEnd w:id="65"/>
+    <w:bookmarkStart w:id="71" w:name="medical-care"/>
     <w:p>
       <w:pPr>
         <w:pStyle w:val="Heading1"/>
@@ -4998,7 +5685,7 @@
         <w:t xml:space="preserve">Medical care</w:t>
       </w:r>
     </w:p>
-    <w:bookmarkStart w:id="65" w:name="diagnosis-and-stabilization"/>
+    <w:bookmarkStart w:id="66" w:name="diagnosis-and-stabilization"/>
     <w:p>
       <w:pPr>
         <w:pStyle w:val="Heading2"/>
@@ -5015,8 +5702,8 @@
         <w:t xml:space="preserve">Roll Medicine when the diagnosis is uncertain or an urgent treatment decision matters. Emergency stabilization takes one action and a successful Medicine roll with a medical kit. It ends Dying and stops deterioration, but removes no boxes.</w:t>
       </w:r>
     </w:p>
-    <w:bookmarkEnd w:id="65"/>
-    <w:bookmarkStart w:id="66" w:name="field-treatment"/>
+    <w:bookmarkEnd w:id="66"/>
+    <w:bookmarkStart w:id="67" w:name="field-treatment"/>
     <w:p>
       <w:pPr>
         <w:pStyle w:val="Heading2"/>
@@ -5033,8 +5720,8 @@
         <w:t xml:space="preserve">With a medical kit and several uninterrupted minutes, successful Medicine removes one injury box; success by 5 or more removes two.</w:t>
       </w:r>
     </w:p>
-    <w:bookmarkEnd w:id="66"/>
-    <w:bookmarkStart w:id="67" w:name="proper-care"/>
+    <w:bookmarkEnd w:id="67"/>
+    <w:bookmarkStart w:id="68" w:name="proper-care"/>
     <w:p>
       <w:pPr>
         <w:pStyle w:val="Heading2"/>
@@ -5051,8 +5738,8 @@
         <w:t xml:space="preserve">A proper infirmary grants +2 to Medicine. A successful treatment removes two boxes; success by 5 or more removes three. Allow the time the treatment requires.</w:t>
       </w:r>
     </w:p>
-    <w:bookmarkEnd w:id="67"/>
-    <w:bookmarkStart w:id="68" w:name="treatment-attempts"/>
+    <w:bookmarkEnd w:id="68"/>
+    <w:bookmarkStart w:id="69" w:name="treatment-attempts"/>
     <w:p>
       <w:pPr>
         <w:pStyle w:val="Heading2"/>
@@ -5157,8 +5844,8 @@
         <w:t xml:space="preserve">Stopping someone Dying is never limited by these attempts and never removes boxes; a treatment roll that removes boxes also stabilizes.</w:t>
       </w:r>
     </w:p>
-    <w:bookmarkEnd w:id="68"/>
-    <w:bookmarkStart w:id="69" w:name="natural-recovery"/>
+    <w:bookmarkEnd w:id="69"/>
+    <w:bookmarkStart w:id="70" w:name="natural-recovery"/>
     <w:p>
       <w:pPr>
         <w:pStyle w:val="Heading2"/>
@@ -5343,9 +6030,9 @@
         <w:t xml:space="preserve">At three boxes, rest alone does nothing until someone has stabilized or treated you; after that, a week of rest in their care clears the first box. A successful treatment is faster. The times add up: from three boxes, rest alone takes about a week and a half to heal completely (a week, then three days, then a day).</w:t>
       </w:r>
     </w:p>
-    <w:bookmarkEnd w:id="69"/>
     <w:bookmarkEnd w:id="70"/>
-    <w:bookmarkStart w:id="75" w:name="magic"/>
+    <w:bookmarkEnd w:id="71"/>
+    <w:bookmarkStart w:id="76" w:name="magic"/>
     <w:p>
       <w:pPr>
         <w:pStyle w:val="Heading1"/>
@@ -5589,7 +6276,7 @@
         </w:tc>
       </w:tr>
     </w:tbl>
-    <w:bookmarkStart w:id="71" w:name="bursts"/>
+    <w:bookmarkStart w:id="72" w:name="bursts"/>
     <w:p>
       <w:pPr>
         <w:pStyle w:val="Heading2"/>
@@ -6188,8 +6875,8 @@
         <w:t xml:space="preserve">A failed burst marks a box of your setting’s price track; a natural 18 marks two, or something answers that shouldn’t.</w:t>
       </w:r>
     </w:p>
-    <w:bookmarkEnd w:id="71"/>
-    <w:bookmarkStart w:id="72" w:name="workings"/>
+    <w:bookmarkEnd w:id="72"/>
+    <w:bookmarkStart w:id="73" w:name="workings"/>
     <w:p>
       <w:pPr>
         <w:pStyle w:val="Heading2"/>
@@ -6524,8 +7211,8 @@
         <w:t xml:space="preserve">A working takes a minute a roll at the very fastest. To use one in combat, finish it beforehand and store it in a charm.</w:t>
       </w:r>
     </w:p>
-    <w:bookmarkEnd w:id="72"/>
-    <w:bookmarkStart w:id="73" w:name="charms"/>
+    <w:bookmarkEnd w:id="73"/>
+    <w:bookmarkStart w:id="74" w:name="charms"/>
     <w:p>
       <w:pPr>
         <w:pStyle w:val="Heading2"/>
@@ -6586,8 +7273,8 @@
         <w:t xml:space="preserve">: against a defense, the target defends with no attack-quality penalty; against a resistance, the target resists by succeeding on their roll (a tie goes to the target, as in any contest). A charm never marks more than 3 boxes on one target.</w:t>
       </w:r>
     </w:p>
-    <w:bookmarkEnd w:id="73"/>
-    <w:bookmarkStart w:id="74" w:name="magic-advancement"/>
+    <w:bookmarkEnd w:id="74"/>
+    <w:bookmarkStart w:id="75" w:name="magic-advancement"/>
     <w:p>
       <w:pPr>
         <w:pStyle w:val="Heading2"/>
@@ -7094,9 +7781,9 @@
         </w:tc>
       </w:tr>
     </w:tbl>
-    <w:bookmarkEnd w:id="74"/>
     <w:bookmarkEnd w:id="75"/>
-    <w:bookmarkStart w:id="79" w:name="legend-points-and-tracks"/>
+    <w:bookmarkEnd w:id="76"/>
+    <w:bookmarkStart w:id="80" w:name="legend-points-and-tracks"/>
     <w:p>
       <w:pPr>
         <w:pStyle w:val="Heading1"/>
@@ -7105,7 +7792,7 @@
         <w:t xml:space="preserve">Legend points and tracks</w:t>
       </w:r>
     </w:p>
-    <w:bookmarkStart w:id="76" w:name="using-legend-points"/>
+    <w:bookmarkStart w:id="77" w:name="using-legend-points"/>
     <w:p>
       <w:pPr>
         <w:pStyle w:val="Heading2"/>
@@ -7323,8 +8010,8 @@
         <w:t xml:space="preserve">Gain one point when one of your complications creates a meaningful problem you accept, including a companion complication. You can decline the proposed complication without penalty.</w:t>
       </w:r>
     </w:p>
-    <w:bookmarkEnd w:id="76"/>
-    <w:bookmarkStart w:id="77" w:name="tracks"/>
+    <w:bookmarkEnd w:id="77"/>
+    <w:bookmarkStart w:id="78" w:name="tracks"/>
     <w:p>
       <w:pPr>
         <w:pStyle w:val="Heading2"/>
@@ -7345,8 +8032,8 @@
         <w:t xml:space="preserve">Your setting pack supplies this (tracks).</w:t>
       </w:r>
     </w:p>
-    <w:bookmarkEnd w:id="77"/>
-    <w:bookmarkStart w:id="78" w:name="advancement"/>
+    <w:bookmarkEnd w:id="78"/>
+    <w:bookmarkStart w:id="79" w:name="advancement"/>
     <w:p>
       <w:pPr>
         <w:pStyle w:val="Heading2"/>
@@ -7790,9 +8477,9 @@
         <w:t xml:space="preserve">Magic and powers grow the same way, at the costs their chapters give.</w:t>
       </w:r>
     </w:p>
-    <w:bookmarkEnd w:id="78"/>
     <w:bookmarkEnd w:id="79"/>
-    <w:bookmarkStart w:id="82" w:name="running-missions"/>
+    <w:bookmarkEnd w:id="80"/>
+    <w:bookmarkStart w:id="83" w:name="running-missions"/>
     <w:p>
       <w:pPr>
         <w:pStyle w:val="Heading1"/>
@@ -7801,7 +8488,7 @@
         <w:t xml:space="preserve">Running missions</w:t>
       </w:r>
     </w:p>
-    <w:bookmarkStart w:id="80" w:name="mission-seeds"/>
+    <w:bookmarkStart w:id="81" w:name="mission-seeds"/>
     <w:p>
       <w:pPr>
         <w:pStyle w:val="Heading2"/>
@@ -7830,8 +8517,8 @@
         <w:t xml:space="preserve">Your setting pack supplies this (seeds).</w:t>
       </w:r>
     </w:p>
-    <w:bookmarkEnd w:id="80"/>
-    <w:bookmarkStart w:id="81" w:name="the-journal"/>
+    <w:bookmarkEnd w:id="81"/>
+    <w:bookmarkStart w:id="82" w:name="the-journal"/>
     <w:p>
       <w:pPr>
         <w:pStyle w:val="Heading2"/>
@@ -7958,9 +8645,9 @@
         <w:t xml:space="preserve">After a significant mission, each character earns 1 advancement point; at a milestone, 2 more.</w:t>
       </w:r>
     </w:p>
-    <w:bookmarkEnd w:id="81"/>
     <w:bookmarkEnd w:id="82"/>
-    <w:bookmarkStart w:id="83" w:name="ready-made-characters"/>
+    <w:bookmarkEnd w:id="83"/>
+    <w:bookmarkStart w:id="84" w:name="ready-made-characters"/>
     <w:p>
       <w:pPr>
         <w:pStyle w:val="Heading1"/>
@@ -7989,8 +8676,8 @@
         <w:t xml:space="preserve">Your setting pack supplies this (pregens).</w:t>
       </w:r>
     </w:p>
-    <w:bookmarkEnd w:id="83"/>
-    <w:bookmarkStart w:id="84" w:name="advantages"/>
+    <w:bookmarkEnd w:id="84"/>
+    <w:bookmarkStart w:id="85" w:name="advantages"/>
     <w:p>
       <w:pPr>
         <w:pStyle w:val="Heading1"/>
@@ -8019,8 +8706,8 @@
         <w:t xml:space="preserve">Your setting pack supplies this (advantages).</w:t>
       </w:r>
     </w:p>
-    <w:bookmarkEnd w:id="84"/>
-    <w:bookmarkStart w:id="85" w:name="origins"/>
+    <w:bookmarkEnd w:id="85"/>
+    <w:bookmarkStart w:id="86" w:name="origins"/>
     <w:p>
       <w:pPr>
         <w:pStyle w:val="Heading1"/>
@@ -8041,8 +8728,8 @@
         <w:t xml:space="preserve">Your setting pack supplies this (origins).</w:t>
       </w:r>
     </w:p>
-    <w:bookmarkEnd w:id="85"/>
-    <w:bookmarkStart w:id="96" w:name="making-your-own"/>
+    <w:bookmarkEnd w:id="86"/>
+    <w:bookmarkStart w:id="97" w:name="making-your-own"/>
     <w:p>
       <w:pPr>
         <w:pStyle w:val="Heading1"/>
@@ -8075,7 +8762,7 @@
         <w:t xml:space="preserve">option at the end of each list, and its checklist holds a custom choice to the same rules as everything else.</w:t>
       </w:r>
     </w:p>
-    <w:bookmarkStart w:id="86" w:name="a-custom-role"/>
+    <w:bookmarkStart w:id="87" w:name="a-custom-role"/>
     <w:p>
       <w:pPr>
         <w:pStyle w:val="Heading2"/>
@@ -8251,8 +8938,8 @@
         <w:t xml:space="preserve">.</w:t>
       </w:r>
     </w:p>
-    <w:bookmarkEnd w:id="86"/>
-    <w:bookmarkStart w:id="95" w:name="a-custom-origin"/>
+    <w:bookmarkEnd w:id="87"/>
+    <w:bookmarkStart w:id="96" w:name="a-custom-origin"/>
     <w:p>
       <w:pPr>
         <w:pStyle w:val="Heading2"/>
@@ -8269,7 +8956,7 @@
         <w:t xml:space="preserve">Build it with the GM, one step at a time.</w:t>
       </w:r>
     </w:p>
-    <w:bookmarkStart w:id="87" w:name="the-concept"/>
+    <w:bookmarkStart w:id="88" w:name="the-concept"/>
     <w:p>
       <w:pPr>
         <w:pStyle w:val="Heading3"/>
@@ -8286,8 +8973,8 @@
         <w:t xml:space="preserve">Two or three sentences: where they come from, what sets them apart, and how others see them. It should be something the origins in this book don’t already cover.</w:t>
       </w:r>
     </w:p>
-    <w:bookmarkEnd w:id="87"/>
-    <w:bookmarkStart w:id="88" w:name="the-tier"/>
+    <w:bookmarkEnd w:id="88"/>
+    <w:bookmarkStart w:id="89" w:name="the-tier"/>
     <w:p>
       <w:pPr>
         <w:pStyle w:val="Heading3"/>
@@ -8584,8 +9271,8 @@
         <w:t xml:space="preserve">When in doubt, choose the higher tier.</w:t>
       </w:r>
     </w:p>
-    <w:bookmarkEnd w:id="88"/>
-    <w:bookmarkStart w:id="89" w:name="attribute-adjustments"/>
+    <w:bookmarkEnd w:id="89"/>
+    <w:bookmarkStart w:id="90" w:name="attribute-adjustments"/>
     <w:p>
       <w:pPr>
         <w:pStyle w:val="Heading3"/>
@@ -8631,8 +9318,32 @@
         <w:t xml:space="preserve">: a +2 needs a −2 or two −1s. The adjustments move the attribute’s base (+1 starts it at 11) and raise its starting maximum (13 plus the bonus). Most origins change two to four attributes.</w:t>
       </w:r>
     </w:p>
-    <w:bookmarkEnd w:id="89"/>
-    <w:bookmarkStart w:id="90" w:name="core-rules-tier-1-and-up"/>
+    <w:p>
+      <w:pPr>
+        <w:pStyle w:val="BodyText"/>
+      </w:pPr>
+      <w:r>
+        <w:t xml:space="preserve">A origin that is plainly faster or slower on its feet than a human (long-legged, heavy, built for another gravity) may also take a</w:t>
+      </w:r>
+      <w:r>
+        <w:t xml:space="preserve"> </w:t>
+      </w:r>
+      <w:r>
+        <w:rPr>
+          <w:bCs/>
+          <w:b/>
+        </w:rPr>
+        <w:t xml:space="preserve">speed adjustment</w:t>
+      </w:r>
+      <w:r>
+        <w:t xml:space="preserve"> </w:t>
+      </w:r>
+      <w:r>
+        <w:t xml:space="preserve">of +1 or −1 to Move. Most have none. It isn’t an attribute adjustment and needn’t balance.</w:t>
+      </w:r>
+    </w:p>
+    <w:bookmarkEnd w:id="90"/>
+    <w:bookmarkStart w:id="91" w:name="core-rules-tier-1-and-up"/>
     <w:p>
       <w:pPr>
         <w:pStyle w:val="Heading3"/>
@@ -8649,8 +9360,8 @@
         <w:t xml:space="preserve">One to three short rules that always apply: what they can do (see in the dark, resist cold, a free Trained skill) and what it costs (a weakness, a people’s distrust, a hazard they can’t abide). A strength with no drawback is worth more than it looks, so price it a tier higher.</w:t>
       </w:r>
     </w:p>
-    <w:bookmarkEnd w:id="90"/>
-    <w:bookmarkStart w:id="91" w:name="origin-advantages"/>
+    <w:bookmarkEnd w:id="91"/>
+    <w:bookmarkStart w:id="92" w:name="origin-advantages"/>
     <w:p>
       <w:pPr>
         <w:pStyle w:val="Heading3"/>
@@ -8705,8 +9416,8 @@
         <w:t xml:space="preserve">: a problem the trait causes, with a clear trigger and a real consequence, which earns a Legend point when it bites, like any complication. A character takes one advantage, general or origin, so make them distinct choices.</w:t>
       </w:r>
     </w:p>
-    <w:bookmarkEnd w:id="91"/>
-    <w:bookmarkStart w:id="92" w:name="an-alternate-form-optional-tier-2-or-3"/>
+    <w:bookmarkEnd w:id="92"/>
+    <w:bookmarkStart w:id="93" w:name="an-alternate-form-optional-tier-2-or-3"/>
     <w:p>
       <w:pPr>
         <w:pStyle w:val="Heading3"/>
@@ -8720,7 +9431,7 @@
         <w:pStyle w:val="FirstParagraph"/>
       </w:pPr>
       <w:r>
-        <w:t xml:space="preserve">If the origin changes shape, give the form attribute bonuses (usually +2 to one attribute and +1 to another), two or three traits, and its drawbacks. The shared rules for forms in</w:t>
+        <w:t xml:space="preserve">If the origin changes shape, give the form attribute bonuses (usually +2 to one attribute and +1 to another), two or three traits, and its drawbacks. A form’s Agility and Body bonuses change its Move, and a fast form may add a speed adjustment of its own. The shared rules for forms in</w:t>
       </w:r>
       <w:r>
         <w:t xml:space="preserve"> </w:t>
@@ -8739,8 +9450,8 @@
         <w:t xml:space="preserve">apply. The bonuses count only while the character is in that form: the sheet’s form switch shows both sets of numbers.</w:t>
       </w:r>
     </w:p>
-    <w:bookmarkEnd w:id="92"/>
-    <w:bookmarkStart w:id="93" w:name="in-the-creator"/>
+    <w:bookmarkEnd w:id="93"/>
+    <w:bookmarkStart w:id="94" w:name="in-the-creator"/>
     <w:p>
       <w:pPr>
         <w:pStyle w:val="Heading3"/>
@@ -8845,8 +9556,8 @@
         <w:t xml:space="preserve">and enter the advantage and its companion complication.</w:t>
       </w:r>
     </w:p>
-    <w:bookmarkEnd w:id="93"/>
-    <w:bookmarkStart w:id="94" w:name="example"/>
+    <w:bookmarkEnd w:id="94"/>
+    <w:bookmarkStart w:id="95" w:name="example"/>
     <w:p>
       <w:pPr>
         <w:pStyle w:val="Heading3"/>
@@ -8951,10 +9662,10 @@
         <w:t xml:space="preserve">: you trust your own people first; when it matters, accept the cost of that loyalty.</w:t>
       </w:r>
     </w:p>
-    <w:bookmarkEnd w:id="94"/>
     <w:bookmarkEnd w:id="95"/>
     <w:bookmarkEnd w:id="96"/>
-    <w:bookmarkStart w:id="97" w:name="complications"/>
+    <w:bookmarkEnd w:id="97"/>
+    <w:bookmarkStart w:id="98" w:name="complications"/>
     <w:p>
       <w:pPr>
         <w:pStyle w:val="Heading1"/>
@@ -8983,8 +9694,8 @@
         <w:t xml:space="preserve">Your setting pack supplies this (complications).</w:t>
       </w:r>
     </w:p>
-    <w:bookmarkEnd w:id="97"/>
-    <w:bookmarkStart w:id="99" w:name="quick-reference"/>
+    <w:bookmarkEnd w:id="98"/>
+    <w:bookmarkStart w:id="100" w:name="quick-reference"/>
     <w:p>
       <w:pPr>
         <w:pStyle w:val="Heading1"/>
@@ -9128,13 +9839,31 @@
           <w:bCs/>
           <w:b/>
         </w:rPr>
+        <w:t xml:space="preserve">Move:</w:t>
+      </w:r>
+      <w:r>
+        <w:t xml:space="preserve"> </w:t>
+      </w:r>
+      <w:r>
+        <w:t xml:space="preserve">5 yd, +1 per 2 points of Agility + Body above 20, +1 Trained Athletics or +2 Specialty/Expert, ± origin speed; run (no action) twice that. Threats 8 yd. Reach: 1 yd fists, knives, clubs; 2 yd swords, axes; 3 yd spears, polearms.</w:t>
+      </w:r>
+    </w:p>
+    <w:p>
+      <w:pPr>
+        <w:pStyle w:val="BodyText"/>
+      </w:pPr>
+      <w:r>
+        <w:rPr>
+          <w:bCs/>
+          <w:b/>
+        </w:rPr>
         <w:t xml:space="preserve">Combat:</w:t>
       </w:r>
       <w:r>
         <w:t xml:space="preserve"> </w:t>
       </w:r>
       <w:r>
-        <w:t xml:space="preserve">move plus one action. Hit → one defense a round (Dodge, Parry or Block; −1 to −3 against a clean hit; Additional Defense: a second, at −2) → weapon effect. Dodge = Agility −2 plus Athletics training (+0, +1, +2). Parry −3, Block −2 plus the shield. Aim: +1. Telling hit (by 5+ or natural 3–4): the attacker picks an effect, which never adds boxes or kills outright; called shot −2 (small target −4). A 2-box weapon that brings you to three boxes leaves you Dying; at three boxes, another 2-box hit kills.</w:t>
+        <w:t xml:space="preserve">move plus one action. Hit → one defense a round (Dodge, Parry or Block; −1 to −3 against a clean hit; Additional Defense: a second, at −2) → weapon effect. Dodge = Agility −2 plus Athletics training (+0, +1, +2). Parry −3, Block −2 plus the shield. Aim: +1. Telling hit (by 5+ or natural 3–4): the attacker picks an effect the weapon can deliver (pin: weapon in hand or grapple only), which never adds boxes or kills outright; called shot −2 (small target −4). A 2-box weapon that brings you to three boxes leaves you Dying; at three boxes, another 2-box hit kills.</w:t>
       </w:r>
     </w:p>
     <w:p>
@@ -9193,7 +9922,7 @@
       <w:r>
         <w:t xml:space="preserve"> </w:t>
       </w:r>
-      <w:hyperlink r:id="rId98">
+      <w:hyperlink r:id="rId99">
         <w:r>
           <w:rPr>
             <w:rStyle w:val="Hyperlink"/>
@@ -9205,7 +9934,7 @@
         <w:t xml:space="preserve">. You may share, adapt, and use it for any purpose, including commercially, as long as you give appropriate credit to the author.</w:t>
       </w:r>
     </w:p>
-    <w:bookmarkEnd w:id="99"/>
+    <w:bookmarkEnd w:id="100"/>
     <w:sectPr/>
   </w:body>
 </w:document>

</xml_diff>

<commit_message>
Injury and hard going slow Move; the encounter panel checks map distance
- Wounded: Move -2 yards; seriously wounded: half, no running;
  incapacitated: none. Hard going (climbing, swimming, snow, rubble,
  a crowd) halves Move. Stepping away from a fight is free.
- The sheet, HUD and GM cards show Move as injury leaves it.
- The battle map reports the distance between two people (a character by
  its card, anyone else by token name). The encounter panel checks it
  against the weapon: in reach, close enough to move in and strike, or too
  far (reach + Move, with the injury rule); for a ranged weapon it sets the
  range band, or says it's out of range. A note only: the GM rules.

Co-Authored-By: Claude Opus 5.5 <noreply@anthropic.com>
Claude-Session: https://claude.ai/code/session_015SADCFzhKijkC2foUmXrpC
</commit_message>
<xml_diff>
--- a/legend-dynamics/Legend_Dynamics_Core_Rules.docx
+++ b/legend-dynamics/Legend_Dynamics_Core_Rules.docx
@@ -4568,6 +4568,72 @@
       </w:r>
       <w:r>
         <w:t xml:space="preserve">and you cover twice your Move. Threats move 8 yards unless their entry says otherwise.</w:t>
+      </w:r>
+    </w:p>
+    <w:p>
+      <w:pPr>
+        <w:numPr>
+          <w:ilvl w:val="0"/>
+          <w:numId w:val="1009"/>
+        </w:numPr>
+        <w:pStyle w:val="Compact"/>
+      </w:pPr>
+      <w:r>
+        <w:rPr>
+          <w:bCs/>
+          <w:b/>
+        </w:rPr>
+        <w:t xml:space="preserve">Injury slows you.</w:t>
+      </w:r>
+      <w:r>
+        <w:t xml:space="preserve"> </w:t>
+      </w:r>
+      <w:r>
+        <w:t xml:space="preserve">Wounded (1 box): Move −2 yards. Seriously wounded (2 boxes): half your Move, rounded down, and you can’t run. Incapacitated: you don’t move. Never less than 1 yard while you can act.</w:t>
+      </w:r>
+    </w:p>
+    <w:p>
+      <w:pPr>
+        <w:numPr>
+          <w:ilvl w:val="0"/>
+          <w:numId w:val="1009"/>
+        </w:numPr>
+        <w:pStyle w:val="Compact"/>
+      </w:pPr>
+      <w:r>
+        <w:rPr>
+          <w:bCs/>
+          <w:b/>
+        </w:rPr>
+        <w:t xml:space="preserve">Hard going halves it.</w:t>
+      </w:r>
+      <w:r>
+        <w:t xml:space="preserve"> </w:t>
+      </w:r>
+      <w:r>
+        <w:t xml:space="preserve">Climbing, swimming, wading, crawling, deep snow or sand, thick brush, rubble or a crowd: half your Move (and half a run), rounded down. Injury and hard going both apply, injury first.</w:t>
+      </w:r>
+    </w:p>
+    <w:p>
+      <w:pPr>
+        <w:numPr>
+          <w:ilvl w:val="0"/>
+          <w:numId w:val="1009"/>
+        </w:numPr>
+        <w:pStyle w:val="Compact"/>
+      </w:pPr>
+      <w:r>
+        <w:rPr>
+          <w:bCs/>
+          <w:b/>
+        </w:rPr>
+        <w:t xml:space="preserve">Stepping away.</w:t>
+      </w:r>
+      <w:r>
+        <w:t xml:space="preserve"> </w:t>
+      </w:r>
+      <w:r>
+        <w:t xml:space="preserve">You can move away from someone in reach freely; leaving a fight doesn’t give them a free attack.</w:t>
       </w:r>
     </w:p>
     <w:tbl>
@@ -5036,7 +5102,7 @@
     <w:tbl>
       <w:tblPr>
         <w:tblStyle w:val="Table"/>
-        <w:tblW w:type="auto" w:w="0"/>
+        <w:tblW w:type="pct" w:w="5000"/>
         <w:tblLook w:firstRow="1" w:lastRow="0" w:firstColumn="0" w:lastColumn="0" w:noHBand="0" w:noVBand="0" w:val="0020"/>
         <w:jc w:val="start"/>
         <w:tblBorders>
@@ -5203,7 +5269,7 @@
               <w:rPr>
                 <w:sz w:val="19"/>
               </w:rPr>
-              <w:t xml:space="preserve">−1 to physical actions</w:t>
+              <w:t xml:space="preserve">−1 to physical actions; Move −2 yards</w:t>
             </w:r>
           </w:p>
         </w:tc>
@@ -5251,7 +5317,7 @@
               <w:rPr>
                 <w:sz w:val="19"/>
               </w:rPr>
-              <w:t xml:space="preserve">−2 to physical actions</w:t>
+              <w:t xml:space="preserve">−2 to physical actions; half Move, no running</w:t>
             </w:r>
           </w:p>
         </w:tc>
@@ -5320,215 +5386,6 @@
       </w:pPr>
       <w:r>
         <w:t xml:space="preserve">Dying and death</w:t>
-      </w:r>
-    </w:p>
-    <w:p>
-      <w:pPr>
-        <w:numPr>
-          <w:ilvl w:val="0"/>
-          <w:numId w:val="1009"/>
-        </w:numPr>
-        <w:pStyle w:val="Compact"/>
-      </w:pPr>
-      <w:r>
-        <w:rPr>
-          <w:bCs/>
-          <w:b/>
-        </w:rPr>
-        <w:t xml:space="preserve">Dying.</w:t>
-      </w:r>
-      <w:r>
-        <w:t xml:space="preserve"> </w:t>
-      </w:r>
-      <w:r>
-        <w:t xml:space="preserve">A hit from a weapon that marks</w:t>
-      </w:r>
-      <w:r>
-        <w:t xml:space="preserve"> </w:t>
-      </w:r>
-      <w:r>
-        <w:rPr>
-          <w:bCs/>
-          <w:b/>
-        </w:rPr>
-        <w:t xml:space="preserve">2 or more boxes</w:t>
-      </w:r>
-      <w:r>
-        <w:t xml:space="preserve"> </w:t>
-      </w:r>
-      <w:r>
-        <w:t xml:space="preserve">and brings you to three boxes leaves you Incapacitated and</w:t>
-      </w:r>
-      <w:r>
-        <w:t xml:space="preserve"> </w:t>
-      </w:r>
-      <w:r>
-        <w:rPr>
-          <w:bCs/>
-          <w:b/>
-        </w:rPr>
-        <w:t xml:space="preserve">Dying</w:t>
-      </w:r>
-      <w:r>
-        <w:t xml:space="preserve">. A Dying character dies at the end of the scene unless someone stabilizes them: one action and a successful Medicine roll with a medical kit.</w:t>
-      </w:r>
-    </w:p>
-    <w:p>
-      <w:pPr>
-        <w:numPr>
-          <w:ilvl w:val="0"/>
-          <w:numId w:val="1009"/>
-        </w:numPr>
-        <w:pStyle w:val="Compact"/>
-      </w:pPr>
-      <w:r>
-        <w:rPr>
-          <w:bCs/>
-          <w:b/>
-        </w:rPr>
-        <w:t xml:space="preserve">A further hit.</w:t>
-      </w:r>
-      <w:r>
-        <w:t xml:space="preserve"> </w:t>
-      </w:r>
-      <w:r>
-        <w:t xml:space="preserve">While you are at three boxes, any hit from a weapon that marks 2 or more boxes kills you. Fists, clubs and knives just keep you down.</w:t>
-      </w:r>
-    </w:p>
-    <w:p>
-      <w:pPr>
-        <w:numPr>
-          <w:ilvl w:val="0"/>
-          <w:numId w:val="1009"/>
-        </w:numPr>
-        <w:pStyle w:val="Compact"/>
-      </w:pPr>
-      <w:r>
-        <w:rPr>
-          <w:bCs/>
-          <w:b/>
-        </w:rPr>
-        <w:t xml:space="preserve">Certain death.</w:t>
-      </w:r>
-      <w:r>
-        <w:t xml:space="preserve"> </w:t>
-      </w:r>
-      <w:r>
-        <w:t xml:space="preserve">Some fates (a fall into a furnace, a beheading, disintegration) bypass the track entirely.</w:t>
-      </w:r>
-    </w:p>
-    <w:p>
-      <w:pPr>
-        <w:pStyle w:val="FirstParagraph"/>
-      </w:pPr>
-      <w:r>
-        <w:t xml:space="preserve">Your protection is avoiding the hit: a defense (Dodge, Parry or Block), cover, and a Legend point, which reduces a hit by one box.</w:t>
-      </w:r>
-    </w:p>
-    <w:bookmarkEnd w:id="60"/>
-    <w:bookmarkEnd w:id="61"/>
-    <w:bookmarkStart w:id="62" w:name="weapons-and-damage"/>
-    <w:p>
-      <w:pPr>
-        <w:pStyle w:val="Heading2"/>
-      </w:pPr>
-      <w:r>
-        <w:t xml:space="preserve">Weapons and damage</w:t>
-      </w:r>
-    </w:p>
-    <w:p>
-      <w:pPr>
-        <w:pStyle w:val="FirstParagraph"/>
-      </w:pPr>
-      <w:r>
-        <w:t xml:space="preserve">How many boxes a hit marks depends on the</w:t>
-      </w:r>
-      <w:r>
-        <w:t xml:space="preserve"> </w:t>
-      </w:r>
-      <w:r>
-        <w:rPr>
-          <w:bCs/>
-          <w:b/>
-        </w:rPr>
-        <w:t xml:space="preserve">weapon</w:t>
-      </w:r>
-      <w:r>
-        <w:t xml:space="preserve">, not on how well the attack succeeded.</w:t>
-      </w:r>
-    </w:p>
-    <w:p>
-      <w:pPr>
-        <w:pStyle w:val="BodyText"/>
-      </w:pPr>
-      <w:r>
-        <w:rPr>
-          <w:iCs/>
-          <w:i/>
-        </w:rPr>
-        <w:t xml:space="preserve">Your setting pack supplies this (ammo).</w:t>
-      </w:r>
-    </w:p>
-    <w:bookmarkEnd w:id="62"/>
-    <w:bookmarkStart w:id="63" w:name="the-battle-map"/>
-    <w:p>
-      <w:pPr>
-        <w:pStyle w:val="Heading2"/>
-      </w:pPr>
-      <w:r>
-        <w:t xml:space="preserve">The battle map</w:t>
-      </w:r>
-    </w:p>
-    <w:p>
-      <w:pPr>
-        <w:pStyle w:val="FirstParagraph"/>
-      </w:pPr>
-      <w:r>
-        <w:t xml:space="preserve">The GM view of the character creator has a</w:t>
-      </w:r>
-      <w:r>
-        <w:t xml:space="preserve"> </w:t>
-      </w:r>
-      <w:r>
-        <w:rPr>
-          <w:bCs/>
-          <w:b/>
-        </w:rPr>
-        <w:t xml:space="preserve">battle map</w:t>
-      </w:r>
-      <w:r>
-        <w:t xml:space="preserve"> </w:t>
-      </w:r>
-      <w:r>
-        <w:t xml:space="preserve">for fights where it helps to see who is where. It is a tool, not a rule: everything on it follows the rules in this chapter, and a fight without it works the same way. Open</w:t>
-      </w:r>
-      <w:r>
-        <w:t xml:space="preserve"> </w:t>
-      </w:r>
-      <w:r>
-        <w:rPr>
-          <w:bCs/>
-          <w:b/>
-        </w:rPr>
-        <w:t xml:space="preserve">How to use the map</w:t>
-      </w:r>
-      <w:r>
-        <w:t xml:space="preserve"> </w:t>
-      </w:r>
-      <w:r>
-        <w:t xml:space="preserve">on the map itself for the buttons, step by step.</w:t>
-      </w:r>
-    </w:p>
-    <w:p>
-      <w:pPr>
-        <w:pStyle w:val="BodyText"/>
-      </w:pPr>
-      <w:r>
-        <w:rPr>
-          <w:bCs/>
-          <w:b/>
-        </w:rPr>
-        <w:t xml:space="preserve">Two kinds of map.</w:t>
       </w:r>
     </w:p>
     <w:p>
@@ -5544,26 +5401,42 @@
           <w:bCs/>
           <w:b/>
         </w:rPr>
-        <w:t xml:space="preserve">A hex map</w:t>
-      </w:r>
-      <w:r>
-        <w:t xml:space="preserve"> </w:t>
-      </w:r>
-      <w:r>
-        <w:t xml:space="preserve">for fights where position matters: cover, doorways, who can reach whom. The GM chooses what one hex is: 1 yard for a brawl in a room, 5 or 10 yards for a street, 50 for open ground. Dragging a token or measuring shows the distance and its</w:t>
-      </w:r>
-      <w:r>
-        <w:t xml:space="preserve"> </w:t>
-      </w:r>
-      <w:r>
-        <w:rPr>
-          <w:bCs/>
-          <w:b/>
-        </w:rPr>
-        <w:t xml:space="preserve">range band</w:t>
-      </w:r>
-      <w:r>
-        <w:t xml:space="preserve">, so the GM can read the penalty from the Range table above.</w:t>
+        <w:t xml:space="preserve">Dying.</w:t>
+      </w:r>
+      <w:r>
+        <w:t xml:space="preserve"> </w:t>
+      </w:r>
+      <w:r>
+        <w:t xml:space="preserve">A hit from a weapon that marks</w:t>
+      </w:r>
+      <w:r>
+        <w:t xml:space="preserve"> </w:t>
+      </w:r>
+      <w:r>
+        <w:rPr>
+          <w:bCs/>
+          <w:b/>
+        </w:rPr>
+        <w:t xml:space="preserve">2 or more boxes</w:t>
+      </w:r>
+      <w:r>
+        <w:t xml:space="preserve"> </w:t>
+      </w:r>
+      <w:r>
+        <w:t xml:space="preserve">and brings you to three boxes leaves you Incapacitated and</w:t>
+      </w:r>
+      <w:r>
+        <w:t xml:space="preserve"> </w:t>
+      </w:r>
+      <w:r>
+        <w:rPr>
+          <w:bCs/>
+          <w:b/>
+        </w:rPr>
+        <w:t xml:space="preserve">Dying</w:t>
+      </w:r>
+      <w:r>
+        <w:t xml:space="preserve">. A Dying character dies at the end of the scene unless someone stabilizes them: one action and a successful Medicine roll with a medical kit.</w:t>
       </w:r>
     </w:p>
     <w:p>
@@ -5579,13 +5452,35 @@
           <w:bCs/>
           <w:b/>
         </w:rPr>
-        <w:t xml:space="preserve">A range track</w:t>
-      </w:r>
-      <w:r>
-        <w:t xml:space="preserve"> </w:t>
-      </w:r>
-      <w:r>
-        <w:t xml:space="preserve">for fights where only distance matters: a chase, a running fight across open country. It has a lane for the party and one for each range band. Moving a token into the next lane moves it one band in or out.</w:t>
+        <w:t xml:space="preserve">A further hit.</w:t>
+      </w:r>
+      <w:r>
+        <w:t xml:space="preserve"> </w:t>
+      </w:r>
+      <w:r>
+        <w:t xml:space="preserve">While you are at three boxes, any hit from a weapon that marks 2 or more boxes kills you. Fists, clubs and knives just keep you down.</w:t>
+      </w:r>
+    </w:p>
+    <w:p>
+      <w:pPr>
+        <w:numPr>
+          <w:ilvl w:val="0"/>
+          <w:numId w:val="1010"/>
+        </w:numPr>
+        <w:pStyle w:val="Compact"/>
+      </w:pPr>
+      <w:r>
+        <w:rPr>
+          <w:bCs/>
+          <w:b/>
+        </w:rPr>
+        <w:t xml:space="preserve">Certain death.</w:t>
+      </w:r>
+      <w:r>
+        <w:t xml:space="preserve"> </w:t>
+      </w:r>
+      <w:r>
+        <w:t xml:space="preserve">Some fates (a fall into a furnace, a beheading, disintegration) bypass the track entirely.</w:t>
       </w:r>
     </w:p>
     <w:p>
@@ -5593,17 +5488,39 @@
         <w:pStyle w:val="FirstParagraph"/>
       </w:pPr>
       <w:r>
-        <w:rPr>
-          <w:bCs/>
-          <w:b/>
-        </w:rPr>
-        <w:t xml:space="preserve">Tokens.</w:t>
-      </w:r>
-      <w:r>
-        <w:t xml:space="preserve"> </w:t>
-      </w:r>
-      <w:r>
-        <w:t xml:space="preserve">The GM places the party with one button. Their tokens stay linked to the characters in the GM view: marking Injury, Dying, the stunned condition or a Legend point on a token marks it on the character, and the other way round. Opponents come from the setting’s threats with their boxes filled in. Their pips fill as they are hurt, and a token whose boxes are all marked is taken out.</w:t>
+        <w:t xml:space="preserve">Your protection is avoiding the hit: a defense (Dodge, Parry or Block), cover, and a Legend point, which reduces a hit by one box.</w:t>
+      </w:r>
+    </w:p>
+    <w:bookmarkEnd w:id="60"/>
+    <w:bookmarkEnd w:id="61"/>
+    <w:bookmarkStart w:id="62" w:name="weapons-and-damage"/>
+    <w:p>
+      <w:pPr>
+        <w:pStyle w:val="Heading2"/>
+      </w:pPr>
+      <w:r>
+        <w:t xml:space="preserve">Weapons and damage</w:t>
+      </w:r>
+    </w:p>
+    <w:p>
+      <w:pPr>
+        <w:pStyle w:val="FirstParagraph"/>
+      </w:pPr>
+      <w:r>
+        <w:t xml:space="preserve">How many boxes a hit marks depends on the</w:t>
+      </w:r>
+      <w:r>
+        <w:t xml:space="preserve"> </w:t>
+      </w:r>
+      <w:r>
+        <w:rPr>
+          <w:bCs/>
+          <w:b/>
+        </w:rPr>
+        <w:t xml:space="preserve">weapon</w:t>
+      </w:r>
+      <w:r>
+        <w:t xml:space="preserve">, not on how well the attack succeeded.</w:t>
       </w:r>
     </w:p>
     <w:p>
@@ -5612,42 +5529,20 @@
       </w:pPr>
       <w:r>
         <w:rPr>
-          <w:bCs/>
-          <w:b/>
-        </w:rPr>
-        <w:t xml:space="preserve">Keeping a map.</w:t>
-      </w:r>
-      <w:r>
-        <w:t xml:space="preserve"> </w:t>
-      </w:r>
-      <w:r>
-        <w:t xml:space="preserve">The map stays in the GM’s browser.</w:t>
-      </w:r>
-      <w:r>
-        <w:t xml:space="preserve"> </w:t>
-      </w:r>
-      <w:r>
-        <w:rPr>
-          <w:bCs/>
-          <w:b/>
-        </w:rPr>
-        <w:t xml:space="preserve">Save map to file</w:t>
-      </w:r>
-      <w:r>
-        <w:t xml:space="preserve"> </w:t>
-      </w:r>
-      <w:r>
-        <w:t xml:space="preserve">keeps both maps, their pictures and tokens in one file, to prepare a fight ahead of time or share it with another GM.</w:t>
-      </w:r>
-    </w:p>
-    <w:bookmarkEnd w:id="63"/>
-    <w:bookmarkStart w:id="64" w:name="the-encounter-panel"/>
+          <w:iCs/>
+          <w:i/>
+        </w:rPr>
+        <w:t xml:space="preserve">Your setting pack supplies this (ammo).</w:t>
+      </w:r>
+    </w:p>
+    <w:bookmarkEnd w:id="62"/>
+    <w:bookmarkStart w:id="63" w:name="the-battle-map"/>
     <w:p>
       <w:pPr>
         <w:pStyle w:val="Heading2"/>
       </w:pPr>
       <w:r>
-        <w:t xml:space="preserve">The Encounter panel</w:t>
+        <w:t xml:space="preserve">The battle map</w:t>
       </w:r>
     </w:p>
     <w:p>
@@ -5655,105 +5550,51 @@
         <w:pStyle w:val="FirstParagraph"/>
       </w:pPr>
       <w:r>
-        <w:t xml:space="preserve">The GM view also has an</w:t>
-      </w:r>
-      <w:r>
-        <w:t xml:space="preserve"> </w:t>
-      </w:r>
-      <w:r>
-        <w:rPr>
-          <w:bCs/>
-          <w:b/>
-        </w:rPr>
-        <w:t xml:space="preserve">Encounter</w:t>
-      </w:r>
-      <w:r>
-        <w:t xml:space="preserve"> </w:t>
-      </w:r>
-      <w:r>
-        <w:t xml:space="preserve">panel that runs a fight by these rules and shows every roll. Add characters from the GM view and opponents from the Threats table (or make one up on the spot), then start: it keeps the turn order by Agility, and for each attack works out the range, the defense (Dodge, Parry or Block, one a round, and a second at −2 with Additional Defense), the boxes marked and any telling hit, offering a Legend point choices at the moment they apply. Hits land on the character cards and the battle map, and with gritty combat on, grievous wounds are rolled and kept. The panel keeps a log and a summary of the fight, which can be saved to a file. It’s a helper, not a rule: the GM can rule any result differently, and the log says so.</w:t>
-      </w:r>
-    </w:p>
-    <w:bookmarkEnd w:id="64"/>
-    <w:bookmarkEnd w:id="65"/>
-    <w:bookmarkStart w:id="71" w:name="medical-care"/>
-    <w:p>
-      <w:pPr>
-        <w:pStyle w:val="Heading1"/>
-      </w:pPr>
-      <w:r>
-        <w:t xml:space="preserve">Medical care</w:t>
-      </w:r>
-    </w:p>
-    <w:bookmarkStart w:id="66" w:name="diagnosis-and-stabilization"/>
-    <w:p>
-      <w:pPr>
-        <w:pStyle w:val="Heading2"/>
-      </w:pPr>
-      <w:r>
-        <w:t xml:space="preserve">Diagnosis and stabilization</w:t>
-      </w:r>
-    </w:p>
-    <w:p>
-      <w:pPr>
-        <w:pStyle w:val="FirstParagraph"/>
-      </w:pPr>
-      <w:r>
-        <w:t xml:space="preserve">Roll Medicine when the diagnosis is uncertain or an urgent treatment decision matters. Emergency stabilization takes one action and a successful Medicine roll with a medical kit. It ends Dying and stops deterioration, but removes no boxes.</w:t>
-      </w:r>
-    </w:p>
-    <w:bookmarkEnd w:id="66"/>
-    <w:bookmarkStart w:id="67" w:name="field-treatment"/>
-    <w:p>
-      <w:pPr>
-        <w:pStyle w:val="Heading2"/>
-      </w:pPr>
-      <w:r>
-        <w:t xml:space="preserve">Field treatment</w:t>
-      </w:r>
-    </w:p>
-    <w:p>
-      <w:pPr>
-        <w:pStyle w:val="FirstParagraph"/>
-      </w:pPr>
-      <w:r>
-        <w:t xml:space="preserve">With a medical kit and several uninterrupted minutes, successful Medicine removes one injury box; success by 5 or more removes two.</w:t>
-      </w:r>
-    </w:p>
-    <w:bookmarkEnd w:id="67"/>
-    <w:bookmarkStart w:id="68" w:name="proper-care"/>
-    <w:p>
-      <w:pPr>
-        <w:pStyle w:val="Heading2"/>
-      </w:pPr>
-      <w:r>
-        <w:t xml:space="preserve">Proper care</w:t>
-      </w:r>
-    </w:p>
-    <w:p>
-      <w:pPr>
-        <w:pStyle w:val="FirstParagraph"/>
-      </w:pPr>
-      <w:r>
-        <w:t xml:space="preserve">A proper infirmary grants +2 to Medicine. A successful treatment removes two boxes; success by 5 or more removes three. Allow the time the treatment requires.</w:t>
-      </w:r>
-    </w:p>
-    <w:bookmarkEnd w:id="68"/>
-    <w:bookmarkStart w:id="69" w:name="treatment-attempts"/>
-    <w:p>
-      <w:pPr>
-        <w:pStyle w:val="Heading2"/>
-      </w:pPr>
-      <w:r>
-        <w:t xml:space="preserve">Treatment attempts</w:t>
-      </w:r>
-    </w:p>
-    <w:p>
-      <w:pPr>
-        <w:pStyle w:val="FirstParagraph"/>
-      </w:pPr>
-      <w:r>
-        <w:t xml:space="preserve">Each set of injuries permits one field-treatment attempt and one proper-care attempt. Further rolls require a meaningful improvement in care, a new treatment, or recovery time. Simply waiting and trying again is insufficient.</w:t>
+        <w:t xml:space="preserve">The GM view of the character creator has a</w:t>
+      </w:r>
+      <w:r>
+        <w:t xml:space="preserve"> </w:t>
+      </w:r>
+      <w:r>
+        <w:rPr>
+          <w:bCs/>
+          <w:b/>
+        </w:rPr>
+        <w:t xml:space="preserve">battle map</w:t>
+      </w:r>
+      <w:r>
+        <w:t xml:space="preserve"> </w:t>
+      </w:r>
+      <w:r>
+        <w:t xml:space="preserve">for fights where it helps to see who is where. It is a tool, not a rule: everything on it follows the rules in this chapter, and a fight without it works the same way. Open</w:t>
+      </w:r>
+      <w:r>
+        <w:t xml:space="preserve"> </w:t>
+      </w:r>
+      <w:r>
+        <w:rPr>
+          <w:bCs/>
+          <w:b/>
+        </w:rPr>
+        <w:t xml:space="preserve">How to use the map</w:t>
+      </w:r>
+      <w:r>
+        <w:t xml:space="preserve"> </w:t>
+      </w:r>
+      <w:r>
+        <w:t xml:space="preserve">on the map itself for the buttons, step by step.</w:t>
+      </w:r>
+    </w:p>
+    <w:p>
+      <w:pPr>
+        <w:pStyle w:val="BodyText"/>
+      </w:pPr>
+      <w:r>
+        <w:rPr>
+          <w:bCs/>
+          <w:b/>
+        </w:rPr>
+        <w:t xml:space="preserve">Two kinds of map.</w:t>
       </w:r>
     </w:p>
     <w:p>
@@ -5769,13 +5610,26 @@
           <w:bCs/>
           <w:b/>
         </w:rPr>
-        <w:t xml:space="preserve">A set of injuries</w:t>
-      </w:r>
-      <w:r>
-        <w:t xml:space="preserve"> </w:t>
-      </w:r>
-      <w:r>
-        <w:t xml:space="preserve">is the injury boxes from one encounter or one harmful incident: a fight, a fall, a fire, a night of exposure.</w:t>
+        <w:t xml:space="preserve">A hex map</w:t>
+      </w:r>
+      <w:r>
+        <w:t xml:space="preserve"> </w:t>
+      </w:r>
+      <w:r>
+        <w:t xml:space="preserve">for fights where position matters: cover, doorways, who can reach whom. The GM chooses what one hex is: 1 yard for a brawl in a room, 5 or 10 yards for a street, 50 for open ground. Dragging a token or measuring shows the distance and its</w:t>
+      </w:r>
+      <w:r>
+        <w:t xml:space="preserve"> </w:t>
+      </w:r>
+      <w:r>
+        <w:rPr>
+          <w:bCs/>
+          <w:b/>
+        </w:rPr>
+        <w:t xml:space="preserve">range band</w:t>
+      </w:r>
+      <w:r>
+        <w:t xml:space="preserve">, so the GM can read the penalty from the Range table above.</w:t>
       </w:r>
     </w:p>
     <w:p>
@@ -5791,20 +5645,188 @@
           <w:bCs/>
           <w:b/>
         </w:rPr>
-        <w:t xml:space="preserve">Later injuries start a new set.</w:t>
-      </w:r>
-      <w:r>
-        <w:t xml:space="preserve"> </w:t>
-      </w:r>
-      <w:r>
-        <w:t xml:space="preserve">Its attempts can remove only its own boxes. A fresh scratch doesn’t reopen the wounds you already treated: those boxes stay until their own set allows another roll, or rest clears them.</w:t>
+        <w:t xml:space="preserve">A range track</w:t>
+      </w:r>
+      <w:r>
+        <w:t xml:space="preserve"> </w:t>
+      </w:r>
+      <w:r>
+        <w:t xml:space="preserve">for fights where only distance matters: a chase, a running fight across open country. It has a lane for the party and one for each range band. Moving a token into the next lane moves it one band in or out.</w:t>
+      </w:r>
+    </w:p>
+    <w:p>
+      <w:pPr>
+        <w:pStyle w:val="FirstParagraph"/>
+      </w:pPr>
+      <w:r>
+        <w:rPr>
+          <w:bCs/>
+          <w:b/>
+        </w:rPr>
+        <w:t xml:space="preserve">Tokens.</w:t>
+      </w:r>
+      <w:r>
+        <w:t xml:space="preserve"> </w:t>
+      </w:r>
+      <w:r>
+        <w:t xml:space="preserve">The GM places the party with one button. Their tokens stay linked to the characters in the GM view: marking Injury, Dying, the stunned condition or a Legend point on a token marks it on the character, and the other way round. Opponents come from the setting’s threats with their boxes filled in. Their pips fill as they are hurt, and a token whose boxes are all marked is taken out.</w:t>
+      </w:r>
+    </w:p>
+    <w:p>
+      <w:pPr>
+        <w:pStyle w:val="BodyText"/>
+      </w:pPr>
+      <w:r>
+        <w:rPr>
+          <w:bCs/>
+          <w:b/>
+        </w:rPr>
+        <w:t xml:space="preserve">Keeping a map.</w:t>
+      </w:r>
+      <w:r>
+        <w:t xml:space="preserve"> </w:t>
+      </w:r>
+      <w:r>
+        <w:t xml:space="preserve">The map stays in the GM’s browser.</w:t>
+      </w:r>
+      <w:r>
+        <w:t xml:space="preserve"> </w:t>
+      </w:r>
+      <w:r>
+        <w:rPr>
+          <w:bCs/>
+          <w:b/>
+        </w:rPr>
+        <w:t xml:space="preserve">Save map to file</w:t>
+      </w:r>
+      <w:r>
+        <w:t xml:space="preserve"> </w:t>
+      </w:r>
+      <w:r>
+        <w:t xml:space="preserve">keeps both maps, their pictures and tokens in one file, to prepare a fight ahead of time or share it with another GM.</w:t>
+      </w:r>
+    </w:p>
+    <w:bookmarkEnd w:id="63"/>
+    <w:bookmarkStart w:id="64" w:name="the-encounter-panel"/>
+    <w:p>
+      <w:pPr>
+        <w:pStyle w:val="Heading2"/>
+      </w:pPr>
+      <w:r>
+        <w:t xml:space="preserve">The Encounter panel</w:t>
+      </w:r>
+    </w:p>
+    <w:p>
+      <w:pPr>
+        <w:pStyle w:val="FirstParagraph"/>
+      </w:pPr>
+      <w:r>
+        <w:t xml:space="preserve">The GM view also has an</w:t>
+      </w:r>
+      <w:r>
+        <w:t xml:space="preserve"> </w:t>
+      </w:r>
+      <w:r>
+        <w:rPr>
+          <w:bCs/>
+          <w:b/>
+        </w:rPr>
+        <w:t xml:space="preserve">Encounter</w:t>
+      </w:r>
+      <w:r>
+        <w:t xml:space="preserve"> </w:t>
+      </w:r>
+      <w:r>
+        <w:t xml:space="preserve">panel that runs a fight by these rules and shows every roll. Add characters from the GM view and opponents from the Threats table (or make one up on the spot), then start: it keeps the turn order by Agility, and for each attack works out the range, the defense (Dodge, Parry or Block, one a round, and a second at −2 with Additional Defense), the boxes marked and any telling hit, offering a Legend point choices at the moment they apply. Hits land on the character cards and the battle map, and with gritty combat on, grievous wounds are rolled and kept. The panel keeps a log and a summary of the fight, which can be saved to a file. It’s a helper, not a rule: the GM can rule any result differently, and the log says so.</w:t>
+      </w:r>
+    </w:p>
+    <w:bookmarkEnd w:id="64"/>
+    <w:bookmarkEnd w:id="65"/>
+    <w:bookmarkStart w:id="71" w:name="medical-care"/>
+    <w:p>
+      <w:pPr>
+        <w:pStyle w:val="Heading1"/>
+      </w:pPr>
+      <w:r>
+        <w:t xml:space="preserve">Medical care</w:t>
+      </w:r>
+    </w:p>
+    <w:bookmarkStart w:id="66" w:name="diagnosis-and-stabilization"/>
+    <w:p>
+      <w:pPr>
+        <w:pStyle w:val="Heading2"/>
+      </w:pPr>
+      <w:r>
+        <w:t xml:space="preserve">Diagnosis and stabilization</w:t>
+      </w:r>
+    </w:p>
+    <w:p>
+      <w:pPr>
+        <w:pStyle w:val="FirstParagraph"/>
+      </w:pPr>
+      <w:r>
+        <w:t xml:space="preserve">Roll Medicine when the diagnosis is uncertain or an urgent treatment decision matters. Emergency stabilization takes one action and a successful Medicine roll with a medical kit. It ends Dying and stops deterioration, but removes no boxes.</w:t>
+      </w:r>
+    </w:p>
+    <w:bookmarkEnd w:id="66"/>
+    <w:bookmarkStart w:id="67" w:name="field-treatment"/>
+    <w:p>
+      <w:pPr>
+        <w:pStyle w:val="Heading2"/>
+      </w:pPr>
+      <w:r>
+        <w:t xml:space="preserve">Field treatment</w:t>
+      </w:r>
+    </w:p>
+    <w:p>
+      <w:pPr>
+        <w:pStyle w:val="FirstParagraph"/>
+      </w:pPr>
+      <w:r>
+        <w:t xml:space="preserve">With a medical kit and several uninterrupted minutes, successful Medicine removes one injury box; success by 5 or more removes two.</w:t>
+      </w:r>
+    </w:p>
+    <w:bookmarkEnd w:id="67"/>
+    <w:bookmarkStart w:id="68" w:name="proper-care"/>
+    <w:p>
+      <w:pPr>
+        <w:pStyle w:val="Heading2"/>
+      </w:pPr>
+      <w:r>
+        <w:t xml:space="preserve">Proper care</w:t>
+      </w:r>
+    </w:p>
+    <w:p>
+      <w:pPr>
+        <w:pStyle w:val="FirstParagraph"/>
+      </w:pPr>
+      <w:r>
+        <w:t xml:space="preserve">A proper infirmary grants +2 to Medicine. A successful treatment removes two boxes; success by 5 or more removes three. Allow the time the treatment requires.</w:t>
+      </w:r>
+    </w:p>
+    <w:bookmarkEnd w:id="68"/>
+    <w:bookmarkStart w:id="69" w:name="treatment-attempts"/>
+    <w:p>
+      <w:pPr>
+        <w:pStyle w:val="Heading2"/>
+      </w:pPr>
+      <w:r>
+        <w:t xml:space="preserve">Treatment attempts</w:t>
+      </w:r>
+    </w:p>
+    <w:p>
+      <w:pPr>
+        <w:pStyle w:val="FirstParagraph"/>
+      </w:pPr>
+      <w:r>
+        <w:t xml:space="preserve">Each set of injuries permits one field-treatment attempt and one proper-care attempt. Further rolls require a meaningful improvement in care, a new treatment, or recovery time. Simply waiting and trying again is insufficient.</w:t>
       </w:r>
     </w:p>
     <w:p>
       <w:pPr>
         <w:numPr>
           <w:ilvl w:val="0"/>
-          <w:numId w:val="1011"/>
+          <w:numId w:val="1012"/>
         </w:numPr>
         <w:pStyle w:val="Compact"/>
       </w:pPr>
@@ -5813,20 +5835,64 @@
           <w:bCs/>
           <w:b/>
         </w:rPr>
-        <w:t xml:space="preserve">What allows another roll:</w:t>
-      </w:r>
-      <w:r>
-        <w:t xml:space="preserve"> </w:t>
-      </w:r>
-      <w:r>
-        <w:t xml:space="preserve">a meaningful improvement (moving from the field to A proper infirmary, a better healer taking over), a new treatment (surgery, a remedy, healing magic), or recovery time (rest that has already cleared a box from that set). The GM decides whether a change is meaningful.</w:t>
+        <w:t xml:space="preserve">A set of injuries</w:t>
+      </w:r>
+      <w:r>
+        <w:t xml:space="preserve"> </w:t>
+      </w:r>
+      <w:r>
+        <w:t xml:space="preserve">is the injury boxes from one encounter or one harmful incident: a fight, a fall, a fire, a night of exposure.</w:t>
       </w:r>
     </w:p>
     <w:p>
       <w:pPr>
         <w:numPr>
           <w:ilvl w:val="0"/>
-          <w:numId w:val="1011"/>
+          <w:numId w:val="1012"/>
+        </w:numPr>
+        <w:pStyle w:val="Compact"/>
+      </w:pPr>
+      <w:r>
+        <w:rPr>
+          <w:bCs/>
+          <w:b/>
+        </w:rPr>
+        <w:t xml:space="preserve">Later injuries start a new set.</w:t>
+      </w:r>
+      <w:r>
+        <w:t xml:space="preserve"> </w:t>
+      </w:r>
+      <w:r>
+        <w:t xml:space="preserve">Its attempts can remove only its own boxes. A fresh scratch doesn’t reopen the wounds you already treated: those boxes stay until their own set allows another roll, or rest clears them.</w:t>
+      </w:r>
+    </w:p>
+    <w:p>
+      <w:pPr>
+        <w:numPr>
+          <w:ilvl w:val="0"/>
+          <w:numId w:val="1012"/>
+        </w:numPr>
+        <w:pStyle w:val="Compact"/>
+      </w:pPr>
+      <w:r>
+        <w:rPr>
+          <w:bCs/>
+          <w:b/>
+        </w:rPr>
+        <w:t xml:space="preserve">What allows another roll:</w:t>
+      </w:r>
+      <w:r>
+        <w:t xml:space="preserve"> </w:t>
+      </w:r>
+      <w:r>
+        <w:t xml:space="preserve">a meaningful improvement (moving from the field to A proper infirmary, a better healer taking over), a new treatment (surgery, a remedy, healing magic), or recovery time (rest that has already cleared a box from that set). The GM decides whether a change is meaningful.</w:t>
+      </w:r>
+    </w:p>
+    <w:p>
+      <w:pPr>
+        <w:numPr>
+          <w:ilvl w:val="0"/>
+          <w:numId w:val="1012"/>
         </w:numPr>
         <w:pStyle w:val="Compact"/>
       </w:pPr>
@@ -6357,7 +6423,7 @@
       <w:pPr>
         <w:numPr>
           <w:ilvl w:val="0"/>
-          <w:numId w:val="1012"/>
+          <w:numId w:val="1013"/>
         </w:numPr>
         <w:pStyle w:val="Compact"/>
       </w:pPr>
@@ -6407,7 +6473,7 @@
       <w:pPr>
         <w:numPr>
           <w:ilvl w:val="0"/>
-          <w:numId w:val="1012"/>
+          <w:numId w:val="1013"/>
         </w:numPr>
         <w:pStyle w:val="Compact"/>
       </w:pPr>
@@ -6456,7 +6522,7 @@
       <w:pPr>
         <w:numPr>
           <w:ilvl w:val="0"/>
-          <w:numId w:val="1012"/>
+          <w:numId w:val="1013"/>
         </w:numPr>
         <w:pStyle w:val="Compact"/>
       </w:pPr>
@@ -6889,7 +6955,7 @@
       <w:pPr>
         <w:numPr>
           <w:ilvl w:val="0"/>
-          <w:numId w:val="1013"/>
+          <w:numId w:val="1014"/>
         </w:numPr>
         <w:pStyle w:val="Compact"/>
       </w:pPr>
@@ -6911,7 +6977,7 @@
       <w:pPr>
         <w:numPr>
           <w:ilvl w:val="0"/>
-          <w:numId w:val="1013"/>
+          <w:numId w:val="1014"/>
         </w:numPr>
         <w:pStyle w:val="Compact"/>
       </w:pPr>
@@ -6933,7 +6999,7 @@
       <w:pPr>
         <w:numPr>
           <w:ilvl w:val="0"/>
-          <w:numId w:val="1013"/>
+          <w:numId w:val="1014"/>
         </w:numPr>
         <w:pStyle w:val="Compact"/>
       </w:pPr>
@@ -8070,7 +8136,7 @@
       <w:pPr>
         <w:numPr>
           <w:ilvl w:val="0"/>
-          <w:numId w:val="1014"/>
+          <w:numId w:val="1015"/>
         </w:numPr>
         <w:pStyle w:val="Compact"/>
       </w:pPr>
@@ -8131,7 +8197,7 @@
       <w:pPr>
         <w:numPr>
           <w:ilvl w:val="0"/>
-          <w:numId w:val="1014"/>
+          <w:numId w:val="1015"/>
         </w:numPr>
         <w:pStyle w:val="Compact"/>
       </w:pPr>
@@ -8539,7 +8605,7 @@
       <w:pPr>
         <w:numPr>
           <w:ilvl w:val="0"/>
-          <w:numId w:val="1015"/>
+          <w:numId w:val="1016"/>
         </w:numPr>
         <w:pStyle w:val="Compact"/>
       </w:pPr>
@@ -8555,228 +8621,6 @@
       </w:r>
       <w:r>
         <w:t xml:space="preserve">What happened, and did we succeed: fully, partly, or not at all?</w:t>
-      </w:r>
-    </w:p>
-    <w:p>
-      <w:pPr>
-        <w:numPr>
-          <w:ilvl w:val="0"/>
-          <w:numId w:val="1015"/>
-        </w:numPr>
-        <w:pStyle w:val="Compact"/>
-      </w:pPr>
-      <w:r>
-        <w:rPr>
-          <w:bCs/>
-          <w:b/>
-        </w:rPr>
-        <w:t xml:space="preserve">Who stood out?</w:t>
-      </w:r>
-      <w:r>
-        <w:t xml:space="preserve"> </w:t>
-      </w:r>
-      <w:r>
-        <w:t xml:space="preserve">A moment worth remembering.</w:t>
-      </w:r>
-    </w:p>
-    <w:p>
-      <w:pPr>
-        <w:numPr>
-          <w:ilvl w:val="0"/>
-          <w:numId w:val="1015"/>
-        </w:numPr>
-        <w:pStyle w:val="Compact"/>
-      </w:pPr>
-      <w:r>
-        <w:rPr>
-          <w:bCs/>
-          <w:b/>
-        </w:rPr>
-        <w:t xml:space="preserve">Complications.</w:t>
-      </w:r>
-      <w:r>
-        <w:t xml:space="preserve"> </w:t>
-      </w:r>
-      <w:r>
-        <w:t xml:space="preserve">Which ones came into play, and what did they cost?</w:t>
-      </w:r>
-    </w:p>
-    <w:p>
-      <w:pPr>
-        <w:numPr>
-          <w:ilvl w:val="0"/>
-          <w:numId w:val="1015"/>
-        </w:numPr>
-        <w:pStyle w:val="Compact"/>
-      </w:pPr>
-      <w:r>
-        <w:rPr>
-          <w:bCs/>
-          <w:b/>
-        </w:rPr>
-        <w:t xml:space="preserve">What changed?</w:t>
-      </w:r>
-      <w:r>
-        <w:t xml:space="preserve"> </w:t>
-      </w:r>
-      <w:r>
-        <w:t xml:space="preserve">New allies or enemies, damage, open threads for next time.</w:t>
-      </w:r>
-    </w:p>
-    <w:p>
-      <w:pPr>
-        <w:numPr>
-          <w:ilvl w:val="0"/>
-          <w:numId w:val="1015"/>
-        </w:numPr>
-        <w:pStyle w:val="Compact"/>
-      </w:pPr>
-      <w:r>
-        <w:rPr>
-          <w:bCs/>
-          <w:b/>
-        </w:rPr>
-        <w:t xml:space="preserve">Advancement.</w:t>
-      </w:r>
-      <w:r>
-        <w:t xml:space="preserve"> </w:t>
-      </w:r>
-      <w:r>
-        <w:t xml:space="preserve">After a significant mission, each character earns 1 advancement point; at a milestone, 2 more.</w:t>
-      </w:r>
-    </w:p>
-    <w:bookmarkEnd w:id="82"/>
-    <w:bookmarkEnd w:id="83"/>
-    <w:bookmarkStart w:id="84" w:name="ready-made-characters"/>
-    <w:p>
-      <w:pPr>
-        <w:pStyle w:val="Heading1"/>
-      </w:pPr>
-      <w:r>
-        <w:t xml:space="preserve">Ready-made characters</w:t>
-      </w:r>
-    </w:p>
-    <w:p>
-      <w:pPr>
-        <w:pStyle w:val="FirstParagraph"/>
-      </w:pPr>
-      <w:r>
-        <w:t xml:space="preserve">Characters ready to play, for one-shots, new players, or a group in a hurry. Each follows the creation rules exactly, and their connections tie them together. In the creator, choose one from the ready-made list to open it and make it your own.</w:t>
-      </w:r>
-    </w:p>
-    <w:p>
-      <w:pPr>
-        <w:pStyle w:val="BodyText"/>
-      </w:pPr>
-      <w:r>
-        <w:rPr>
-          <w:iCs/>
-          <w:i/>
-        </w:rPr>
-        <w:t xml:space="preserve">Your setting pack supplies this (pregens).</w:t>
-      </w:r>
-    </w:p>
-    <w:bookmarkEnd w:id="84"/>
-    <w:bookmarkStart w:id="85" w:name="advantages"/>
-    <w:p>
-      <w:pPr>
-        <w:pStyle w:val="Heading1"/>
-      </w:pPr>
-      <w:r>
-        <w:t xml:space="preserve">Advantages</w:t>
-      </w:r>
-    </w:p>
-    <w:p>
-      <w:pPr>
-        <w:pStyle w:val="FirstParagraph"/>
-      </w:pPr>
-      <w:r>
-        <w:t xml:space="preserve">Choose one advantage at character creation: a general advantage from this chapter, or an origin advantage from the next. Each grants +2 only in the listed circumstances. An advantage does not grant training, authorize an impossible action, or replace essential gear. Use only one advantage bonus per roll.</w:t>
-      </w:r>
-    </w:p>
-    <w:p>
-      <w:pPr>
-        <w:pStyle w:val="BodyText"/>
-      </w:pPr>
-      <w:r>
-        <w:rPr>
-          <w:iCs/>
-          <w:i/>
-        </w:rPr>
-        <w:t xml:space="preserve">Your setting pack supplies this (advantages).</w:t>
-      </w:r>
-    </w:p>
-    <w:bookmarkEnd w:id="85"/>
-    <w:bookmarkStart w:id="86" w:name="origins"/>
-    <w:p>
-      <w:pPr>
-        <w:pStyle w:val="Heading1"/>
-      </w:pPr>
-      <w:r>
-        <w:t xml:space="preserve">Origins</w:t>
-      </w:r>
-    </w:p>
-    <w:p>
-      <w:pPr>
-        <w:pStyle w:val="FirstParagraph"/>
-      </w:pPr>
-      <w:r>
-        <w:rPr>
-          <w:iCs/>
-          <w:i/>
-        </w:rPr>
-        <w:t xml:space="preserve">Your setting pack supplies this (origins).</w:t>
-      </w:r>
-    </w:p>
-    <w:bookmarkEnd w:id="86"/>
-    <w:bookmarkStart w:id="97" w:name="making-your-own"/>
-    <w:p>
-      <w:pPr>
-        <w:pStyle w:val="Heading1"/>
-      </w:pPr>
-      <w:r>
-        <w:t xml:space="preserve">Making your own</w:t>
-      </w:r>
-    </w:p>
-    <w:p>
-      <w:pPr>
-        <w:pStyle w:val="FirstParagraph"/>
-      </w:pPr>
-      <w:r>
-        <w:t xml:space="preserve">The roles and origins in this book are a starting point, not a limit. With the GM’s agreement, any player can create their own role or origin. The creator has a</w:t>
-      </w:r>
-      <w:r>
-        <w:t xml:space="preserve"> </w:t>
-      </w:r>
-      <w:r>
-        <w:rPr>
-          <w:bCs/>
-          <w:b/>
-        </w:rPr>
-        <w:t xml:space="preserve">Custom</w:t>
-      </w:r>
-      <w:r>
-        <w:t xml:space="preserve"> </w:t>
-      </w:r>
-      <w:r>
-        <w:t xml:space="preserve">option at the end of each list, and its checklist holds a custom choice to the same rules as everything else.</w:t>
-      </w:r>
-    </w:p>
-    <w:bookmarkStart w:id="87" w:name="a-custom-role"/>
-    <w:p>
-      <w:pPr>
-        <w:pStyle w:val="Heading2"/>
-      </w:pPr>
-      <w:r>
-        <w:t xml:space="preserve">A custom role</w:t>
-      </w:r>
-    </w:p>
-    <w:p>
-      <w:pPr>
-        <w:pStyle w:val="FirstParagraph"/>
-      </w:pPr>
-      <w:r>
-        <w:t xml:space="preserve">A role is a concept, not a package of powers: it gives no bonus of its own. A custom one only needs a clear place in the group.</w:t>
       </w:r>
     </w:p>
     <w:p>
@@ -8792,37 +8636,13 @@
           <w:bCs/>
           <w:b/>
         </w:rPr>
-        <w:t xml:space="preserve">Name it and describe it.</w:t>
-      </w:r>
-      <w:r>
-        <w:t xml:space="preserve"> </w:t>
-      </w:r>
-      <w:r>
-        <w:t xml:space="preserve">One sentence for what your character does that no one else does, in the style of the roles above:</w:t>
-      </w:r>
-      <w:r>
-        <w:t xml:space="preserve"> </w:t>
-      </w:r>
-      <w:r>
-        <w:rPr>
-          <w:iCs/>
-          <w:i/>
-        </w:rPr>
-        <w:t xml:space="preserve">“</w:t>
-      </w:r>
-      <w:r>
-        <w:rPr>
-          <w:iCs/>
-          <w:i/>
-        </w:rPr>
-        <w:t xml:space="preserve">Smuggler: knows every back door, bribe and hidden hold.</w:t>
-      </w:r>
-      <w:r>
-        <w:rPr>
-          <w:iCs/>
-          <w:i/>
-        </w:rPr>
-        <w:t xml:space="preserve">”</w:t>
+        <w:t xml:space="preserve">Who stood out?</w:t>
+      </w:r>
+      <w:r>
+        <w:t xml:space="preserve"> </w:t>
+      </w:r>
+      <w:r>
+        <w:t xml:space="preserve">A moment worth remembering.</w:t>
       </w:r>
     </w:p>
     <w:p>
@@ -8838,13 +8658,13 @@
           <w:bCs/>
           <w:b/>
         </w:rPr>
-        <w:t xml:space="preserve">Choose a group.</w:t>
-      </w:r>
-      <w:r>
-        <w:t xml:space="preserve"> </w:t>
-      </w:r>
-      <w:r>
-        <w:t xml:space="preserve">Pick the one it belongs with: one of your setting’s groups. The group only sets your sheet’s colors and emblem.</w:t>
+        <w:t xml:space="preserve">Complications.</w:t>
+      </w:r>
+      <w:r>
+        <w:t xml:space="preserve"> </w:t>
+      </w:r>
+      <w:r>
+        <w:t xml:space="preserve">Which ones came into play, and what did they cost?</w:t>
       </w:r>
     </w:p>
     <w:p>
@@ -8860,13 +8680,13 @@
           <w:bCs/>
           <w:b/>
         </w:rPr>
-        <w:t xml:space="preserve">Pick four core skills.</w:t>
-      </w:r>
-      <w:r>
-        <w:t xml:space="preserve"> </w:t>
-      </w:r>
-      <w:r>
-        <w:t xml:space="preserve">The skills it can’t do without. Mark them Trained yourself in step 3 (the built-in roles do this for you); they count toward your normal Trained skills.</w:t>
+        <w:t xml:space="preserve">What changed?</w:t>
+      </w:r>
+      <w:r>
+        <w:t xml:space="preserve"> </w:t>
+      </w:r>
+      <w:r>
+        <w:t xml:space="preserve">New allies or enemies, damage, open threads for next time.</w:t>
       </w:r>
     </w:p>
     <w:p>
@@ -8874,6 +8694,252 @@
         <w:numPr>
           <w:ilvl w:val="0"/>
           <w:numId w:val="1016"/>
+        </w:numPr>
+        <w:pStyle w:val="Compact"/>
+      </w:pPr>
+      <w:r>
+        <w:rPr>
+          <w:bCs/>
+          <w:b/>
+        </w:rPr>
+        <w:t xml:space="preserve">Advancement.</w:t>
+      </w:r>
+      <w:r>
+        <w:t xml:space="preserve"> </w:t>
+      </w:r>
+      <w:r>
+        <w:t xml:space="preserve">After a significant mission, each character earns 1 advancement point; at a milestone, 2 more.</w:t>
+      </w:r>
+    </w:p>
+    <w:bookmarkEnd w:id="82"/>
+    <w:bookmarkEnd w:id="83"/>
+    <w:bookmarkStart w:id="84" w:name="ready-made-characters"/>
+    <w:p>
+      <w:pPr>
+        <w:pStyle w:val="Heading1"/>
+      </w:pPr>
+      <w:r>
+        <w:t xml:space="preserve">Ready-made characters</w:t>
+      </w:r>
+    </w:p>
+    <w:p>
+      <w:pPr>
+        <w:pStyle w:val="FirstParagraph"/>
+      </w:pPr>
+      <w:r>
+        <w:t xml:space="preserve">Characters ready to play, for one-shots, new players, or a group in a hurry. Each follows the creation rules exactly, and their connections tie them together. In the creator, choose one from the ready-made list to open it and make it your own.</w:t>
+      </w:r>
+    </w:p>
+    <w:p>
+      <w:pPr>
+        <w:pStyle w:val="BodyText"/>
+      </w:pPr>
+      <w:r>
+        <w:rPr>
+          <w:iCs/>
+          <w:i/>
+        </w:rPr>
+        <w:t xml:space="preserve">Your setting pack supplies this (pregens).</w:t>
+      </w:r>
+    </w:p>
+    <w:bookmarkEnd w:id="84"/>
+    <w:bookmarkStart w:id="85" w:name="advantages"/>
+    <w:p>
+      <w:pPr>
+        <w:pStyle w:val="Heading1"/>
+      </w:pPr>
+      <w:r>
+        <w:t xml:space="preserve">Advantages</w:t>
+      </w:r>
+    </w:p>
+    <w:p>
+      <w:pPr>
+        <w:pStyle w:val="FirstParagraph"/>
+      </w:pPr>
+      <w:r>
+        <w:t xml:space="preserve">Choose one advantage at character creation: a general advantage from this chapter, or an origin advantage from the next. Each grants +2 only in the listed circumstances. An advantage does not grant training, authorize an impossible action, or replace essential gear. Use only one advantage bonus per roll.</w:t>
+      </w:r>
+    </w:p>
+    <w:p>
+      <w:pPr>
+        <w:pStyle w:val="BodyText"/>
+      </w:pPr>
+      <w:r>
+        <w:rPr>
+          <w:iCs/>
+          <w:i/>
+        </w:rPr>
+        <w:t xml:space="preserve">Your setting pack supplies this (advantages).</w:t>
+      </w:r>
+    </w:p>
+    <w:bookmarkEnd w:id="85"/>
+    <w:bookmarkStart w:id="86" w:name="origins"/>
+    <w:p>
+      <w:pPr>
+        <w:pStyle w:val="Heading1"/>
+      </w:pPr>
+      <w:r>
+        <w:t xml:space="preserve">Origins</w:t>
+      </w:r>
+    </w:p>
+    <w:p>
+      <w:pPr>
+        <w:pStyle w:val="FirstParagraph"/>
+      </w:pPr>
+      <w:r>
+        <w:rPr>
+          <w:iCs/>
+          <w:i/>
+        </w:rPr>
+        <w:t xml:space="preserve">Your setting pack supplies this (origins).</w:t>
+      </w:r>
+    </w:p>
+    <w:bookmarkEnd w:id="86"/>
+    <w:bookmarkStart w:id="97" w:name="making-your-own"/>
+    <w:p>
+      <w:pPr>
+        <w:pStyle w:val="Heading1"/>
+      </w:pPr>
+      <w:r>
+        <w:t xml:space="preserve">Making your own</w:t>
+      </w:r>
+    </w:p>
+    <w:p>
+      <w:pPr>
+        <w:pStyle w:val="FirstParagraph"/>
+      </w:pPr>
+      <w:r>
+        <w:t xml:space="preserve">The roles and origins in this book are a starting point, not a limit. With the GM’s agreement, any player can create their own role or origin. The creator has a</w:t>
+      </w:r>
+      <w:r>
+        <w:t xml:space="preserve"> </w:t>
+      </w:r>
+      <w:r>
+        <w:rPr>
+          <w:bCs/>
+          <w:b/>
+        </w:rPr>
+        <w:t xml:space="preserve">Custom</w:t>
+      </w:r>
+      <w:r>
+        <w:t xml:space="preserve"> </w:t>
+      </w:r>
+      <w:r>
+        <w:t xml:space="preserve">option at the end of each list, and its checklist holds a custom choice to the same rules as everything else.</w:t>
+      </w:r>
+    </w:p>
+    <w:bookmarkStart w:id="87" w:name="a-custom-role"/>
+    <w:p>
+      <w:pPr>
+        <w:pStyle w:val="Heading2"/>
+      </w:pPr>
+      <w:r>
+        <w:t xml:space="preserve">A custom role</w:t>
+      </w:r>
+    </w:p>
+    <w:p>
+      <w:pPr>
+        <w:pStyle w:val="FirstParagraph"/>
+      </w:pPr>
+      <w:r>
+        <w:t xml:space="preserve">A role is a concept, not a package of powers: it gives no bonus of its own. A custom one only needs a clear place in the group.</w:t>
+      </w:r>
+    </w:p>
+    <w:p>
+      <w:pPr>
+        <w:numPr>
+          <w:ilvl w:val="0"/>
+          <w:numId w:val="1017"/>
+        </w:numPr>
+        <w:pStyle w:val="Compact"/>
+      </w:pPr>
+      <w:r>
+        <w:rPr>
+          <w:bCs/>
+          <w:b/>
+        </w:rPr>
+        <w:t xml:space="preserve">Name it and describe it.</w:t>
+      </w:r>
+      <w:r>
+        <w:t xml:space="preserve"> </w:t>
+      </w:r>
+      <w:r>
+        <w:t xml:space="preserve">One sentence for what your character does that no one else does, in the style of the roles above:</w:t>
+      </w:r>
+      <w:r>
+        <w:t xml:space="preserve"> </w:t>
+      </w:r>
+      <w:r>
+        <w:rPr>
+          <w:iCs/>
+          <w:i/>
+        </w:rPr>
+        <w:t xml:space="preserve">“</w:t>
+      </w:r>
+      <w:r>
+        <w:rPr>
+          <w:iCs/>
+          <w:i/>
+        </w:rPr>
+        <w:t xml:space="preserve">Smuggler: knows every back door, bribe and hidden hold.</w:t>
+      </w:r>
+      <w:r>
+        <w:rPr>
+          <w:iCs/>
+          <w:i/>
+        </w:rPr>
+        <w:t xml:space="preserve">”</w:t>
+      </w:r>
+    </w:p>
+    <w:p>
+      <w:pPr>
+        <w:numPr>
+          <w:ilvl w:val="0"/>
+          <w:numId w:val="1017"/>
+        </w:numPr>
+        <w:pStyle w:val="Compact"/>
+      </w:pPr>
+      <w:r>
+        <w:rPr>
+          <w:bCs/>
+          <w:b/>
+        </w:rPr>
+        <w:t xml:space="preserve">Choose a group.</w:t>
+      </w:r>
+      <w:r>
+        <w:t xml:space="preserve"> </w:t>
+      </w:r>
+      <w:r>
+        <w:t xml:space="preserve">Pick the one it belongs with: one of your setting’s groups. The group only sets your sheet’s colors and emblem.</w:t>
+      </w:r>
+    </w:p>
+    <w:p>
+      <w:pPr>
+        <w:numPr>
+          <w:ilvl w:val="0"/>
+          <w:numId w:val="1017"/>
+        </w:numPr>
+        <w:pStyle w:val="Compact"/>
+      </w:pPr>
+      <w:r>
+        <w:rPr>
+          <w:bCs/>
+          <w:b/>
+        </w:rPr>
+        <w:t xml:space="preserve">Pick four core skills.</w:t>
+      </w:r>
+      <w:r>
+        <w:t xml:space="preserve"> </w:t>
+      </w:r>
+      <w:r>
+        <w:t xml:space="preserve">The skills it can’t do without. Mark them Trained yourself in step 3 (the built-in roles do this for you); they count toward your normal Trained skills.</w:t>
+      </w:r>
+    </w:p>
+    <w:p>
+      <w:pPr>
+        <w:numPr>
+          <w:ilvl w:val="0"/>
+          <w:numId w:val="1017"/>
         </w:numPr>
         <w:pStyle w:val="Compact"/>
       </w:pPr>
@@ -9464,7 +9530,7 @@
       <w:pPr>
         <w:numPr>
           <w:ilvl w:val="0"/>
-          <w:numId w:val="1017"/>
+          <w:numId w:val="1018"/>
         </w:numPr>
         <w:pStyle w:val="Compact"/>
       </w:pPr>
@@ -9492,7 +9558,7 @@
       <w:pPr>
         <w:numPr>
           <w:ilvl w:val="0"/>
-          <w:numId w:val="1017"/>
+          <w:numId w:val="1018"/>
         </w:numPr>
         <w:pStyle w:val="Compact"/>
       </w:pPr>
@@ -9504,7 +9570,7 @@
       <w:pPr>
         <w:numPr>
           <w:ilvl w:val="0"/>
-          <w:numId w:val="1017"/>
+          <w:numId w:val="1018"/>
         </w:numPr>
         <w:pStyle w:val="Compact"/>
       </w:pPr>
@@ -9532,7 +9598,7 @@
       <w:pPr>
         <w:numPr>
           <w:ilvl w:val="0"/>
-          <w:numId w:val="1017"/>
+          <w:numId w:val="1018"/>
         </w:numPr>
         <w:pStyle w:val="Compact"/>
       </w:pPr>
@@ -9845,7 +9911,7 @@
         <w:t xml:space="preserve"> </w:t>
       </w:r>
       <w:r>
-        <w:t xml:space="preserve">5 yd, +1 per 2 points of Agility + Body above 20, +1 Trained Athletics or +2 Specialty/Expert, ± origin speed; run (no action) twice that. Threats 8 yd. Reach: 1 yd fists, knives, clubs; 2 yd swords, axes; 3 yd spears, polearms.</w:t>
+        <w:t xml:space="preserve">5 yd, +1 per 2 points of Agility + Body above 20, +1 Trained Athletics or +2 Specialty/Expert, ± origin speed; run (no action) twice that. Threats 8 yd. Wounded −2 yd; seriously wounded half, no run. Hard going: half. Stepping away is free. Reach: 1 yd fists, knives, clubs; 2 yd swords, axes; 3 yd spears, polearms.</w:t>
       </w:r>
     </w:p>
     <w:p>
@@ -10242,6 +10308,9 @@
     <w:abstractNumId w:val="991"/>
   </w:num>
   <w:num w:numId="1013">
+    <w:abstractNumId w:val="991"/>
+  </w:num>
+  <w:num w:numId="1014">
     <w:abstractNumId w:val="99411"/>
     <w:lvlOverride w:ilvl="0">
       <w:startOverride w:val="1"/>
@@ -10271,38 +10340,8 @@
       <w:startOverride w:val="1"/>
     </w:lvlOverride>
   </w:num>
-  <w:num w:numId="1014">
+  <w:num w:numId="1015">
     <w:abstractNumId w:val="991"/>
-  </w:num>
-  <w:num w:numId="1015">
-    <w:abstractNumId w:val="99411"/>
-    <w:lvlOverride w:ilvl="0">
-      <w:startOverride w:val="1"/>
-    </w:lvlOverride>
-    <w:lvlOverride w:ilvl="1">
-      <w:startOverride w:val="1"/>
-    </w:lvlOverride>
-    <w:lvlOverride w:ilvl="2">
-      <w:startOverride w:val="1"/>
-    </w:lvlOverride>
-    <w:lvlOverride w:ilvl="3">
-      <w:startOverride w:val="1"/>
-    </w:lvlOverride>
-    <w:lvlOverride w:ilvl="4">
-      <w:startOverride w:val="1"/>
-    </w:lvlOverride>
-    <w:lvlOverride w:ilvl="5">
-      <w:startOverride w:val="1"/>
-    </w:lvlOverride>
-    <w:lvlOverride w:ilvl="6">
-      <w:startOverride w:val="1"/>
-    </w:lvlOverride>
-    <w:lvlOverride w:ilvl="7">
-      <w:startOverride w:val="1"/>
-    </w:lvlOverride>
-    <w:lvlOverride w:ilvl="8">
-      <w:startOverride w:val="1"/>
-    </w:lvlOverride>
   </w:num>
   <w:num w:numId="1016">
     <w:abstractNumId w:val="99411"/>
@@ -10335,6 +10374,36 @@
     </w:lvlOverride>
   </w:num>
   <w:num w:numId="1017">
+    <w:abstractNumId w:val="99411"/>
+    <w:lvlOverride w:ilvl="0">
+      <w:startOverride w:val="1"/>
+    </w:lvlOverride>
+    <w:lvlOverride w:ilvl="1">
+      <w:startOverride w:val="1"/>
+    </w:lvlOverride>
+    <w:lvlOverride w:ilvl="2">
+      <w:startOverride w:val="1"/>
+    </w:lvlOverride>
+    <w:lvlOverride w:ilvl="3">
+      <w:startOverride w:val="1"/>
+    </w:lvlOverride>
+    <w:lvlOverride w:ilvl="4">
+      <w:startOverride w:val="1"/>
+    </w:lvlOverride>
+    <w:lvlOverride w:ilvl="5">
+      <w:startOverride w:val="1"/>
+    </w:lvlOverride>
+    <w:lvlOverride w:ilvl="6">
+      <w:startOverride w:val="1"/>
+    </w:lvlOverride>
+    <w:lvlOverride w:ilvl="7">
+      <w:startOverride w:val="1"/>
+    </w:lvlOverride>
+    <w:lvlOverride w:ilvl="8">
+      <w:startOverride w:val="1"/>
+    </w:lvlOverride>
+  </w:num>
+  <w:num w:numId="1018">
     <w:abstractNumId w:val="99411"/>
     <w:lvlOverride w:ilvl="0">
       <w:startOverride w:val="1"/>

</xml_diff>

<commit_message>
Origin speeds, mounts and vehicles; balance report follow-up
- Speed adjustments: Werewolf and Skinchanger forms +1, Vesh +1, Sen -1,
  Qor -1, in each origin's rules and counted in Move.
- Mounts and vehicles: riders use the mount's Move, attacks from a moving
  mount are -2, a wounded mount slows; each setting lists its own (horses,
  mules, warhorses, wagons; rovers, grav-bikes, cars, motorcycles).
- BALANCE-REVISION.md records the post-playtest changes.

Co-Authored-By: Claude Opus 5.5 <noreply@anthropic.com>
Claude-Session: https://claude.ai/code/session_015SADCFzhKijkC2foUmXrpC
</commit_message>
<xml_diff>
--- a/legend-dynamics/Legend_Dynamics_Core_Rules.docx
+++ b/legend-dynamics/Legend_Dynamics_Core_Rules.docx
@@ -3274,7 +3274,7 @@
     </w:p>
     <w:bookmarkEnd w:id="53"/>
     <w:bookmarkEnd w:id="54"/>
-    <w:bookmarkStart w:id="65" w:name="personal-combat"/>
+    <w:bookmarkStart w:id="66" w:name="personal-combat"/>
     <w:p>
       <w:pPr>
         <w:pStyle w:val="Heading1"/>
@@ -4498,7 +4498,7 @@
       </w:r>
     </w:p>
     <w:bookmarkEnd w:id="58"/>
-    <w:bookmarkStart w:id="59" w:name="move-and-reach"/>
+    <w:bookmarkStart w:id="60" w:name="move-and-reach"/>
     <w:p>
       <w:pPr>
         <w:pStyle w:val="Heading2"/>
@@ -4634,6 +4634,35 @@
       </w:r>
       <w:r>
         <w:t xml:space="preserve">You can move away from someone in reach freely; leaving a fight doesn’t give them a free attack.</w:t>
+      </w:r>
+    </w:p>
+    <w:bookmarkStart w:id="59" w:name="mounts-and-vehicles"/>
+    <w:p>
+      <w:pPr>
+        <w:pStyle w:val="Heading3"/>
+      </w:pPr>
+      <w:r>
+        <w:t xml:space="preserve">Mounts and vehicles</w:t>
+      </w:r>
+    </w:p>
+    <w:p>
+      <w:pPr>
+        <w:pStyle w:val="FirstParagraph"/>
+      </w:pPr>
+      <w:r>
+        <w:t xml:space="preserve">A rider or driver moves at the mount’s or vehicle’s Move, not their own, and running it (a gallop, full throttle) takes their action. Attacking from a moving mount or vehicle is −2. A wounded mount slows down under the same injury rule as a person. Starships, aircraft and car chases are too fast for yards: they use range tracks and chase clocks.</w:t>
+      </w:r>
+    </w:p>
+    <w:p>
+      <w:pPr>
+        <w:pStyle w:val="BodyText"/>
+      </w:pPr>
+      <w:r>
+        <w:rPr>
+          <w:iCs/>
+          <w:i/>
+        </w:rPr>
+        <w:t xml:space="preserve">Your setting pack supplies this (mounts).</w:t>
       </w:r>
     </w:p>
     <w:tbl>
@@ -5090,7 +5119,8 @@
       </w:r>
     </w:p>
     <w:bookmarkEnd w:id="59"/>
-    <w:bookmarkStart w:id="61" w:name="injury"/>
+    <w:bookmarkEnd w:id="60"/>
+    <w:bookmarkStart w:id="62" w:name="injury"/>
     <w:p>
       <w:pPr>
         <w:pStyle w:val="Heading2"/>
@@ -5379,7 +5409,7 @@
         <w:t xml:space="preserve">Injury penalties replace each other rather than stacking. They apply to movement, attacks, Dodge, and other tasks the injury physically hinders.</w:t>
       </w:r>
     </w:p>
-    <w:bookmarkStart w:id="60" w:name="dying-and-death"/>
+    <w:bookmarkStart w:id="61" w:name="dying-and-death"/>
     <w:p>
       <w:pPr>
         <w:pStyle w:val="Heading3"/>
@@ -5491,9 +5521,9 @@
         <w:t xml:space="preserve">Your protection is avoiding the hit: a defense (Dodge, Parry or Block), cover, and a Legend point, which reduces a hit by one box.</w:t>
       </w:r>
     </w:p>
-    <w:bookmarkEnd w:id="60"/>
     <w:bookmarkEnd w:id="61"/>
-    <w:bookmarkStart w:id="62" w:name="weapons-and-damage"/>
+    <w:bookmarkEnd w:id="62"/>
+    <w:bookmarkStart w:id="63" w:name="weapons-and-damage"/>
     <w:p>
       <w:pPr>
         <w:pStyle w:val="Heading2"/>
@@ -5535,8 +5565,8 @@
         <w:t xml:space="preserve">Your setting pack supplies this (ammo).</w:t>
       </w:r>
     </w:p>
-    <w:bookmarkEnd w:id="62"/>
-    <w:bookmarkStart w:id="63" w:name="the-battle-map"/>
+    <w:bookmarkEnd w:id="63"/>
+    <w:bookmarkStart w:id="64" w:name="the-battle-map"/>
     <w:p>
       <w:pPr>
         <w:pStyle w:val="Heading2"/>
@@ -5706,8 +5736,8 @@
         <w:t xml:space="preserve">keeps both maps, their pictures and tokens in one file, to prepare a fight ahead of time or share it with another GM.</w:t>
       </w:r>
     </w:p>
-    <w:bookmarkEnd w:id="63"/>
-    <w:bookmarkStart w:id="64" w:name="the-encounter-panel"/>
+    <w:bookmarkEnd w:id="64"/>
+    <w:bookmarkStart w:id="65" w:name="the-encounter-panel"/>
     <w:p>
       <w:pPr>
         <w:pStyle w:val="Heading2"/>
@@ -5740,9 +5770,9 @@
         <w:t xml:space="preserve">panel that runs a fight by these rules and shows every roll. Add characters from the GM view and opponents from the Threats table (or make one up on the spot), then start: it keeps the turn order by Agility, and for each attack works out the range, the defense (Dodge, Parry or Block, one a round, and a second at −2 with Additional Defense), the boxes marked and any telling hit, offering a Legend point choices at the moment they apply. Hits land on the character cards and the battle map, and with gritty combat on, grievous wounds are rolled and kept. The panel keeps a log and a summary of the fight, which can be saved to a file. It’s a helper, not a rule: the GM can rule any result differently, and the log says so.</w:t>
       </w:r>
     </w:p>
-    <w:bookmarkEnd w:id="64"/>
     <w:bookmarkEnd w:id="65"/>
-    <w:bookmarkStart w:id="71" w:name="medical-care"/>
+    <w:bookmarkEnd w:id="66"/>
+    <w:bookmarkStart w:id="72" w:name="medical-care"/>
     <w:p>
       <w:pPr>
         <w:pStyle w:val="Heading1"/>
@@ -5751,7 +5781,7 @@
         <w:t xml:space="preserve">Medical care</w:t>
       </w:r>
     </w:p>
-    <w:bookmarkStart w:id="66" w:name="diagnosis-and-stabilization"/>
+    <w:bookmarkStart w:id="67" w:name="diagnosis-and-stabilization"/>
     <w:p>
       <w:pPr>
         <w:pStyle w:val="Heading2"/>
@@ -5768,8 +5798,8 @@
         <w:t xml:space="preserve">Roll Medicine when the diagnosis is uncertain or an urgent treatment decision matters. Emergency stabilization takes one action and a successful Medicine roll with a medical kit. It ends Dying and stops deterioration, but removes no boxes.</w:t>
       </w:r>
     </w:p>
-    <w:bookmarkEnd w:id="66"/>
-    <w:bookmarkStart w:id="67" w:name="field-treatment"/>
+    <w:bookmarkEnd w:id="67"/>
+    <w:bookmarkStart w:id="68" w:name="field-treatment"/>
     <w:p>
       <w:pPr>
         <w:pStyle w:val="Heading2"/>
@@ -5786,8 +5816,8 @@
         <w:t xml:space="preserve">With a medical kit and several uninterrupted minutes, successful Medicine removes one injury box; success by 5 or more removes two.</w:t>
       </w:r>
     </w:p>
-    <w:bookmarkEnd w:id="67"/>
-    <w:bookmarkStart w:id="68" w:name="proper-care"/>
+    <w:bookmarkEnd w:id="68"/>
+    <w:bookmarkStart w:id="69" w:name="proper-care"/>
     <w:p>
       <w:pPr>
         <w:pStyle w:val="Heading2"/>
@@ -5804,8 +5834,8 @@
         <w:t xml:space="preserve">A proper infirmary grants +2 to Medicine. A successful treatment removes two boxes; success by 5 or more removes three. Allow the time the treatment requires.</w:t>
       </w:r>
     </w:p>
-    <w:bookmarkEnd w:id="68"/>
-    <w:bookmarkStart w:id="69" w:name="treatment-attempts"/>
+    <w:bookmarkEnd w:id="69"/>
+    <w:bookmarkStart w:id="70" w:name="treatment-attempts"/>
     <w:p>
       <w:pPr>
         <w:pStyle w:val="Heading2"/>
@@ -5910,8 +5940,8 @@
         <w:t xml:space="preserve">Stopping someone Dying is never limited by these attempts and never removes boxes; a treatment roll that removes boxes also stabilizes.</w:t>
       </w:r>
     </w:p>
-    <w:bookmarkEnd w:id="69"/>
-    <w:bookmarkStart w:id="70" w:name="natural-recovery"/>
+    <w:bookmarkEnd w:id="70"/>
+    <w:bookmarkStart w:id="71" w:name="natural-recovery"/>
     <w:p>
       <w:pPr>
         <w:pStyle w:val="Heading2"/>
@@ -6096,9 +6126,9 @@
         <w:t xml:space="preserve">At three boxes, rest alone does nothing until someone has stabilized or treated you; after that, a week of rest in their care clears the first box. A successful treatment is faster. The times add up: from three boxes, rest alone takes about a week and a half to heal completely (a week, then three days, then a day).</w:t>
       </w:r>
     </w:p>
-    <w:bookmarkEnd w:id="70"/>
     <w:bookmarkEnd w:id="71"/>
-    <w:bookmarkStart w:id="76" w:name="magic"/>
+    <w:bookmarkEnd w:id="72"/>
+    <w:bookmarkStart w:id="77" w:name="magic"/>
     <w:p>
       <w:pPr>
         <w:pStyle w:val="Heading1"/>
@@ -6342,7 +6372,7 @@
         </w:tc>
       </w:tr>
     </w:tbl>
-    <w:bookmarkStart w:id="72" w:name="bursts"/>
+    <w:bookmarkStart w:id="73" w:name="bursts"/>
     <w:p>
       <w:pPr>
         <w:pStyle w:val="Heading2"/>
@@ -6941,8 +6971,8 @@
         <w:t xml:space="preserve">A failed burst marks a box of your setting’s price track; a natural 18 marks two, or something answers that shouldn’t.</w:t>
       </w:r>
     </w:p>
-    <w:bookmarkEnd w:id="72"/>
-    <w:bookmarkStart w:id="73" w:name="workings"/>
+    <w:bookmarkEnd w:id="73"/>
+    <w:bookmarkStart w:id="74" w:name="workings"/>
     <w:p>
       <w:pPr>
         <w:pStyle w:val="Heading2"/>
@@ -7277,8 +7307,8 @@
         <w:t xml:space="preserve">A working takes a minute a roll at the very fastest. To use one in combat, finish it beforehand and store it in a charm.</w:t>
       </w:r>
     </w:p>
-    <w:bookmarkEnd w:id="73"/>
-    <w:bookmarkStart w:id="74" w:name="charms"/>
+    <w:bookmarkEnd w:id="74"/>
+    <w:bookmarkStart w:id="75" w:name="charms"/>
     <w:p>
       <w:pPr>
         <w:pStyle w:val="Heading2"/>
@@ -7339,8 +7369,8 @@
         <w:t xml:space="preserve">: against a defense, the target defends with no attack-quality penalty; against a resistance, the target resists by succeeding on their roll (a tie goes to the target, as in any contest). A charm never marks more than 3 boxes on one target.</w:t>
       </w:r>
     </w:p>
-    <w:bookmarkEnd w:id="74"/>
-    <w:bookmarkStart w:id="75" w:name="magic-advancement"/>
+    <w:bookmarkEnd w:id="75"/>
+    <w:bookmarkStart w:id="76" w:name="magic-advancement"/>
     <w:p>
       <w:pPr>
         <w:pStyle w:val="Heading2"/>
@@ -7847,9 +7877,9 @@
         </w:tc>
       </w:tr>
     </w:tbl>
-    <w:bookmarkEnd w:id="75"/>
     <w:bookmarkEnd w:id="76"/>
-    <w:bookmarkStart w:id="80" w:name="legend-points-and-tracks"/>
+    <w:bookmarkEnd w:id="77"/>
+    <w:bookmarkStart w:id="81" w:name="legend-points-and-tracks"/>
     <w:p>
       <w:pPr>
         <w:pStyle w:val="Heading1"/>
@@ -7858,7 +7888,7 @@
         <w:t xml:space="preserve">Legend points and tracks</w:t>
       </w:r>
     </w:p>
-    <w:bookmarkStart w:id="77" w:name="using-legend-points"/>
+    <w:bookmarkStart w:id="78" w:name="using-legend-points"/>
     <w:p>
       <w:pPr>
         <w:pStyle w:val="Heading2"/>
@@ -8076,8 +8106,8 @@
         <w:t xml:space="preserve">Gain one point when one of your complications creates a meaningful problem you accept, including a companion complication. You can decline the proposed complication without penalty.</w:t>
       </w:r>
     </w:p>
-    <w:bookmarkEnd w:id="77"/>
-    <w:bookmarkStart w:id="78" w:name="tracks"/>
+    <w:bookmarkEnd w:id="78"/>
+    <w:bookmarkStart w:id="79" w:name="tracks"/>
     <w:p>
       <w:pPr>
         <w:pStyle w:val="Heading2"/>
@@ -8098,8 +8128,8 @@
         <w:t xml:space="preserve">Your setting pack supplies this (tracks).</w:t>
       </w:r>
     </w:p>
-    <w:bookmarkEnd w:id="78"/>
-    <w:bookmarkStart w:id="79" w:name="advancement"/>
+    <w:bookmarkEnd w:id="79"/>
+    <w:bookmarkStart w:id="80" w:name="advancement"/>
     <w:p>
       <w:pPr>
         <w:pStyle w:val="Heading2"/>
@@ -8543,9 +8573,9 @@
         <w:t xml:space="preserve">Magic and powers grow the same way, at the costs their chapters give.</w:t>
       </w:r>
     </w:p>
-    <w:bookmarkEnd w:id="79"/>
     <w:bookmarkEnd w:id="80"/>
-    <w:bookmarkStart w:id="83" w:name="running-missions"/>
+    <w:bookmarkEnd w:id="81"/>
+    <w:bookmarkStart w:id="84" w:name="running-missions"/>
     <w:p>
       <w:pPr>
         <w:pStyle w:val="Heading1"/>
@@ -8554,7 +8584,7 @@
         <w:t xml:space="preserve">Running missions</w:t>
       </w:r>
     </w:p>
-    <w:bookmarkStart w:id="81" w:name="mission-seeds"/>
+    <w:bookmarkStart w:id="82" w:name="mission-seeds"/>
     <w:p>
       <w:pPr>
         <w:pStyle w:val="Heading2"/>
@@ -8583,8 +8613,8 @@
         <w:t xml:space="preserve">Your setting pack supplies this (seeds).</w:t>
       </w:r>
     </w:p>
-    <w:bookmarkEnd w:id="81"/>
-    <w:bookmarkStart w:id="82" w:name="the-journal"/>
+    <w:bookmarkEnd w:id="82"/>
+    <w:bookmarkStart w:id="83" w:name="the-journal"/>
     <w:p>
       <w:pPr>
         <w:pStyle w:val="Heading2"/>
@@ -8711,9 +8741,9 @@
         <w:t xml:space="preserve">After a significant mission, each character earns 1 advancement point; at a milestone, 2 more.</w:t>
       </w:r>
     </w:p>
-    <w:bookmarkEnd w:id="82"/>
     <w:bookmarkEnd w:id="83"/>
-    <w:bookmarkStart w:id="84" w:name="ready-made-characters"/>
+    <w:bookmarkEnd w:id="84"/>
+    <w:bookmarkStart w:id="85" w:name="ready-made-characters"/>
     <w:p>
       <w:pPr>
         <w:pStyle w:val="Heading1"/>
@@ -8742,8 +8772,8 @@
         <w:t xml:space="preserve">Your setting pack supplies this (pregens).</w:t>
       </w:r>
     </w:p>
-    <w:bookmarkEnd w:id="84"/>
-    <w:bookmarkStart w:id="85" w:name="advantages"/>
+    <w:bookmarkEnd w:id="85"/>
+    <w:bookmarkStart w:id="86" w:name="advantages"/>
     <w:p>
       <w:pPr>
         <w:pStyle w:val="Heading1"/>
@@ -8772,8 +8802,8 @@
         <w:t xml:space="preserve">Your setting pack supplies this (advantages).</w:t>
       </w:r>
     </w:p>
-    <w:bookmarkEnd w:id="85"/>
-    <w:bookmarkStart w:id="86" w:name="origins"/>
+    <w:bookmarkEnd w:id="86"/>
+    <w:bookmarkStart w:id="87" w:name="origins"/>
     <w:p>
       <w:pPr>
         <w:pStyle w:val="Heading1"/>
@@ -8794,8 +8824,8 @@
         <w:t xml:space="preserve">Your setting pack supplies this (origins).</w:t>
       </w:r>
     </w:p>
-    <w:bookmarkEnd w:id="86"/>
-    <w:bookmarkStart w:id="97" w:name="making-your-own"/>
+    <w:bookmarkEnd w:id="87"/>
+    <w:bookmarkStart w:id="98" w:name="making-your-own"/>
     <w:p>
       <w:pPr>
         <w:pStyle w:val="Heading1"/>
@@ -8828,7 +8858,7 @@
         <w:t xml:space="preserve">option at the end of each list, and its checklist holds a custom choice to the same rules as everything else.</w:t>
       </w:r>
     </w:p>
-    <w:bookmarkStart w:id="87" w:name="a-custom-role"/>
+    <w:bookmarkStart w:id="88" w:name="a-custom-role"/>
     <w:p>
       <w:pPr>
         <w:pStyle w:val="Heading2"/>
@@ -9004,8 +9034,8 @@
         <w:t xml:space="preserve">.</w:t>
       </w:r>
     </w:p>
-    <w:bookmarkEnd w:id="87"/>
-    <w:bookmarkStart w:id="96" w:name="a-custom-origin"/>
+    <w:bookmarkEnd w:id="88"/>
+    <w:bookmarkStart w:id="97" w:name="a-custom-origin"/>
     <w:p>
       <w:pPr>
         <w:pStyle w:val="Heading2"/>
@@ -9022,7 +9052,7 @@
         <w:t xml:space="preserve">Build it with the GM, one step at a time.</w:t>
       </w:r>
     </w:p>
-    <w:bookmarkStart w:id="88" w:name="the-concept"/>
+    <w:bookmarkStart w:id="89" w:name="the-concept"/>
     <w:p>
       <w:pPr>
         <w:pStyle w:val="Heading3"/>
@@ -9039,8 +9069,8 @@
         <w:t xml:space="preserve">Two or three sentences: where they come from, what sets them apart, and how others see them. It should be something the origins in this book don’t already cover.</w:t>
       </w:r>
     </w:p>
-    <w:bookmarkEnd w:id="88"/>
-    <w:bookmarkStart w:id="89" w:name="the-tier"/>
+    <w:bookmarkEnd w:id="89"/>
+    <w:bookmarkStart w:id="90" w:name="the-tier"/>
     <w:p>
       <w:pPr>
         <w:pStyle w:val="Heading3"/>
@@ -9337,8 +9367,8 @@
         <w:t xml:space="preserve">When in doubt, choose the higher tier.</w:t>
       </w:r>
     </w:p>
-    <w:bookmarkEnd w:id="89"/>
-    <w:bookmarkStart w:id="90" w:name="attribute-adjustments"/>
+    <w:bookmarkEnd w:id="90"/>
+    <w:bookmarkStart w:id="91" w:name="attribute-adjustments"/>
     <w:p>
       <w:pPr>
         <w:pStyle w:val="Heading3"/>
@@ -9408,8 +9438,8 @@
         <w:t xml:space="preserve">of +1 or −1 to Move. Most have none. It isn’t an attribute adjustment and needn’t balance.</w:t>
       </w:r>
     </w:p>
-    <w:bookmarkEnd w:id="90"/>
-    <w:bookmarkStart w:id="91" w:name="core-rules-tier-1-and-up"/>
+    <w:bookmarkEnd w:id="91"/>
+    <w:bookmarkStart w:id="92" w:name="core-rules-tier-1-and-up"/>
     <w:p>
       <w:pPr>
         <w:pStyle w:val="Heading3"/>
@@ -9426,8 +9456,8 @@
         <w:t xml:space="preserve">One to three short rules that always apply: what they can do (see in the dark, resist cold, a free Trained skill) and what it costs (a weakness, a people’s distrust, a hazard they can’t abide). A strength with no drawback is worth more than it looks, so price it a tier higher.</w:t>
       </w:r>
     </w:p>
-    <w:bookmarkEnd w:id="91"/>
-    <w:bookmarkStart w:id="92" w:name="origin-advantages"/>
+    <w:bookmarkEnd w:id="92"/>
+    <w:bookmarkStart w:id="93" w:name="origin-advantages"/>
     <w:p>
       <w:pPr>
         <w:pStyle w:val="Heading3"/>
@@ -9482,8 +9512,8 @@
         <w:t xml:space="preserve">: a problem the trait causes, with a clear trigger and a real consequence, which earns a Legend point when it bites, like any complication. A character takes one advantage, general or origin, so make them distinct choices.</w:t>
       </w:r>
     </w:p>
-    <w:bookmarkEnd w:id="92"/>
-    <w:bookmarkStart w:id="93" w:name="an-alternate-form-optional-tier-2-or-3"/>
+    <w:bookmarkEnd w:id="93"/>
+    <w:bookmarkStart w:id="94" w:name="an-alternate-form-optional-tier-2-or-3"/>
     <w:p>
       <w:pPr>
         <w:pStyle w:val="Heading3"/>
@@ -9516,8 +9546,8 @@
         <w:t xml:space="preserve">apply. The bonuses count only while the character is in that form: the sheet’s form switch shows both sets of numbers.</w:t>
       </w:r>
     </w:p>
-    <w:bookmarkEnd w:id="93"/>
-    <w:bookmarkStart w:id="94" w:name="in-the-creator"/>
+    <w:bookmarkEnd w:id="94"/>
+    <w:bookmarkStart w:id="95" w:name="in-the-creator"/>
     <w:p>
       <w:pPr>
         <w:pStyle w:val="Heading3"/>
@@ -9622,8 +9652,8 @@
         <w:t xml:space="preserve">and enter the advantage and its companion complication.</w:t>
       </w:r>
     </w:p>
-    <w:bookmarkEnd w:id="94"/>
-    <w:bookmarkStart w:id="95" w:name="example"/>
+    <w:bookmarkEnd w:id="95"/>
+    <w:bookmarkStart w:id="96" w:name="example"/>
     <w:p>
       <w:pPr>
         <w:pStyle w:val="Heading3"/>
@@ -9728,10 +9758,10 @@
         <w:t xml:space="preserve">: you trust your own people first; when it matters, accept the cost of that loyalty.</w:t>
       </w:r>
     </w:p>
-    <w:bookmarkEnd w:id="95"/>
     <w:bookmarkEnd w:id="96"/>
     <w:bookmarkEnd w:id="97"/>
-    <w:bookmarkStart w:id="98" w:name="complications"/>
+    <w:bookmarkEnd w:id="98"/>
+    <w:bookmarkStart w:id="99" w:name="complications"/>
     <w:p>
       <w:pPr>
         <w:pStyle w:val="Heading1"/>
@@ -9760,8 +9790,8 @@
         <w:t xml:space="preserve">Your setting pack supplies this (complications).</w:t>
       </w:r>
     </w:p>
-    <w:bookmarkEnd w:id="98"/>
-    <w:bookmarkStart w:id="100" w:name="quick-reference"/>
+    <w:bookmarkEnd w:id="99"/>
+    <w:bookmarkStart w:id="101" w:name="quick-reference"/>
     <w:p>
       <w:pPr>
         <w:pStyle w:val="Heading1"/>
@@ -9988,7 +10018,7 @@
       <w:r>
         <w:t xml:space="preserve"> </w:t>
       </w:r>
-      <w:hyperlink r:id="rId99">
+      <w:hyperlink r:id="rId100">
         <w:r>
           <w:rPr>
             <w:rStyle w:val="Hyperlink"/>
@@ -10000,7 +10030,7 @@
         <w:t xml:space="preserve">. You may share, adapt, and use it for any purpose, including commercially, as long as you give appropriate credit to the author.</w:t>
       </w:r>
     </w:p>
-    <w:bookmarkEnd w:id="100"/>
+    <w:bookmarkEnd w:id="101"/>
     <w:sectPr/>
   </w:body>
 </w:document>

</xml_diff>

<commit_message>
Core rules: rename the paths to Specialist and Expert, note setting Edges
The core rules' paths become Specialist (one Specialty, nine Trained) and
Expert (one Expert skill, seven Trained), and the Edges section notes that
each setting offers special Edges of its own. Setting packs keep their own
path names. Rebuilt the website and site copies, which also brings the site
up to date with the Aurora Non-Operant change.

Co-Authored-By: Claude Opus 5.5 <noreply@anthropic.com>
Claude-Session: https://claude.ai/code/session_015SADCFzhKijkC2foUmXrpC
</commit_message>
<xml_diff>
--- a/legend-dynamics/Legend_Dynamics_Core_Rules.docx
+++ b/legend-dynamics/Legend_Dynamics_Core_Rules.docx
@@ -259,13 +259,13 @@
         <w:t xml:space="preserve">Trained when you choose it. Keep them, raise one to your Specialty, or swap any of them for other skills; changing role swaps the core skills you haven’t changed.</w:t>
       </w:r>
     </w:p>
-    <w:bookmarkStart w:id="22" w:name="generalist-or-specialist"/>
+    <w:bookmarkStart w:id="22" w:name="specialist-or-expert"/>
     <w:p>
       <w:pPr>
         <w:pStyle w:val="Heading3"/>
       </w:pPr>
       <w:r>
-        <w:t xml:space="preserve">Generalist or Specialist</w:t>
+        <w:t xml:space="preserve">Specialist or Expert</w:t>
       </w:r>
     </w:p>
     <w:p>
@@ -289,7 +289,7 @@
           <w:bCs/>
           <w:b/>
         </w:rPr>
-        <w:t xml:space="preserve">Generalist:</w:t>
+        <w:t xml:space="preserve">Specialist:</w:t>
       </w:r>
       <w:r>
         <w:t xml:space="preserve"> </w:t>
@@ -311,7 +311,7 @@
           <w:bCs/>
           <w:b/>
         </w:rPr>
-        <w:t xml:space="preserve">Specialist:</w:t>
+        <w:t xml:space="preserve">Expert:</w:t>
       </w:r>
       <w:r>
         <w:t xml:space="preserve"> </w:t>
@@ -1220,6 +1220,14 @@
         </w:tc>
       </w:tr>
     </w:tbl>
+    <w:p>
+      <w:pPr>
+        <w:pStyle w:val="BodyText"/>
+      </w:pPr>
+      <w:r>
+        <w:t xml:space="preserve">Each setting also offers special Edges of its own, such as powers in Aurora; its Players’ Guide lists them.</w:t>
+      </w:r>
+    </w:p>
     <w:bookmarkEnd w:id="26"/>
     <w:bookmarkStart w:id="27" w:name="spending-points"/>
     <w:p>
@@ -1345,7 +1353,7 @@
           <w:bCs/>
           <w:b/>
         </w:rPr>
-        <w:t xml:space="preserve">A Generalist</w:t>
+        <w:t xml:space="preserve">A Specialist</w:t>
       </w:r>
       <w:r>
         <w:t xml:space="preserve"> </w:t>
@@ -1393,7 +1401,7 @@
           <w:bCs/>
           <w:b/>
         </w:rPr>
-        <w:t xml:space="preserve">A Specialist</w:t>
+        <w:t xml:space="preserve">An Expert</w:t>
       </w:r>
       <w:r>
         <w:t xml:space="preserve"> </w:t>
@@ -1496,7 +1504,7 @@
         <w:t xml:space="preserve"> </w:t>
       </w:r>
       <w:r>
-        <w:t xml:space="preserve">A Specialist can broaden later (the GM’s call, usually after a significant mission): the Expert skill becomes a Specialty at +3, and two more skills become Trained.</w:t>
+        <w:t xml:space="preserve">An Expert can broaden later (the GM’s call, usually after a significant mission): the Expert skill becomes a Specialty at +3, and two more skills become Trained.</w:t>
       </w:r>
     </w:p>
     <w:bookmarkEnd w:id="30"/>
@@ -9211,7 +9219,7 @@
               <w:rPr>
                 <w:sz w:val="19"/>
               </w:rPr>
-              <w:t xml:space="preserve">Specialty (+3) is the ceiling: only a Specialist’s starting skill is Expert, unless they broaden (see Step 3)</w:t>
+              <w:t xml:space="preserve">Specialty (+3) is the ceiling: only an Expert’s starting skill is Expert, unless they broaden (see Step 3)</w:t>
             </w:r>
           </w:p>
         </w:tc>
@@ -10629,7 +10637,7 @@
         <w:t xml:space="preserve"> </w:t>
       </w:r>
       <w:r>
-        <w:t xml:space="preserve">attributes start at 10, adjusted by origin (always totaling zero), plus 5 points; maximum 13 plus any origin bonus. 3 points split between origin tier and Edges. Generalist: one Specialty and nine Trained. Specialist: one Expert at +5 and seven Trained. One advantage (general or origin) and one complication; an optional Allegiance.</w:t>
+        <w:t xml:space="preserve">attributes start at 10, adjusted by origin (always totaling zero), plus 5 points; maximum 13 plus any origin bonus. 3 points split between origin tier and Edges. Specialist: one Specialty and nine Trained. Expert: one Expert at +5 and seven Trained. One advantage (general or origin) and one complication; an optional Allegiance.</w:t>
       </w:r>
     </w:p>
     <w:p>
@@ -10647,7 +10655,7 @@
         <w:t xml:space="preserve"> </w:t>
       </w:r>
       <w:r>
-        <w:t xml:space="preserve">Untrained = attribute −4; Trained = attribute +1; Specialty = attribute +3; Expert (Specialist) = attribute +5.</w:t>
+        <w:t xml:space="preserve">Untrained = attribute −4; Trained = attribute +1; Specialty = attribute +3; Expert = attribute +5.</w:t>
       </w:r>
     </w:p>
     <w:p>

</xml_diff>

<commit_message>
Replace the Creative Commons license with a copyright notice
The core rules, the four settings' guides and creators, and the website
now carry "Copyright © 2025–2026 Don Smallwood. All rights reserved."
in place of the CC BY 4.0 release line. LICENSE.md becomes a copyright
notice.

Co-Authored-By: Claude Opus 5.5 <noreply@anthropic.com>
Claude-Session: https://claude.ai/code/session_015SADCFzhKijkC2foUmXrpC
</commit_message>
<xml_diff>
--- a/legend-dynamics/Legend_Dynamics_Core_Rules.docx
+++ b/legend-dynamics/Legend_Dynamics_Core_Rules.docx
@@ -10595,7 +10595,7 @@
       </w:r>
     </w:p>
     <w:bookmarkEnd w:id="101"/>
-    <w:bookmarkStart w:id="103" w:name="quick-reference"/>
+    <w:bookmarkStart w:id="102" w:name="quick-reference"/>
     <w:p>
       <w:pPr>
         <w:pStyle w:val="Heading1"/>
@@ -10817,24 +10817,10 @@
         <w:t xml:space="preserve"> </w:t>
       </w:r>
       <w:r>
-        <w:t xml:space="preserve">This RPG is released under the</w:t>
-      </w:r>
-      <w:r>
-        <w:t xml:space="preserve"> </w:t>
-      </w:r>
-      <w:hyperlink r:id="rId102">
-        <w:r>
-          <w:rPr>
-            <w:rStyle w:val="Hyperlink"/>
-          </w:rPr>
-          <w:t xml:space="preserve">Creative Commons Attribution 4.0 International License</w:t>
-        </w:r>
-      </w:hyperlink>
-      <w:r>
-        <w:t xml:space="preserve">. You may share, adapt, and use it for any purpose, including commercially, as long as you give appropriate credit to the author.</w:t>
-      </w:r>
-    </w:p>
-    <w:bookmarkEnd w:id="103"/>
+        <w:t xml:space="preserve">Copyright © 2025–2026 Don Smallwood. All rights reserved.</w:t>
+      </w:r>
+    </w:p>
+    <w:bookmarkEnd w:id="102"/>
     <w:sectPr/>
   </w:body>
 </w:document>

</xml_diff>

<commit_message>
Homebrew: cards, spells and rituals too
- Cards: homebrew lore cards, data records, dossiers and tales (subject, what's true, what it
  permits) join the subjects the GM records findings with, and Trails' Hunter's Almanac.
- Spells: homebrew hexes, cantrips and psionic powers join the creator's choices.
- Rituals: a ritual book (name, weight and its clock, time a roll, what it does, price) beside
  Rituals by heart in the creator, with Know it by heart.
- Each section appears only where the setting has that part (no rituals in Fracture Lines).
- Core rules, Making your own: numbers for cards, spells and rituals; changelog entry updated.

Co-Authored-By: Claude Opus 5.5 <noreply@anthropic.com>
Claude-Session: https://claude.ai/code/session_015SADCFzhKijkC2foUmXrpC
</commit_message>
<xml_diff>
--- a/legend-dynamics/Legend_Dynamics_Core_Rules.docx
+++ b/legend-dynamics/Legend_Dynamics_Core_Rules.docx
@@ -10649,6 +10649,72 @@
     </w:p>
     <w:p>
       <w:pPr>
+        <w:numPr>
+          <w:ilvl w:val="0"/>
+          <w:numId w:val="1022"/>
+        </w:numPr>
+        <w:pStyle w:val="Compact"/>
+      </w:pPr>
+      <w:r>
+        <w:rPr>
+          <w:bCs/>
+          <w:b/>
+        </w:rPr>
+        <w:t xml:space="preserve">Cards.</w:t>
+      </w:r>
+      <w:r>
+        <w:t xml:space="preserve"> </w:t>
+      </w:r>
+      <w:r>
+        <w:t xml:space="preserve">One subject, what’s true about it and what that permits: as narrow as a card earned in play.</w:t>
+      </w:r>
+    </w:p>
+    <w:p>
+      <w:pPr>
+        <w:numPr>
+          <w:ilvl w:val="0"/>
+          <w:numId w:val="1022"/>
+        </w:numPr>
+        <w:pStyle w:val="Compact"/>
+      </w:pPr>
+      <w:r>
+        <w:rPr>
+          <w:bCs/>
+          <w:b/>
+        </w:rPr>
+        <w:t xml:space="preserve">Spells.</w:t>
+      </w:r>
+      <w:r>
+        <w:t xml:space="preserve"> </w:t>
+      </w:r>
+      <w:r>
+        <w:t xml:space="preserve">A new hex, cantrip or power matches the setting’s own: an attack marks 1 or 2 boxes at Close or Short range, and anything stronger says who resists and what it costs.</w:t>
+      </w:r>
+    </w:p>
+    <w:p>
+      <w:pPr>
+        <w:numPr>
+          <w:ilvl w:val="0"/>
+          <w:numId w:val="1022"/>
+        </w:numPr>
+        <w:pStyle w:val="Compact"/>
+      </w:pPr>
+      <w:r>
+        <w:rPr>
+          <w:bCs/>
+          <w:b/>
+        </w:rPr>
+        <w:t xml:space="preserve">Rituals.</w:t>
+      </w:r>
+      <w:r>
+        <w:t xml:space="preserve"> </w:t>
+      </w:r>
+      <w:r>
+        <w:t xml:space="preserve">Give a ritual its weight (Minor 2 segments, Significant 4, Major 6), the time a roll takes, what it does and its price.</w:t>
+      </w:r>
+    </w:p>
+    <w:p>
+      <w:pPr>
         <w:pStyle w:val="FirstParagraph"/>
       </w:pPr>
       <w:r>
@@ -10678,7 +10744,7 @@
         <w:t xml:space="preserve"> </w:t>
       </w:r>
       <w:r>
-        <w:t xml:space="preserve">tab keeps your threats, weapons and Edges. They then work like the book’s, marked</w:t>
+        <w:t xml:space="preserve">tab keeps your threats, weapons, Edges, cards, spells and rituals. They then work like the book’s, marked</w:t>
       </w:r>
       <w:r>
         <w:t xml:space="preserve"> </w:t>
@@ -10691,7 +10757,20 @@
         <w:t xml:space="preserve">homebrew</w:t>
       </w:r>
       <w:r>
-        <w:t xml:space="preserve">: threats in the Encounter panel and on the battle map, weapons in characters’ gear and the roller, Edges in the creator. Players get them when they join your shared table, or from a homebrew file you give them. A special trait or Edge is a note the GM applies at the table.</w:t>
+        <w:t xml:space="preserve">: threats in the Encounter panel and on the battle map, weapons in characters’ gear and the roller, Edges and spells among the creator’s choices, cards where findings are recorded, and rituals in a ritual book beside</w:t>
+      </w:r>
+      <w:r>
+        <w:t xml:space="preserve"> </w:t>
+      </w:r>
+      <w:r>
+        <w:rPr>
+          <w:iCs/>
+          <w:i/>
+        </w:rPr>
+        <w:t xml:space="preserve">Rituals by heart</w:t>
+      </w:r>
+      <w:r>
+        <w:t xml:space="preserve">. Players get them when they join your shared table, or from a homebrew file you give them. A special trait or Edge is a note the GM applies at the table.</w:t>
       </w:r>
     </w:p>
     <w:bookmarkEnd w:id="100"/>

</xml_diff>